<commit_message>
docs: documentação inicial do projeto V1.1
</commit_message>
<xml_diff>
--- a/PID_Relatório_5o_e_6o.Períodos_2026.docx
+++ b/PID_Relatório_5o_e_6o.Períodos_2026.docx
@@ -1,6 +1,6 @@
 
 <file path=word/document.xml><?xml version="1.0" encoding="utf-8"?>
-<w:document xmlns:wpc="http://schemas.microsoft.com/office/word/2010/wordprocessingCanvas" xmlns:cx="http://schemas.microsoft.com/office/drawing/2014/chartex" xmlns:cx1="http://schemas.microsoft.com/office/drawing/2015/9/8/chartex" xmlns:cx2="http://schemas.microsoft.com/office/drawing/2015/10/21/chartex" xmlns:cx3="http://schemas.microsoft.com/office/drawing/2016/5/9/chartex" xmlns:cx4="http://schemas.microsoft.com/office/drawing/2016/5/10/chartex" xmlns:cx5="http://schemas.microsoft.com/office/drawing/2016/5/11/chartex" xmlns:cx6="http://schemas.microsoft.com/office/drawing/2016/5/12/chartex" xmlns:cx7="http://schemas.microsoft.com/office/drawing/2016/5/13/chartex" xmlns:cx8="http://schemas.microsoft.com/office/drawing/2016/5/14/chartex" xmlns:mc="http://schemas.openxmlformats.org/markup-compatibility/2006" xmlns:aink="http://schemas.microsoft.com/office/drawing/2016/ink" xmlns:am3d="http://schemas.microsoft.com/office/drawing/2017/model3d" xmlns:o="urn:schemas-microsoft-com:office:office" xmlns:oel="http://schemas.microsoft.com/office/2019/extlst" xmlns:r="http://schemas.openxmlformats.org/officeDocument/2006/relationships" xmlns:m="http://schemas.openxmlformats.org/officeDocument/2006/math" xmlns:v="urn:schemas-microsoft-com:vml" xmlns:wp14="http://schemas.microsoft.com/office/word/2010/wordprocessingDrawing" xmlns:wp="http://schemas.openxmlformats.org/drawingml/2006/wordprocessingDrawing" xmlns:w10="urn:schemas-microsoft-com:office:word" xmlns:w="http://schemas.openxmlformats.org/wordprocessingml/2006/main" xmlns:w14="http://schemas.microsoft.com/office/word/2010/wordml" xmlns:w15="http://schemas.microsoft.com/office/word/2012/wordml" xmlns:w16cex="http://schemas.microsoft.com/office/word/2018/wordml/cex" xmlns:w16cid="http://schemas.microsoft.com/office/word/2016/wordml/cid" xmlns:w16="http://schemas.microsoft.com/office/word/2018/wordml" xmlns:w16du="http://schemas.microsoft.com/office/word/2023/wordml/word16du" xmlns:w16sdtdh="http://schemas.microsoft.com/office/word/2020/wordml/sdtdatahash" xmlns:w16sdtfl="http://schemas.microsoft.com/office/word/2024/wordml/sdtformatlock" xmlns:w16se="http://schemas.microsoft.com/office/word/2015/wordml/symex" xmlns:wpg="http://schemas.microsoft.com/office/word/2010/wordprocessingGroup" xmlns:wpi="http://schemas.microsoft.com/office/word/2010/wordprocessingInk" xmlns:wne="http://schemas.microsoft.com/office/word/2006/wordml" xmlns:wps="http://schemas.microsoft.com/office/word/2010/wordprocessingShape" mc:Ignorable="w14 w15 w16se w16cid w16 w16cex w16sdtdh w16sdtfl w16du wp14">
+<w:document xmlns:wpc="http://schemas.microsoft.com/office/word/2010/wordprocessingCanvas" xmlns:cx="http://schemas.microsoft.com/office/drawing/2014/chartex" xmlns:cx1="http://schemas.microsoft.com/office/drawing/2015/9/8/chartex" xmlns:cx2="http://schemas.microsoft.com/office/drawing/2015/10/21/chartex" xmlns:cx3="http://schemas.microsoft.com/office/drawing/2016/5/9/chartex" xmlns:cx4="http://schemas.microsoft.com/office/drawing/2016/5/10/chartex" xmlns:cx5="http://schemas.microsoft.com/office/drawing/2016/5/11/chartex" xmlns:cx6="http://schemas.microsoft.com/office/drawing/2016/5/12/chartex" xmlns:cx7="http://schemas.microsoft.com/office/drawing/2016/5/13/chartex" xmlns:cx8="http://schemas.microsoft.com/office/drawing/2016/5/14/chartex" xmlns:mc="http://schemas.openxmlformats.org/markup-compatibility/2006" xmlns:aink="http://schemas.microsoft.com/office/drawing/2016/ink" xmlns:am3d="http://schemas.microsoft.com/office/drawing/2017/model3d" xmlns:o="urn:schemas-microsoft-com:office:office" xmlns:oel="http://schemas.microsoft.com/office/2019/extlst" xmlns:r="http://schemas.openxmlformats.org/officeDocument/2006/relationships" xmlns:m="http://schemas.openxmlformats.org/officeDocument/2006/math" xmlns:v="urn:schemas-microsoft-com:vml" xmlns:wp14="http://schemas.microsoft.com/office/word/2010/wordprocessingDrawing" xmlns:wp="http://schemas.openxmlformats.org/drawingml/2006/wordprocessingDrawing" xmlns:w10="urn:schemas-microsoft-com:office:word" xmlns:w="http://schemas.openxmlformats.org/wordprocessingml/2006/main" xmlns:w14="http://schemas.microsoft.com/office/word/2010/wordml" xmlns:w15="http://schemas.microsoft.com/office/word/2012/wordml" xmlns:w16cex="http://schemas.microsoft.com/office/word/2018/wordml/cex" xmlns:w16cid="http://schemas.microsoft.com/office/word/2016/wordml/cid" xmlns:w16="http://schemas.microsoft.com/office/word/2018/wordml" xmlns:w16du="http://schemas.microsoft.com/office/word/2023/wordml/word16du" xmlns:w16sdtdh="http://schemas.microsoft.com/office/word/2020/wordml/sdtdatahash" xmlns:w16sdtfl="http://schemas.microsoft.com/office/word/2024/wordml/sdtformatlock" xmlns:w16se="http://schemas.microsoft.com/office/word/2015/wordml/symex" xmlns:wpg="http://schemas.microsoft.com/office/word/2010/wordprocessingGroup" xmlns:wpi="http://schemas.microsoft.com/office/word/2010/wordprocessingInk" xmlns:wne="http://schemas.microsoft.com/office/word/2006/wordml" xmlns:wps="http://schemas.microsoft.com/office/word/2010/wordprocessingShape" xmlns:a="http://schemas.openxmlformats.org/drawingml/2006/main" mc:Ignorable="w14 w15 w16se w16cid w16 w16cex w16sdtdh w16sdtfl w16du wp14">
   <w:body>
     <w:p>
       <w:pPr>
@@ -57,6 +57,22 @@
     <w:p>
       <w:pPr>
         <w:jc w:val="center"/>
+        <w:rPr>
+          <w:b w:val="1"/>
+          <w:bCs w:val="1"/>
+        </w:rPr>
+      </w:pPr>
+      <w:r>
+        <w:rPr>
+          <w:b w:val="1"/>
+          <w:bCs w:val="1"/>
+        </w:rPr>
+        <w:t>BRUNO EDUARDO FARIA DE MORAIS</w:t>
+      </w:r>
+    </w:p>
+    <w:p>
+      <w:pPr>
+        <w:jc w:val="center"/>
       </w:pPr>
       <w:r>
         <w:rPr>
@@ -178,7 +194,6 @@
           <w:b/>
           <w:bCs/>
         </w:rPr>
-        <w:lastRenderedPageBreak/>
         <w:t>FAI – CENTRO DE ENSINO SUPERIOR EM GESTÃO, TECNOLOGIA E EDUCAÇÃO</w:t>
       </w:r>
     </w:p>
@@ -323,22 +338,20 @@
           <w:b/>
           <w:bCs/>
         </w:rPr>
-        <w:lastRenderedPageBreak/>
         <w:t xml:space="preserve">LISTA DE REVISÃO </w:t>
       </w:r>
     </w:p>
     <w:tbl>
       <w:tblPr>
-        <w:tblStyle w:val="a"/>
         <w:tblW w:w="8926" w:type="dxa"/>
         <w:tblInd w:w="288" w:type="dxa"/>
         <w:tblBorders>
-          <w:top w:val="single" w:sz="6" w:space="0" w:color="000000"/>
-          <w:left w:val="single" w:sz="6" w:space="0" w:color="000000"/>
-          <w:bottom w:val="single" w:sz="6" w:space="0" w:color="000000"/>
-          <w:right w:val="single" w:sz="6" w:space="0" w:color="000000"/>
-          <w:insideH w:val="single" w:sz="6" w:space="0" w:color="000000"/>
-          <w:insideV w:val="single" w:sz="6" w:space="0" w:color="000000"/>
+          <w:top w:val="single" w:color="000000" w:themeColor="text1" w:sz="6" w:space="0"/>
+          <w:left w:val="single" w:color="000000" w:themeColor="text1" w:sz="6" w:space="0"/>
+          <w:bottom w:val="single" w:color="000000" w:themeColor="text1" w:sz="6" w:space="0"/>
+          <w:right w:val="single" w:color="000000" w:themeColor="text1" w:sz="6" w:space="0"/>
+          <w:insideH w:val="single" w:color="000000" w:themeColor="text1" w:sz="6" w:space="0"/>
+          <w:insideV w:val="single" w:color="000000" w:themeColor="text1" w:sz="6" w:space="0"/>
         </w:tblBorders>
         <w:tblLayout w:type="fixed"/>
         <w:tblLook w:val="0000" w:firstRow="0" w:lastRow="0" w:firstColumn="0" w:lastColumn="0" w:noHBand="0" w:noVBand="0"/>
@@ -356,7 +369,8 @@
         <w:tc>
           <w:tcPr>
             <w:tcW w:w="1272" w:type="dxa"/>
-            <w:shd w:val="clear" w:color="auto" w:fill="FFFFFF"/>
+            <w:shd w:val="clear" w:color="auto" w:fill="FFFFFF" w:themeFill="background1"/>
+            <w:tcMar/>
           </w:tcPr>
           <w:p>
             <w:pPr>
@@ -385,7 +399,8 @@
         <w:tc>
           <w:tcPr>
             <w:tcW w:w="1275" w:type="dxa"/>
-            <w:shd w:val="clear" w:color="auto" w:fill="FFFFFF"/>
+            <w:shd w:val="clear" w:color="auto" w:fill="FFFFFF" w:themeFill="background1"/>
+            <w:tcMar/>
           </w:tcPr>
           <w:p>
             <w:pPr>
@@ -414,7 +429,8 @@
         <w:tc>
           <w:tcPr>
             <w:tcW w:w="1977" w:type="dxa"/>
-            <w:shd w:val="clear" w:color="auto" w:fill="FFFFFF"/>
+            <w:shd w:val="clear" w:color="auto" w:fill="FFFFFF" w:themeFill="background1"/>
+            <w:tcMar/>
           </w:tcPr>
           <w:p>
             <w:pPr>
@@ -443,7 +459,8 @@
         <w:tc>
           <w:tcPr>
             <w:tcW w:w="4402" w:type="dxa"/>
-            <w:shd w:val="clear" w:color="auto" w:fill="FFFFFF"/>
+            <w:shd w:val="clear" w:color="auto" w:fill="FFFFFF" w:themeFill="background1"/>
+            <w:tcMar/>
           </w:tcPr>
           <w:p>
             <w:pPr>
@@ -474,6 +491,7 @@
         <w:tc>
           <w:tcPr>
             <w:tcW w:w="1272" w:type="dxa"/>
+            <w:tcMar/>
           </w:tcPr>
           <w:p>
             <w:pPr>
@@ -501,6 +519,7 @@
         <w:tc>
           <w:tcPr>
             <w:tcW w:w="1275" w:type="dxa"/>
+            <w:tcMar/>
           </w:tcPr>
           <w:p>
             <w:pPr>
@@ -515,6 +534,7 @@
         <w:tc>
           <w:tcPr>
             <w:tcW w:w="1977" w:type="dxa"/>
+            <w:tcMar/>
           </w:tcPr>
           <w:p>
             <w:pPr>
@@ -541,6 +561,7 @@
         <w:tc>
           <w:tcPr>
             <w:tcW w:w="4402" w:type="dxa"/>
+            <w:tcMar/>
           </w:tcPr>
           <w:p>
             <w:pPr>
@@ -566,6 +587,120 @@
           </w:p>
         </w:tc>
       </w:tr>
+      <w:tr>
+        <w:trPr>
+          <w:trHeight w:val="300"/>
+        </w:trPr>
+        <w:tc>
+          <w:tcPr>
+            <w:tcW w:w="1272" w:type="dxa"/>
+            <w:tcMar/>
+          </w:tcPr>
+          <w:p>
+            <w:pPr>
+              <w:pStyle w:val="Normal"/>
+              <w:jc w:val="center"/>
+              <w:rPr>
+                <w:color w:val="000000" w:themeColor="text1" w:themeTint="FF" w:themeShade="FF"/>
+              </w:rPr>
+            </w:pPr>
+            <w:r>
+              <w:rPr>
+                <w:rFonts w:ascii="Times New Roman" w:hAnsi="Times New Roman" w:eastAsia="Times New Roman" w:cs="Times New Roman"/>
+                <w:color w:val="000000" w:themeColor="text1" w:themeTint="FF" w:themeShade="FF"/>
+                <w:sz w:val="24"/>
+                <w:szCs w:val="24"/>
+                <w:lang w:eastAsia="pt-BR" w:bidi="ar-SA"/>
+              </w:rPr>
+              <w:t>08/03/26</w:t>
+            </w:r>
+          </w:p>
+        </w:tc>
+        <w:tc>
+          <w:tcPr>
+            <w:tcW w:w="1275" w:type="dxa"/>
+            <w:tcMar/>
+          </w:tcPr>
+          <w:p>
+            <w:pPr>
+              <w:pStyle w:val="Normal"/>
+              <w:jc w:val="center"/>
+              <w:rPr>
+                <w:color w:val="000000" w:themeColor="text1" w:themeTint="FF" w:themeShade="FF"/>
+              </w:rPr>
+            </w:pPr>
+            <w:r>
+              <w:rPr>
+                <w:rFonts w:ascii="Times New Roman" w:hAnsi="Times New Roman" w:eastAsia="Times New Roman" w:cs="Times New Roman"/>
+                <w:color w:val="000000" w:themeColor="text1" w:themeTint="FF" w:themeShade="FF"/>
+                <w:sz w:val="24"/>
+                <w:szCs w:val="24"/>
+                <w:lang w:eastAsia="pt-BR" w:bidi="ar-SA"/>
+              </w:rPr>
+              <w:t>V1.1</w:t>
+            </w:r>
+          </w:p>
+        </w:tc>
+        <w:tc>
+          <w:tcPr>
+            <w:tcW w:w="1977" w:type="dxa"/>
+            <w:tcMar/>
+          </w:tcPr>
+          <w:p>
+            <w:pPr>
+              <w:pStyle w:val="Normal"/>
+              <w:rPr>
+                <w:color w:val="000000" w:themeColor="text1" w:themeTint="FF" w:themeShade="FF"/>
+              </w:rPr>
+            </w:pPr>
+            <w:r>
+              <w:rPr>
+                <w:rFonts w:ascii="Times New Roman" w:hAnsi="Times New Roman" w:eastAsia="Times New Roman" w:cs="Times New Roman"/>
+                <w:color w:val="000000" w:themeColor="text1" w:themeTint="FF" w:themeShade="FF"/>
+                <w:sz w:val="24"/>
+                <w:szCs w:val="24"/>
+                <w:lang w:eastAsia="pt-BR" w:bidi="ar-SA"/>
+              </w:rPr>
+              <w:t>BRUNO EDUARDO</w:t>
+            </w:r>
+          </w:p>
+        </w:tc>
+        <w:tc>
+          <w:tcPr>
+            <w:tcW w:w="4402" w:type="dxa"/>
+            <w:tcMar/>
+          </w:tcPr>
+          <w:p>
+            <w:pPr>
+              <w:pStyle w:val="Normal"/>
+              <w:jc w:val="both"/>
+              <w:rPr>
+                <w:color w:val="000000" w:themeColor="text1" w:themeTint="FF" w:themeShade="FF"/>
+              </w:rPr>
+            </w:pPr>
+            <w:r>
+              <w:rPr>
+                <w:rFonts w:ascii="Times New Roman" w:hAnsi="Times New Roman" w:eastAsia="Times New Roman" w:cs="Times New Roman"/>
+                <w:color w:val="000000" w:themeColor="text1" w:themeTint="FF" w:themeShade="FF"/>
+                <w:sz w:val="24"/>
+                <w:szCs w:val="24"/>
+                <w:lang w:eastAsia="pt-BR" w:bidi="ar-SA"/>
+              </w:rPr>
+              <w:t>CAPITULO</w:t>
+            </w:r>
+            <w:r>
+              <w:rPr>
+                <w:rFonts w:ascii="Times New Roman" w:hAnsi="Times New Roman" w:eastAsia="Times New Roman" w:cs="Times New Roman"/>
+                <w:color w:val="000000" w:themeColor="text1" w:themeTint="FF" w:themeShade="FF"/>
+                <w:sz w:val="24"/>
+                <w:szCs w:val="24"/>
+                <w:lang w:eastAsia="pt-BR" w:bidi="ar-SA"/>
+              </w:rPr>
+              <w:t xml:space="preserve"> 1 (2.6, 2.7 e 2.8)</w:t>
+            </w:r>
+          </w:p>
+        </w:tc>
+      </w:tr>
     </w:tbl>
     <w:p>
       <w:pPr>
@@ -580,7 +715,7 @@
       <w:pPr>
         <w:jc w:val="center"/>
       </w:pPr>
-      <w:bookmarkStart w:id="0" w:name="_ch6ot5knti9w" w:colFirst="0" w:colLast="0"/>
+      <w:bookmarkStart w:name="_ch6ot5knti9w" w:colFirst="0" w:colLast="0" w:id="0"/>
       <w:bookmarkEnd w:id="0"/>
       <w:r>
         <w:br w:type="page"/>
@@ -590,7 +725,6 @@
           <w:b/>
           <w:bCs/>
         </w:rPr>
-        <w:lastRenderedPageBreak/>
         <w:t>AGRADECIMENTOS</w:t>
       </w:r>
     </w:p>
@@ -606,7 +740,6 @@
           <w:b/>
           <w:bCs/>
         </w:rPr>
-        <w:lastRenderedPageBreak/>
         <w:t>RESUMO</w:t>
       </w:r>
     </w:p>
@@ -645,7 +778,6 @@
           <w:b/>
           <w:bCs/>
         </w:rPr>
-        <w:lastRenderedPageBreak/>
         <w:t>LISTA DE FIGURAS</w:t>
       </w:r>
       <w:r>
@@ -696,7 +828,7 @@
                             <w:pPr>
                               <w:suppressAutoHyphens/>
                               <w:spacing w:line="1" w:lineRule="atLeast"/>
-                              <w:ind w:leftChars="-1" w:hangingChars="1" w:hanging="2"/>
+                              <w:ind w:leftChars="-1" w:hanging="2" w:hangingChars="1"/>
                               <w:textDirection w:val="btLr"/>
                               <w:textAlignment w:val="top"/>
                               <w:outlineLvl w:val="0"/>
@@ -709,7 +841,7 @@
                             <w:pPr>
                               <w:suppressAutoHyphens/>
                               <w:spacing w:line="1" w:lineRule="atLeast"/>
-                              <w:ind w:leftChars="-1" w:hangingChars="1" w:hanging="2"/>
+                              <w:ind w:leftChars="-1" w:hanging="2" w:hangingChars="1"/>
                               <w:textDirection w:val="btLr"/>
                               <w:textAlignment w:val="top"/>
                               <w:outlineLvl w:val="0"/>
@@ -727,20 +859,20 @@
               </wp:anchor>
             </w:drawing>
           </mc:Choice>
-          <mc:Fallback>
-            <w:pict>
-              <v:shapetype w14:anchorId="7018CBA8" id="_x0000_t202" coordsize="21600,21600" o:spt="202" path="m,l,21600r21600,l21600,xe">
+          <mc:Fallback xmlns:a="http://schemas.openxmlformats.org/drawingml/2006/main">
+            <w:pict w14:anchorId="08459B00">
+              <v:shapetype id="_x0000_t202" coordsize="21600,21600" o:spt="202" path="m,l,21600r21600,l21600,xe" w14:anchorId="7018CBA8">
                 <v:stroke joinstyle="miter"/>
                 <v:path gradientshapeok="t" o:connecttype="rect"/>
               </v:shapetype>
-              <v:shape id="Caixa de Texto 1" o:spid="_x0000_s1026" type="#_x0000_t202" style="position:absolute;margin-left:445pt;margin-top:-47.6pt;width:10pt;height:13.6pt;z-index:251658240;visibility:visible;mso-wrap-style:square;mso-wrap-distance-left:9pt;mso-wrap-distance-top:0;mso-wrap-distance-right:9pt;mso-wrap-distance-bottom:0;mso-position-horizontal:absolute;mso-position-horizontal-relative:text;mso-position-vertical:absolute;mso-position-vertical-relative:text;v-text-anchor:top" o:gfxdata="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" stroked="f">
+              <v:shape id="Caixa de Texto 1" style="position:absolute;margin-left:445pt;margin-top:-47.6pt;width:10pt;height:13.6pt;z-index:251658240;visibility:visible;mso-wrap-style:square;mso-wrap-distance-left:9pt;mso-wrap-distance-top:0;mso-wrap-distance-right:9pt;mso-wrap-distance-bottom:0;mso-position-horizontal:absolute;mso-position-horizontal-relative:text;mso-position-vertical:absolute;mso-position-vertical-relative:text;v-text-anchor:top" o:spid="_x0000_s1026" stroked="f" type="#_x0000_t202" o:gfxdata="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">
                 <v:textbox>
                   <w:txbxContent>
                     <w:p>
                       <w:pPr>
                         <w:suppressAutoHyphens/>
                         <w:spacing w:line="1" w:lineRule="atLeast"/>
-                        <w:ind w:leftChars="-1" w:hangingChars="1" w:hanging="2"/>
+                        <w:ind w:leftChars="-1" w:hanging="2" w:hangingChars="1"/>
                         <w:textDirection w:val="btLr"/>
                         <w:textAlignment w:val="top"/>
                         <w:outlineLvl w:val="0"/>
@@ -753,7 +885,7 @@
                       <w:pPr>
                         <w:suppressAutoHyphens/>
                         <w:spacing w:line="1" w:lineRule="atLeast"/>
-                        <w:ind w:leftChars="-1" w:hangingChars="1" w:hanging="2"/>
+                        <w:ind w:leftChars="-1" w:hanging="2" w:hangingChars="1"/>
                         <w:textDirection w:val="btLr"/>
                         <w:textAlignment w:val="top"/>
                         <w:outlineLvl w:val="0"/>
@@ -802,7 +934,6 @@
           <w:b/>
           <w:bCs/>
         </w:rPr>
-        <w:lastRenderedPageBreak/>
         <w:t>LISTA DE SIGLAS E ABREVIATURAS</w:t>
       </w:r>
     </w:p>
@@ -1145,8 +1276,13 @@
           <w:b/>
           <w:bCs/>
         </w:rPr>
-        <w:lastRenderedPageBreak/>
         <w:tab/>
+      </w:r>
+      <w:r>
+        <w:rPr>
+          <w:b/>
+          <w:bCs/>
+        </w:rPr>
         <w:t>SUMÁRIO</w:t>
       </w:r>
       <w:r>
@@ -1165,6 +1301,7 @@
           <w:docPartUnique/>
         </w:docPartObj>
       </w:sdtPr>
+      <w:sdtEndPr/>
       <w:sdtContent>
         <w:p>
           <w:pPr>
@@ -1179,7 +1316,7 @@
               <w:tab w:val="right" w:pos="9062"/>
             </w:tabs>
             <w:rPr>
-              <w:rFonts w:ascii="Calibri" w:eastAsia="Calibri" w:hAnsi="Calibri" w:cs="Calibri"/>
+              <w:rFonts w:ascii="Calibri" w:hAnsi="Calibri" w:eastAsia="Calibri" w:cs="Calibri"/>
               <w:color w:val="000000"/>
               <w:sz w:val="22"/>
               <w:szCs w:val="22"/>
@@ -1206,6 +1343,11 @@
                 <w:color w:val="000000"/>
               </w:rPr>
               <w:tab/>
+            </w:r>
+            <w:r>
+              <w:rPr>
+                <w:color w:val="000000"/>
+              </w:rPr>
               <w:t>10</w:t>
             </w:r>
           </w:hyperlink>
@@ -1223,7 +1365,7 @@
               <w:tab w:val="right" w:pos="9062"/>
             </w:tabs>
             <w:rPr>
-              <w:rFonts w:ascii="Calibri" w:eastAsia="Calibri" w:hAnsi="Calibri" w:cs="Calibri"/>
+              <w:rFonts w:ascii="Calibri" w:hAnsi="Calibri" w:eastAsia="Calibri" w:cs="Calibri"/>
               <w:color w:val="000000"/>
               <w:sz w:val="22"/>
               <w:szCs w:val="22"/>
@@ -1241,6 +1383,11 @@
                 <w:color w:val="000000"/>
               </w:rPr>
               <w:tab/>
+            </w:r>
+            <w:r>
+              <w:rPr>
+                <w:color w:val="000000"/>
+              </w:rPr>
               <w:t>11</w:t>
             </w:r>
           </w:hyperlink>
@@ -1259,7 +1406,7 @@
             </w:tabs>
             <w:ind w:left="240"/>
             <w:rPr>
-              <w:rFonts w:ascii="Calibri" w:eastAsia="Calibri" w:hAnsi="Calibri" w:cs="Calibri"/>
+              <w:rFonts w:ascii="Calibri" w:hAnsi="Calibri" w:eastAsia="Calibri" w:cs="Calibri"/>
               <w:color w:val="000000"/>
               <w:sz w:val="22"/>
               <w:szCs w:val="22"/>
@@ -1277,6 +1424,11 @@
                 <w:color w:val="000000"/>
               </w:rPr>
               <w:tab/>
+            </w:r>
+            <w:r>
+              <w:rPr>
+                <w:color w:val="000000"/>
+              </w:rPr>
               <w:t>11</w:t>
             </w:r>
           </w:hyperlink>
@@ -1295,7 +1447,7 @@
             </w:tabs>
             <w:ind w:left="240"/>
             <w:rPr>
-              <w:rFonts w:ascii="Calibri" w:eastAsia="Calibri" w:hAnsi="Calibri" w:cs="Calibri"/>
+              <w:rFonts w:ascii="Calibri" w:hAnsi="Calibri" w:eastAsia="Calibri" w:cs="Calibri"/>
               <w:color w:val="000000"/>
               <w:sz w:val="22"/>
               <w:szCs w:val="22"/>
@@ -1313,6 +1465,11 @@
                 <w:color w:val="000000"/>
               </w:rPr>
               <w:tab/>
+            </w:r>
+            <w:r>
+              <w:rPr>
+                <w:color w:val="000000"/>
+              </w:rPr>
               <w:t>11</w:t>
             </w:r>
           </w:hyperlink>
@@ -1331,7 +1488,7 @@
             </w:tabs>
             <w:ind w:left="240"/>
             <w:rPr>
-              <w:rFonts w:ascii="Calibri" w:eastAsia="Calibri" w:hAnsi="Calibri" w:cs="Calibri"/>
+              <w:rFonts w:ascii="Calibri" w:hAnsi="Calibri" w:eastAsia="Calibri" w:cs="Calibri"/>
               <w:color w:val="000000"/>
               <w:sz w:val="22"/>
               <w:szCs w:val="22"/>
@@ -1349,6 +1506,11 @@
                 <w:color w:val="000000"/>
               </w:rPr>
               <w:tab/>
+            </w:r>
+            <w:r>
+              <w:rPr>
+                <w:color w:val="000000"/>
+              </w:rPr>
               <w:t>11</w:t>
             </w:r>
           </w:hyperlink>
@@ -1367,7 +1529,7 @@
             </w:tabs>
             <w:ind w:left="240"/>
             <w:rPr>
-              <w:rFonts w:ascii="Calibri" w:eastAsia="Calibri" w:hAnsi="Calibri" w:cs="Calibri"/>
+              <w:rFonts w:ascii="Calibri" w:hAnsi="Calibri" w:eastAsia="Calibri" w:cs="Calibri"/>
               <w:color w:val="000000"/>
               <w:sz w:val="22"/>
               <w:szCs w:val="22"/>
@@ -1385,6 +1547,11 @@
                 <w:color w:val="000000"/>
               </w:rPr>
               <w:tab/>
+            </w:r>
+            <w:r>
+              <w:rPr>
+                <w:color w:val="000000"/>
+              </w:rPr>
               <w:t>12</w:t>
             </w:r>
           </w:hyperlink>
@@ -1403,7 +1570,7 @@
             </w:tabs>
             <w:ind w:left="240"/>
             <w:rPr>
-              <w:rFonts w:ascii="Calibri" w:eastAsia="Calibri" w:hAnsi="Calibri" w:cs="Calibri"/>
+              <w:rFonts w:ascii="Calibri" w:hAnsi="Calibri" w:eastAsia="Calibri" w:cs="Calibri"/>
               <w:color w:val="000000"/>
               <w:sz w:val="22"/>
               <w:szCs w:val="22"/>
@@ -1421,6 +1588,11 @@
                 <w:color w:val="000000"/>
               </w:rPr>
               <w:tab/>
+            </w:r>
+            <w:r>
+              <w:rPr>
+                <w:color w:val="000000"/>
+              </w:rPr>
               <w:t>12</w:t>
             </w:r>
           </w:hyperlink>
@@ -1439,7 +1611,7 @@
             </w:tabs>
             <w:ind w:left="240"/>
             <w:rPr>
-              <w:rFonts w:ascii="Calibri" w:eastAsia="Calibri" w:hAnsi="Calibri" w:cs="Calibri"/>
+              <w:rFonts w:ascii="Calibri" w:hAnsi="Calibri" w:eastAsia="Calibri" w:cs="Calibri"/>
               <w:color w:val="000000"/>
               <w:sz w:val="22"/>
               <w:szCs w:val="22"/>
@@ -1457,6 +1629,11 @@
                 <w:color w:val="000000"/>
               </w:rPr>
               <w:tab/>
+            </w:r>
+            <w:r>
+              <w:rPr>
+                <w:color w:val="000000"/>
+              </w:rPr>
               <w:t>12</w:t>
             </w:r>
           </w:hyperlink>
@@ -1475,7 +1652,7 @@
             </w:tabs>
             <w:ind w:left="240"/>
             <w:rPr>
-              <w:rFonts w:ascii="Calibri" w:eastAsia="Calibri" w:hAnsi="Calibri" w:cs="Calibri"/>
+              <w:rFonts w:ascii="Calibri" w:hAnsi="Calibri" w:eastAsia="Calibri" w:cs="Calibri"/>
               <w:color w:val="000000"/>
               <w:sz w:val="22"/>
               <w:szCs w:val="22"/>
@@ -1493,6 +1670,11 @@
                 <w:color w:val="000000"/>
               </w:rPr>
               <w:tab/>
+            </w:r>
+            <w:r>
+              <w:rPr>
+                <w:color w:val="000000"/>
+              </w:rPr>
               <w:t>12</w:t>
             </w:r>
           </w:hyperlink>
@@ -1511,7 +1693,7 @@
             </w:tabs>
             <w:ind w:left="240"/>
             <w:rPr>
-              <w:rFonts w:ascii="Calibri" w:eastAsia="Calibri" w:hAnsi="Calibri" w:cs="Calibri"/>
+              <w:rFonts w:ascii="Calibri" w:hAnsi="Calibri" w:eastAsia="Calibri" w:cs="Calibri"/>
               <w:color w:val="000000"/>
               <w:sz w:val="22"/>
               <w:szCs w:val="22"/>
@@ -1529,6 +1711,11 @@
                 <w:color w:val="000000"/>
               </w:rPr>
               <w:tab/>
+            </w:r>
+            <w:r>
+              <w:rPr>
+                <w:color w:val="000000"/>
+              </w:rPr>
               <w:t>12</w:t>
             </w:r>
           </w:hyperlink>
@@ -1546,7 +1733,7 @@
               <w:tab w:val="right" w:pos="9062"/>
             </w:tabs>
             <w:rPr>
-              <w:rFonts w:ascii="Calibri" w:eastAsia="Calibri" w:hAnsi="Calibri" w:cs="Calibri"/>
+              <w:rFonts w:ascii="Calibri" w:hAnsi="Calibri" w:eastAsia="Calibri" w:cs="Calibri"/>
               <w:color w:val="000000"/>
               <w:sz w:val="22"/>
               <w:szCs w:val="22"/>
@@ -1564,6 +1751,11 @@
                 <w:color w:val="000000"/>
               </w:rPr>
               <w:tab/>
+            </w:r>
+            <w:r>
+              <w:rPr>
+                <w:color w:val="000000"/>
+              </w:rPr>
               <w:t>14</w:t>
             </w:r>
           </w:hyperlink>
@@ -1582,7 +1774,7 @@
             </w:tabs>
             <w:ind w:left="240"/>
             <w:rPr>
-              <w:rFonts w:ascii="Calibri" w:eastAsia="Calibri" w:hAnsi="Calibri" w:cs="Calibri"/>
+              <w:rFonts w:ascii="Calibri" w:hAnsi="Calibri" w:eastAsia="Calibri" w:cs="Calibri"/>
               <w:color w:val="000000"/>
               <w:sz w:val="22"/>
               <w:szCs w:val="22"/>
@@ -1600,6 +1792,11 @@
                 <w:color w:val="000000"/>
               </w:rPr>
               <w:tab/>
+            </w:r>
+            <w:r>
+              <w:rPr>
+                <w:color w:val="000000"/>
+              </w:rPr>
               <w:t>14</w:t>
             </w:r>
           </w:hyperlink>
@@ -1618,7 +1815,7 @@
             </w:tabs>
             <w:ind w:left="240"/>
             <w:rPr>
-              <w:rFonts w:ascii="Calibri" w:eastAsia="Calibri" w:hAnsi="Calibri" w:cs="Calibri"/>
+              <w:rFonts w:ascii="Calibri" w:hAnsi="Calibri" w:eastAsia="Calibri" w:cs="Calibri"/>
               <w:color w:val="000000"/>
               <w:sz w:val="22"/>
               <w:szCs w:val="22"/>
@@ -1636,6 +1833,11 @@
                 <w:color w:val="000000"/>
               </w:rPr>
               <w:tab/>
+            </w:r>
+            <w:r>
+              <w:rPr>
+                <w:color w:val="000000"/>
+              </w:rPr>
               <w:t>14</w:t>
             </w:r>
           </w:hyperlink>
@@ -1654,7 +1856,7 @@
             </w:tabs>
             <w:ind w:left="240"/>
             <w:rPr>
-              <w:rFonts w:ascii="Calibri" w:eastAsia="Calibri" w:hAnsi="Calibri" w:cs="Calibri"/>
+              <w:rFonts w:ascii="Calibri" w:hAnsi="Calibri" w:eastAsia="Calibri" w:cs="Calibri"/>
               <w:color w:val="000000"/>
               <w:sz w:val="22"/>
               <w:szCs w:val="22"/>
@@ -1672,6 +1874,11 @@
                 <w:color w:val="000000"/>
               </w:rPr>
               <w:tab/>
+            </w:r>
+            <w:r>
+              <w:rPr>
+                <w:color w:val="000000"/>
+              </w:rPr>
               <w:t>14</w:t>
             </w:r>
           </w:hyperlink>
@@ -1690,7 +1897,7 @@
             </w:tabs>
             <w:ind w:left="240"/>
             <w:rPr>
-              <w:rFonts w:ascii="Calibri" w:eastAsia="Calibri" w:hAnsi="Calibri" w:cs="Calibri"/>
+              <w:rFonts w:ascii="Calibri" w:hAnsi="Calibri" w:eastAsia="Calibri" w:cs="Calibri"/>
               <w:color w:val="000000"/>
               <w:sz w:val="22"/>
               <w:szCs w:val="22"/>
@@ -1708,6 +1915,11 @@
                 <w:color w:val="000000"/>
               </w:rPr>
               <w:tab/>
+            </w:r>
+            <w:r>
+              <w:rPr>
+                <w:color w:val="000000"/>
+              </w:rPr>
               <w:t>15</w:t>
             </w:r>
           </w:hyperlink>
@@ -1726,7 +1938,7 @@
             </w:tabs>
             <w:ind w:left="240"/>
             <w:rPr>
-              <w:rFonts w:ascii="Calibri" w:eastAsia="Calibri" w:hAnsi="Calibri" w:cs="Calibri"/>
+              <w:rFonts w:ascii="Calibri" w:hAnsi="Calibri" w:eastAsia="Calibri" w:cs="Calibri"/>
               <w:color w:val="000000"/>
               <w:sz w:val="22"/>
               <w:szCs w:val="22"/>
@@ -1744,6 +1956,11 @@
                 <w:color w:val="000000"/>
               </w:rPr>
               <w:tab/>
+            </w:r>
+            <w:r>
+              <w:rPr>
+                <w:color w:val="000000"/>
+              </w:rPr>
               <w:t>15</w:t>
             </w:r>
           </w:hyperlink>
@@ -1761,7 +1978,7 @@
               <w:tab w:val="right" w:pos="9062"/>
             </w:tabs>
             <w:rPr>
-              <w:rFonts w:ascii="Calibri" w:eastAsia="Calibri" w:hAnsi="Calibri" w:cs="Calibri"/>
+              <w:rFonts w:ascii="Calibri" w:hAnsi="Calibri" w:eastAsia="Calibri" w:cs="Calibri"/>
               <w:color w:val="000000"/>
               <w:sz w:val="22"/>
               <w:szCs w:val="22"/>
@@ -1779,6 +1996,11 @@
                 <w:color w:val="000000"/>
               </w:rPr>
               <w:tab/>
+            </w:r>
+            <w:r>
+              <w:rPr>
+                <w:color w:val="000000"/>
+              </w:rPr>
               <w:t>16</w:t>
             </w:r>
           </w:hyperlink>
@@ -1797,7 +2019,7 @@
             </w:tabs>
             <w:ind w:left="240"/>
             <w:rPr>
-              <w:rFonts w:ascii="Calibri" w:eastAsia="Calibri" w:hAnsi="Calibri" w:cs="Calibri"/>
+              <w:rFonts w:ascii="Calibri" w:hAnsi="Calibri" w:eastAsia="Calibri" w:cs="Calibri"/>
               <w:color w:val="000000"/>
               <w:sz w:val="22"/>
               <w:szCs w:val="22"/>
@@ -1815,6 +2037,11 @@
                 <w:color w:val="000000"/>
               </w:rPr>
               <w:tab/>
+            </w:r>
+            <w:r>
+              <w:rPr>
+                <w:color w:val="000000"/>
+              </w:rPr>
               <w:t>16</w:t>
             </w:r>
           </w:hyperlink>
@@ -1833,7 +2060,7 @@
             </w:tabs>
             <w:ind w:left="240"/>
             <w:rPr>
-              <w:rFonts w:ascii="Calibri" w:eastAsia="Calibri" w:hAnsi="Calibri" w:cs="Calibri"/>
+              <w:rFonts w:ascii="Calibri" w:hAnsi="Calibri" w:eastAsia="Calibri" w:cs="Calibri"/>
               <w:color w:val="000000"/>
               <w:sz w:val="22"/>
               <w:szCs w:val="22"/>
@@ -1851,6 +2078,11 @@
                 <w:color w:val="000000"/>
               </w:rPr>
               <w:tab/>
+            </w:r>
+            <w:r>
+              <w:rPr>
+                <w:color w:val="000000"/>
+              </w:rPr>
               <w:t>16</w:t>
             </w:r>
           </w:hyperlink>
@@ -1869,7 +2101,7 @@
             </w:tabs>
             <w:ind w:left="240"/>
             <w:rPr>
-              <w:rFonts w:ascii="Calibri" w:eastAsia="Calibri" w:hAnsi="Calibri" w:cs="Calibri"/>
+              <w:rFonts w:ascii="Calibri" w:hAnsi="Calibri" w:eastAsia="Calibri" w:cs="Calibri"/>
               <w:color w:val="000000"/>
               <w:sz w:val="22"/>
               <w:szCs w:val="22"/>
@@ -1887,6 +2119,11 @@
                 <w:color w:val="000000"/>
               </w:rPr>
               <w:tab/>
+            </w:r>
+            <w:r>
+              <w:rPr>
+                <w:color w:val="000000"/>
+              </w:rPr>
               <w:t>16</w:t>
             </w:r>
           </w:hyperlink>
@@ -1904,7 +2141,7 @@
               <w:tab w:val="right" w:pos="9062"/>
             </w:tabs>
             <w:rPr>
-              <w:rFonts w:ascii="Calibri" w:eastAsia="Calibri" w:hAnsi="Calibri" w:cs="Calibri"/>
+              <w:rFonts w:ascii="Calibri" w:hAnsi="Calibri" w:eastAsia="Calibri" w:cs="Calibri"/>
               <w:color w:val="000000"/>
               <w:sz w:val="22"/>
               <w:szCs w:val="22"/>
@@ -1922,6 +2159,11 @@
                 <w:color w:val="000000"/>
               </w:rPr>
               <w:tab/>
+            </w:r>
+            <w:r>
+              <w:rPr>
+                <w:color w:val="000000"/>
+              </w:rPr>
               <w:t>17</w:t>
             </w:r>
           </w:hyperlink>
@@ -1939,7 +2181,7 @@
               <w:tab w:val="right" w:pos="9062"/>
             </w:tabs>
             <w:rPr>
-              <w:rFonts w:ascii="Calibri" w:eastAsia="Calibri" w:hAnsi="Calibri" w:cs="Calibri"/>
+              <w:rFonts w:ascii="Calibri" w:hAnsi="Calibri" w:eastAsia="Calibri" w:cs="Calibri"/>
               <w:color w:val="000000"/>
               <w:sz w:val="22"/>
               <w:szCs w:val="22"/>
@@ -1957,6 +2199,11 @@
                 <w:color w:val="000000"/>
               </w:rPr>
               <w:tab/>
+            </w:r>
+            <w:r>
+              <w:rPr>
+                <w:color w:val="000000"/>
+              </w:rPr>
               <w:t>18</w:t>
             </w:r>
           </w:hyperlink>
@@ -1974,7 +2221,7 @@
               <w:tab w:val="right" w:pos="9062"/>
             </w:tabs>
             <w:rPr>
-              <w:rFonts w:ascii="Calibri" w:eastAsia="Calibri" w:hAnsi="Calibri" w:cs="Calibri"/>
+              <w:rFonts w:ascii="Calibri" w:hAnsi="Calibri" w:eastAsia="Calibri" w:cs="Calibri"/>
               <w:color w:val="000000"/>
               <w:sz w:val="22"/>
               <w:szCs w:val="22"/>
@@ -1992,6 +2239,11 @@
                 <w:color w:val="000000"/>
               </w:rPr>
               <w:tab/>
+            </w:r>
+            <w:r>
+              <w:rPr>
+                <w:color w:val="000000"/>
+              </w:rPr>
               <w:t>19</w:t>
             </w:r>
           </w:hyperlink>
@@ -2009,7 +2261,7 @@
               <w:tab w:val="right" w:pos="9062"/>
             </w:tabs>
             <w:rPr>
-              <w:rFonts w:ascii="Calibri" w:eastAsia="Calibri" w:hAnsi="Calibri" w:cs="Calibri"/>
+              <w:rFonts w:ascii="Calibri" w:hAnsi="Calibri" w:eastAsia="Calibri" w:cs="Calibri"/>
               <w:color w:val="000000"/>
               <w:sz w:val="22"/>
               <w:szCs w:val="22"/>
@@ -2027,6 +2279,11 @@
                 <w:color w:val="000000"/>
               </w:rPr>
               <w:tab/>
+            </w:r>
+            <w:r>
+              <w:rPr>
+                <w:color w:val="000000"/>
+              </w:rPr>
               <w:t>20</w:t>
             </w:r>
           </w:hyperlink>
@@ -2044,7 +2301,7 @@
               <w:tab w:val="right" w:pos="9062"/>
             </w:tabs>
             <w:rPr>
-              <w:rFonts w:ascii="Calibri" w:eastAsia="Calibri" w:hAnsi="Calibri" w:cs="Calibri"/>
+              <w:rFonts w:ascii="Calibri" w:hAnsi="Calibri" w:eastAsia="Calibri" w:cs="Calibri"/>
               <w:color w:val="000000"/>
               <w:sz w:val="22"/>
               <w:szCs w:val="22"/>
@@ -2062,6 +2319,11 @@
                 <w:color w:val="000000"/>
               </w:rPr>
               <w:tab/>
+            </w:r>
+            <w:r>
+              <w:rPr>
+                <w:color w:val="000000"/>
+              </w:rPr>
               <w:t>21</w:t>
             </w:r>
           </w:hyperlink>
@@ -2079,7 +2341,7 @@
               <w:tab w:val="right" w:pos="9062"/>
             </w:tabs>
             <w:rPr>
-              <w:rFonts w:ascii="Calibri" w:eastAsia="Calibri" w:hAnsi="Calibri" w:cs="Calibri"/>
+              <w:rFonts w:ascii="Calibri" w:hAnsi="Calibri" w:eastAsia="Calibri" w:cs="Calibri"/>
               <w:color w:val="000000"/>
               <w:sz w:val="22"/>
               <w:szCs w:val="22"/>
@@ -2097,6 +2359,11 @@
                 <w:color w:val="000000"/>
               </w:rPr>
               <w:tab/>
+            </w:r>
+            <w:r>
+              <w:rPr>
+                <w:color w:val="000000"/>
+              </w:rPr>
               <w:t>22</w:t>
             </w:r>
           </w:hyperlink>
@@ -2114,7 +2381,7 @@
               <w:tab w:val="right" w:pos="9062"/>
             </w:tabs>
             <w:rPr>
-              <w:rFonts w:ascii="Calibri" w:eastAsia="Calibri" w:hAnsi="Calibri" w:cs="Calibri"/>
+              <w:rFonts w:ascii="Calibri" w:hAnsi="Calibri" w:eastAsia="Calibri" w:cs="Calibri"/>
               <w:color w:val="000000"/>
               <w:sz w:val="22"/>
               <w:szCs w:val="22"/>
@@ -2132,6 +2399,11 @@
                 <w:color w:val="000000"/>
               </w:rPr>
               <w:tab/>
+            </w:r>
+            <w:r>
+              <w:rPr>
+                <w:color w:val="000000"/>
+              </w:rPr>
               <w:t>23</w:t>
             </w:r>
           </w:hyperlink>
@@ -2149,7 +2421,7 @@
               <w:tab w:val="right" w:pos="9062"/>
             </w:tabs>
             <w:rPr>
-              <w:rFonts w:ascii="Calibri" w:eastAsia="Calibri" w:hAnsi="Calibri" w:cs="Calibri"/>
+              <w:rFonts w:ascii="Calibri" w:hAnsi="Calibri" w:eastAsia="Calibri" w:cs="Calibri"/>
               <w:color w:val="000000"/>
               <w:sz w:val="22"/>
               <w:szCs w:val="22"/>
@@ -2167,6 +2439,11 @@
                 <w:color w:val="000000"/>
               </w:rPr>
               <w:tab/>
+            </w:r>
+            <w:r>
+              <w:rPr>
+                <w:color w:val="000000"/>
+              </w:rPr>
               <w:t>24</w:t>
             </w:r>
           </w:hyperlink>
@@ -2184,7 +2461,7 @@
           <w:headerReference w:type="even" r:id="rId6"/>
           <w:headerReference w:type="default" r:id="rId7"/>
           <w:headerReference w:type="first" r:id="rId8"/>
-          <w:pgSz w:w="11907" w:h="16840"/>
+          <w:pgSz w:w="11907" w:h="16840" w:orient="portrait"/>
           <w:pgMar w:top="1701" w:right="1134" w:bottom="1134" w:left="1701" w:header="720" w:footer="720" w:gutter="0"/>
           <w:pgNumType w:start="1"/>
           <w:cols w:space="720"/>
@@ -2211,7 +2488,7 @@
           <w:color w:val="000000"/>
         </w:rPr>
       </w:pPr>
-      <w:bookmarkStart w:id="1" w:name="_uebpuqog7hoa" w:colFirst="0" w:colLast="0"/>
+      <w:bookmarkStart w:name="_uebpuqog7hoa" w:colFirst="0" w:colLast="0" w:id="1"/>
       <w:bookmarkEnd w:id="1"/>
       <w:r>
         <w:rPr>
@@ -2220,7 +2497,6 @@
           <w:smallCaps/>
           <w:color w:val="000000"/>
         </w:rPr>
-        <w:lastRenderedPageBreak/>
         <w:t>1 INTRODUÇÃO</w:t>
       </w:r>
       <w:r>
@@ -2271,7 +2547,7 @@
                             <w:pPr>
                               <w:suppressAutoHyphens/>
                               <w:spacing w:line="1" w:lineRule="atLeast"/>
-                              <w:ind w:leftChars="-1" w:hangingChars="1" w:hanging="2"/>
+                              <w:ind w:leftChars="-1" w:hanging="2" w:hangingChars="1"/>
                               <w:textDirection w:val="btLr"/>
                               <w:textAlignment w:val="top"/>
                               <w:outlineLvl w:val="0"/>
@@ -2284,7 +2560,7 @@
                             <w:pPr>
                               <w:suppressAutoHyphens/>
                               <w:spacing w:line="1" w:lineRule="atLeast"/>
-                              <w:ind w:leftChars="-1" w:hangingChars="1" w:hanging="2"/>
+                              <w:ind w:leftChars="-1" w:hanging="2" w:hangingChars="1"/>
                               <w:textDirection w:val="btLr"/>
                               <w:textAlignment w:val="top"/>
                               <w:outlineLvl w:val="0"/>
@@ -2302,16 +2578,16 @@
               </wp:anchor>
             </w:drawing>
           </mc:Choice>
-          <mc:Fallback>
-            <w:pict>
-              <v:shape w14:anchorId="65E7CEEC" id="Caixa de Texto 3" o:spid="_x0000_s1027" type="#_x0000_t202" style="position:absolute;margin-left:440pt;margin-top:-54.4pt;width:15pt;height:20.4pt;z-index:251659264;visibility:visible;mso-wrap-style:square;mso-wrap-distance-left:9pt;mso-wrap-distance-top:0;mso-wrap-distance-right:9pt;mso-wrap-distance-bottom:0;mso-position-horizontal:absolute;mso-position-horizontal-relative:text;mso-position-vertical:absolute;mso-position-vertical-relative:text;v-text-anchor:top" o:gfxdata="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" stroked="f">
+          <mc:Fallback xmlns:a="http://schemas.openxmlformats.org/drawingml/2006/main">
+            <w:pict w14:anchorId="39C9A96B">
+              <v:shape id="Caixa de Texto 3" style="position:absolute;margin-left:440pt;margin-top:-54.4pt;width:15pt;height:20.4pt;z-index:251659264;visibility:visible;mso-wrap-style:square;mso-wrap-distance-left:9pt;mso-wrap-distance-top:0;mso-wrap-distance-right:9pt;mso-wrap-distance-bottom:0;mso-position-horizontal:absolute;mso-position-horizontal-relative:text;mso-position-vertical:absolute;mso-position-vertical-relative:text;v-text-anchor:top" o:spid="_x0000_s1027" stroked="f" type="#_x0000_t202" o:gfxdata="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" w14:anchorId="65E7CEEC">
                 <v:textbox>
                   <w:txbxContent>
                     <w:p>
                       <w:pPr>
                         <w:suppressAutoHyphens/>
                         <w:spacing w:line="1" w:lineRule="atLeast"/>
-                        <w:ind w:leftChars="-1" w:hangingChars="1" w:hanging="2"/>
+                        <w:ind w:leftChars="-1" w:hanging="2" w:hangingChars="1"/>
                         <w:textDirection w:val="btLr"/>
                         <w:textAlignment w:val="top"/>
                         <w:outlineLvl w:val="0"/>
@@ -2324,7 +2600,7 @@
                       <w:pPr>
                         <w:suppressAutoHyphens/>
                         <w:spacing w:line="1" w:lineRule="atLeast"/>
-                        <w:ind w:leftChars="-1" w:hangingChars="1" w:hanging="2"/>
+                        <w:ind w:leftChars="-1" w:hanging="2" w:hangingChars="1"/>
                         <w:textDirection w:val="btLr"/>
                         <w:textAlignment w:val="top"/>
                         <w:outlineLvl w:val="0"/>
@@ -2388,7 +2664,7 @@
                             <w:pPr>
                               <w:suppressAutoHyphens/>
                               <w:spacing w:line="1" w:lineRule="atLeast"/>
-                              <w:ind w:leftChars="-1" w:hangingChars="1" w:hanging="2"/>
+                              <w:ind w:leftChars="-1" w:hanging="2" w:hangingChars="1"/>
                               <w:textDirection w:val="btLr"/>
                               <w:textAlignment w:val="top"/>
                               <w:outlineLvl w:val="0"/>
@@ -2401,7 +2677,7 @@
                             <w:pPr>
                               <w:suppressAutoHyphens/>
                               <w:spacing w:line="1" w:lineRule="atLeast"/>
-                              <w:ind w:leftChars="-1" w:hangingChars="1" w:hanging="2"/>
+                              <w:ind w:leftChars="-1" w:hanging="2" w:hangingChars="1"/>
                               <w:textDirection w:val="btLr"/>
                               <w:textAlignment w:val="top"/>
                               <w:outlineLvl w:val="0"/>
@@ -2419,16 +2695,16 @@
               </wp:anchor>
             </w:drawing>
           </mc:Choice>
-          <mc:Fallback>
-            <w:pict>
-              <v:shape w14:anchorId="7FCD1C33" id="Caixa de Texto 2" o:spid="_x0000_s1028" type="#_x0000_t202" style="position:absolute;margin-left:445pt;margin-top:-54.4pt;width:10pt;height:20.4pt;z-index:251660288;visibility:visible;mso-wrap-style:square;mso-wrap-distance-left:9pt;mso-wrap-distance-top:0;mso-wrap-distance-right:9pt;mso-wrap-distance-bottom:0;mso-position-horizontal:absolute;mso-position-horizontal-relative:text;mso-position-vertical:absolute;mso-position-vertical-relative:text;v-text-anchor:top" o:gfxdata="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" stroked="f">
+          <mc:Fallback xmlns:a="http://schemas.openxmlformats.org/drawingml/2006/main">
+            <w:pict w14:anchorId="32BFD1CD">
+              <v:shape id="Caixa de Texto 2" style="position:absolute;margin-left:445pt;margin-top:-54.4pt;width:10pt;height:20.4pt;z-index:251660288;visibility:visible;mso-wrap-style:square;mso-wrap-distance-left:9pt;mso-wrap-distance-top:0;mso-wrap-distance-right:9pt;mso-wrap-distance-bottom:0;mso-position-horizontal:absolute;mso-position-horizontal-relative:text;mso-position-vertical:absolute;mso-position-vertical-relative:text;v-text-anchor:top" o:spid="_x0000_s1028" stroked="f" type="#_x0000_t202" o:gfxdata="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" w14:anchorId="7FCD1C33">
                 <v:textbox>
                   <w:txbxContent>
                     <w:p>
                       <w:pPr>
                         <w:suppressAutoHyphens/>
                         <w:spacing w:line="1" w:lineRule="atLeast"/>
-                        <w:ind w:leftChars="-1" w:hangingChars="1" w:hanging="2"/>
+                        <w:ind w:leftChars="-1" w:hanging="2" w:hangingChars="1"/>
                         <w:textDirection w:val="btLr"/>
                         <w:textAlignment w:val="top"/>
                         <w:outlineLvl w:val="0"/>
@@ -2441,7 +2717,7 @@
                       <w:pPr>
                         <w:suppressAutoHyphens/>
                         <w:spacing w:line="1" w:lineRule="atLeast"/>
-                        <w:ind w:leftChars="-1" w:hangingChars="1" w:hanging="2"/>
+                        <w:ind w:leftChars="-1" w:hanging="2" w:hangingChars="1"/>
                         <w:textDirection w:val="btLr"/>
                         <w:textAlignment w:val="top"/>
                         <w:outlineLvl w:val="0"/>
@@ -2554,7 +2830,7 @@
           <w:color w:val="000000"/>
         </w:rPr>
       </w:pPr>
-      <w:bookmarkStart w:id="2" w:name="_gihow8iyy5tk" w:colFirst="0" w:colLast="0"/>
+      <w:bookmarkStart w:name="_gihow8iyy5tk" w:colFirst="0" w:colLast="0" w:id="2"/>
       <w:bookmarkEnd w:id="2"/>
       <w:r>
         <w:br w:type="page"/>
@@ -2566,7 +2842,6 @@
           <w:smallCaps/>
           <w:color w:val="000000"/>
         </w:rPr>
-        <w:lastRenderedPageBreak/>
         <w:t>2</w:t>
       </w:r>
       <w:r>
@@ -2653,7 +2928,7 @@
         </w:rPr>
         <w:t>Sistema Web para auxiliar comunicação entre idosos, responsáveis e cuidadores, facilitando o contato e a organização dos cuidados.</w:t>
       </w:r>
-      <w:bookmarkStart w:id="3" w:name="_wtwf8uuzt1zz" w:colFirst="0" w:colLast="0"/>
+      <w:bookmarkStart w:name="_wtwf8uuzt1zz" w:colFirst="0" w:colLast="0" w:id="3"/>
       <w:bookmarkEnd w:id="3"/>
     </w:p>
     <w:p>
@@ -2735,7 +3010,7 @@
           <w:color w:val="FF0000"/>
         </w:rPr>
       </w:pPr>
-      <w:bookmarkStart w:id="4" w:name="_4kon9gd1dvv5" w:colFirst="0" w:colLast="0"/>
+      <w:bookmarkStart w:name="_4kon9gd1dvv5" w:colFirst="0" w:colLast="0" w:id="4"/>
       <w:bookmarkEnd w:id="4"/>
     </w:p>
     <w:p>
@@ -2775,7 +3050,6 @@
           <w:b/>
           <w:bCs/>
         </w:rPr>
-        <w:lastRenderedPageBreak/>
         <w:t>2.3.1 Objetivo Geral</w:t>
       </w:r>
     </w:p>
@@ -2823,22 +3097,32 @@
       </w:r>
       <w:r>
         <w:br/>
+      </w:r>
+      <w:r>
         <w:t>• Permitir que cuidadores informem experiência, cidade, valor por hora e disponibilidade de horários.</w:t>
       </w:r>
       <w:r>
         <w:br/>
+      </w:r>
+      <w:r>
         <w:t>• Criar um sistema de busca que possibilite aos responsáveis encontrar cuidadores utilizando filtros específicos.</w:t>
       </w:r>
       <w:r>
         <w:br/>
+      </w:r>
+      <w:r>
         <w:t>• Desenvolver uma funcionalidade para vincular cuidadores aos idosos após a contratação.</w:t>
       </w:r>
       <w:r>
         <w:br/>
+      </w:r>
+      <w:r>
         <w:t>• Implementar uma agenda de medicamentos para auxiliar no controle de remédios, doses e horários.</w:t>
       </w:r>
       <w:r>
         <w:br/>
+      </w:r>
+      <w:r>
         <w:t>• Utilizar Java no desenvolvimento do sistema e PostgreSQL para armazenamento dos dados.</w:t>
       </w:r>
     </w:p>
@@ -2903,7 +3187,7 @@
           <w:color w:val="FF0000"/>
         </w:rPr>
       </w:pPr>
-      <w:bookmarkStart w:id="5" w:name="_a242hfqy1pb1" w:colFirst="0" w:colLast="0"/>
+      <w:bookmarkStart w:name="_a242hfqy1pb1" w:colFirst="0" w:colLast="0" w:id="5"/>
       <w:bookmarkEnd w:id="5"/>
     </w:p>
     <w:p>
@@ -2956,7 +3240,7 @@
           <w:color w:val="FF0000"/>
         </w:rPr>
       </w:pPr>
-      <w:bookmarkStart w:id="6" w:name="_vu5456qxwj1m" w:colFirst="0" w:colLast="0"/>
+      <w:bookmarkStart w:name="_vu5456qxwj1m" w:colFirst="0" w:colLast="0" w:id="6"/>
       <w:bookmarkEnd w:id="6"/>
     </w:p>
     <w:p>
@@ -2976,15 +3260,659 @@
       </w:pPr>
       <w:r>
         <w:rPr>
-          <w:smallCaps/>
+          <w:smallCaps w:val="1"/>
+          <w:color w:val="000000" w:themeColor="text1" w:themeTint="FF" w:themeShade="FF"/>
+        </w:rPr>
+        <w:t xml:space="preserve">2.6 REFERENCIAL TEÓRICO </w:t>
+      </w:r>
+    </w:p>
+    <w:p>
+      <w:pPr>
+        <w:spacing w:before="240" w:beforeAutospacing="off" w:after="240" w:afterAutospacing="off"/>
+        <w:jc w:val="both"/>
+        <w:rPr>
+          <w:noProof w:val="0"/>
+          <w:lang w:val="pt-BR"/>
+        </w:rPr>
+      </w:pPr>
+      <w:r>
+        <w:rPr>
+          <w:rFonts w:ascii="Times New Roman" w:hAnsi="Times New Roman" w:eastAsia="Times New Roman" w:cs="Times New Roman"/>
+          <w:noProof w:val="0"/>
+          <w:color w:val="auto"/>
+          <w:sz w:val="24"/>
+          <w:szCs w:val="24"/>
+          <w:lang w:val="pt-BR" w:eastAsia="pt-BR" w:bidi="ar-SA"/>
+        </w:rPr>
+        <w:t>O</w:t>
+      </w:r>
+      <w:r>
+        <w:rPr>
+          <w:rFonts w:ascii="Times New Roman" w:hAnsi="Times New Roman" w:eastAsia="Times New Roman" w:cs="Times New Roman"/>
+          <w:noProof w:val="0"/>
+          <w:color w:val="auto"/>
+          <w:sz w:val="24"/>
+          <w:szCs w:val="24"/>
+          <w:lang w:val="pt-BR" w:eastAsia="pt-BR" w:bidi="ar-SA"/>
+        </w:rPr>
+        <w:t xml:space="preserve"> crescimento da população idosa tem aumentado a demanda por soluções que auxiliem no cuidado, acompanhamento e organização da rotina dessas pessoas. Com o avanço da expectativa de vida, torna cada vez mais comum que familiares ou profissionais assumam o papel de cuidadores, sendo necessário o uso de ferramentas que facilitem a gestão das informações relacionadas à saúde, medicamentos e atividades diárias do idoso.</w:t>
+      </w:r>
+    </w:p>
+    <w:p>
+      <w:pPr>
+        <w:spacing w:before="240" w:beforeAutospacing="off" w:after="240" w:afterAutospacing="off"/>
+        <w:jc w:val="both"/>
+        <w:rPr>
+          <w:noProof w:val="0"/>
+          <w:lang w:val="pt-BR"/>
+        </w:rPr>
+      </w:pPr>
+      <w:r>
+        <w:rPr>
+          <w:rFonts w:ascii="Times New Roman" w:hAnsi="Times New Roman" w:eastAsia="Times New Roman" w:cs="Times New Roman"/>
+          <w:noProof w:val="0"/>
+          <w:color w:val="auto"/>
+          <w:sz w:val="24"/>
+          <w:szCs w:val="24"/>
+          <w:lang w:val="pt-BR" w:eastAsia="pt-BR" w:bidi="ar-SA"/>
+        </w:rPr>
+        <w:t>De acordo com Marek et al., o gerenciamento de medicamentos em idosos é um processo complexo, pois envolve diversos fatores como dificuldades cognitivas, problemas de visão e a presença de múltipl</w:t>
+      </w:r>
+      <w:r>
+        <w:rPr>
+          <w:rFonts w:ascii="Times New Roman" w:hAnsi="Times New Roman" w:eastAsia="Times New Roman" w:cs="Times New Roman"/>
+          <w:noProof w:val="0"/>
+          <w:color w:val="auto"/>
+          <w:sz w:val="24"/>
+          <w:szCs w:val="24"/>
+          <w:lang w:val="pt-BR" w:eastAsia="pt-BR" w:bidi="ar-SA"/>
+        </w:rPr>
+        <w:t>os medicamentos prescritos. Esses fatores podem levar a erros na administração dos remédios quando não há um acompanhamento adequado, principalmente quando o idoso vive sozinho ou depende de diferentes cuidadores ao longo do dia (MAREK et al., 2008</w:t>
+      </w:r>
+      <w:r>
+        <w:rPr>
+          <w:rFonts w:ascii="Times New Roman" w:hAnsi="Times New Roman" w:eastAsia="Times New Roman" w:cs="Times New Roman"/>
+          <w:noProof w:val="0"/>
+          <w:color w:val="auto"/>
+          <w:sz w:val="24"/>
+          <w:szCs w:val="24"/>
+          <w:lang w:val="pt-BR" w:eastAsia="pt-BR" w:bidi="ar-SA"/>
+        </w:rPr>
+        <w:t>) .</w:t>
+      </w:r>
+    </w:p>
+    <w:p>
+      <w:pPr>
+        <w:spacing w:before="240" w:beforeAutospacing="off" w:after="240" w:afterAutospacing="off"/>
+        <w:jc w:val="both"/>
+        <w:rPr>
+          <w:noProof w:val="0"/>
+          <w:lang w:val="pt-BR"/>
+        </w:rPr>
+      </w:pPr>
+    </w:p>
+    <w:p>
+      <w:pPr>
+        <w:spacing w:before="240" w:beforeAutospacing="off" w:after="240" w:afterAutospacing="off"/>
+        <w:jc w:val="both"/>
+        <w:rPr>
+          <w:noProof w:val="0"/>
+          <w:lang w:val="pt-BR"/>
+        </w:rPr>
+      </w:pPr>
+      <w:r>
+        <w:rPr>
+          <w:rFonts w:ascii="Times New Roman" w:hAnsi="Times New Roman" w:eastAsia="Times New Roman" w:cs="Times New Roman"/>
+          <w:noProof w:val="0"/>
+          <w:color w:val="auto"/>
+          <w:sz w:val="24"/>
+          <w:szCs w:val="24"/>
+          <w:lang w:val="pt-BR" w:eastAsia="pt-BR" w:bidi="ar-SA"/>
+        </w:rPr>
+        <w:t>Nesse con</w:t>
+      </w:r>
+      <w:r>
+        <w:rPr>
+          <w:rFonts w:ascii="Times New Roman" w:hAnsi="Times New Roman" w:eastAsia="Times New Roman" w:cs="Times New Roman"/>
+          <w:noProof w:val="0"/>
+          <w:color w:val="auto"/>
+          <w:sz w:val="24"/>
+          <w:szCs w:val="24"/>
+          <w:lang w:val="pt-BR" w:eastAsia="pt-BR" w:bidi="ar-SA"/>
+        </w:rPr>
+        <w:t>texto, o uso de tecnologias digitais tem sido cada vez mais explorado para apoiar o cuidado com pessoas idosas. Sistemas computacionais podem auxiliar no monitoramento da saúde, no controle de medicamentos e na comunicação entre cuidadores e familiares. Estudos recentes também apontam que soluções tecnológicas voltadas à saúde podem contribuir para melhorar a adesão ao tratamento e reduzir o estresse dos cuidadores, ao oferecer lembretes, registros e acompanhamento das rotinas de cuidado (ZHOU, 2025).</w:t>
+      </w:r>
+    </w:p>
+    <w:p>
+      <w:pPr>
+        <w:spacing w:before="240" w:beforeAutospacing="off" w:after="240" w:afterAutospacing="off"/>
+        <w:jc w:val="both"/>
+        <w:rPr>
+          <w:noProof w:val="0"/>
+          <w:lang w:val="pt-BR"/>
+        </w:rPr>
+      </w:pPr>
+      <w:r>
+        <w:rPr>
+          <w:rFonts w:ascii="Times New Roman" w:hAnsi="Times New Roman" w:eastAsia="Times New Roman" w:cs="Times New Roman"/>
+          <w:noProof w:val="0"/>
+          <w:color w:val="auto"/>
+          <w:sz w:val="24"/>
+          <w:szCs w:val="24"/>
+          <w:lang w:val="pt-BR" w:eastAsia="pt-BR" w:bidi="ar-SA"/>
+        </w:rPr>
+        <w:t xml:space="preserve">Um exemplo de trabalho relacionado é o aplicativo </w:t>
+      </w:r>
+      <w:r>
+        <w:rPr>
+          <w:rFonts w:ascii="Times New Roman" w:hAnsi="Times New Roman" w:eastAsia="Times New Roman" w:cs="Times New Roman"/>
+          <w:noProof w:val="0"/>
+          <w:color w:val="auto"/>
+          <w:sz w:val="24"/>
+          <w:szCs w:val="24"/>
+          <w:lang w:val="pt-BR" w:eastAsia="pt-BR" w:bidi="ar-SA"/>
+        </w:rPr>
+        <w:t>DoseApp</w:t>
+      </w:r>
+      <w:r>
+        <w:rPr>
+          <w:rFonts w:ascii="Times New Roman" w:hAnsi="Times New Roman" w:eastAsia="Times New Roman" w:cs="Times New Roman"/>
+          <w:noProof w:val="0"/>
+          <w:color w:val="auto"/>
+          <w:sz w:val="24"/>
+          <w:szCs w:val="24"/>
+          <w:lang w:val="pt-BR" w:eastAsia="pt-BR" w:bidi="ar-SA"/>
+        </w:rPr>
+        <w:t>, que foi desenvolvido com o objetivo de auxiliar cuidadores e familiares no gerenciamento de medicamentos e na organização da rotina diária de idosos. O sistema permite registrar horários, dosagens e outras informações importantes, reduzindo o risco de perda de informações quando há revezamento entre diferentes cuidadores (ROSTIROLLA; SOUZA, 2022)</w:t>
+      </w:r>
+      <w:bookmarkStart w:name="_ctqy09cxo6nw" w:id="7"/>
+      <w:bookmarkEnd w:id="7"/>
+    </w:p>
+    <w:p>
+      <w:pPr>
+        <w:keepNext w:val="1"/>
+        <w:pBdr>
+          <w:top w:val="nil" w:color="FF000000" w:sz="0" w:space="0"/>
+          <w:left w:val="nil" w:color="FF000000" w:sz="0" w:space="0"/>
+          <w:bottom w:val="nil" w:color="FF000000" w:sz="0" w:space="0"/>
+          <w:right w:val="nil" w:color="FF000000" w:sz="0" w:space="0"/>
+          <w:between w:val="nil" w:color="FF000000" w:sz="0" w:space="0"/>
+        </w:pBdr>
+      </w:pPr>
+      <w:r>
+        <w:rPr>
+          <w:rFonts w:ascii="Times New Roman" w:hAnsi="Times New Roman" w:eastAsia="Times New Roman" w:cs="Times New Roman"/>
+          <w:color w:val="auto"/>
+          <w:sz w:val="24"/>
+          <w:szCs w:val="24"/>
+          <w:lang w:eastAsia="pt-BR" w:bidi="ar-SA"/>
+        </w:rPr>
+        <w:t>2.7 METODOLOGIA DE TRABALHO</w:t>
+      </w:r>
+    </w:p>
+    <w:p>
+      <w:pPr>
+        <w:spacing w:before="240" w:beforeAutospacing="off" w:after="240" w:afterAutospacing="off" w:line="360" w:lineRule="auto"/>
+        <w:ind w:left="0" w:right="0"/>
+        <w:jc w:val="both"/>
+        <w:rPr>
+          <w:rFonts w:ascii="Times New Roman" w:hAnsi="Times New Roman" w:eastAsia="Times New Roman" w:cs="Times New Roman"/>
+          <w:noProof w:val="0"/>
+          <w:color w:val="auto"/>
+          <w:sz w:val="24"/>
+          <w:szCs w:val="24"/>
+          <w:lang w:val="pt-BR" w:eastAsia="pt-BR" w:bidi="ar-SA"/>
+        </w:rPr>
+      </w:pPr>
+      <w:r>
+        <w:rPr>
+          <w:rFonts w:ascii="Times New Roman" w:hAnsi="Times New Roman" w:eastAsia="Times New Roman" w:cs="Times New Roman"/>
+          <w:noProof w:val="0"/>
+          <w:color w:val="auto"/>
+          <w:sz w:val="24"/>
+          <w:szCs w:val="24"/>
+          <w:lang w:val="pt-BR" w:eastAsia="pt-BR" w:bidi="ar-SA"/>
+        </w:rPr>
+        <w:t xml:space="preserve">Para o desenvolvimento do projeto </w:t>
+      </w:r>
+      <w:r>
+        <w:rPr>
+          <w:rFonts w:ascii="Times New Roman" w:hAnsi="Times New Roman" w:eastAsia="Times New Roman" w:cs="Times New Roman"/>
+          <w:noProof w:val="0"/>
+          <w:color w:val="auto"/>
+          <w:sz w:val="24"/>
+          <w:szCs w:val="24"/>
+          <w:lang w:val="pt-BR" w:eastAsia="pt-BR" w:bidi="ar-SA"/>
+        </w:rPr>
+        <w:t>ElderConnect</w:t>
+      </w:r>
+      <w:r>
+        <w:rPr>
+          <w:rFonts w:ascii="Times New Roman" w:hAnsi="Times New Roman" w:eastAsia="Times New Roman" w:cs="Times New Roman"/>
+          <w:noProof w:val="0"/>
+          <w:color w:val="auto"/>
+          <w:sz w:val="24"/>
+          <w:szCs w:val="24"/>
+          <w:lang w:val="pt-BR" w:eastAsia="pt-BR" w:bidi="ar-SA"/>
+        </w:rPr>
+        <w:t>, será adotada uma abordagem baseada nas etapas de análise, planejamento, desenvolvimento e testes do sistema. O objetivo dessa metodologia é garantir que o sistema seja construído de forma organizada, atendendo às necessidades identificadas durante o levantamento de informações e entrevistas realizadas.</w:t>
+      </w:r>
+    </w:p>
+    <w:p>
+      <w:pPr>
+        <w:spacing w:before="240" w:beforeAutospacing="off" w:after="240" w:afterAutospacing="off" w:line="360" w:lineRule="auto"/>
+        <w:ind w:left="0" w:right="0"/>
+        <w:jc w:val="both"/>
+        <w:rPr>
+          <w:noProof w:val="0"/>
+          <w:lang w:val="pt-BR"/>
+        </w:rPr>
+      </w:pPr>
+      <w:r>
+        <w:rPr>
+          <w:rFonts w:ascii="Times New Roman" w:hAnsi="Times New Roman" w:eastAsia="Times New Roman" w:cs="Times New Roman"/>
+          <w:noProof w:val="0"/>
+          <w:color w:val="auto"/>
+          <w:sz w:val="24"/>
+          <w:szCs w:val="24"/>
+          <w:lang w:val="pt-BR" w:eastAsia="pt-BR" w:bidi="ar-SA"/>
+        </w:rPr>
+        <w:t>Inicialmente foi realizada uma etapa de levantamento de requisitos, na qual foram coletadas informações sobre os principais problemas enfrentados por cuidadores, familiares e profissionais da área da saúde no cuidado com pessoas idosas. Essa etapa foi realizada por meio de entrevistas com pessoas que possuem experiência no tema, permitindo compreender melhor as necessidades do público-alvo e as principais dificuldades existentes na contratação de cuidadores e no acompanhamento da rotina dos idosos.</w:t>
+      </w:r>
+    </w:p>
+    <w:p>
+      <w:pPr>
+        <w:spacing w:before="240" w:beforeAutospacing="off" w:after="240" w:afterAutospacing="off" w:line="360" w:lineRule="auto"/>
+        <w:ind w:left="0" w:right="0"/>
+        <w:jc w:val="both"/>
+        <w:rPr>
+          <w:noProof w:val="0"/>
+          <w:lang w:val="pt-BR"/>
+        </w:rPr>
+      </w:pPr>
+      <w:r>
+        <w:rPr>
+          <w:rFonts w:ascii="Times New Roman" w:hAnsi="Times New Roman" w:eastAsia="Times New Roman" w:cs="Times New Roman"/>
+          <w:noProof w:val="0"/>
+          <w:color w:val="auto"/>
+          <w:sz w:val="24"/>
+          <w:szCs w:val="24"/>
+          <w:lang w:val="pt-BR" w:eastAsia="pt-BR" w:bidi="ar-SA"/>
+        </w:rPr>
+        <w:t>Após o levantamento dessas informações, foi realizada a análise do problema e definição das funcionalidades do sistema, com o objetivo de identificar quais recursos seriam necessários para atender às demandas observadas. Entre as funcionalidades definidas estão o cadastro de usuários (responsáveis, cuidadores e idosos), sistema de autenticação, busca de cuidadores com filtros específicos, vinculação de cuidadores aos idosos e uma agenda para controle de medicamentos.</w:t>
+      </w:r>
+    </w:p>
+    <w:p>
+      <w:pPr>
+        <w:spacing w:before="240" w:beforeAutospacing="off" w:after="240" w:afterAutospacing="off" w:line="360" w:lineRule="auto"/>
+        <w:ind w:left="0" w:right="0"/>
+        <w:jc w:val="both"/>
+        <w:rPr>
+          <w:noProof w:val="0"/>
+          <w:lang w:val="pt-BR"/>
+        </w:rPr>
+      </w:pPr>
+      <w:r>
+        <w:rPr>
+          <w:rFonts w:ascii="Times New Roman" w:hAnsi="Times New Roman" w:eastAsia="Times New Roman" w:cs="Times New Roman"/>
+          <w:noProof w:val="0"/>
+          <w:color w:val="auto"/>
+          <w:sz w:val="24"/>
+          <w:szCs w:val="24"/>
+          <w:lang w:val="pt-BR" w:eastAsia="pt-BR" w:bidi="ar-SA"/>
+        </w:rPr>
+        <w:t>Na etapa seguinte será realizado o projeto e modelagem do sistema, incluindo a criação dos diagramas necessários para representar a estrutura do banco de dados e o funcionamento do sistema. Essa etapa envolve a definição das entidades, relacionamentos e regras de funcionamento, garantindo uma organização adequada das informações.</w:t>
+      </w:r>
+    </w:p>
+    <w:p>
+      <w:pPr>
+        <w:spacing w:before="240" w:beforeAutospacing="off" w:after="240" w:afterAutospacing="off" w:line="360" w:lineRule="auto"/>
+        <w:ind w:left="0" w:right="0"/>
+        <w:jc w:val="both"/>
+        <w:rPr>
+          <w:noProof w:val="0"/>
+          <w:lang w:val="pt-BR"/>
+        </w:rPr>
+      </w:pPr>
+      <w:r>
+        <w:rPr>
+          <w:rFonts w:ascii="Times New Roman" w:hAnsi="Times New Roman" w:eastAsia="Times New Roman" w:cs="Times New Roman"/>
+          <w:noProof w:val="0"/>
+          <w:color w:val="auto"/>
+          <w:sz w:val="24"/>
+          <w:szCs w:val="24"/>
+          <w:lang w:val="pt-BR" w:eastAsia="pt-BR" w:bidi="ar-SA"/>
+        </w:rPr>
+        <w:t xml:space="preserve">Posteriormente será iniciada a fase de desenvolvimento do sistema, utilizando a linguagem de programação Java para o </w:t>
+      </w:r>
+      <w:r>
+        <w:rPr>
+          <w:rFonts w:ascii="Times New Roman" w:hAnsi="Times New Roman" w:eastAsia="Times New Roman" w:cs="Times New Roman"/>
+          <w:noProof w:val="0"/>
+          <w:color w:val="auto"/>
+          <w:sz w:val="24"/>
+          <w:szCs w:val="24"/>
+          <w:lang w:val="pt-BR" w:eastAsia="pt-BR" w:bidi="ar-SA"/>
+        </w:rPr>
+        <w:t>backend</w:t>
+      </w:r>
+      <w:r>
+        <w:rPr>
+          <w:rFonts w:ascii="Times New Roman" w:hAnsi="Times New Roman" w:eastAsia="Times New Roman" w:cs="Times New Roman"/>
+          <w:noProof w:val="0"/>
+          <w:color w:val="auto"/>
+          <w:sz w:val="24"/>
+          <w:szCs w:val="24"/>
+          <w:lang w:val="pt-BR" w:eastAsia="pt-BR" w:bidi="ar-SA"/>
+        </w:rPr>
+        <w:t xml:space="preserve"> e o sistema de gerenciamento de banco de dados PostgreSQL para armazenamento das informações. Durante essa fase serão implementadas as funcionalidades definidas anteriormente, bem como os mecanismos de autenticação e organização dos dados dos usuários.</w:t>
+      </w:r>
+    </w:p>
+    <w:p>
+      <w:pPr>
+        <w:spacing w:before="240" w:beforeAutospacing="off" w:after="240" w:afterAutospacing="off" w:line="360" w:lineRule="auto"/>
+        <w:ind w:left="0" w:right="0"/>
+        <w:jc w:val="both"/>
+        <w:rPr>
+          <w:noProof w:val="0"/>
+          <w:lang w:val="pt-BR"/>
+        </w:rPr>
+      </w:pPr>
+      <w:r>
+        <w:rPr>
+          <w:rFonts w:ascii="Times New Roman" w:hAnsi="Times New Roman" w:eastAsia="Times New Roman" w:cs="Times New Roman"/>
+          <w:noProof w:val="0"/>
+          <w:color w:val="auto"/>
+          <w:sz w:val="24"/>
+          <w:szCs w:val="24"/>
+          <w:lang w:val="pt-BR" w:eastAsia="pt-BR" w:bidi="ar-SA"/>
+        </w:rPr>
+        <w:t>Por fim, será realizada a fase de testes e validação do sistema, com o objetivo de verificar se as funcionalidades estão operando corretamente e se o sistema atende às necessidades identificadas no início do projeto. Caso sejam identificados problemas ou melhorias, ajustes serão realizados antes da finalização do projeto.</w:t>
+      </w:r>
+      <w:bookmarkStart w:name="_u304za3h7w33" w:id="8"/>
+      <w:bookmarkEnd w:id="8"/>
+    </w:p>
+    <w:p>
+      <w:pPr>
+        <w:keepNext w:val="1"/>
+        <w:pBdr>
+          <w:top w:val="nil" w:color="FF000000" w:sz="0" w:space="0"/>
+          <w:left w:val="nil" w:color="FF000000" w:sz="0" w:space="0"/>
+          <w:bottom w:val="nil" w:color="FF000000" w:sz="0" w:space="0"/>
+          <w:right w:val="nil" w:color="FF000000" w:sz="0" w:space="0"/>
+          <w:between w:val="nil" w:color="FF000000" w:sz="0" w:space="0"/>
+        </w:pBdr>
+      </w:pPr>
+      <w:r>
+        <w:rPr>
+          <w:rFonts w:ascii="Times New Roman" w:hAnsi="Times New Roman" w:eastAsia="Times New Roman" w:cs="Times New Roman"/>
+          <w:color w:val="auto"/>
+          <w:sz w:val="24"/>
+          <w:szCs w:val="24"/>
+          <w:lang w:eastAsia="pt-BR" w:bidi="ar-SA"/>
+        </w:rPr>
+        <w:t>2.8 ANÁLISE SITUACIONAL</w:t>
+      </w:r>
+    </w:p>
+    <w:p>
+      <w:pPr>
+        <w:keepNext/>
+        <w:spacing w:before="240" w:beforeAutospacing="off" w:after="240" w:afterAutospacing="off"/>
+        <w:jc w:val="both"/>
+        <w:rPr>
+          <w:noProof w:val="0"/>
+          <w:lang w:val="pt-BR"/>
+        </w:rPr>
+      </w:pPr>
+      <w:r>
+        <w:rPr>
+          <w:rFonts w:ascii="Times New Roman" w:hAnsi="Times New Roman" w:eastAsia="Times New Roman" w:cs="Times New Roman"/>
+          <w:noProof w:val="0"/>
+          <w:color w:val="auto"/>
+          <w:sz w:val="24"/>
+          <w:szCs w:val="24"/>
+          <w:lang w:val="pt-BR" w:eastAsia="pt-BR" w:bidi="ar-SA"/>
+        </w:rPr>
+        <w:t>Para compreender melhor o contexto em que o projeto está inserido, realizamos entrevistas com pessoas que possuem experiência direta no cuidado e acompanhamento de idosos. O objetivo foi identificar os principais desafios enfrentados por cuidadores, familiares e profissionais da saúde, além de compreender as necessidades existentes e possíveis oportunidades de melhoria por meio do uso de tecnologias.</w:t>
+      </w:r>
+    </w:p>
+    <w:p>
+      <w:pPr>
+        <w:keepNext/>
+        <w:spacing w:before="240" w:beforeAutospacing="off" w:after="240" w:afterAutospacing="off"/>
+        <w:jc w:val="both"/>
+        <w:rPr>
+          <w:noProof w:val="0"/>
+          <w:lang w:val="pt-BR"/>
+        </w:rPr>
+      </w:pPr>
+      <w:r>
+        <w:rPr>
+          <w:rFonts w:ascii="Times New Roman" w:hAnsi="Times New Roman" w:eastAsia="Times New Roman" w:cs="Times New Roman"/>
+          <w:noProof w:val="0"/>
+          <w:color w:val="auto"/>
+          <w:sz w:val="24"/>
+          <w:szCs w:val="24"/>
+          <w:lang w:val="pt-BR" w:eastAsia="pt-BR" w:bidi="ar-SA"/>
+        </w:rPr>
+        <w:t xml:space="preserve">A primeira entrevistada foi </w:t>
+      </w:r>
+      <w:r>
+        <w:rPr>
+          <w:rFonts w:ascii="Times New Roman" w:hAnsi="Times New Roman" w:eastAsia="Times New Roman" w:cs="Times New Roman"/>
+          <w:noProof w:val="0"/>
+          <w:color w:val="auto"/>
+          <w:sz w:val="24"/>
+          <w:szCs w:val="24"/>
+          <w:lang w:val="pt-BR" w:eastAsia="pt-BR" w:bidi="ar-SA"/>
+        </w:rPr>
+        <w:t>Lúcia Helena</w:t>
+      </w:r>
+      <w:r>
+        <w:rPr>
+          <w:rFonts w:ascii="Times New Roman" w:hAnsi="Times New Roman" w:eastAsia="Times New Roman" w:cs="Times New Roman"/>
+          <w:noProof w:val="0"/>
+          <w:color w:val="auto"/>
+          <w:sz w:val="24"/>
+          <w:szCs w:val="24"/>
+          <w:lang w:val="pt-BR" w:eastAsia="pt-BR" w:bidi="ar-SA"/>
+        </w:rPr>
+        <w:t>, cuidadora de idosos com cerca de 15 anos de experiência. Ela comentou que o processo de contratação de cuidadores é, atualmente, pouco organizado, acontecendo principalmente por indicações de profissionais de saúde ou de conhecidos. Isso gera dificuldades tanto para os cuidadores, que dependem dessas recomendações para conseguir trabalho, quanto para as famílias, que muitas vezes precisam encontrar rapidamente alguém de confiança para cuidar de um idoso.</w:t>
+      </w:r>
+    </w:p>
+    <w:p>
+      <w:pPr>
+        <w:keepNext/>
+        <w:spacing w:before="240" w:beforeAutospacing="off" w:after="240" w:afterAutospacing="off"/>
+        <w:jc w:val="both"/>
+        <w:rPr>
+          <w:noProof w:val="0"/>
+          <w:lang w:val="pt-BR"/>
+        </w:rPr>
+      </w:pPr>
+      <w:r>
+        <w:rPr>
+          <w:rFonts w:ascii="Times New Roman" w:hAnsi="Times New Roman" w:eastAsia="Times New Roman" w:cs="Times New Roman"/>
+          <w:noProof w:val="0"/>
+          <w:color w:val="auto"/>
+          <w:sz w:val="24"/>
+          <w:szCs w:val="24"/>
+          <w:lang w:val="pt-BR" w:eastAsia="pt-BR" w:bidi="ar-SA"/>
+        </w:rPr>
+        <w:t xml:space="preserve">Outro desafio destacado por Lúcia é a dificuldade em conseguir cuidadores disponíveis de forma imediata, especialmente em situações emergenciais, como quando um idoso recebe alta hospitalar e necessita de acompanhamento contínuo. Segundo ela, um sistema organizado que permitisse às famílias </w:t>
+      </w:r>
+      <w:r>
+        <w:rPr>
+          <w:rFonts w:ascii="Times New Roman" w:hAnsi="Times New Roman" w:eastAsia="Times New Roman" w:cs="Times New Roman"/>
+          <w:noProof w:val="0"/>
+          <w:color w:val="auto"/>
+          <w:sz w:val="24"/>
+          <w:szCs w:val="24"/>
+          <w:lang w:val="pt-BR" w:eastAsia="pt-BR" w:bidi="ar-SA"/>
+        </w:rPr>
+        <w:t>encontrar</w:t>
+      </w:r>
+      <w:r>
+        <w:rPr>
+          <w:rFonts w:ascii="Times New Roman" w:hAnsi="Times New Roman" w:eastAsia="Times New Roman" w:cs="Times New Roman"/>
+          <w:noProof w:val="0"/>
+          <w:color w:val="auto"/>
+          <w:sz w:val="24"/>
+          <w:szCs w:val="24"/>
+          <w:lang w:val="pt-BR" w:eastAsia="pt-BR" w:bidi="ar-SA"/>
+        </w:rPr>
+        <w:t xml:space="preserve"> cuidadores, verificar suas experiências e entrar em contato facilmente poderia melhorar bastante essa situação. Lúcia também enfatizou que a solução precisa ser simples de usar, considerando que muitas pessoas têm pouca familiaridade com tecnologia e utilizam principalmente redes sociais em dispositivos móveis.</w:t>
+      </w:r>
+    </w:p>
+    <w:p>
+      <w:pPr>
+        <w:keepNext/>
+        <w:spacing w:before="240" w:beforeAutospacing="off" w:after="240" w:afterAutospacing="off"/>
+        <w:jc w:val="both"/>
+        <w:rPr>
+          <w:rFonts w:ascii="Times New Roman" w:hAnsi="Times New Roman" w:eastAsia="Times New Roman" w:cs="Times New Roman"/>
+          <w:noProof w:val="0"/>
+          <w:color w:val="auto"/>
+          <w:sz w:val="24"/>
+          <w:szCs w:val="24"/>
+          <w:lang w:val="pt-BR" w:eastAsia="pt-BR" w:bidi="ar-SA"/>
+        </w:rPr>
+      </w:pPr>
+      <w:r>
+        <w:rPr>
+          <w:rFonts w:ascii="Times New Roman" w:hAnsi="Times New Roman" w:eastAsia="Times New Roman" w:cs="Times New Roman"/>
+          <w:noProof w:val="0"/>
+          <w:color w:val="auto"/>
+          <w:sz w:val="24"/>
+          <w:szCs w:val="24"/>
+          <w:lang w:val="pt-BR" w:eastAsia="pt-BR" w:bidi="ar-SA"/>
+        </w:rPr>
+        <w:t xml:space="preserve">A segunda entrevista foi com </w:t>
+      </w:r>
+      <w:r>
+        <w:rPr>
+          <w:rFonts w:ascii="Times New Roman" w:hAnsi="Times New Roman" w:eastAsia="Times New Roman" w:cs="Times New Roman"/>
+          <w:noProof w:val="0"/>
+          <w:color w:val="auto"/>
+          <w:sz w:val="24"/>
+          <w:szCs w:val="24"/>
+          <w:lang w:val="pt-BR" w:eastAsia="pt-BR" w:bidi="ar-SA"/>
+        </w:rPr>
+        <w:t>Aparecida de Fátima Faria Barbosa</w:t>
+      </w:r>
+      <w:r>
+        <w:rPr>
+          <w:rFonts w:ascii="Times New Roman" w:hAnsi="Times New Roman" w:eastAsia="Times New Roman" w:cs="Times New Roman"/>
+          <w:noProof w:val="0"/>
+          <w:color w:val="auto"/>
+          <w:sz w:val="24"/>
+          <w:szCs w:val="24"/>
+          <w:lang w:val="pt-BR" w:eastAsia="pt-BR" w:bidi="ar-SA"/>
+        </w:rPr>
+        <w:t>, agente comunitária de saúde com 18 anos de atuação e coordenadora de uma comunidade religiosa há cerca de 20 anos. Ela apontou que o envelhecimento da população aumenta a demanda por cuidados especializados para idosos, criando desafios para famílias que precisam trabalhar e não podem acompanhar seus parentes o tempo todo.</w:t>
+      </w:r>
+    </w:p>
+    <w:p>
+      <w:pPr>
+        <w:keepNext/>
+        <w:spacing w:before="240" w:beforeAutospacing="off" w:after="240" w:afterAutospacing="off"/>
+        <w:jc w:val="both"/>
+        <w:rPr>
+          <w:rFonts w:ascii="Times New Roman" w:hAnsi="Times New Roman" w:eastAsia="Times New Roman" w:cs="Times New Roman"/>
+          <w:noProof w:val="0"/>
+          <w:color w:val="auto"/>
+          <w:sz w:val="24"/>
+          <w:szCs w:val="24"/>
+          <w:lang w:val="pt-BR" w:eastAsia="pt-BR" w:bidi="ar-SA"/>
+        </w:rPr>
+      </w:pPr>
+      <w:r>
+        <w:rPr>
+          <w:rFonts w:ascii="Times New Roman" w:hAnsi="Times New Roman" w:eastAsia="Times New Roman" w:cs="Times New Roman"/>
+          <w:noProof w:val="0"/>
+          <w:color w:val="auto"/>
+          <w:sz w:val="24"/>
+          <w:szCs w:val="24"/>
+          <w:lang w:val="pt-BR" w:eastAsia="pt-BR" w:bidi="ar-SA"/>
+        </w:rPr>
+        <w:t xml:space="preserve">Aparecida destacou que encontrar cuidadores capacitados e de confiança é uma dificuldade comum. Muitas famílias recorrem a soluções improvisadas, como escalas entre parentes ou instalação de equipamentos de monitoramento em casa. Ela também acredita que tecnologias digitais podem melhorar o acompanhamento dos idosos, principalmente se forem capazes de enviar alertas em </w:t>
+      </w:r>
+      <w:r>
+        <w:rPr>
+          <w:rFonts w:ascii="Times New Roman" w:hAnsi="Times New Roman" w:eastAsia="Times New Roman" w:cs="Times New Roman"/>
+          <w:noProof w:val="0"/>
+          <w:color w:val="auto"/>
+          <w:sz w:val="24"/>
+          <w:szCs w:val="24"/>
+          <w:lang w:val="pt-BR" w:eastAsia="pt-BR" w:bidi="ar-SA"/>
+        </w:rPr>
+        <w:t>situações de emergência</w:t>
+      </w:r>
+      <w:r>
+        <w:rPr>
+          <w:rFonts w:ascii="Times New Roman" w:hAnsi="Times New Roman" w:eastAsia="Times New Roman" w:cs="Times New Roman"/>
+          <w:noProof w:val="0"/>
+          <w:color w:val="auto"/>
+          <w:sz w:val="24"/>
+          <w:szCs w:val="24"/>
+          <w:lang w:val="pt-BR" w:eastAsia="pt-BR" w:bidi="ar-SA"/>
+        </w:rPr>
+        <w:t>, como quedas ou problemas de saúde. Outro ponto importante mencionado foi a dificuldade de acesso enfrentada por moradores da zona rural, onde a distância entre residências e a limitação de internet dificultam o acompanhamento constante do idoso e o acesso a serviços de cuidado.</w:t>
+      </w:r>
+    </w:p>
+    <w:p>
+      <w:pPr>
+        <w:keepNext/>
+        <w:spacing w:before="240" w:beforeAutospacing="off" w:after="240" w:afterAutospacing="off"/>
+        <w:jc w:val="both"/>
+        <w:rPr>
+          <w:rFonts w:ascii="Times New Roman" w:hAnsi="Times New Roman" w:eastAsia="Times New Roman" w:cs="Times New Roman"/>
+          <w:noProof w:val="0"/>
+          <w:color w:val="auto"/>
+          <w:sz w:val="24"/>
+          <w:szCs w:val="24"/>
+          <w:lang w:val="pt-BR" w:eastAsia="pt-BR" w:bidi="ar-SA"/>
+        </w:rPr>
+      </w:pPr>
+      <w:r>
+        <w:rPr>
+          <w:rFonts w:ascii="Times New Roman" w:hAnsi="Times New Roman" w:eastAsia="Times New Roman" w:cs="Times New Roman"/>
+          <w:noProof w:val="0"/>
+          <w:color w:val="auto"/>
+          <w:sz w:val="24"/>
+          <w:szCs w:val="24"/>
+          <w:lang w:val="pt-BR" w:eastAsia="pt-BR" w:bidi="ar-SA"/>
+        </w:rPr>
+        <w:t>A partir dessas entrevistas, foi possível identificar alguns pontos em comum. Entre os principais desafios estão a dificuldade de encontrar cuidadores disponíveis e confiáveis, a falta de organização na divulgação dos serviços de cuidado e a necessidade de ferramentas que auxiliem no acompanhamento da rotina e da saúde dos idosos. Observou-se também que soluções tecnológicas podem contribuir significativamente para reduzir essas dificuldades, desde que sejam simples, acessíveis e adaptadas ao perfil dos usuários, que muitas vezes possuem pouca familiaridade com sistemas digitais.</w:t>
+      </w:r>
+    </w:p>
+    <w:p>
+      <w:pPr>
+        <w:pStyle w:val="Normal"/>
+        <w:keepNext/>
+        <w:spacing w:before="240"/>
+        <w:jc w:val="both"/>
+        <w:rPr>
+          <w:b w:val="1"/>
+          <w:bCs w:val="1"/>
+          <w:smallCaps w:val="1"/>
           <w:color w:val="000000"/>
         </w:rPr>
-        <w:t xml:space="preserve">2.6 REFERENCIAL TEÓRICO </w:t>
-      </w:r>
-    </w:p>
-    <w:p>
-      <w:pPr>
-        <w:jc w:val="both"/>
+      </w:pPr>
+      <w:bookmarkStart w:name="_5xhdqyoxv5pz" w:id="9"/>
+      <w:bookmarkEnd w:id="9"/>
+      <w:r>
+        <w:rPr>
+          <w:b w:val="1"/>
+          <w:bCs w:val="1"/>
+          <w:smallCaps w:val="1"/>
+          <w:color w:val="000000" w:themeColor="text1" w:themeTint="FF" w:themeShade="FF"/>
+        </w:rPr>
+        <w:t xml:space="preserve">3 PLANEJAMENTO </w:t>
+      </w:r>
+    </w:p>
+    <w:p>
+      <w:pPr>
         <w:rPr>
           <w:color w:val="0070C0"/>
         </w:rPr>
@@ -2993,32 +3921,17 @@
         <w:rPr>
           <w:color w:val="0070C0"/>
         </w:rPr>
-        <w:t xml:space="preserve">Cite pelo menos 3 artigos, livros e trabalhos anteriores da </w:t>
-      </w:r>
-      <w:proofErr w:type="spellStart"/>
-      <w:r>
+        <w:t>Descreva a apresentação do capítulo.</w:t>
+      </w:r>
+    </w:p>
+    <w:p>
+      <w:pPr>
         <w:rPr>
           <w:color w:val="0070C0"/>
         </w:rPr>
-        <w:t>Faitec</w:t>
-      </w:r>
-      <w:proofErr w:type="spellEnd"/>
-      <w:r>
-        <w:rPr>
-          <w:color w:val="0070C0"/>
-        </w:rPr>
-        <w:t xml:space="preserve"> ou produtos no mercado que tenham relação com o seu trabalho. As citações presentes no texto devem indicar a fonte consultada de acordo com as regras das diretrizes para trabalhos acadêmicos da FAI.</w:t>
-      </w:r>
-    </w:p>
-    <w:p>
-      <w:pPr>
-        <w:jc w:val="both"/>
-        <w:rPr>
-          <w:color w:val="FF0000"/>
-        </w:rPr>
-      </w:pPr>
-      <w:bookmarkStart w:id="7" w:name="_ctqy09cxo6nw" w:colFirst="0" w:colLast="0"/>
-      <w:bookmarkEnd w:id="7"/>
+      </w:pPr>
+      <w:bookmarkStart w:name="_85x6gq42hjga" w:colFirst="0" w:colLast="0" w:id="11"/>
+      <w:bookmarkEnd w:id="11"/>
     </w:p>
     <w:p>
       <w:pPr>
@@ -3040,7 +3953,7 @@
           <w:smallCaps/>
           <w:color w:val="000000"/>
         </w:rPr>
-        <w:t>2.7 METODOLOGIA DE TRABALHO</w:t>
+        <w:t>3.1 RECURSOS HUMANOS</w:t>
       </w:r>
     </w:p>
     <w:p>
@@ -3054,17 +3967,18 @@
         <w:rPr>
           <w:color w:val="0070C0"/>
         </w:rPr>
-        <w:t xml:space="preserve">Explique como será desenvolvido o trabalho. Quais são as atividades realizadas para o cumprimento dos objetivos de seu trabalho. </w:t>
-      </w:r>
-    </w:p>
-    <w:p>
-      <w:pPr>
+        <w:t>Apresente a relação dos integrantes da equipe, professores e demais colaboradores do trabalho.</w:t>
+      </w:r>
+    </w:p>
+    <w:p>
+      <w:pPr>
+        <w:jc w:val="both"/>
         <w:rPr>
           <w:color w:val="FF0000"/>
         </w:rPr>
       </w:pPr>
-      <w:bookmarkStart w:id="8" w:name="_u304za3h7w33" w:colFirst="0" w:colLast="0"/>
-      <w:bookmarkEnd w:id="8"/>
+      <w:bookmarkStart w:name="_hlzhjesqyqyu" w:colFirst="0" w:colLast="0" w:id="12"/>
+      <w:bookmarkEnd w:id="12"/>
     </w:p>
     <w:p>
       <w:pPr>
@@ -3077,14 +3991,16 @@
           <w:between w:val="nil"/>
         </w:pBdr>
         <w:rPr>
+          <w:smallCaps/>
           <w:color w:val="000000"/>
         </w:rPr>
       </w:pPr>
       <w:r>
         <w:rPr>
+          <w:smallCaps/>
           <w:color w:val="000000"/>
         </w:rPr>
-        <w:t>2.8 ANÁLISE SITUACIONAL</w:t>
+        <w:t>3.2 RECURSOS DE HARDWARE</w:t>
       </w:r>
     </w:p>
     <w:p>
@@ -3094,17 +4010,338 @@
           <w:color w:val="0070C0"/>
         </w:rPr>
       </w:pPr>
+      <w:bookmarkStart w:name="_47l4drcmyedf" w:colFirst="0" w:colLast="0" w:id="13"/>
+      <w:bookmarkEnd w:id="13"/>
       <w:r>
         <w:rPr>
           <w:color w:val="0070C0"/>
         </w:rPr>
-        <w:t>Esta seção deve ser utilizada para descrever um conjunto de informações sobre a realidade em que o projeto está inserido. Para descrever esta seção, pelo menos duas pessoas devem ser entrevistadas na sociedade que conhecem sobre o tema de seu projeto. Descreva as entrevistas realizadas aqui.</w:t>
-      </w:r>
-    </w:p>
-    <w:p>
-      <w:bookmarkStart w:id="9" w:name="_5xhdqyoxv5pz" w:colFirst="0" w:colLast="0"/>
-      <w:bookmarkEnd w:id="9"/>
-    </w:p>
+        <w:t xml:space="preserve">Escreva as configurações de computadores e demais periféricos a ser utilizados para o desenvolvimento do trabalho. </w:t>
+      </w:r>
+    </w:p>
+    <w:p>
+      <w:pPr>
+        <w:jc w:val="both"/>
+        <w:rPr>
+          <w:color w:val="0070C0"/>
+        </w:rPr>
+      </w:pPr>
+      <w:r>
+        <w:rPr>
+          <w:color w:val="0070C0"/>
+        </w:rPr>
+        <w:t xml:space="preserve">Exemplos: </w:t>
+      </w:r>
+    </w:p>
+    <w:p>
+      <w:pPr>
+        <w:jc w:val="both"/>
+        <w:rPr>
+          <w:color w:val="0070C0"/>
+        </w:rPr>
+      </w:pPr>
+      <w:r>
+        <w:rPr>
+          <w:color w:val="0070C0"/>
+        </w:rPr>
+        <w:t xml:space="preserve">RH 1 – Três microcomputadores com processadores Intel i7, 4,9 GHz, 32-bit (x86); 16 </w:t>
+      </w:r>
+      <w:proofErr w:type="spellStart"/>
+      <w:r>
+        <w:rPr>
+          <w:color w:val="0070C0"/>
+        </w:rPr>
+        <w:t>Gbytes</w:t>
+      </w:r>
+      <w:proofErr w:type="spellEnd"/>
+      <w:r>
+        <w:rPr>
+          <w:color w:val="0070C0"/>
+        </w:rPr>
+        <w:t xml:space="preserve"> RAM e 16 </w:t>
+      </w:r>
+      <w:proofErr w:type="spellStart"/>
+      <w:r>
+        <w:rPr>
+          <w:color w:val="0070C0"/>
+        </w:rPr>
+        <w:t>Gbytes</w:t>
+      </w:r>
+      <w:proofErr w:type="spellEnd"/>
+      <w:r>
+        <w:rPr>
+          <w:color w:val="0070C0"/>
+        </w:rPr>
+        <w:t xml:space="preserve"> de espaço livre em disco.</w:t>
+      </w:r>
+    </w:p>
+    <w:p>
+      <w:pPr>
+        <w:jc w:val="both"/>
+        <w:rPr>
+          <w:color w:val="0070C0"/>
+        </w:rPr>
+      </w:pPr>
+      <w:r>
+        <w:rPr>
+          <w:color w:val="0070C0"/>
+        </w:rPr>
+        <w:t>RH 2 – Uma Impressora HP Deskjet colorida.</w:t>
+      </w:r>
+    </w:p>
+    <w:p>
+      <w:pPr>
+        <w:jc w:val="both"/>
+        <w:rPr>
+          <w:color w:val="0070C0"/>
+        </w:rPr>
+      </w:pPr>
+      <w:r>
+        <w:rPr>
+          <w:color w:val="0070C0"/>
+        </w:rPr>
+        <w:t xml:space="preserve">RH 3 – Uma </w:t>
+      </w:r>
+      <w:r>
+        <w:rPr>
+          <w:i/>
+          <w:iCs/>
+          <w:color w:val="0070C0"/>
+        </w:rPr>
+        <w:t>webcam</w:t>
+      </w:r>
+      <w:r>
+        <w:rPr>
+          <w:color w:val="0070C0"/>
+        </w:rPr>
+        <w:t xml:space="preserve"> com resolução mínima de 6 MP.</w:t>
+      </w:r>
+    </w:p>
+    <w:p>
+      <w:pPr>
+        <w:jc w:val="both"/>
+        <w:rPr>
+          <w:color w:val="FF0000"/>
+        </w:rPr>
+      </w:pPr>
+      <w:bookmarkStart w:name="_zgip7uuby6ix" w:colFirst="0" w:colLast="0" w:id="14"/>
+      <w:bookmarkEnd w:id="14"/>
+    </w:p>
+    <w:p>
+      <w:pPr>
+        <w:keepNext/>
+        <w:pBdr>
+          <w:top w:val="nil"/>
+          <w:left w:val="nil"/>
+          <w:bottom w:val="nil"/>
+          <w:right w:val="nil"/>
+          <w:between w:val="nil"/>
+        </w:pBdr>
+        <w:rPr>
+          <w:smallCaps/>
+          <w:color w:val="000000"/>
+        </w:rPr>
+      </w:pPr>
+      <w:r>
+        <w:rPr>
+          <w:smallCaps/>
+          <w:color w:val="000000"/>
+        </w:rPr>
+        <w:t>3.3 RECURSOS DE SOFTWARE</w:t>
+      </w:r>
+    </w:p>
+    <w:p>
+      <w:pPr>
+        <w:jc w:val="both"/>
+        <w:rPr>
+          <w:color w:val="0070C0"/>
+        </w:rPr>
+      </w:pPr>
+      <w:r>
+        <w:rPr>
+          <w:color w:val="0070C0"/>
+        </w:rPr>
+        <w:t xml:space="preserve">Exemplos: </w:t>
+      </w:r>
+    </w:p>
+    <w:p>
+      <w:pPr>
+        <w:rPr>
+          <w:color w:val="0070C0"/>
+          <w:lang w:val="en-US"/>
+        </w:rPr>
+      </w:pPr>
+      <w:r>
+        <w:rPr>
+          <w:color w:val="0070C0"/>
+          <w:lang w:val="en-US"/>
+        </w:rPr>
+        <w:t xml:space="preserve">RS 1 </w:t>
+      </w:r>
+      <w:proofErr w:type="gramStart"/>
+      <w:r>
+        <w:rPr>
+          <w:color w:val="0070C0"/>
+          <w:lang w:val="en-US"/>
+        </w:rPr>
+        <w:t>-  IntelliJ</w:t>
+      </w:r>
+      <w:proofErr w:type="gramEnd"/>
+      <w:r>
+        <w:rPr>
+          <w:color w:val="0070C0"/>
+          <w:lang w:val="en-US"/>
+        </w:rPr>
+        <w:t xml:space="preserve"> IDEA v. 2025.</w:t>
+      </w:r>
+    </w:p>
+    <w:p>
+      <w:pPr>
+        <w:rPr>
+          <w:color w:val="0070C0"/>
+          <w:lang w:val="en-US"/>
+        </w:rPr>
+      </w:pPr>
+      <w:r>
+        <w:rPr>
+          <w:color w:val="0070C0"/>
+          <w:lang w:val="en-US"/>
+        </w:rPr>
+        <w:t xml:space="preserve">RS </w:t>
+      </w:r>
+      <w:proofErr w:type="gramStart"/>
+      <w:r>
+        <w:rPr>
+          <w:color w:val="0070C0"/>
+          <w:lang w:val="en-US"/>
+        </w:rPr>
+        <w:t>2  -</w:t>
+      </w:r>
+      <w:proofErr w:type="gramEnd"/>
+      <w:r>
+        <w:rPr>
+          <w:color w:val="0070C0"/>
+          <w:lang w:val="en-US"/>
+        </w:rPr>
+        <w:t xml:space="preserve"> Microsoft Word 2019.</w:t>
+      </w:r>
+    </w:p>
+    <w:p>
+      <w:pPr>
+        <w:rPr>
+          <w:color w:val="0070C0"/>
+        </w:rPr>
+      </w:pPr>
+      <w:r>
+        <w:rPr>
+          <w:color w:val="0070C0"/>
+        </w:rPr>
+        <w:t>RS 3 - Sistema operacional Microsoft Windows 11 Professional.</w:t>
+      </w:r>
+    </w:p>
+    <w:p>
+      <w:pPr>
+        <w:rPr>
+          <w:color w:val="FF0000"/>
+        </w:rPr>
+      </w:pPr>
+      <w:bookmarkStart w:name="_pxyab1tdqc6h" w:colFirst="0" w:colLast="0" w:id="15"/>
+      <w:bookmarkEnd w:id="15"/>
+    </w:p>
+    <w:p>
+      <w:pPr>
+        <w:keepNext/>
+        <w:pBdr>
+          <w:top w:val="nil"/>
+          <w:left w:val="nil"/>
+          <w:bottom w:val="nil"/>
+          <w:right w:val="nil"/>
+          <w:between w:val="nil"/>
+        </w:pBdr>
+        <w:spacing w:before="120" w:after="120"/>
+        <w:rPr>
+          <w:smallCaps/>
+          <w:color w:val="000000"/>
+        </w:rPr>
+      </w:pPr>
+      <w:r>
+        <w:rPr>
+          <w:smallCaps/>
+          <w:color w:val="000000"/>
+        </w:rPr>
+        <w:t xml:space="preserve">3.4 OUTROS RECURSOS </w:t>
+      </w:r>
+    </w:p>
+    <w:p>
+      <w:pPr>
+        <w:jc w:val="both"/>
+        <w:rPr>
+          <w:color w:val="0070C0"/>
+        </w:rPr>
+      </w:pPr>
+      <w:r>
+        <w:rPr>
+          <w:color w:val="0070C0"/>
+        </w:rPr>
+        <w:t>Outros equipamentos, materiais ou recursos financeiros necessários para o trabalho. Por exemplo: vídeos, gravadores e câmera de vídeo.</w:t>
+      </w:r>
+    </w:p>
+    <w:p>
+      <w:pPr>
+        <w:jc w:val="both"/>
+        <w:rPr>
+          <w:color w:val="0070C0"/>
+        </w:rPr>
+      </w:pPr>
+      <w:bookmarkStart w:name="_3unqfi5pywb" w:colFirst="0" w:colLast="0" w:id="16"/>
+      <w:bookmarkEnd w:id="16"/>
+    </w:p>
+    <w:p>
+      <w:pPr>
+        <w:keepNext/>
+        <w:pBdr>
+          <w:top w:val="nil"/>
+          <w:left w:val="nil"/>
+          <w:bottom w:val="nil"/>
+          <w:right w:val="nil"/>
+          <w:between w:val="nil"/>
+        </w:pBdr>
+        <w:spacing w:before="120" w:after="120"/>
+        <w:rPr>
+          <w:smallCaps/>
+          <w:color w:val="000000"/>
+        </w:rPr>
+      </w:pPr>
+      <w:r>
+        <w:rPr>
+          <w:color w:val="000000"/>
+        </w:rPr>
+        <w:t>3.5 CRONOGRAMA DO PROJETO</w:t>
+      </w:r>
+    </w:p>
+    <w:p>
+      <w:pPr>
+        <w:jc w:val="both"/>
+        <w:rPr>
+          <w:color w:val="0070C0"/>
+        </w:rPr>
+      </w:pPr>
+      <w:r>
+        <w:rPr>
+          <w:color w:val="0070C0"/>
+        </w:rPr>
+        <w:t>Preencher o documento do Apêndice A. O cronograma deve ser continuamente atualizado pela equipe.</w:t>
+      </w:r>
+    </w:p>
+    <w:p>
+      <w:pPr>
+        <w:jc w:val="both"/>
+        <w:rPr>
+          <w:color w:val="0070C0"/>
+        </w:rPr>
+      </w:pPr>
+    </w:p>
+    <w:p/>
     <w:p>
       <w:pPr>
         <w:keepNext/>
@@ -3123,8 +4360,8 @@
           <w:color w:val="000000"/>
         </w:rPr>
       </w:pPr>
-      <w:bookmarkStart w:id="10" w:name="_bxfqtjx1616m" w:colFirst="0" w:colLast="0"/>
-      <w:bookmarkEnd w:id="10"/>
+      <w:bookmarkStart w:name="_69ez10u2xwkb" w:colFirst="0" w:colLast="0" w:id="17"/>
+      <w:bookmarkEnd w:id="17"/>
       <w:r>
         <w:br w:type="page"/>
       </w:r>
@@ -3132,350 +4369,12 @@
         <w:rPr>
           <w:b/>
           <w:bCs/>
-          <w:smallCaps/>
           <w:color w:val="000000"/>
         </w:rPr>
-        <w:lastRenderedPageBreak/>
-        <w:t xml:space="preserve">3 PLANEJAMENTO </w:t>
-      </w:r>
-    </w:p>
-    <w:p>
-      <w:pPr>
-        <w:rPr>
-          <w:color w:val="0070C0"/>
-        </w:rPr>
-      </w:pPr>
-      <w:r>
-        <w:rPr>
-          <w:color w:val="0070C0"/>
-        </w:rPr>
-        <w:t>Descreva a apresentação do capítulo.</w:t>
-      </w:r>
-    </w:p>
-    <w:p>
-      <w:pPr>
-        <w:rPr>
-          <w:color w:val="0070C0"/>
-        </w:rPr>
-      </w:pPr>
-      <w:bookmarkStart w:id="11" w:name="_85x6gq42hjga" w:colFirst="0" w:colLast="0"/>
-      <w:bookmarkEnd w:id="11"/>
-    </w:p>
-    <w:p>
-      <w:pPr>
-        <w:keepNext/>
-        <w:pBdr>
-          <w:top w:val="nil"/>
-          <w:left w:val="nil"/>
-          <w:bottom w:val="nil"/>
-          <w:right w:val="nil"/>
-          <w:between w:val="nil"/>
-        </w:pBdr>
-        <w:rPr>
-          <w:smallCaps/>
-          <w:color w:val="000000"/>
-        </w:rPr>
-      </w:pPr>
-      <w:r>
-        <w:rPr>
-          <w:smallCaps/>
-          <w:color w:val="000000"/>
-        </w:rPr>
-        <w:t>3.1 RECURSOS HUMANOS</w:t>
-      </w:r>
-    </w:p>
-    <w:p>
-      <w:pPr>
-        <w:jc w:val="both"/>
-        <w:rPr>
-          <w:color w:val="0070C0"/>
-        </w:rPr>
-      </w:pPr>
-      <w:r>
-        <w:rPr>
-          <w:color w:val="0070C0"/>
-        </w:rPr>
-        <w:t>Apresente a relação dos integrantes da equipe, professores e demais colaboradores do trabalho.</w:t>
-      </w:r>
-    </w:p>
-    <w:p>
-      <w:pPr>
-        <w:jc w:val="both"/>
-        <w:rPr>
-          <w:color w:val="FF0000"/>
-        </w:rPr>
-      </w:pPr>
-      <w:bookmarkStart w:id="12" w:name="_hlzhjesqyqyu" w:colFirst="0" w:colLast="0"/>
-      <w:bookmarkEnd w:id="12"/>
-    </w:p>
-    <w:p>
-      <w:pPr>
-        <w:keepNext/>
-        <w:pBdr>
-          <w:top w:val="nil"/>
-          <w:left w:val="nil"/>
-          <w:bottom w:val="nil"/>
-          <w:right w:val="nil"/>
-          <w:between w:val="nil"/>
-        </w:pBdr>
-        <w:rPr>
-          <w:smallCaps/>
-          <w:color w:val="000000"/>
-        </w:rPr>
-      </w:pPr>
-      <w:r>
-        <w:rPr>
-          <w:smallCaps/>
-          <w:color w:val="000000"/>
-        </w:rPr>
-        <w:t>3.2 RECURSOS DE HARDWARE</w:t>
-      </w:r>
-    </w:p>
-    <w:p>
-      <w:pPr>
-        <w:jc w:val="both"/>
-        <w:rPr>
-          <w:color w:val="0070C0"/>
-        </w:rPr>
-      </w:pPr>
-      <w:bookmarkStart w:id="13" w:name="_47l4drcmyedf" w:colFirst="0" w:colLast="0"/>
-      <w:bookmarkEnd w:id="13"/>
-      <w:r>
-        <w:rPr>
-          <w:color w:val="0070C0"/>
-        </w:rPr>
-        <w:t xml:space="preserve">Escreva as configurações de computadores e demais periféricos a ser utilizados para o desenvolvimento do trabalho. </w:t>
-      </w:r>
-    </w:p>
-    <w:p>
-      <w:pPr>
-        <w:jc w:val="both"/>
-        <w:rPr>
-          <w:color w:val="0070C0"/>
-        </w:rPr>
-      </w:pPr>
-      <w:r>
-        <w:rPr>
-          <w:color w:val="0070C0"/>
-        </w:rPr>
-        <w:t xml:space="preserve">Exemplos: </w:t>
-      </w:r>
-    </w:p>
-    <w:p>
-      <w:pPr>
-        <w:jc w:val="both"/>
-        <w:rPr>
-          <w:color w:val="0070C0"/>
-        </w:rPr>
-      </w:pPr>
-      <w:r>
-        <w:rPr>
-          <w:color w:val="0070C0"/>
-        </w:rPr>
-        <w:t xml:space="preserve">RH 1 – Três microcomputadores com processadores Intel i7, 4,9 GHz, 32-bit (x86); 16 </w:t>
-      </w:r>
-      <w:proofErr w:type="spellStart"/>
-      <w:r>
-        <w:rPr>
-          <w:color w:val="0070C0"/>
-        </w:rPr>
-        <w:t>Gbytes</w:t>
-      </w:r>
-      <w:proofErr w:type="spellEnd"/>
-      <w:r>
-        <w:rPr>
-          <w:color w:val="0070C0"/>
-        </w:rPr>
-        <w:t xml:space="preserve"> RAM e 16 </w:t>
-      </w:r>
-      <w:proofErr w:type="spellStart"/>
-      <w:r>
-        <w:rPr>
-          <w:color w:val="0070C0"/>
-        </w:rPr>
-        <w:t>Gbytes</w:t>
-      </w:r>
-      <w:proofErr w:type="spellEnd"/>
-      <w:r>
-        <w:rPr>
-          <w:color w:val="0070C0"/>
-        </w:rPr>
-        <w:t xml:space="preserve"> de espaço livre em disco.</w:t>
-      </w:r>
-    </w:p>
-    <w:p>
-      <w:pPr>
-        <w:jc w:val="both"/>
-        <w:rPr>
-          <w:color w:val="0070C0"/>
-        </w:rPr>
-      </w:pPr>
-      <w:r>
-        <w:rPr>
-          <w:color w:val="0070C0"/>
-        </w:rPr>
-        <w:t>RH 2 – Uma Impressora HP Deskjet colorida.</w:t>
-      </w:r>
-    </w:p>
-    <w:p>
-      <w:pPr>
-        <w:jc w:val="both"/>
-        <w:rPr>
-          <w:color w:val="0070C0"/>
-        </w:rPr>
-      </w:pPr>
-      <w:r>
-        <w:rPr>
-          <w:color w:val="0070C0"/>
-        </w:rPr>
-        <w:t xml:space="preserve">RH 3 – Uma </w:t>
-      </w:r>
-      <w:r>
-        <w:rPr>
-          <w:i/>
-          <w:iCs/>
-          <w:color w:val="0070C0"/>
-        </w:rPr>
-        <w:t>webcam</w:t>
-      </w:r>
-      <w:r>
-        <w:rPr>
-          <w:color w:val="0070C0"/>
-        </w:rPr>
-        <w:t xml:space="preserve"> com resolução mínima de 6 MP.</w:t>
-      </w:r>
-    </w:p>
-    <w:p>
-      <w:pPr>
-        <w:jc w:val="both"/>
-        <w:rPr>
-          <w:color w:val="FF0000"/>
-        </w:rPr>
-      </w:pPr>
-      <w:bookmarkStart w:id="14" w:name="_zgip7uuby6ix" w:colFirst="0" w:colLast="0"/>
-      <w:bookmarkEnd w:id="14"/>
-    </w:p>
-    <w:p>
-      <w:pPr>
-        <w:keepNext/>
-        <w:pBdr>
-          <w:top w:val="nil"/>
-          <w:left w:val="nil"/>
-          <w:bottom w:val="nil"/>
-          <w:right w:val="nil"/>
-          <w:between w:val="nil"/>
-        </w:pBdr>
-        <w:rPr>
-          <w:smallCaps/>
-          <w:color w:val="000000"/>
-        </w:rPr>
-      </w:pPr>
-      <w:r>
-        <w:rPr>
-          <w:smallCaps/>
-          <w:color w:val="000000"/>
-        </w:rPr>
-        <w:t>3.3 RECURSOS DE SOFTWARE</w:t>
-      </w:r>
-    </w:p>
-    <w:p>
-      <w:pPr>
-        <w:jc w:val="both"/>
-        <w:rPr>
-          <w:color w:val="0070C0"/>
-        </w:rPr>
-      </w:pPr>
-      <w:r>
-        <w:rPr>
-          <w:color w:val="0070C0"/>
-        </w:rPr>
-        <w:t xml:space="preserve">Exemplos: </w:t>
-      </w:r>
-    </w:p>
-    <w:p>
-      <w:pPr>
-        <w:rPr>
-          <w:color w:val="0070C0"/>
-          <w:lang w:val="en-US"/>
-        </w:rPr>
-      </w:pPr>
-      <w:r>
-        <w:rPr>
-          <w:color w:val="0070C0"/>
-          <w:lang w:val="en-US"/>
-        </w:rPr>
-        <w:t xml:space="preserve">RS 1 </w:t>
-      </w:r>
-      <w:proofErr w:type="gramStart"/>
-      <w:r>
-        <w:rPr>
-          <w:color w:val="0070C0"/>
-          <w:lang w:val="en-US"/>
-        </w:rPr>
-        <w:t>-  IntelliJ</w:t>
-      </w:r>
-      <w:proofErr w:type="gramEnd"/>
-      <w:r>
-        <w:rPr>
-          <w:color w:val="0070C0"/>
-          <w:lang w:val="en-US"/>
-        </w:rPr>
-        <w:t xml:space="preserve"> IDEA v. 2025.</w:t>
-      </w:r>
-    </w:p>
-    <w:p>
-      <w:pPr>
-        <w:rPr>
-          <w:color w:val="0070C0"/>
-          <w:lang w:val="en-US"/>
-        </w:rPr>
-      </w:pPr>
-      <w:r>
-        <w:rPr>
-          <w:color w:val="0070C0"/>
-          <w:lang w:val="en-US"/>
-        </w:rPr>
-        <w:t xml:space="preserve">RS </w:t>
-      </w:r>
-      <w:proofErr w:type="gramStart"/>
-      <w:r>
-        <w:rPr>
-          <w:color w:val="0070C0"/>
-          <w:lang w:val="en-US"/>
-        </w:rPr>
-        <w:t>2  -</w:t>
-      </w:r>
-      <w:proofErr w:type="gramEnd"/>
-      <w:r>
-        <w:rPr>
-          <w:color w:val="0070C0"/>
-          <w:lang w:val="en-US"/>
-        </w:rPr>
-        <w:t xml:space="preserve"> Microsoft Word 2019.</w:t>
-      </w:r>
-    </w:p>
-    <w:p>
-      <w:pPr>
-        <w:rPr>
-          <w:color w:val="0070C0"/>
-        </w:rPr>
-      </w:pPr>
-      <w:r>
-        <w:rPr>
-          <w:color w:val="0070C0"/>
-        </w:rPr>
-        <w:t>RS 3 - Sistema operacional Microsoft Windows 11 Professional.</w:t>
-      </w:r>
-    </w:p>
-    <w:p>
-      <w:pPr>
-        <w:rPr>
-          <w:color w:val="FF0000"/>
-        </w:rPr>
-      </w:pPr>
-      <w:bookmarkStart w:id="15" w:name="_pxyab1tdqc6h" w:colFirst="0" w:colLast="0"/>
-      <w:bookmarkEnd w:id="15"/>
-    </w:p>
+        <w:t>4 ESPECIFICAÇÃO E ANÁLISE DOS REQUISITOS DO SISTEMA DE SOFTWARE</w:t>
+      </w:r>
+    </w:p>
+    <w:p/>
     <w:p>
       <w:pPr>
         <w:keepNext/>
@@ -3488,17 +4387,16 @@
         </w:pBdr>
         <w:spacing w:before="120" w:after="120"/>
         <w:rPr>
-          <w:smallCaps/>
           <w:color w:val="000000"/>
         </w:rPr>
       </w:pPr>
-      <w:r>
-        <w:rPr>
-          <w:smallCaps/>
+      <w:bookmarkStart w:name="_p41l1yyjr2lp" w:colFirst="0" w:colLast="0" w:id="18"/>
+      <w:bookmarkEnd w:id="18"/>
+      <w:r>
+        <w:rPr>
           <w:color w:val="000000"/>
         </w:rPr>
-        <w:lastRenderedPageBreak/>
-        <w:t xml:space="preserve">3.4 OUTROS RECURSOS </w:t>
+        <w:t>4.1 ESPECIFICAÇÃO DOS REQUISITOS FUNCIONAIS</w:t>
       </w:r>
     </w:p>
     <w:p>
@@ -3512,18 +4410,12 @@
         <w:rPr>
           <w:color w:val="0070C0"/>
         </w:rPr>
-        <w:t>Outros equipamentos, materiais ou recursos financeiros necessários para o trabalho. Por exemplo: vídeos, gravadores e câmera de vídeo.</w:t>
-      </w:r>
-    </w:p>
-    <w:p>
-      <w:pPr>
-        <w:jc w:val="both"/>
-        <w:rPr>
-          <w:color w:val="0070C0"/>
-        </w:rPr>
-      </w:pPr>
-      <w:bookmarkStart w:id="16" w:name="_3unqfi5pywb" w:colFirst="0" w:colLast="0"/>
-      <w:bookmarkEnd w:id="16"/>
+        <w:t>Preencher o documento disponível no Apêndice B. Deve ser continuamente atualizado pela equipe.</w:t>
+      </w:r>
+    </w:p>
+    <w:p>
+      <w:bookmarkStart w:name="_jnfti9d8nig6" w:colFirst="0" w:colLast="0" w:id="19"/>
+      <w:bookmarkEnd w:id="19"/>
     </w:p>
     <w:p>
       <w:pPr>
@@ -3537,15 +4429,55 @@
         </w:pBdr>
         <w:spacing w:before="120" w:after="120"/>
         <w:rPr>
+          <w:color w:val="000000"/>
+        </w:rPr>
+      </w:pPr>
+      <w:r>
+        <w:rPr>
+          <w:color w:val="000000"/>
+        </w:rPr>
+        <w:t>4.2 ESPECIFICAÇÃO DOS REQUISITOS NÃO FUNCIONAIS</w:t>
+      </w:r>
+    </w:p>
+    <w:p>
+      <w:pPr>
+        <w:jc w:val="both"/>
+        <w:rPr>
+          <w:color w:val="0070C0"/>
+        </w:rPr>
+      </w:pPr>
+      <w:r>
+        <w:rPr>
+          <w:color w:val="0070C0"/>
+        </w:rPr>
+        <w:t>Preencher os documentos disponíveis no Apêndice C. Deve ser continuamente atualizado pela equipe.</w:t>
+      </w:r>
+    </w:p>
+    <w:p>
+      <w:bookmarkStart w:name="_yfftpsqmbn38" w:colFirst="0" w:colLast="0" w:id="20"/>
+      <w:bookmarkEnd w:id="20"/>
+    </w:p>
+    <w:p>
+      <w:pPr>
+        <w:keepNext/>
+        <w:pBdr>
+          <w:top w:val="nil"/>
+          <w:left w:val="nil"/>
+          <w:bottom w:val="nil"/>
+          <w:right w:val="nil"/>
+          <w:between w:val="nil"/>
+        </w:pBdr>
+        <w:rPr>
           <w:smallCaps/>
           <w:color w:val="000000"/>
         </w:rPr>
       </w:pPr>
       <w:r>
         <w:rPr>
+          <w:smallCaps/>
           <w:color w:val="000000"/>
         </w:rPr>
-        <w:t>3.5 CRONOGRAMA DO PROJETO</w:t>
+        <w:t>4.3 ANÁLISE DOS REQUISITOS</w:t>
       </w:r>
     </w:p>
     <w:p>
@@ -3559,18 +4491,9 @@
         <w:rPr>
           <w:color w:val="0070C0"/>
         </w:rPr>
-        <w:t>Preencher o documento do Apêndice A. O cronograma deve ser continuamente atualizado pela equipe.</w:t>
-      </w:r>
-    </w:p>
-    <w:p>
-      <w:pPr>
-        <w:jc w:val="both"/>
-        <w:rPr>
-          <w:color w:val="0070C0"/>
-        </w:rPr>
-      </w:pPr>
-    </w:p>
-    <w:p/>
+        <w:t xml:space="preserve">Preencher os documentos disponíveis no Apêndice D.  </w:t>
+      </w:r>
+    </w:p>
     <w:p>
       <w:pPr>
         <w:keepNext/>
@@ -3585,12 +4508,11 @@
         <w:rPr>
           <w:b/>
           <w:bCs/>
-          <w:smallCaps/>
           <w:color w:val="000000"/>
         </w:rPr>
       </w:pPr>
-      <w:bookmarkStart w:id="17" w:name="_69ez10u2xwkb" w:colFirst="0" w:colLast="0"/>
-      <w:bookmarkEnd w:id="17"/>
+      <w:bookmarkStart w:name="_zbtgsztsx5qt" w:colFirst="0" w:colLast="0" w:id="21"/>
+      <w:bookmarkEnd w:id="21"/>
       <w:r>
         <w:br w:type="page"/>
       </w:r>
@@ -3600,33 +4522,7 @@
           <w:bCs/>
           <w:color w:val="000000"/>
         </w:rPr>
-        <w:lastRenderedPageBreak/>
-        <w:t>4 ESPECIFICAÇÃO E ANÁLISE DOS REQUISITOS DO SISTEMA DE SOFTWARE</w:t>
-      </w:r>
-    </w:p>
-    <w:p/>
-    <w:p>
-      <w:pPr>
-        <w:keepNext/>
-        <w:pBdr>
-          <w:top w:val="nil"/>
-          <w:left w:val="nil"/>
-          <w:bottom w:val="nil"/>
-          <w:right w:val="nil"/>
-          <w:between w:val="nil"/>
-        </w:pBdr>
-        <w:spacing w:before="120" w:after="120"/>
-        <w:rPr>
-          <w:color w:val="000000"/>
-        </w:rPr>
-      </w:pPr>
-      <w:bookmarkStart w:id="18" w:name="_p41l1yyjr2lp" w:colFirst="0" w:colLast="0"/>
-      <w:bookmarkEnd w:id="18"/>
-      <w:r>
-        <w:rPr>
-          <w:color w:val="000000"/>
-        </w:rPr>
-        <w:t>4.1 ESPECIFICAÇÃO DOS REQUISITOS FUNCIONAIS</w:t>
+        <w:t>5 ARQUITETURA E PROJETO DO SISTEMA DE SOFTWARE</w:t>
       </w:r>
     </w:p>
     <w:p>
@@ -3640,88 +4536,7 @@
         <w:rPr>
           <w:color w:val="0070C0"/>
         </w:rPr>
-        <w:t>Preencher o documento disponível no Apêndice B. Deve ser continuamente atualizado pela equipe.</w:t>
-      </w:r>
-    </w:p>
-    <w:p>
-      <w:bookmarkStart w:id="19" w:name="_jnfti9d8nig6" w:colFirst="0" w:colLast="0"/>
-      <w:bookmarkEnd w:id="19"/>
-    </w:p>
-    <w:p>
-      <w:pPr>
-        <w:keepNext/>
-        <w:pBdr>
-          <w:top w:val="nil"/>
-          <w:left w:val="nil"/>
-          <w:bottom w:val="nil"/>
-          <w:right w:val="nil"/>
-          <w:between w:val="nil"/>
-        </w:pBdr>
-        <w:spacing w:before="120" w:after="120"/>
-        <w:rPr>
-          <w:color w:val="000000"/>
-        </w:rPr>
-      </w:pPr>
-      <w:r>
-        <w:rPr>
-          <w:color w:val="000000"/>
-        </w:rPr>
-        <w:t>4.2 ESPECIFICAÇÃO DOS REQUISITOS NÃO FUNCIONAIS</w:t>
-      </w:r>
-    </w:p>
-    <w:p>
-      <w:pPr>
-        <w:jc w:val="both"/>
-        <w:rPr>
-          <w:color w:val="0070C0"/>
-        </w:rPr>
-      </w:pPr>
-      <w:r>
-        <w:rPr>
-          <w:color w:val="0070C0"/>
-        </w:rPr>
-        <w:t>Preencher os documentos disponíveis no Apêndice C. Deve ser continuamente atualizado pela equipe.</w:t>
-      </w:r>
-    </w:p>
-    <w:p>
-      <w:bookmarkStart w:id="20" w:name="_yfftpsqmbn38" w:colFirst="0" w:colLast="0"/>
-      <w:bookmarkEnd w:id="20"/>
-    </w:p>
-    <w:p>
-      <w:pPr>
-        <w:keepNext/>
-        <w:pBdr>
-          <w:top w:val="nil"/>
-          <w:left w:val="nil"/>
-          <w:bottom w:val="nil"/>
-          <w:right w:val="nil"/>
-          <w:between w:val="nil"/>
-        </w:pBdr>
-        <w:rPr>
-          <w:smallCaps/>
-          <w:color w:val="000000"/>
-        </w:rPr>
-      </w:pPr>
-      <w:r>
-        <w:rPr>
-          <w:smallCaps/>
-          <w:color w:val="000000"/>
-        </w:rPr>
-        <w:t>4.3 ANÁLISE DOS REQUISITOS</w:t>
-      </w:r>
-    </w:p>
-    <w:p>
-      <w:pPr>
-        <w:jc w:val="both"/>
-        <w:rPr>
-          <w:color w:val="0070C0"/>
-        </w:rPr>
-      </w:pPr>
-      <w:r>
-        <w:rPr>
-          <w:color w:val="0070C0"/>
-        </w:rPr>
-        <w:t xml:space="preserve">Preencher os documentos disponíveis no Apêndice D.  </w:t>
+        <w:t>Para ser relatada no segundo semestre.</w:t>
       </w:r>
     </w:p>
     <w:p>
@@ -3741,8 +4556,8 @@
           <w:color w:val="000000"/>
         </w:rPr>
       </w:pPr>
-      <w:bookmarkStart w:id="21" w:name="_zbtgsztsx5qt" w:colFirst="0" w:colLast="0"/>
-      <w:bookmarkEnd w:id="21"/>
+      <w:bookmarkStart w:name="_uzs395uand0e" w:colFirst="0" w:colLast="0" w:id="22"/>
+      <w:bookmarkEnd w:id="22"/>
       <w:r>
         <w:br w:type="page"/>
       </w:r>
@@ -3752,10 +4567,10 @@
           <w:bCs/>
           <w:color w:val="000000"/>
         </w:rPr>
-        <w:lastRenderedPageBreak/>
-        <w:t>5 ARQUITETURA E PROJETO DO SISTEMA DE SOFTWARE</w:t>
-      </w:r>
-    </w:p>
+        <w:t>6 IMPLEMENTAÇÃO DO SISTEMA DE SOFTWARE</w:t>
+      </w:r>
+    </w:p>
+    <w:p/>
     <w:p>
       <w:pPr>
         <w:jc w:val="both"/>
@@ -3770,6 +4585,7 @@
         <w:t>Para ser relatada no segundo semestre.</w:t>
       </w:r>
     </w:p>
+    <w:p/>
     <w:p>
       <w:pPr>
         <w:keepNext/>
@@ -3784,11 +4600,12 @@
         <w:rPr>
           <w:b/>
           <w:bCs/>
+          <w:smallCaps/>
           <w:color w:val="000000"/>
         </w:rPr>
       </w:pPr>
-      <w:bookmarkStart w:id="22" w:name="_uzs395uand0e" w:colFirst="0" w:colLast="0"/>
-      <w:bookmarkEnd w:id="22"/>
+      <w:bookmarkStart w:name="_xwz6vzo9lzyl" w:colFirst="0" w:colLast="0" w:id="23"/>
+      <w:bookmarkEnd w:id="23"/>
       <w:r>
         <w:br w:type="page"/>
       </w:r>
@@ -3798,26 +4615,9 @@
           <w:bCs/>
           <w:color w:val="000000"/>
         </w:rPr>
-        <w:lastRenderedPageBreak/>
-        <w:t>6 IMPLEMENTAÇÃO DO SISTEMA DE SOFTWARE</w:t>
-      </w:r>
-    </w:p>
-    <w:p/>
-    <w:p>
-      <w:pPr>
-        <w:jc w:val="both"/>
-        <w:rPr>
-          <w:color w:val="0070C0"/>
-        </w:rPr>
-      </w:pPr>
-      <w:r>
-        <w:rPr>
-          <w:color w:val="0070C0"/>
-        </w:rPr>
-        <w:t>Para ser relatada no segundo semestre.</w:t>
-      </w:r>
-    </w:p>
-    <w:p/>
+        <w:t>7 PLANO DE TESTES PARA O SISTEMA DE SOFTWARE</w:t>
+      </w:r>
+    </w:p>
     <w:p>
       <w:pPr>
         <w:keepNext/>
@@ -3836,20 +4636,42 @@
           <w:color w:val="000000"/>
         </w:rPr>
       </w:pPr>
-      <w:bookmarkStart w:id="23" w:name="_xwz6vzo9lzyl" w:colFirst="0" w:colLast="0"/>
-      <w:bookmarkEnd w:id="23"/>
-      <w:r>
-        <w:br w:type="page"/>
-      </w:r>
-      <w:r>
-        <w:rPr>
-          <w:b/>
-          <w:bCs/>
-          <w:color w:val="000000"/>
-        </w:rPr>
-        <w:lastRenderedPageBreak/>
-        <w:t>7 PLANO DE TESTES PARA O SISTEMA DE SOFTWARE</w:t>
-      </w:r>
+    </w:p>
+    <w:p>
+      <w:pPr>
+        <w:jc w:val="both"/>
+        <w:rPr>
+          <w:color w:val="0070C0"/>
+        </w:rPr>
+      </w:pPr>
+      <w:r>
+        <w:rPr>
+          <w:color w:val="FF0000"/>
+        </w:rPr>
+        <w:t xml:space="preserve"> </w:t>
+      </w:r>
+      <w:r>
+        <w:rPr>
+          <w:color w:val="0070C0"/>
+        </w:rPr>
+        <w:t>Para ser relatado no segundo semestre.</w:t>
+      </w:r>
+    </w:p>
+    <w:p>
+      <w:pPr>
+        <w:rPr>
+          <w:color w:val="FF0000"/>
+        </w:rPr>
+      </w:pPr>
+    </w:p>
+    <w:p>
+      <w:pPr>
+        <w:rPr>
+          <w:color w:val="FF0000"/>
+        </w:rPr>
+      </w:pPr>
+      <w:bookmarkStart w:name="_mkvs2qyhhbcp" w:colFirst="0" w:colLast="0" w:id="24"/>
+      <w:bookmarkEnd w:id="24"/>
     </w:p>
     <w:p>
       <w:pPr>
@@ -3869,42 +4691,34 @@
           <w:color w:val="000000"/>
         </w:rPr>
       </w:pPr>
-    </w:p>
-    <w:p>
-      <w:pPr>
-        <w:jc w:val="both"/>
+      <w:bookmarkStart w:name="_8zxqz5wgmdxn" w:colFirst="0" w:colLast="0" w:id="25"/>
+      <w:bookmarkEnd w:id="25"/>
+      <w:r>
+        <w:br w:type="page"/>
+      </w:r>
+      <w:r>
+        <w:rPr>
+          <w:b/>
+          <w:bCs/>
+          <w:smallCaps/>
+          <w:color w:val="000000"/>
+        </w:rPr>
+        <w:t>8 CONCLUSÃO</w:t>
+      </w:r>
+    </w:p>
+    <w:p>
+      <w:pPr>
+        <w:spacing w:before="120" w:after="120"/>
         <w:rPr>
           <w:color w:val="0070C0"/>
         </w:rPr>
       </w:pPr>
       <w:r>
         <w:rPr>
-          <w:color w:val="FF0000"/>
-        </w:rPr>
-        <w:t xml:space="preserve"> </w:t>
-      </w:r>
-      <w:r>
-        <w:rPr>
           <w:color w:val="0070C0"/>
         </w:rPr>
-        <w:t>Para ser relatado no segundo semestre.</w:t>
-      </w:r>
-    </w:p>
-    <w:p>
-      <w:pPr>
-        <w:rPr>
-          <w:color w:val="FF0000"/>
-        </w:rPr>
-      </w:pPr>
-    </w:p>
-    <w:p>
-      <w:pPr>
-        <w:rPr>
-          <w:color w:val="FF0000"/>
-        </w:rPr>
-      </w:pPr>
-      <w:bookmarkStart w:id="24" w:name="_mkvs2qyhhbcp" w:colFirst="0" w:colLast="0"/>
-      <w:bookmarkEnd w:id="24"/>
+        <w:t>Descreva a conclusão do trabalho em cada entrega de incremento, identificando se os objetivos definidos estão sendo alcançados, as perspectivas para a continuidade do trabalho, os desafios encontrados e os conhecimentos adquiridos.</w:t>
+      </w:r>
     </w:p>
     <w:p>
       <w:pPr>
@@ -3924,35 +4738,360 @@
           <w:color w:val="000000"/>
         </w:rPr>
       </w:pPr>
-      <w:bookmarkStart w:id="25" w:name="_8zxqz5wgmdxn" w:colFirst="0" w:colLast="0"/>
-      <w:bookmarkEnd w:id="25"/>
+      <w:bookmarkStart w:name="_vu8skbkjafvu" w:id="26"/>
+      <w:bookmarkEnd w:id="26"/>
       <w:r>
         <w:br w:type="page"/>
       </w:r>
       <w:r>
         <w:rPr>
-          <w:b/>
-          <w:bCs/>
-          <w:smallCaps/>
-          <w:color w:val="000000"/>
-        </w:rPr>
-        <w:lastRenderedPageBreak/>
-        <w:t>8 CONCLUSÃO</w:t>
-      </w:r>
-    </w:p>
-    <w:p>
-      <w:pPr>
+          <w:b w:val="1"/>
+          <w:bCs w:val="1"/>
+          <w:smallCaps w:val="1"/>
+          <w:color w:val="000000" w:themeColor="text1" w:themeTint="FF" w:themeShade="FF"/>
+        </w:rPr>
+        <w:t xml:space="preserve">REFERÊNCIAS </w:t>
+      </w:r>
+    </w:p>
+    <w:p>
+      <w:pPr>
+        <w:pStyle w:val="Normal"/>
         <w:spacing w:before="120" w:after="120"/>
-        <w:rPr>
-          <w:color w:val="0070C0"/>
-        </w:rPr>
-      </w:pPr>
-      <w:r>
-        <w:rPr>
-          <w:color w:val="0070C0"/>
-        </w:rPr>
-        <w:t>Descreva a conclusão do trabalho em cada entrega de incremento, identificando se os objetivos definidos estão sendo alcançados, as perspectivas para a continuidade do trabalho, os desafios encontrados e os conhecimentos adquiridos.</w:t>
-      </w:r>
+      </w:pPr>
+      <w:r>
+        <w:rPr>
+          <w:rFonts w:ascii="Times New Roman" w:hAnsi="Times New Roman" w:eastAsia="Times New Roman" w:cs="Times New Roman"/>
+          <w:noProof w:val="0"/>
+          <w:color w:val="auto"/>
+          <w:sz w:val="24"/>
+          <w:szCs w:val="24"/>
+          <w:lang w:val="en-US" w:eastAsia="pt-BR" w:bidi="ar-SA"/>
+        </w:rPr>
+        <w:t>MAREK, Karen D. et al. Medication Management of the Community-Dwelling Older Adult. In: Patient Safety and Quality: An Evidence-Based Handbook for Nurses. Rockville: AHRQ, 2008.</w:t>
+      </w:r>
+      <w:r>
+        <w:rPr>
+          <w:rFonts w:ascii="Times New Roman" w:hAnsi="Times New Roman" w:eastAsia="Times New Roman" w:cs="Times New Roman"/>
+          <w:noProof w:val="0"/>
+          <w:color w:val="auto"/>
+          <w:sz w:val="24"/>
+          <w:szCs w:val="24"/>
+          <w:lang w:val="en-US" w:eastAsia="pt-BR" w:bidi="ar-SA"/>
+        </w:rPr>
+        <w:t xml:space="preserve"> </w:t>
+      </w:r>
+      <w:r>
+        <w:rPr>
+          <w:rFonts w:ascii="Times New Roman" w:hAnsi="Times New Roman" w:eastAsia="Times New Roman" w:cs="Times New Roman"/>
+          <w:color w:val="auto"/>
+          <w:sz w:val="24"/>
+          <w:szCs w:val="24"/>
+          <w:lang w:eastAsia="pt-BR" w:bidi="ar-SA"/>
+        </w:rPr>
+        <w:t>Disponível em: &lt;https://www.ncbi.nlm.nih.gov/books/NBK2670/&gt;</w:t>
+      </w:r>
+      <w:r>
+        <w:rPr>
+          <w:rFonts w:ascii="Times New Roman" w:hAnsi="Times New Roman" w:eastAsia="Times New Roman" w:cs="Times New Roman"/>
+          <w:noProof w:val="0"/>
+          <w:sz w:val="24"/>
+          <w:szCs w:val="24"/>
+          <w:lang w:val="en-US"/>
+        </w:rPr>
+        <w:t xml:space="preserve"> </w:t>
+      </w:r>
+    </w:p>
+    <w:p>
+      <w:pPr>
+        <w:pStyle w:val="Normal"/>
+        <w:spacing w:line="240" w:lineRule="auto"/>
+        <w:rPr>
+          <w:rFonts w:ascii="Times New Roman" w:hAnsi="Times New Roman" w:eastAsia="Times New Roman" w:cs="Times New Roman"/>
+          <w:color w:val="auto"/>
+          <w:sz w:val="24"/>
+          <w:szCs w:val="24"/>
+          <w:lang w:eastAsia="pt-BR" w:bidi="ar-SA"/>
+        </w:rPr>
+      </w:pPr>
+      <w:r>
+        <w:rPr>
+          <w:rFonts w:ascii="Times New Roman" w:hAnsi="Times New Roman" w:eastAsia="Times New Roman" w:cs="Times New Roman"/>
+          <w:noProof w:val="0"/>
+          <w:sz w:val="24"/>
+          <w:szCs w:val="24"/>
+          <w:lang w:val="pt-BR"/>
+        </w:rPr>
+        <w:t xml:space="preserve">ROSTIROLLA, Gabriela T.; SOUZA, Odair M. </w:t>
+      </w:r>
+      <w:r>
+        <w:rPr>
+          <w:rFonts w:ascii="Times New Roman" w:hAnsi="Times New Roman" w:eastAsia="Times New Roman" w:cs="Times New Roman"/>
+          <w:noProof w:val="0"/>
+          <w:sz w:val="24"/>
+          <w:szCs w:val="24"/>
+          <w:lang w:val="pt-BR"/>
+        </w:rPr>
+        <w:t>DoseApp</w:t>
+      </w:r>
+      <w:r>
+        <w:rPr>
+          <w:rFonts w:ascii="Times New Roman" w:hAnsi="Times New Roman" w:eastAsia="Times New Roman" w:cs="Times New Roman"/>
+          <w:noProof w:val="0"/>
+          <w:sz w:val="24"/>
+          <w:szCs w:val="24"/>
+          <w:lang w:val="pt-BR"/>
+        </w:rPr>
+        <w:t xml:space="preserve">: Aplicativo para gestão de medicamentos e auxílio nas rotinas dos cuidadores de idosos. Anais do </w:t>
+      </w:r>
+      <w:r>
+        <w:rPr>
+          <w:rFonts w:ascii="Times New Roman" w:hAnsi="Times New Roman" w:eastAsia="Times New Roman" w:cs="Times New Roman"/>
+          <w:noProof w:val="0"/>
+          <w:sz w:val="24"/>
+          <w:szCs w:val="24"/>
+          <w:lang w:val="pt-BR"/>
+        </w:rPr>
+        <w:t>Latinoware</w:t>
+      </w:r>
+      <w:r>
+        <w:rPr>
+          <w:rFonts w:ascii="Times New Roman" w:hAnsi="Times New Roman" w:eastAsia="Times New Roman" w:cs="Times New Roman"/>
+          <w:noProof w:val="0"/>
+          <w:sz w:val="24"/>
+          <w:szCs w:val="24"/>
+          <w:lang w:val="pt-BR"/>
+        </w:rPr>
+        <w:t>, 2022.</w:t>
+      </w:r>
+      <w:r>
+        <w:rPr>
+          <w:rFonts w:ascii="Times New Roman" w:hAnsi="Times New Roman" w:eastAsia="Times New Roman" w:cs="Times New Roman"/>
+          <w:noProof w:val="0"/>
+          <w:sz w:val="24"/>
+          <w:szCs w:val="24"/>
+          <w:lang w:val="pt-BR"/>
+        </w:rPr>
+        <w:t xml:space="preserve"> </w:t>
+      </w:r>
+      <w:r>
+        <w:rPr>
+          <w:rFonts w:ascii="Times New Roman" w:hAnsi="Times New Roman" w:eastAsia="Times New Roman" w:cs="Times New Roman"/>
+          <w:color w:val="auto"/>
+          <w:sz w:val="24"/>
+          <w:szCs w:val="24"/>
+          <w:lang w:eastAsia="pt-BR" w:bidi="ar-SA"/>
+        </w:rPr>
+        <w:t>Disponível em: &lt;https://sol.sbc.org.br/</w:t>
+      </w:r>
+      <w:r>
+        <w:rPr>
+          <w:rFonts w:ascii="Times New Roman" w:hAnsi="Times New Roman" w:eastAsia="Times New Roman" w:cs="Times New Roman"/>
+          <w:color w:val="auto"/>
+          <w:sz w:val="24"/>
+          <w:szCs w:val="24"/>
+          <w:lang w:eastAsia="pt-BR" w:bidi="ar-SA"/>
+        </w:rPr>
+        <w:t>index.php</w:t>
+      </w:r>
+      <w:r>
+        <w:rPr>
+          <w:rFonts w:ascii="Times New Roman" w:hAnsi="Times New Roman" w:eastAsia="Times New Roman" w:cs="Times New Roman"/>
+          <w:color w:val="auto"/>
+          <w:sz w:val="24"/>
+          <w:szCs w:val="24"/>
+          <w:lang w:eastAsia="pt-BR" w:bidi="ar-SA"/>
+        </w:rPr>
+        <w:t>/</w:t>
+      </w:r>
+      <w:r>
+        <w:rPr>
+          <w:rFonts w:ascii="Times New Roman" w:hAnsi="Times New Roman" w:eastAsia="Times New Roman" w:cs="Times New Roman"/>
+          <w:color w:val="auto"/>
+          <w:sz w:val="24"/>
+          <w:szCs w:val="24"/>
+          <w:lang w:eastAsia="pt-BR" w:bidi="ar-SA"/>
+        </w:rPr>
+        <w:t>latinoware</w:t>
+      </w:r>
+      <w:r>
+        <w:rPr>
+          <w:rFonts w:ascii="Times New Roman" w:hAnsi="Times New Roman" w:eastAsia="Times New Roman" w:cs="Times New Roman"/>
+          <w:color w:val="auto"/>
+          <w:sz w:val="24"/>
+          <w:szCs w:val="24"/>
+          <w:lang w:eastAsia="pt-BR" w:bidi="ar-SA"/>
+        </w:rPr>
+        <w:t>/</w:t>
+      </w:r>
+      <w:r>
+        <w:rPr>
+          <w:rFonts w:ascii="Times New Roman" w:hAnsi="Times New Roman" w:eastAsia="Times New Roman" w:cs="Times New Roman"/>
+          <w:color w:val="auto"/>
+          <w:sz w:val="24"/>
+          <w:szCs w:val="24"/>
+          <w:lang w:eastAsia="pt-BR" w:bidi="ar-SA"/>
+        </w:rPr>
+        <w:t>article</w:t>
+      </w:r>
+      <w:r>
+        <w:rPr>
+          <w:rFonts w:ascii="Times New Roman" w:hAnsi="Times New Roman" w:eastAsia="Times New Roman" w:cs="Times New Roman"/>
+          <w:color w:val="auto"/>
+          <w:sz w:val="24"/>
+          <w:szCs w:val="24"/>
+          <w:lang w:eastAsia="pt-BR" w:bidi="ar-SA"/>
+        </w:rPr>
+        <w:t>/</w:t>
+      </w:r>
+      <w:r>
+        <w:rPr>
+          <w:rFonts w:ascii="Times New Roman" w:hAnsi="Times New Roman" w:eastAsia="Times New Roman" w:cs="Times New Roman"/>
+          <w:color w:val="auto"/>
+          <w:sz w:val="24"/>
+          <w:szCs w:val="24"/>
+          <w:lang w:eastAsia="pt-BR" w:bidi="ar-SA"/>
+        </w:rPr>
+        <w:t>view</w:t>
+      </w:r>
+      <w:r>
+        <w:rPr>
+          <w:rFonts w:ascii="Times New Roman" w:hAnsi="Times New Roman" w:eastAsia="Times New Roman" w:cs="Times New Roman"/>
+          <w:color w:val="auto"/>
+          <w:sz w:val="24"/>
+          <w:szCs w:val="24"/>
+          <w:lang w:eastAsia="pt-BR" w:bidi="ar-SA"/>
+        </w:rPr>
+        <w:t>/22976/&gt;.</w:t>
+      </w:r>
+    </w:p>
+    <w:p>
+      <w:pPr>
+        <w:pStyle w:val="Normal"/>
+        <w:spacing w:before="120" w:after="120"/>
+        <w:rPr>
+          <w:rFonts w:ascii="Times New Roman" w:hAnsi="Times New Roman" w:eastAsia="Times New Roman" w:cs="Times New Roman"/>
+          <w:sz w:val="24"/>
+          <w:szCs w:val="24"/>
+        </w:rPr>
+      </w:pPr>
+      <w:r>
+        <w:rPr>
+          <w:rFonts w:ascii="Times New Roman" w:hAnsi="Times New Roman" w:eastAsia="Times New Roman" w:cs="Times New Roman"/>
+          <w:noProof w:val="0"/>
+          <w:sz w:val="24"/>
+          <w:szCs w:val="24"/>
+          <w:lang w:val="en-US"/>
+        </w:rPr>
+        <w:t xml:space="preserve">ZHOU, </w:t>
+      </w:r>
+      <w:r>
+        <w:rPr>
+          <w:rFonts w:ascii="Times New Roman" w:hAnsi="Times New Roman" w:eastAsia="Times New Roman" w:cs="Times New Roman"/>
+          <w:noProof w:val="0"/>
+          <w:sz w:val="24"/>
+          <w:szCs w:val="24"/>
+          <w:lang w:val="en-US"/>
+        </w:rPr>
+        <w:t>Zhiyin</w:t>
+      </w:r>
+      <w:r>
+        <w:rPr>
+          <w:rFonts w:ascii="Times New Roman" w:hAnsi="Times New Roman" w:eastAsia="Times New Roman" w:cs="Times New Roman"/>
+          <w:noProof w:val="0"/>
+          <w:sz w:val="24"/>
+          <w:szCs w:val="24"/>
+          <w:lang w:val="en-US"/>
+        </w:rPr>
+        <w:t xml:space="preserve">. </w:t>
+      </w:r>
+      <w:r>
+        <w:rPr>
+          <w:rFonts w:ascii="Times New Roman" w:hAnsi="Times New Roman" w:eastAsia="Times New Roman" w:cs="Times New Roman"/>
+          <w:noProof w:val="0"/>
+          <w:sz w:val="24"/>
+          <w:szCs w:val="24"/>
+          <w:lang w:val="en-US"/>
+        </w:rPr>
+        <w:t>Adhera</w:t>
+      </w:r>
+      <w:r>
+        <w:rPr>
+          <w:rFonts w:ascii="Times New Roman" w:hAnsi="Times New Roman" w:eastAsia="Times New Roman" w:cs="Times New Roman"/>
+          <w:noProof w:val="0"/>
+          <w:sz w:val="24"/>
+          <w:szCs w:val="24"/>
+          <w:lang w:val="en-US"/>
+        </w:rPr>
+        <w:t>: A Human-Centered Health Informatics Solution for Reducing Informal Caregiver Burden through Improved Medication Adherence. 2025.</w:t>
+      </w:r>
+      <w:r>
+        <w:rPr>
+          <w:rFonts w:ascii="Times New Roman" w:hAnsi="Times New Roman" w:eastAsia="Times New Roman" w:cs="Times New Roman"/>
+          <w:noProof w:val="0"/>
+          <w:sz w:val="24"/>
+          <w:szCs w:val="24"/>
+          <w:lang w:val="en-US"/>
+        </w:rPr>
+        <w:t xml:space="preserve"> </w:t>
+      </w:r>
+      <w:r>
+        <w:rPr>
+          <w:rFonts w:ascii="Times New Roman" w:hAnsi="Times New Roman" w:eastAsia="Times New Roman" w:cs="Times New Roman"/>
+          <w:color w:val="auto"/>
+          <w:sz w:val="24"/>
+          <w:szCs w:val="24"/>
+          <w:lang w:eastAsia="pt-BR" w:bidi="ar-SA"/>
+        </w:rPr>
+        <w:t xml:space="preserve">Disponível em: </w:t>
+      </w:r>
+      <w:r>
+        <w:rPr>
+          <w:rFonts w:ascii="Times New Roman" w:hAnsi="Times New Roman" w:eastAsia="Times New Roman" w:cs="Times New Roman"/>
+          <w:color w:val="auto"/>
+          <w:sz w:val="24"/>
+          <w:szCs w:val="24"/>
+          <w:lang w:eastAsia="pt-BR" w:bidi="ar-SA"/>
+        </w:rPr>
+        <w:t>&lt;https://arxiv.org/</w:t>
+      </w:r>
+      <w:r>
+        <w:rPr>
+          <w:rFonts w:ascii="Times New Roman" w:hAnsi="Times New Roman" w:eastAsia="Times New Roman" w:cs="Times New Roman"/>
+          <w:color w:val="auto"/>
+          <w:sz w:val="24"/>
+          <w:szCs w:val="24"/>
+          <w:lang w:eastAsia="pt-BR" w:bidi="ar-SA"/>
+        </w:rPr>
+        <w:t>abs</w:t>
+      </w:r>
+      <w:r>
+        <w:rPr>
+          <w:rFonts w:ascii="Times New Roman" w:hAnsi="Times New Roman" w:eastAsia="Times New Roman" w:cs="Times New Roman"/>
+          <w:color w:val="auto"/>
+          <w:sz w:val="24"/>
+          <w:szCs w:val="24"/>
+          <w:lang w:eastAsia="pt-BR" w:bidi="ar-SA"/>
+        </w:rPr>
+        <w:t>/2512.03878/&gt;</w:t>
+      </w:r>
+      <w:r>
+        <w:rPr>
+          <w:rFonts w:ascii="Times New Roman" w:hAnsi="Times New Roman" w:eastAsia="Times New Roman" w:cs="Times New Roman"/>
+          <w:color w:val="auto"/>
+          <w:sz w:val="24"/>
+          <w:szCs w:val="24"/>
+          <w:lang w:eastAsia="pt-BR" w:bidi="ar-SA"/>
+        </w:rPr>
+        <w:t>.</w:t>
+      </w:r>
+    </w:p>
+    <w:p>
+      <w:pPr>
+        <w:spacing w:before="120" w:after="120"/>
+        <w:rPr>
+          <w:color w:val="FF0000"/>
+        </w:rPr>
+      </w:pPr>
     </w:p>
     <w:p>
       <w:pPr>
@@ -3972,8 +5111,8 @@
           <w:color w:val="000000"/>
         </w:rPr>
       </w:pPr>
-      <w:bookmarkStart w:id="26" w:name="_vu8skbkjafvu" w:colFirst="0" w:colLast="0"/>
-      <w:bookmarkEnd w:id="26"/>
+      <w:bookmarkStart w:name="_amvst46n8d5f" w:colFirst="0" w:colLast="0" w:id="27"/>
+      <w:bookmarkEnd w:id="27"/>
       <w:r>
         <w:br w:type="page"/>
       </w:r>
@@ -3981,134 +5120,23 @@
         <w:rPr>
           <w:b/>
           <w:bCs/>
-          <w:smallCaps/>
           <w:color w:val="000000"/>
         </w:rPr>
-        <w:lastRenderedPageBreak/>
-        <w:t xml:space="preserve">REFERÊNCIAS </w:t>
-      </w:r>
-    </w:p>
-    <w:p>
-      <w:pPr>
-        <w:spacing w:before="120" w:after="120"/>
-        <w:rPr>
-          <w:color w:val="0070C0"/>
-        </w:rPr>
-      </w:pPr>
-      <w:r>
-        <w:rPr>
-          <w:color w:val="0070C0"/>
-        </w:rPr>
-        <w:t>Descreva as fontes (artigos, sites, livros) que foram citadas neste documento, preservando a ordem alfabética.</w:t>
-      </w:r>
-    </w:p>
-    <w:p>
-      <w:pPr>
-        <w:jc w:val="both"/>
-        <w:rPr>
-          <w:color w:val="0070C0"/>
-        </w:rPr>
-      </w:pPr>
-      <w:r>
-        <w:rPr>
-          <w:color w:val="0070C0"/>
-        </w:rPr>
-        <w:t>Exemplos:</w:t>
-      </w:r>
-    </w:p>
-    <w:p>
-      <w:pPr>
-        <w:spacing w:after="0" w:line="240" w:lineRule="auto"/>
-        <w:rPr>
-          <w:color w:val="0070C0"/>
-        </w:rPr>
-      </w:pPr>
-      <w:r>
-        <w:rPr>
-          <w:color w:val="0070C0"/>
-        </w:rPr>
-        <w:t xml:space="preserve">BRASIL. Lei nº 13.709, de 14 de agosto de 2018. Lei Geral de Proteção de Dados Pessoais. Brasília, DF, </w:t>
-      </w:r>
-      <w:r>
-        <w:rPr>
-          <w:b/>
-          <w:bCs/>
-          <w:color w:val="0070C0"/>
-        </w:rPr>
-        <w:t>Diário Oficial [da] União</w:t>
-      </w:r>
-      <w:r>
-        <w:rPr>
-          <w:color w:val="0070C0"/>
-        </w:rPr>
-        <w:t>, 15 ago. 2018. Disponível em: &lt;http://www.planalto.gov.br/ccivil_03/_ato2015-2018/2018/lei/l13709.htm&gt;</w:t>
-      </w:r>
-    </w:p>
-    <w:p>
-      <w:pPr>
-        <w:spacing w:after="0" w:line="240" w:lineRule="auto"/>
-        <w:rPr>
-          <w:color w:val="0070C0"/>
-        </w:rPr>
-      </w:pPr>
-    </w:p>
-    <w:p>
-      <w:pPr>
-        <w:spacing w:line="240" w:lineRule="auto"/>
-        <w:rPr>
-          <w:color w:val="0070C0"/>
-        </w:rPr>
-      </w:pPr>
-      <w:r>
-        <w:rPr>
-          <w:color w:val="0070C0"/>
-        </w:rPr>
-        <w:t xml:space="preserve">DEITEL, Paul J.; DEITEL, Harvey M. </w:t>
-      </w:r>
-      <w:r>
-        <w:rPr>
-          <w:b/>
-          <w:bCs/>
-          <w:color w:val="0070C0"/>
-        </w:rPr>
-        <w:t>Java Como Programar</w:t>
-      </w:r>
-      <w:r>
-        <w:rPr>
-          <w:color w:val="0070C0"/>
-        </w:rPr>
-        <w:t xml:space="preserve">.  10. ed.  São Paulo: Pearson </w:t>
+        <w:t>APÊNDICE A – CRONOGRAMA DO PROJETO</w:t>
+      </w:r>
+    </w:p>
+    <w:p>
+      <w:r>
+        <w:t>O cronograma do projeto está disponível na pasta “</w:t>
       </w:r>
       <w:proofErr w:type="spellStart"/>
       <w:r>
-        <w:rPr>
-          <w:color w:val="0070C0"/>
-        </w:rPr>
-        <w:t>Education</w:t>
+        <w:t>ApêndiceA</w:t>
       </w:r>
       <w:proofErr w:type="spellEnd"/>
       <w:r>
-        <w:rPr>
-          <w:color w:val="0070C0"/>
-        </w:rPr>
-        <w:t xml:space="preserve"> do Brasil, 2017. Disponível em: &lt;https://plataforma.bvirtual.com.br/&gt;. Livro eletrônico.</w:t>
-      </w:r>
-    </w:p>
-    <w:p>
-      <w:pPr>
-        <w:jc w:val="both"/>
-        <w:rPr>
-          <w:color w:val="FF0000"/>
-        </w:rPr>
-      </w:pPr>
-    </w:p>
-    <w:p>
-      <w:pPr>
-        <w:spacing w:before="120" w:after="120"/>
-        <w:rPr>
-          <w:color w:val="FF0000"/>
-        </w:rPr>
-      </w:pPr>
+        <w:t>” que acompanha este documento.</w:t>
+      </w:r>
     </w:p>
     <w:p>
       <w:pPr>
@@ -4128,8 +5156,8 @@
           <w:color w:val="000000"/>
         </w:rPr>
       </w:pPr>
-      <w:bookmarkStart w:id="27" w:name="_amvst46n8d5f" w:colFirst="0" w:colLast="0"/>
-      <w:bookmarkEnd w:id="27"/>
+      <w:bookmarkStart w:name="_9qjp406jcxub" w:colFirst="0" w:colLast="0" w:id="28"/>
+      <w:bookmarkEnd w:id="28"/>
       <w:r>
         <w:br w:type="page"/>
       </w:r>
@@ -4139,17 +5167,16 @@
           <w:bCs/>
           <w:color w:val="000000"/>
         </w:rPr>
-        <w:lastRenderedPageBreak/>
-        <w:t>APÊNDICE A – CRONOGRAMA DO PROJETO</w:t>
-      </w:r>
-    </w:p>
-    <w:p>
-      <w:r>
-        <w:t>O cronograma do projeto está disponível na pasta “</w:t>
+        <w:t>APÊNDICE B – REQUISITOS DO SISTEMA DE SOFTWARE</w:t>
+      </w:r>
+    </w:p>
+    <w:p>
+      <w:r>
+        <w:t>Os requisitos estão disponíveis na pasta “</w:t>
       </w:r>
       <w:proofErr w:type="spellStart"/>
       <w:r>
-        <w:t>ApêndiceA</w:t>
+        <w:t>ApêndiceB</w:t>
       </w:r>
       <w:proofErr w:type="spellEnd"/>
       <w:r>
@@ -4174,8 +5201,8 @@
           <w:color w:val="000000"/>
         </w:rPr>
       </w:pPr>
-      <w:bookmarkStart w:id="28" w:name="_9qjp406jcxub" w:colFirst="0" w:colLast="0"/>
-      <w:bookmarkEnd w:id="28"/>
+      <w:bookmarkStart w:name="_io2bxhhvd09c" w:colFirst="0" w:colLast="0" w:id="29"/>
+      <w:bookmarkEnd w:id="29"/>
       <w:r>
         <w:br w:type="page"/>
       </w:r>
@@ -4185,8 +5212,7 @@
           <w:bCs/>
           <w:color w:val="000000"/>
         </w:rPr>
-        <w:lastRenderedPageBreak/>
-        <w:t>APÊNDICE B – REQUISITOS DO SISTEMA DE SOFTWARE</w:t>
+        <w:t>APÊNDICE C – ANÁLISE DOS REQUISITOS DO SISTEMA DE SOFTWARE</w:t>
       </w:r>
     </w:p>
     <w:p>
@@ -4195,13 +5221,15 @@
       </w:r>
       <w:proofErr w:type="spellStart"/>
       <w:r>
-        <w:t>ApêndiceB</w:t>
+        <w:t>ApêndiceC</w:t>
       </w:r>
       <w:proofErr w:type="spellEnd"/>
       <w:r>
         <w:t>” que acompanha este documento.</w:t>
       </w:r>
     </w:p>
+    <w:p/>
+    <w:p/>
     <w:p>
       <w:pPr>
         <w:keepNext/>
@@ -4220,59 +5248,11 @@
           <w:color w:val="000000"/>
         </w:rPr>
       </w:pPr>
-      <w:bookmarkStart w:id="29" w:name="_io2bxhhvd09c" w:colFirst="0" w:colLast="0"/>
-      <w:bookmarkEnd w:id="29"/>
-      <w:r>
-        <w:br w:type="page"/>
-      </w:r>
-      <w:r>
-        <w:rPr>
-          <w:b/>
-          <w:bCs/>
-          <w:color w:val="000000"/>
-        </w:rPr>
-        <w:lastRenderedPageBreak/>
-        <w:t>APÊNDICE C – ANÁLISE DOS REQUISITOS DO SISTEMA DE SOFTWARE</w:t>
-      </w:r>
-    </w:p>
-    <w:p>
-      <w:r>
-        <w:t>Os requisitos estão disponíveis na pasta “</w:t>
-      </w:r>
-      <w:proofErr w:type="spellStart"/>
-      <w:r>
-        <w:t>ApêndiceC</w:t>
-      </w:r>
-      <w:proofErr w:type="spellEnd"/>
-      <w:r>
-        <w:t>” que acompanha este documento.</w:t>
-      </w:r>
-    </w:p>
-    <w:p/>
-    <w:p/>
-    <w:p>
-      <w:pPr>
-        <w:keepNext/>
-        <w:pBdr>
-          <w:top w:val="nil"/>
-          <w:left w:val="nil"/>
-          <w:bottom w:val="nil"/>
-          <w:right w:val="nil"/>
-          <w:between w:val="nil"/>
-        </w:pBdr>
-        <w:spacing w:before="240"/>
-        <w:rPr>
-          <w:b/>
-          <w:bCs/>
-          <w:smallCaps/>
-          <w:color w:val="000000"/>
-        </w:rPr>
-      </w:pPr>
     </w:p>
     <w:sectPr>
       <w:headerReference w:type="default" r:id="rId9"/>
       <w:headerReference w:type="first" r:id="rId10"/>
-      <w:pgSz w:w="11907" w:h="16840"/>
+      <w:pgSz w:w="11907" w:h="16840" w:orient="portrait"/>
       <w:pgMar w:top="1699" w:right="1138" w:bottom="1238" w:left="1699" w:header="720" w:footer="720" w:gutter="0"/>
       <w:cols w:space="720"/>
       <w:titlePg/>
@@ -4650,11 +5630,11 @@
 </file>
 
 <file path=word/styles.xml><?xml version="1.0" encoding="utf-8"?>
-<w:styles xmlns:mc="http://schemas.openxmlformats.org/markup-compatibility/2006" xmlns:r="http://schemas.openxmlformats.org/officeDocument/2006/relationships" xmlns:w="http://schemas.openxmlformats.org/wordprocessingml/2006/main" xmlns:w14="http://schemas.microsoft.com/office/word/2010/wordml" xmlns:w15="http://schemas.microsoft.com/office/word/2012/wordml" xmlns:w16cex="http://schemas.microsoft.com/office/word/2018/wordml/cex" xmlns:w16cid="http://schemas.microsoft.com/office/word/2016/wordml/cid" xmlns:w16="http://schemas.microsoft.com/office/word/2018/wordml" xmlns:w16du="http://schemas.microsoft.com/office/word/2023/wordml/word16du" xmlns:w16sdtdh="http://schemas.microsoft.com/office/word/2020/wordml/sdtdatahash" xmlns:w16sdtfl="http://schemas.microsoft.com/office/word/2024/wordml/sdtformatlock" xmlns:w16se="http://schemas.microsoft.com/office/word/2015/wordml/symex" mc:Ignorable="w14 w15 w16se w16cid w16 w16cex w16sdtdh w16sdtfl w16du">
+<w:styles xmlns:wp14="http://schemas.microsoft.com/office/word/2010/wordprocessingDrawing" xmlns:mc="http://schemas.openxmlformats.org/markup-compatibility/2006" xmlns:r="http://schemas.openxmlformats.org/officeDocument/2006/relationships" xmlns:w="http://schemas.openxmlformats.org/wordprocessingml/2006/main" xmlns:w14="http://schemas.microsoft.com/office/word/2010/wordml" xmlns:w15="http://schemas.microsoft.com/office/word/2012/wordml" xmlns:w16cex="http://schemas.microsoft.com/office/word/2018/wordml/cex" xmlns:w16cid="http://schemas.microsoft.com/office/word/2016/wordml/cid" xmlns:w16="http://schemas.microsoft.com/office/word/2018/wordml" xmlns:w16du="http://schemas.microsoft.com/office/word/2023/wordml/word16du" xmlns:w16sdtdh="http://schemas.microsoft.com/office/word/2020/wordml/sdtdatahash" xmlns:w16sdtfl="http://schemas.microsoft.com/office/word/2024/wordml/sdtformatlock" xmlns:w16se="http://schemas.microsoft.com/office/word/2015/wordml/symex" mc:Ignorable="w14 w15 w16se w16cid w16 w16cex w16sdtdh w16sdtfl w16du wp14">
   <w:docDefaults>
     <w:rPrDefault>
       <w:rPr>
-        <w:rFonts w:ascii="Times New Roman" w:eastAsia="Times New Roman" w:hAnsi="Times New Roman" w:cs="Times New Roman"/>
+        <w:rFonts w:ascii="Times New Roman" w:hAnsi="Times New Roman" w:eastAsia="Times New Roman" w:cs="Times New Roman"/>
         <w:sz w:val="24"/>
         <w:szCs w:val="24"/>
         <w:lang w:val="pt-BR" w:eastAsia="pt-BR" w:bidi="ar-SA"/>
@@ -4669,14 +5649,14 @@
   <w:latentStyles w:defLockedState="0" w:defUIPriority="99" w:defSemiHidden="0" w:defUnhideWhenUsed="0" w:defQFormat="0" w:count="376">
     <w:lsdException w:name="Normal" w:uiPriority="0" w:qFormat="1"/>
     <w:lsdException w:name="heading 1" w:uiPriority="9" w:qFormat="1"/>
-    <w:lsdException w:name="heading 2" w:semiHidden="1" w:uiPriority="9" w:unhideWhenUsed="1" w:qFormat="1"/>
-    <w:lsdException w:name="heading 3" w:semiHidden="1" w:uiPriority="9" w:unhideWhenUsed="1" w:qFormat="1"/>
-    <w:lsdException w:name="heading 4" w:semiHidden="1" w:uiPriority="9" w:unhideWhenUsed="1" w:qFormat="1"/>
-    <w:lsdException w:name="heading 5" w:semiHidden="1" w:uiPriority="9" w:unhideWhenUsed="1" w:qFormat="1"/>
-    <w:lsdException w:name="heading 6" w:semiHidden="1" w:uiPriority="9" w:unhideWhenUsed="1" w:qFormat="1"/>
-    <w:lsdException w:name="heading 7" w:semiHidden="1" w:uiPriority="9" w:unhideWhenUsed="1" w:qFormat="1"/>
-    <w:lsdException w:name="heading 8" w:semiHidden="1" w:uiPriority="9" w:unhideWhenUsed="1" w:qFormat="1"/>
-    <w:lsdException w:name="heading 9" w:semiHidden="1" w:uiPriority="9" w:unhideWhenUsed="1" w:qFormat="1"/>
+    <w:lsdException w:name="heading 2" w:uiPriority="9" w:semiHidden="1" w:unhideWhenUsed="1" w:qFormat="1"/>
+    <w:lsdException w:name="heading 3" w:uiPriority="9" w:semiHidden="1" w:unhideWhenUsed="1" w:qFormat="1"/>
+    <w:lsdException w:name="heading 4" w:uiPriority="9" w:semiHidden="1" w:unhideWhenUsed="1" w:qFormat="1"/>
+    <w:lsdException w:name="heading 5" w:uiPriority="9" w:semiHidden="1" w:unhideWhenUsed="1" w:qFormat="1"/>
+    <w:lsdException w:name="heading 6" w:uiPriority="9" w:semiHidden="1" w:unhideWhenUsed="1" w:qFormat="1"/>
+    <w:lsdException w:name="heading 7" w:uiPriority="9" w:semiHidden="1" w:unhideWhenUsed="1" w:qFormat="1"/>
+    <w:lsdException w:name="heading 8" w:uiPriority="9" w:semiHidden="1" w:unhideWhenUsed="1" w:qFormat="1"/>
+    <w:lsdException w:name="heading 9" w:uiPriority="9" w:semiHidden="1" w:unhideWhenUsed="1" w:qFormat="1"/>
     <w:lsdException w:name="index 1" w:semiHidden="1" w:unhideWhenUsed="1"/>
     <w:lsdException w:name="index 2" w:semiHidden="1" w:unhideWhenUsed="1"/>
     <w:lsdException w:name="index 3" w:semiHidden="1" w:unhideWhenUsed="1"/>
@@ -4686,22 +5666,22 @@
     <w:lsdException w:name="index 7" w:semiHidden="1" w:unhideWhenUsed="1"/>
     <w:lsdException w:name="index 8" w:semiHidden="1" w:unhideWhenUsed="1"/>
     <w:lsdException w:name="index 9" w:semiHidden="1" w:unhideWhenUsed="1"/>
-    <w:lsdException w:name="toc 1" w:semiHidden="1" w:uiPriority="39" w:unhideWhenUsed="1"/>
-    <w:lsdException w:name="toc 2" w:semiHidden="1" w:uiPriority="39" w:unhideWhenUsed="1"/>
-    <w:lsdException w:name="toc 3" w:semiHidden="1" w:uiPriority="39" w:unhideWhenUsed="1"/>
-    <w:lsdException w:name="toc 4" w:semiHidden="1" w:uiPriority="39" w:unhideWhenUsed="1"/>
-    <w:lsdException w:name="toc 5" w:semiHidden="1" w:uiPriority="39" w:unhideWhenUsed="1"/>
-    <w:lsdException w:name="toc 6" w:semiHidden="1" w:uiPriority="39" w:unhideWhenUsed="1"/>
-    <w:lsdException w:name="toc 7" w:semiHidden="1" w:uiPriority="39" w:unhideWhenUsed="1"/>
-    <w:lsdException w:name="toc 8" w:semiHidden="1" w:uiPriority="39" w:unhideWhenUsed="1"/>
-    <w:lsdException w:name="toc 9" w:semiHidden="1" w:uiPriority="39" w:unhideWhenUsed="1"/>
+    <w:lsdException w:name="toc 1" w:uiPriority="39" w:semiHidden="1" w:unhideWhenUsed="1"/>
+    <w:lsdException w:name="toc 2" w:uiPriority="39" w:semiHidden="1" w:unhideWhenUsed="1"/>
+    <w:lsdException w:name="toc 3" w:uiPriority="39" w:semiHidden="1" w:unhideWhenUsed="1"/>
+    <w:lsdException w:name="toc 4" w:uiPriority="39" w:semiHidden="1" w:unhideWhenUsed="1"/>
+    <w:lsdException w:name="toc 5" w:uiPriority="39" w:semiHidden="1" w:unhideWhenUsed="1"/>
+    <w:lsdException w:name="toc 6" w:uiPriority="39" w:semiHidden="1" w:unhideWhenUsed="1"/>
+    <w:lsdException w:name="toc 7" w:uiPriority="39" w:semiHidden="1" w:unhideWhenUsed="1"/>
+    <w:lsdException w:name="toc 8" w:uiPriority="39" w:semiHidden="1" w:unhideWhenUsed="1"/>
+    <w:lsdException w:name="toc 9" w:uiPriority="39" w:semiHidden="1" w:unhideWhenUsed="1"/>
     <w:lsdException w:name="Normal Indent" w:semiHidden="1" w:unhideWhenUsed="1"/>
     <w:lsdException w:name="footnote text" w:semiHidden="1" w:unhideWhenUsed="1"/>
     <w:lsdException w:name="annotation text" w:semiHidden="1" w:unhideWhenUsed="1"/>
     <w:lsdException w:name="header" w:semiHidden="1" w:unhideWhenUsed="1"/>
     <w:lsdException w:name="footer" w:semiHidden="1" w:unhideWhenUsed="1"/>
     <w:lsdException w:name="index heading" w:semiHidden="1" w:unhideWhenUsed="1"/>
-    <w:lsdException w:name="caption" w:semiHidden="1" w:uiPriority="35" w:unhideWhenUsed="1" w:qFormat="1"/>
+    <w:lsdException w:name="caption" w:uiPriority="35" w:semiHidden="1" w:unhideWhenUsed="1" w:qFormat="1"/>
     <w:lsdException w:name="table of figures" w:semiHidden="1" w:unhideWhenUsed="1"/>
     <w:lsdException w:name="envelope address" w:semiHidden="1" w:unhideWhenUsed="1"/>
     <w:lsdException w:name="envelope return" w:semiHidden="1" w:unhideWhenUsed="1"/>
@@ -4732,7 +5712,7 @@
     <w:lsdException w:name="Title" w:uiPriority="10" w:qFormat="1"/>
     <w:lsdException w:name="Closing" w:semiHidden="1" w:unhideWhenUsed="1"/>
     <w:lsdException w:name="Signature" w:semiHidden="1" w:unhideWhenUsed="1"/>
-    <w:lsdException w:name="Default Paragraph Font" w:semiHidden="1" w:uiPriority="1" w:unhideWhenUsed="1"/>
+    <w:lsdException w:name="Default Paragraph Font" w:uiPriority="1" w:semiHidden="1" w:unhideWhenUsed="1"/>
     <w:lsdException w:name="Body Text" w:semiHidden="1" w:unhideWhenUsed="1"/>
     <w:lsdException w:name="Body Text Indent" w:semiHidden="1" w:unhideWhenUsed="1"/>
     <w:lsdException w:name="List Continue" w:semiHidden="1" w:unhideWhenUsed="1"/>
@@ -4932,8 +5912,8 @@
     <w:lsdException w:name="Subtle Reference" w:uiPriority="31" w:qFormat="1"/>
     <w:lsdException w:name="Intense Reference" w:uiPriority="32" w:qFormat="1"/>
     <w:lsdException w:name="Book Title" w:uiPriority="33" w:qFormat="1"/>
-    <w:lsdException w:name="Bibliography" w:semiHidden="1" w:uiPriority="37" w:unhideWhenUsed="1"/>
-    <w:lsdException w:name="TOC Heading" w:semiHidden="1" w:uiPriority="39" w:unhideWhenUsed="1" w:qFormat="1"/>
+    <w:lsdException w:name="Bibliography" w:uiPriority="37" w:semiHidden="1" w:unhideWhenUsed="1"/>
+    <w:lsdException w:name="TOC Heading" w:uiPriority="39" w:semiHidden="1" w:unhideWhenUsed="1" w:qFormat="1"/>
     <w:lsdException w:name="Plain Table 1" w:uiPriority="41"/>
     <w:lsdException w:name="Plain Table 2" w:uiPriority="42"/>
     <w:lsdException w:name="Plain Table 3" w:uiPriority="43"/>
@@ -5044,7 +6024,7 @@
     <w:lsdException w:name="Unresolved Mention" w:semiHidden="1" w:unhideWhenUsed="1"/>
     <w:lsdException w:name="Smart Link" w:semiHidden="1" w:unhideWhenUsed="1"/>
   </w:latentStyles>
-  <w:style w:type="paragraph" w:default="1" w:styleId="Normal">
+  <w:style w:type="paragraph" w:styleId="Normal" w:default="1">
     <w:name w:val="Normal"/>
     <w:qFormat/>
   </w:style>
@@ -5170,12 +6150,13 @@
       <w:szCs w:val="20"/>
     </w:rPr>
   </w:style>
-  <w:style w:type="character" w:default="1" w:styleId="Fontepargpadro">
+  <w:style w:type="character" w:styleId="Fontepargpadro" w:default="1">
     <w:name w:val="Default Paragraph Font"/>
     <w:uiPriority w:val="1"/>
+    <w:semiHidden/>
     <w:unhideWhenUsed/>
   </w:style>
-  <w:style w:type="table" w:default="1" w:styleId="Tabelanormal">
+  <w:style w:type="table" w:styleId="Tabelanormal" w:default="1">
     <w:name w:val="Normal Table"/>
     <w:uiPriority w:val="99"/>
     <w:semiHidden/>
@@ -5190,13 +6171,13 @@
       </w:tblCellMar>
     </w:tblPr>
   </w:style>
-  <w:style w:type="numbering" w:default="1" w:styleId="Semlista">
+  <w:style w:type="numbering" w:styleId="Semlista" w:default="1">
     <w:name w:val="No List"/>
     <w:uiPriority w:val="99"/>
     <w:semiHidden/>
     <w:unhideWhenUsed/>
   </w:style>
-  <w:style w:type="table" w:customStyle="1" w:styleId="TableNormal">
+  <w:style w:type="table" w:styleId="TableNormal" w:customStyle="1">
     <w:name w:val="TableNormal"/>
     <w:tblPr>
       <w:tblCellMar>
@@ -5237,7 +6218,7 @@
       <w:spacing w:before="360" w:after="80"/>
     </w:pPr>
     <w:rPr>
-      <w:rFonts w:ascii="Georgia" w:eastAsia="Georgia" w:hAnsi="Georgia" w:cs="Georgia"/>
+      <w:rFonts w:ascii="Georgia" w:hAnsi="Georgia" w:eastAsia="Georgia" w:cs="Georgia"/>
       <w:i/>
       <w:iCs/>
       <w:color w:val="666666"/>
@@ -5245,7 +6226,7 @@
       <w:szCs w:val="48"/>
     </w:rPr>
   </w:style>
-  <w:style w:type="table" w:customStyle="1" w:styleId="a">
+  <w:style w:type="table" w:styleId="a" w:customStyle="1">
     <w:basedOn w:val="TableNormal"/>
     <w:tblPr>
       <w:tblStyleRowBandSize w:val="1"/>
@@ -5258,7 +6239,7 @@
       </w:tblCellMar>
     </w:tblPr>
   </w:style>
-  <w:style w:type="table" w:customStyle="1" w:styleId="a0">
+  <w:style w:type="table" w:styleId="a0" w:customStyle="1">
     <w:basedOn w:val="TableNormal"/>
     <w:tblPr>
       <w:tblStyleRowBandSize w:val="1"/>

</xml_diff>

<commit_message>
docs: preenchimento do capitulo 3 do pid
</commit_message>
<xml_diff>
--- a/PID_Relatório_5o_e_6o.Períodos_2026.docx
+++ b/PID_Relatório_5o_e_6o.Períodos_2026.docx
@@ -922,7 +922,13 @@
               <w:rPr>
                 <w:color w:val="000000" w:themeColor="text1" w:themeTint="FF" w:themeShade="FF"/>
               </w:rPr>
-              <w:t>V1.3</w:t>
+              <w:t>v</w:t>
+            </w:r>
+            <w:r>
+              <w:rPr>
+                <w:color w:val="000000" w:themeColor="text1" w:themeTint="FF" w:themeShade="FF"/>
+              </w:rPr>
+              <w:t>1.3</w:t>
             </w:r>
           </w:p>
         </w:tc>
@@ -1007,6 +1013,222 @@
                 <w:lang w:val="pt-BR"/>
               </w:rPr>
               <w:t>)</w:t>
+            </w:r>
+          </w:p>
+        </w:tc>
+      </w:tr>
+      <w:tr>
+        <w:trPr>
+          <w:trHeight w:val="300"/>
+        </w:trPr>
+        <w:tc>
+          <w:tcPr>
+            <w:tcW w:w="1272" w:type="dxa"/>
+            <w:tcMar/>
+          </w:tcPr>
+          <w:p>
+            <w:pPr>
+              <w:pStyle w:val="Normal"/>
+              <w:jc w:val="center"/>
+              <w:rPr>
+                <w:color w:val="000000" w:themeColor="text1" w:themeTint="FF" w:themeShade="FF"/>
+              </w:rPr>
+            </w:pPr>
+            <w:r>
+              <w:rPr>
+                <w:color w:val="000000" w:themeColor="text1" w:themeTint="FF" w:themeShade="FF"/>
+              </w:rPr>
+              <w:t>13/03/26</w:t>
+            </w:r>
+          </w:p>
+        </w:tc>
+        <w:tc>
+          <w:tcPr>
+            <w:tcW w:w="1275" w:type="dxa"/>
+            <w:tcMar/>
+          </w:tcPr>
+          <w:p>
+            <w:pPr>
+              <w:pStyle w:val="Normal"/>
+              <w:jc w:val="center"/>
+              <w:rPr>
+                <w:color w:val="000000" w:themeColor="text1" w:themeTint="FF" w:themeShade="FF"/>
+              </w:rPr>
+            </w:pPr>
+            <w:r>
+              <w:rPr>
+                <w:color w:val="000000" w:themeColor="text1" w:themeTint="FF" w:themeShade="FF"/>
+              </w:rPr>
+              <w:t>v2</w:t>
+            </w:r>
+          </w:p>
+        </w:tc>
+        <w:tc>
+          <w:tcPr>
+            <w:tcW w:w="1977" w:type="dxa"/>
+            <w:tcMar/>
+          </w:tcPr>
+          <w:p>
+            <w:pPr>
+              <w:pStyle w:val="Normal"/>
+              <w:spacing w:line="360" w:lineRule="auto"/>
+              <w:jc w:val="left"/>
+              <w:rPr>
+                <w:color w:val="000000" w:themeColor="text1" w:themeTint="FF" w:themeShade="FF"/>
+              </w:rPr>
+            </w:pPr>
+            <w:r>
+              <w:rPr>
+                <w:color w:val="000000" w:themeColor="text1" w:themeTint="FF" w:themeShade="FF"/>
+              </w:rPr>
+              <w:t>José Alfredo</w:t>
+            </w:r>
+          </w:p>
+        </w:tc>
+        <w:tc>
+          <w:tcPr>
+            <w:tcW w:w="4402" w:type="dxa"/>
+            <w:tcMar/>
+          </w:tcPr>
+          <w:p>
+            <w:pPr>
+              <w:pStyle w:val="Normal"/>
+              <w:jc w:val="both"/>
+              <w:rPr>
+                <w:rFonts w:ascii="Times New Roman" w:hAnsi="Times New Roman" w:eastAsia="Times New Roman" w:cs="Times New Roman"/>
+                <w:noProof w:val="0"/>
+                <w:sz w:val="24"/>
+                <w:szCs w:val="24"/>
+                <w:lang w:val="pt-BR"/>
+              </w:rPr>
+            </w:pPr>
+            <w:r>
+              <w:rPr>
+                <w:rFonts w:ascii="Times New Roman" w:hAnsi="Times New Roman" w:eastAsia="Times New Roman" w:cs="Times New Roman"/>
+                <w:noProof w:val="0"/>
+                <w:sz w:val="24"/>
+                <w:szCs w:val="24"/>
+                <w:lang w:val="pt-BR"/>
+              </w:rPr>
+              <w:t>Capítulo 2</w:t>
+            </w:r>
+          </w:p>
+        </w:tc>
+      </w:tr>
+      <w:tr>
+        <w:trPr>
+          <w:trHeight w:val="300"/>
+        </w:trPr>
+        <w:tc>
+          <w:tcPr>
+            <w:tcW w:w="1272" w:type="dxa"/>
+            <w:tcMar/>
+          </w:tcPr>
+          <w:p>
+            <w:pPr>
+              <w:pStyle w:val="Normal"/>
+              <w:jc w:val="center"/>
+              <w:rPr>
+                <w:color w:val="000000" w:themeColor="text1" w:themeTint="FF" w:themeShade="FF"/>
+              </w:rPr>
+            </w:pPr>
+            <w:r>
+              <w:rPr>
+                <w:color w:val="000000" w:themeColor="text1" w:themeTint="FF" w:themeShade="FF"/>
+              </w:rPr>
+              <w:t>26/03/26</w:t>
+            </w:r>
+          </w:p>
+        </w:tc>
+        <w:tc>
+          <w:tcPr>
+            <w:tcW w:w="1275" w:type="dxa"/>
+            <w:tcMar/>
+          </w:tcPr>
+          <w:p>
+            <w:pPr>
+              <w:pStyle w:val="Normal"/>
+              <w:jc w:val="center"/>
+              <w:rPr>
+                <w:color w:val="000000" w:themeColor="text1" w:themeTint="FF" w:themeShade="FF"/>
+              </w:rPr>
+            </w:pPr>
+            <w:r>
+              <w:rPr>
+                <w:color w:val="000000" w:themeColor="text1" w:themeTint="FF" w:themeShade="FF"/>
+              </w:rPr>
+              <w:t>v3</w:t>
+            </w:r>
+          </w:p>
+        </w:tc>
+        <w:tc>
+          <w:tcPr>
+            <w:tcW w:w="1977" w:type="dxa"/>
+            <w:tcMar/>
+          </w:tcPr>
+          <w:p>
+            <w:pPr>
+              <w:pStyle w:val="Normal"/>
+              <w:spacing w:line="360" w:lineRule="auto"/>
+              <w:jc w:val="left"/>
+              <w:rPr>
+                <w:color w:val="000000" w:themeColor="text1" w:themeTint="FF" w:themeShade="FF"/>
+              </w:rPr>
+            </w:pPr>
+            <w:r>
+              <w:rPr>
+                <w:color w:val="000000" w:themeColor="text1" w:themeTint="FF" w:themeShade="FF"/>
+              </w:rPr>
+              <w:t>Bruno Eduardo</w:t>
+            </w:r>
+          </w:p>
+        </w:tc>
+        <w:tc>
+          <w:tcPr>
+            <w:tcW w:w="4402" w:type="dxa"/>
+            <w:tcMar/>
+          </w:tcPr>
+          <w:p>
+            <w:pPr>
+              <w:pStyle w:val="Normal"/>
+              <w:jc w:val="both"/>
+              <w:rPr>
+                <w:rFonts w:ascii="Times New Roman" w:hAnsi="Times New Roman" w:eastAsia="Times New Roman" w:cs="Times New Roman"/>
+                <w:noProof w:val="0"/>
+                <w:sz w:val="24"/>
+                <w:szCs w:val="24"/>
+                <w:lang w:val="pt-BR"/>
+              </w:rPr>
+            </w:pPr>
+            <w:r>
+              <w:rPr>
+                <w:rFonts w:ascii="Times New Roman" w:hAnsi="Times New Roman" w:eastAsia="Times New Roman" w:cs="Times New Roman"/>
+                <w:noProof w:val="0"/>
+                <w:sz w:val="24"/>
+                <w:szCs w:val="24"/>
+                <w:lang w:val="pt-BR"/>
+              </w:rPr>
+              <w:t>Capí</w:t>
+            </w:r>
+            <w:r>
+              <w:rPr>
+                <w:rFonts w:ascii="Times New Roman" w:hAnsi="Times New Roman" w:eastAsia="Times New Roman" w:cs="Times New Roman"/>
+                <w:noProof w:val="0"/>
+                <w:sz w:val="24"/>
+                <w:szCs w:val="24"/>
+                <w:lang w:val="pt-BR"/>
+              </w:rPr>
+              <w:t>tulo</w:t>
+            </w:r>
+            <w:r>
+              <w:rPr>
+                <w:rFonts w:ascii="Times New Roman" w:hAnsi="Times New Roman" w:eastAsia="Times New Roman" w:cs="Times New Roman"/>
+                <w:noProof w:val="0"/>
+                <w:sz w:val="24"/>
+                <w:szCs w:val="24"/>
+                <w:lang w:val="pt-BR"/>
+              </w:rPr>
+              <w:t xml:space="preserve"> 3</w:t>
             </w:r>
           </w:p>
         </w:tc>
@@ -3757,25 +3979,72 @@
       <w:bookmarkEnd w:id="10"/>
       <w:r>
         <w:rPr>
-          <w:b/>
-          <w:bCs/>
-          <w:smallCaps/>
-          <w:color w:val="000000" w:themeColor="text1"/>
+          <w:b w:val="1"/>
+          <w:bCs w:val="1"/>
+          <w:smallCaps w:val="1"/>
+          <w:color w:val="000000" w:themeColor="text1" w:themeTint="FF" w:themeShade="FF"/>
         </w:rPr>
         <w:t xml:space="preserve">3 PLANEJAMENTO </w:t>
       </w:r>
     </w:p>
     <w:p>
       <w:pPr>
-        <w:rPr>
-          <w:color w:val="0070C0"/>
-        </w:rPr>
-      </w:pPr>
-      <w:r>
-        <w:rPr>
-          <w:color w:val="0070C0"/>
-        </w:rPr>
-        <w:t>Descreva a apresentação do capítulo.</w:t>
+        <w:pStyle w:val="Normal"/>
+      </w:pPr>
+      <w:r>
+        <w:rPr>
+          <w:rFonts w:ascii="Times New Roman" w:hAnsi="Times New Roman" w:eastAsia="Times New Roman" w:cs="Times New Roman"/>
+          <w:noProof w:val="0"/>
+          <w:color w:val="auto"/>
+          <w:sz w:val="24"/>
+          <w:szCs w:val="24"/>
+          <w:lang w:val="pt-BR" w:eastAsia="pt-BR" w:bidi="ar-SA"/>
+        </w:rPr>
+        <w:t xml:space="preserve">Neste capítulo, é apresentado o planejamento do projeto </w:t>
+      </w:r>
+      <w:r>
+        <w:rPr>
+          <w:rFonts w:ascii="Times New Roman" w:hAnsi="Times New Roman" w:eastAsia="Times New Roman" w:cs="Times New Roman"/>
+          <w:noProof w:val="0"/>
+          <w:color w:val="auto"/>
+          <w:sz w:val="24"/>
+          <w:szCs w:val="24"/>
+          <w:lang w:val="pt-BR" w:eastAsia="pt-BR" w:bidi="ar-SA"/>
+        </w:rPr>
+        <w:t>ElderConnect</w:t>
+      </w:r>
+      <w:r>
+        <w:rPr>
+          <w:rFonts w:ascii="Times New Roman" w:hAnsi="Times New Roman" w:eastAsia="Times New Roman" w:cs="Times New Roman"/>
+          <w:noProof w:val="0"/>
+          <w:color w:val="auto"/>
+          <w:sz w:val="24"/>
+          <w:szCs w:val="24"/>
+          <w:lang w:val="pt-BR" w:eastAsia="pt-BR" w:bidi="ar-SA"/>
+        </w:rPr>
+        <w:t xml:space="preserve">, mostrando de forma clara e organizada como o sistema será desenvolvido ao longo do tempo. São descritos os recursos necessários para a execução do projeto, incluindo recursos humanos, de software e de hardware, além de outros elementos importantes para seu desenvolvimento. Também é apresentado o cronograma do projeto, definindo prazos e organizando as atividades, o que facilita o acompanhamento de todo o processo. Dessa forma, este capítulo funciona como um guia prático, ajudando a manter o projeto no caminho certo e garantindo que o </w:t>
+      </w:r>
+      <w:r>
+        <w:rPr>
+          <w:rFonts w:ascii="Times New Roman" w:hAnsi="Times New Roman" w:eastAsia="Times New Roman" w:cs="Times New Roman"/>
+          <w:noProof w:val="0"/>
+          <w:color w:val="auto"/>
+          <w:sz w:val="24"/>
+          <w:szCs w:val="24"/>
+          <w:lang w:val="pt-BR" w:eastAsia="pt-BR" w:bidi="ar-SA"/>
+        </w:rPr>
+        <w:t>ElderConnect</w:t>
+      </w:r>
+      <w:r>
+        <w:rPr>
+          <w:rFonts w:ascii="Times New Roman" w:hAnsi="Times New Roman" w:eastAsia="Times New Roman" w:cs="Times New Roman"/>
+          <w:noProof w:val="0"/>
+          <w:color w:val="auto"/>
+          <w:sz w:val="24"/>
+          <w:szCs w:val="24"/>
+          <w:lang w:val="pt-BR" w:eastAsia="pt-BR" w:bidi="ar-SA"/>
+        </w:rPr>
+        <w:t xml:space="preserve"> seja desenvolvido de forma eficiente, segura e alinhada aos objetivos propostos.</w:t>
       </w:r>
     </w:p>
     <w:p>
@@ -3804,25 +4073,212 @@
       </w:pPr>
       <w:r>
         <w:rPr>
-          <w:smallCaps/>
-          <w:color w:val="000000"/>
+          <w:smallCaps w:val="1"/>
+          <w:color w:val="000000" w:themeColor="text1" w:themeTint="FF" w:themeShade="FF"/>
         </w:rPr>
         <w:t>3.1 RECURSOS HUMANOS</w:t>
       </w:r>
     </w:p>
     <w:p>
       <w:pPr>
+        <w:spacing w:before="240" w:beforeAutospacing="off" w:after="240" w:afterAutospacing="off"/>
         <w:jc w:val="both"/>
         <w:rPr>
+          <w:rFonts w:ascii="Times New Roman" w:hAnsi="Times New Roman" w:eastAsia="Times New Roman" w:cs="Times New Roman"/>
+          <w:noProof w:val="0"/>
+          <w:color w:val="auto"/>
+          <w:sz w:val="24"/>
+          <w:szCs w:val="24"/>
+          <w:lang w:val="pt-BR" w:eastAsia="pt-BR" w:bidi="ar-SA"/>
+        </w:rPr>
+      </w:pPr>
+      <w:r>
+        <w:rPr>
+          <w:rFonts w:ascii="Times New Roman" w:hAnsi="Times New Roman" w:eastAsia="Times New Roman" w:cs="Times New Roman"/>
+          <w:noProof w:val="0"/>
+          <w:color w:val="auto"/>
+          <w:sz w:val="24"/>
+          <w:szCs w:val="24"/>
+          <w:lang w:val="pt-BR" w:eastAsia="pt-BR" w:bidi="ar-SA"/>
+        </w:rPr>
+        <w:t xml:space="preserve">Os recursos humanos do projeto </w:t>
+      </w:r>
+      <w:r>
+        <w:rPr>
+          <w:rFonts w:ascii="Times New Roman" w:hAnsi="Times New Roman" w:eastAsia="Times New Roman" w:cs="Times New Roman"/>
+          <w:noProof w:val="0"/>
+          <w:color w:val="auto"/>
+          <w:sz w:val="24"/>
+          <w:szCs w:val="24"/>
+          <w:lang w:val="pt-BR" w:eastAsia="pt-BR" w:bidi="ar-SA"/>
+        </w:rPr>
+        <w:t>ElderConnect</w:t>
+      </w:r>
+      <w:r>
+        <w:rPr>
+          <w:rFonts w:ascii="Times New Roman" w:hAnsi="Times New Roman" w:eastAsia="Times New Roman" w:cs="Times New Roman"/>
+          <w:noProof w:val="0"/>
+          <w:color w:val="auto"/>
+          <w:sz w:val="24"/>
+          <w:szCs w:val="24"/>
+          <w:lang w:val="pt-BR" w:eastAsia="pt-BR" w:bidi="ar-SA"/>
+        </w:rPr>
+        <w:t xml:space="preserve"> são compostos por três integrantes: Bruno Eduardo Faria de Morais, </w:t>
+      </w:r>
+      <w:r>
+        <w:rPr>
+          <w:rFonts w:ascii="Times New Roman" w:hAnsi="Times New Roman" w:eastAsia="Times New Roman" w:cs="Times New Roman"/>
+          <w:noProof w:val="0"/>
+          <w:color w:val="auto"/>
+          <w:sz w:val="24"/>
+          <w:szCs w:val="24"/>
+          <w:lang w:val="pt-BR" w:eastAsia="pt-BR" w:bidi="ar-SA"/>
+        </w:rPr>
+        <w:t>José Alfredo dos Reis Júnior</w:t>
+      </w:r>
+      <w:r>
+        <w:rPr>
+          <w:rFonts w:ascii="Times New Roman" w:hAnsi="Times New Roman" w:eastAsia="Times New Roman" w:cs="Times New Roman"/>
+          <w:noProof w:val="0"/>
+          <w:color w:val="auto"/>
+          <w:sz w:val="24"/>
+          <w:szCs w:val="24"/>
+          <w:lang w:val="pt-BR" w:eastAsia="pt-BR" w:bidi="ar-SA"/>
+        </w:rPr>
+        <w:t xml:space="preserve"> e </w:t>
+      </w:r>
+      <w:r>
+        <w:rPr>
+          <w:rFonts w:ascii="Times New Roman" w:hAnsi="Times New Roman" w:eastAsia="Times New Roman" w:cs="Times New Roman"/>
+          <w:noProof w:val="0"/>
+          <w:color w:val="auto"/>
+          <w:sz w:val="24"/>
+          <w:szCs w:val="24"/>
+          <w:lang w:val="pt-BR" w:eastAsia="pt-BR" w:bidi="ar-SA"/>
+        </w:rPr>
+        <w:t>Marcela de Cássia Costa Rezende</w:t>
+      </w:r>
+      <w:r>
+        <w:rPr>
+          <w:rFonts w:ascii="Times New Roman" w:hAnsi="Times New Roman" w:eastAsia="Times New Roman" w:cs="Times New Roman"/>
+          <w:noProof w:val="0"/>
+          <w:color w:val="auto"/>
+          <w:sz w:val="24"/>
+          <w:szCs w:val="24"/>
+          <w:lang w:val="pt-BR" w:eastAsia="pt-BR" w:bidi="ar-SA"/>
+        </w:rPr>
+        <w:t>, responsáveis pelo desenvolvimento do sistema. Os membros atuam de forma colaborativa nas etapas de análise, implementação e testes, contribuindo conjuntamente para a construção da solução e para a tomada de decisões ao longo do projeto.</w:t>
+      </w:r>
+    </w:p>
+    <w:p>
+      <w:pPr>
+        <w:pStyle w:val="Normal"/>
+        <w:spacing w:before="240" w:beforeAutospacing="off" w:after="240" w:afterAutospacing="off"/>
+        <w:jc w:val="both"/>
+      </w:pPr>
+      <w:r>
+        <w:rPr>
+          <w:rFonts w:ascii="Times New Roman" w:hAnsi="Times New Roman" w:eastAsia="Times New Roman" w:cs="Times New Roman"/>
+          <w:noProof w:val="0"/>
+          <w:color w:val="auto"/>
+          <w:sz w:val="24"/>
+          <w:szCs w:val="24"/>
+          <w:lang w:val="pt-BR" w:eastAsia="pt-BR" w:bidi="ar-SA"/>
+        </w:rPr>
+        <w:t>Além disso, o projeto conta com o acompanhamento de quatro professores orientadores: [</w:t>
+      </w:r>
+      <w:r>
+        <w:rPr>
+          <w:rFonts w:ascii="Times New Roman" w:hAnsi="Times New Roman" w:eastAsia="Times New Roman" w:cs="Times New Roman"/>
+          <w:noProof w:val="0"/>
+          <w:sz w:val="24"/>
+          <w:szCs w:val="24"/>
+          <w:lang w:val="pt-BR"/>
+        </w:rPr>
+        <w:t>Luciano Reis Vilela</w:t>
+      </w:r>
+      <w:r>
+        <w:rPr>
+          <w:rFonts w:ascii="Times New Roman" w:hAnsi="Times New Roman" w:eastAsia="Times New Roman" w:cs="Times New Roman"/>
+          <w:noProof w:val="0"/>
+          <w:color w:val="auto"/>
+          <w:sz w:val="24"/>
+          <w:szCs w:val="24"/>
+          <w:lang w:val="pt-BR" w:eastAsia="pt-BR" w:bidi="ar-SA"/>
+        </w:rPr>
+        <w:t>], [</w:t>
+      </w:r>
+      <w:r>
+        <w:rPr>
+          <w:rFonts w:ascii="Times New Roman" w:hAnsi="Times New Roman" w:eastAsia="Times New Roman" w:cs="Times New Roman"/>
+          <w:noProof w:val="0"/>
+          <w:sz w:val="24"/>
+          <w:szCs w:val="24"/>
+          <w:lang w:val="pt-BR"/>
+        </w:rPr>
+        <w:t>Luciane Cassia Santos</w:t>
+      </w:r>
+      <w:r>
+        <w:rPr>
+          <w:rFonts w:ascii="Times New Roman" w:hAnsi="Times New Roman" w:eastAsia="Times New Roman" w:cs="Times New Roman"/>
+          <w:noProof w:val="0"/>
+          <w:color w:val="auto"/>
+          <w:sz w:val="24"/>
+          <w:szCs w:val="24"/>
+          <w:lang w:val="pt-BR" w:eastAsia="pt-BR" w:bidi="ar-SA"/>
+        </w:rPr>
+        <w:t>], [</w:t>
+      </w:r>
+      <w:r>
+        <w:rPr>
+          <w:rFonts w:ascii="Times New Roman" w:hAnsi="Times New Roman" w:eastAsia="Times New Roman" w:cs="Times New Roman"/>
+          <w:noProof w:val="0"/>
+          <w:sz w:val="24"/>
+          <w:szCs w:val="24"/>
+          <w:lang w:val="pt-BR"/>
+        </w:rPr>
+        <w:t>Silvana Isabel de Lima</w:t>
+      </w:r>
+      <w:r>
+        <w:rPr>
+          <w:rFonts w:ascii="Times New Roman" w:hAnsi="Times New Roman" w:eastAsia="Times New Roman" w:cs="Times New Roman"/>
+          <w:noProof w:val="0"/>
+          <w:color w:val="auto"/>
+          <w:sz w:val="24"/>
+          <w:szCs w:val="24"/>
+          <w:lang w:val="pt-BR" w:eastAsia="pt-BR" w:bidi="ar-SA"/>
+        </w:rPr>
+        <w:t>] e [</w:t>
+      </w:r>
+      <w:r>
+        <w:rPr>
+          <w:rFonts w:ascii="Times New Roman" w:hAnsi="Times New Roman" w:eastAsia="Times New Roman" w:cs="Times New Roman"/>
+          <w:noProof w:val="0"/>
+          <w:sz w:val="24"/>
+          <w:szCs w:val="24"/>
+          <w:lang w:val="pt-BR"/>
+        </w:rPr>
+        <w:t>Wellington Openheimer Ribeiro</w:t>
+      </w:r>
+      <w:r>
+        <w:rPr>
+          <w:rFonts w:ascii="Times New Roman" w:hAnsi="Times New Roman" w:eastAsia="Times New Roman" w:cs="Times New Roman"/>
+          <w:noProof w:val="0"/>
+          <w:color w:val="auto"/>
+          <w:sz w:val="24"/>
+          <w:szCs w:val="24"/>
+          <w:lang w:val="pt-BR" w:eastAsia="pt-BR" w:bidi="ar-SA"/>
+        </w:rPr>
+        <w:t>], que fornecem suporte técnico e acadêmico durante todo o desenvolvimento. Os orientadores auxiliam na validação das etapas do projeto, na identificação e correção de possíveis falhas e na garantia de que o trabalho esteja alinhado com os objetivos e requisitos propostos.</w:t>
+      </w:r>
+    </w:p>
+    <w:p>
+      <w:pPr>
+        <w:jc w:val="both"/>
+        <w:rPr>
           <w:color w:val="0070C0"/>
         </w:rPr>
       </w:pPr>
-      <w:r>
-        <w:rPr>
-          <w:color w:val="0070C0"/>
-        </w:rPr>
-        <w:t>Apresente a relação dos integrantes da equipe, professores e demais colaboradores do trabalho.</w:t>
-      </w:r>
     </w:p>
     <w:p>
       <w:pPr>
@@ -3831,8 +4287,24 @@
           <w:color w:val="FF0000"/>
         </w:rPr>
       </w:pPr>
-      <w:bookmarkStart w:name="_hlzhjesqyqyu" w:colFirst="0" w:colLast="0" w:id="12"/>
+      <w:bookmarkStart w:name="_hlzhjesqyqyu" w:id="12"/>
       <w:bookmarkEnd w:id="12"/>
+    </w:p>
+    <w:p>
+      <w:pPr>
+        <w:keepNext w:val="1"/>
+        <w:pBdr>
+          <w:top w:val="nil" w:color="FF000000" w:sz="0" w:space="0"/>
+          <w:left w:val="nil" w:color="FF000000" w:sz="0" w:space="0"/>
+          <w:bottom w:val="nil" w:color="FF000000" w:sz="0" w:space="0"/>
+          <w:right w:val="nil" w:color="FF000000" w:sz="0" w:space="0"/>
+          <w:between w:val="nil" w:color="FF000000" w:sz="0" w:space="0"/>
+        </w:pBdr>
+        <w:rPr>
+          <w:smallCaps w:val="1"/>
+          <w:color w:val="000000" w:themeColor="text1" w:themeTint="FF" w:themeShade="FF"/>
+        </w:rPr>
+      </w:pPr>
     </w:p>
     <w:p>
       <w:pPr>
@@ -3851,8 +4323,8 @@
       </w:pPr>
       <w:r>
         <w:rPr>
-          <w:smallCaps/>
-          <w:color w:val="000000"/>
+          <w:smallCaps w:val="1"/>
+          <w:color w:val="000000" w:themeColor="text1" w:themeTint="FF" w:themeShade="FF"/>
         </w:rPr>
         <w:t>3.2 RECURSOS DE HARDWARE</w:t>
       </w:r>
@@ -3861,212 +4333,306 @@
       <w:pPr>
         <w:jc w:val="both"/>
         <w:rPr>
+          <w:color w:val="000000" w:themeColor="text1" w:themeTint="FF" w:themeShade="FF"/>
+          <w:lang w:val="en-US"/>
+        </w:rPr>
+      </w:pPr>
+      <w:r>
+        <w:rPr>
+          <w:color w:val="000000" w:themeColor="text1" w:themeTint="FF" w:themeShade="FF"/>
+          <w:lang w:val="en-US"/>
+        </w:rPr>
+        <w:t xml:space="preserve">RH 1 – </w:t>
+      </w:r>
+      <w:r>
+        <w:rPr>
+          <w:color w:val="000000" w:themeColor="text1" w:themeTint="FF" w:themeShade="FF"/>
+          <w:lang w:val="en-US"/>
+        </w:rPr>
+        <w:t>Notebook</w:t>
+      </w:r>
+      <w:r>
+        <w:rPr>
+          <w:color w:val="000000" w:themeColor="text1" w:themeTint="FF" w:themeShade="FF"/>
+          <w:lang w:val="en-US"/>
+        </w:rPr>
+        <w:t xml:space="preserve"> ASUS </w:t>
+      </w:r>
+      <w:r>
+        <w:rPr>
+          <w:color w:val="000000" w:themeColor="text1" w:themeTint="FF" w:themeShade="FF"/>
+          <w:lang w:val="en-US"/>
+        </w:rPr>
+        <w:t>Vivobook</w:t>
+      </w:r>
+      <w:r>
+        <w:rPr>
+          <w:color w:val="000000" w:themeColor="text1" w:themeTint="FF" w:themeShade="FF"/>
+          <w:lang w:val="en-US"/>
+        </w:rPr>
+        <w:t xml:space="preserve"> </w:t>
+      </w:r>
+      <w:r>
+        <w:rPr>
+          <w:color w:val="000000" w:themeColor="text1" w:themeTint="FF" w:themeShade="FF"/>
+          <w:lang w:val="en-US"/>
+        </w:rPr>
+        <w:t>AMD Ryzen 7 5825U 16</w:t>
+      </w:r>
+      <w:r>
+        <w:rPr>
+          <w:color w:val="000000" w:themeColor="text1" w:themeTint="FF" w:themeShade="FF"/>
+          <w:lang w:val="en-US"/>
+        </w:rPr>
+        <w:t>gb</w:t>
+      </w:r>
+      <w:r>
+        <w:rPr>
+          <w:color w:val="000000" w:themeColor="text1" w:themeTint="FF" w:themeShade="FF"/>
+          <w:lang w:val="en-US"/>
+        </w:rPr>
+        <w:t xml:space="preserve"> </w:t>
+      </w:r>
+      <w:r>
+        <w:rPr>
+          <w:color w:val="000000" w:themeColor="text1" w:themeTint="FF" w:themeShade="FF"/>
+          <w:lang w:val="en-US"/>
+        </w:rPr>
+        <w:t>ram</w:t>
+      </w:r>
+    </w:p>
+    <w:p>
+      <w:pPr>
+        <w:jc w:val="both"/>
+        <w:rPr>
+          <w:color w:val="000000" w:themeColor="text1" w:themeTint="FF" w:themeShade="FF"/>
+        </w:rPr>
+      </w:pPr>
+      <w:r>
+        <w:rPr>
+          <w:color w:val="000000" w:themeColor="text1" w:themeTint="FF" w:themeShade="FF"/>
+          <w:lang w:val="en-US"/>
+        </w:rPr>
+        <w:t xml:space="preserve">RH 2 – </w:t>
+      </w:r>
+      <w:r>
+        <w:rPr>
+          <w:color w:val="000000" w:themeColor="text1" w:themeTint="FF" w:themeShade="FF"/>
+          <w:lang w:val="en-US"/>
+        </w:rPr>
+        <w:t xml:space="preserve">Notebook Dell </w:t>
+      </w:r>
+      <w:r>
+        <w:rPr>
+          <w:color w:val="000000" w:themeColor="text1" w:themeTint="FF" w:themeShade="FF"/>
+          <w:lang w:val="en-US"/>
+        </w:rPr>
+        <w:t>Inspirion</w:t>
+      </w:r>
+      <w:r>
+        <w:rPr>
+          <w:color w:val="000000" w:themeColor="text1" w:themeTint="FF" w:themeShade="FF"/>
+          <w:lang w:val="en-US"/>
+        </w:rPr>
+        <w:t xml:space="preserve"> i7 16</w:t>
+      </w:r>
+      <w:r>
+        <w:rPr>
+          <w:color w:val="000000" w:themeColor="text1" w:themeTint="FF" w:themeShade="FF"/>
+          <w:lang w:val="en-US"/>
+        </w:rPr>
+        <w:t>gb</w:t>
+      </w:r>
+      <w:r>
+        <w:rPr>
+          <w:color w:val="000000" w:themeColor="text1" w:themeTint="FF" w:themeShade="FF"/>
+          <w:lang w:val="en-US"/>
+        </w:rPr>
+        <w:t xml:space="preserve"> ram ssd480 </w:t>
+      </w:r>
+      <w:r>
+        <w:rPr>
+          <w:color w:val="000000" w:themeColor="text1" w:themeTint="FF" w:themeShade="FF"/>
+          <w:lang w:val="en-US"/>
+        </w:rPr>
+        <w:t>hd</w:t>
+      </w:r>
+      <w:r>
+        <w:rPr>
+          <w:color w:val="000000" w:themeColor="text1" w:themeTint="FF" w:themeShade="FF"/>
+          <w:lang w:val="en-US"/>
+        </w:rPr>
+        <w:t xml:space="preserve"> 500</w:t>
+      </w:r>
+    </w:p>
+    <w:p>
+      <w:pPr>
+        <w:jc w:val="both"/>
+        <w:rPr>
+          <w:color w:val="000000" w:themeColor="text1" w:themeTint="FF" w:themeShade="FF"/>
+        </w:rPr>
+      </w:pPr>
+      <w:r>
+        <w:rPr>
+          <w:color w:val="000000" w:themeColor="text1" w:themeTint="FF" w:themeShade="FF"/>
+          <w:lang w:val="en-US"/>
+        </w:rPr>
+        <w:t xml:space="preserve">RH 3 – </w:t>
+      </w:r>
+      <w:r>
+        <w:rPr>
+          <w:color w:val="000000" w:themeColor="text1" w:themeTint="FF" w:themeShade="FF"/>
+          <w:lang w:val="en-US"/>
+        </w:rPr>
+        <w:t xml:space="preserve">Notebook Dell Inspiron i5 8gb ram, </w:t>
+      </w:r>
+      <w:r>
+        <w:rPr>
+          <w:color w:val="000000" w:themeColor="text1" w:themeTint="FF" w:themeShade="FF"/>
+          <w:lang w:val="en-US"/>
+        </w:rPr>
+        <w:t>ssd</w:t>
+      </w:r>
+      <w:r>
+        <w:rPr>
+          <w:color w:val="000000" w:themeColor="text1" w:themeTint="FF" w:themeShade="FF"/>
+          <w:lang w:val="en-US"/>
+        </w:rPr>
+        <w:t xml:space="preserve"> 240, </w:t>
+      </w:r>
+      <w:r>
+        <w:rPr>
+          <w:color w:val="000000" w:themeColor="text1" w:themeTint="FF" w:themeShade="FF"/>
+          <w:lang w:val="en-US"/>
+        </w:rPr>
+        <w:t>hd</w:t>
+      </w:r>
+      <w:r>
+        <w:rPr>
+          <w:color w:val="000000" w:themeColor="text1" w:themeTint="FF" w:themeShade="FF"/>
+          <w:lang w:val="en-US"/>
+        </w:rPr>
+        <w:t xml:space="preserve"> 620</w:t>
+      </w:r>
+    </w:p>
+    <w:p>
+      <w:pPr>
+        <w:jc w:val="both"/>
+        <w:rPr>
+          <w:color w:val="000000" w:themeColor="text1" w:themeTint="FF" w:themeShade="FF"/>
+        </w:rPr>
+      </w:pPr>
+      <w:r>
+        <w:rPr>
+          <w:color w:val="000000" w:themeColor="text1" w:themeTint="FF" w:themeShade="FF"/>
+        </w:rPr>
+        <w:t>RH 4 – Teclado</w:t>
+      </w:r>
+    </w:p>
+    <w:p>
+      <w:pPr>
+        <w:pStyle w:val="Normal"/>
+        <w:jc w:val="both"/>
+        <w:rPr>
+          <w:color w:val="000000" w:themeColor="text1" w:themeTint="FF" w:themeShade="FF"/>
+        </w:rPr>
+      </w:pPr>
+      <w:r>
+        <w:rPr>
+          <w:color w:val="000000" w:themeColor="text1" w:themeTint="FF" w:themeShade="FF"/>
+        </w:rPr>
+        <w:t>RH 5 -</w:t>
+      </w:r>
+      <w:r>
+        <w:rPr>
+          <w:color w:val="000000" w:themeColor="text1" w:themeTint="FF" w:themeShade="FF"/>
+        </w:rPr>
+        <w:t xml:space="preserve"> Mouse</w:t>
+      </w:r>
+      <w:bookmarkStart w:name="_zgip7uuby6ix" w:id="14"/>
+      <w:bookmarkEnd w:id="14"/>
+    </w:p>
+    <w:p>
+      <w:pPr>
+        <w:keepNext w:val="1"/>
+        <w:pBdr>
+          <w:top w:val="nil" w:color="FF000000" w:sz="0" w:space="0"/>
+          <w:left w:val="nil" w:color="FF000000" w:sz="0" w:space="0"/>
+          <w:bottom w:val="nil" w:color="FF000000" w:sz="0" w:space="0"/>
+          <w:right w:val="nil" w:color="FF000000" w:sz="0" w:space="0"/>
+          <w:between w:val="nil" w:color="FF000000" w:sz="0" w:space="0"/>
+        </w:pBdr>
+        <w:rPr>
           <w:color w:val="0070C0"/>
         </w:rPr>
       </w:pPr>
-      <w:bookmarkStart w:name="_47l4drcmyedf" w:colFirst="0" w:colLast="0" w:id="13"/>
-      <w:bookmarkEnd w:id="13"/>
+      <w:r>
+        <w:rPr>
+          <w:smallCaps w:val="1"/>
+          <w:color w:val="000000" w:themeColor="text1" w:themeTint="FF" w:themeShade="FF"/>
+        </w:rPr>
+        <w:t>3.3 RECURSOS DE SOFTWARE</w:t>
+      </w:r>
       <w:r>
         <w:rPr>
           <w:color w:val="0070C0"/>
         </w:rPr>
-        <w:t xml:space="preserve">Escreva as configurações de computadores e demais periféricos a ser utilizados para o desenvolvimento do trabalho. </w:t>
-      </w:r>
-    </w:p>
-    <w:p>
-      <w:pPr>
-        <w:jc w:val="both"/>
-        <w:rPr>
-          <w:color w:val="0070C0"/>
-        </w:rPr>
-      </w:pPr>
-      <w:r>
-        <w:rPr>
-          <w:color w:val="0070C0"/>
-        </w:rPr>
-        <w:t xml:space="preserve">Exemplos: </w:t>
-      </w:r>
-    </w:p>
-    <w:p>
-      <w:pPr>
-        <w:jc w:val="both"/>
-        <w:rPr>
-          <w:color w:val="0070C0"/>
-        </w:rPr>
-      </w:pPr>
-      <w:r>
-        <w:rPr>
-          <w:color w:val="0070C0"/>
-        </w:rPr>
-        <w:t xml:space="preserve">RH 1 – Três microcomputadores com processadores Intel i7, 4,9 GHz, 32-bit (x86); 16 </w:t>
-      </w:r>
-      <w:proofErr w:type="spellStart"/>
-      <w:r>
-        <w:rPr>
-          <w:color w:val="0070C0"/>
-        </w:rPr>
-        <w:t>Gbytes</w:t>
-      </w:r>
-      <w:proofErr w:type="spellEnd"/>
-      <w:r>
-        <w:rPr>
-          <w:color w:val="0070C0"/>
-        </w:rPr>
-        <w:t xml:space="preserve"> RAM e 16 </w:t>
-      </w:r>
-      <w:proofErr w:type="spellStart"/>
-      <w:r>
-        <w:rPr>
-          <w:color w:val="0070C0"/>
-        </w:rPr>
-        <w:t>Gbytes</w:t>
-      </w:r>
-      <w:proofErr w:type="spellEnd"/>
-      <w:r>
-        <w:rPr>
-          <w:color w:val="0070C0"/>
-        </w:rPr>
-        <w:t xml:space="preserve"> de espaço livre em disco.</w:t>
-      </w:r>
-    </w:p>
-    <w:p>
-      <w:pPr>
-        <w:jc w:val="both"/>
-        <w:rPr>
-          <w:color w:val="0070C0"/>
-        </w:rPr>
-      </w:pPr>
-      <w:r>
-        <w:rPr>
-          <w:color w:val="0070C0"/>
-        </w:rPr>
-        <w:t>RH 2 – Uma Impressora HP Deskjet colorida.</w:t>
-      </w:r>
-    </w:p>
-    <w:p>
-      <w:pPr>
-        <w:jc w:val="both"/>
-        <w:rPr>
-          <w:color w:val="0070C0"/>
-        </w:rPr>
-      </w:pPr>
-      <w:r>
-        <w:rPr>
-          <w:color w:val="0070C0"/>
-        </w:rPr>
-        <w:t xml:space="preserve">RH 3 – </w:t>
-      </w:r>
-      <w:proofErr w:type="gramStart"/>
-      <w:r>
-        <w:rPr>
-          <w:color w:val="0070C0"/>
-        </w:rPr>
-        <w:t xml:space="preserve">Uma </w:t>
-      </w:r>
-      <w:r>
-        <w:rPr>
-          <w:i/>
-          <w:iCs/>
-          <w:color w:val="0070C0"/>
-        </w:rPr>
-        <w:t>webcam</w:t>
-      </w:r>
-      <w:proofErr w:type="gramEnd"/>
-      <w:r>
-        <w:rPr>
-          <w:color w:val="0070C0"/>
-        </w:rPr>
-        <w:t xml:space="preserve"> com resolução mínima de 6 MP.</w:t>
-      </w:r>
-    </w:p>
-    <w:p>
-      <w:pPr>
-        <w:jc w:val="both"/>
-        <w:rPr>
-          <w:color w:val="FF0000"/>
-        </w:rPr>
-      </w:pPr>
-      <w:bookmarkStart w:name="_zgip7uuby6ix" w:colFirst="0" w:colLast="0" w:id="14"/>
-      <w:bookmarkEnd w:id="14"/>
-    </w:p>
-    <w:p>
-      <w:pPr>
-        <w:keepNext/>
-        <w:pBdr>
-          <w:top w:val="nil"/>
-          <w:left w:val="nil"/>
-          <w:bottom w:val="nil"/>
-          <w:right w:val="nil"/>
-          <w:between w:val="nil"/>
-        </w:pBdr>
-        <w:rPr>
-          <w:smallCaps/>
-          <w:color w:val="000000"/>
-        </w:rPr>
-      </w:pPr>
-      <w:r>
-        <w:rPr>
-          <w:smallCaps/>
-          <w:color w:val="000000"/>
-        </w:rPr>
-        <w:t>3.3 RECURSOS DE SOFTWARE</w:t>
-      </w:r>
-    </w:p>
-    <w:p>
-      <w:pPr>
-        <w:jc w:val="both"/>
-        <w:rPr>
-          <w:color w:val="0070C0"/>
-        </w:rPr>
-      </w:pPr>
-      <w:r>
-        <w:rPr>
-          <w:color w:val="0070C0"/>
-        </w:rPr>
-        <w:t xml:space="preserve">Exemplos: </w:t>
-      </w:r>
-    </w:p>
-    <w:p>
-      <w:pPr>
-        <w:rPr>
-          <w:color w:val="0070C0"/>
+        <w:t xml:space="preserve"> </w:t>
+      </w:r>
+    </w:p>
+    <w:p>
+      <w:pPr>
+        <w:rPr>
+          <w:color w:val="000000" w:themeColor="text1" w:themeTint="FF" w:themeShade="FF"/>
           <w:lang w:val="en-US"/>
         </w:rPr>
       </w:pPr>
       <w:r>
         <w:rPr>
-          <w:color w:val="0070C0"/>
+          <w:color w:val="000000" w:themeColor="text1" w:themeTint="FF" w:themeShade="FF"/>
           <w:lang w:val="en-US"/>
         </w:rPr>
-        <w:t>RS 1 -  IntelliJ IDEA v. 2025.</w:t>
-      </w:r>
-    </w:p>
-    <w:p>
-      <w:pPr>
-        <w:rPr>
-          <w:color w:val="0070C0"/>
+        <w:t xml:space="preserve">RS 1 </w:t>
+      </w:r>
+      <w:r>
+        <w:rPr>
+          <w:color w:val="000000" w:themeColor="text1" w:themeTint="FF" w:themeShade="FF"/>
           <w:lang w:val="en-US"/>
         </w:rPr>
-      </w:pPr>
-      <w:r>
-        <w:rPr>
-          <w:color w:val="0070C0"/>
+        <w:t>-  IntelliJ</w:t>
+      </w:r>
+      <w:r>
+        <w:rPr>
+          <w:color w:val="000000" w:themeColor="text1" w:themeTint="FF" w:themeShade="FF"/>
           <w:lang w:val="en-US"/>
         </w:rPr>
+        <w:t xml:space="preserve"> IDEA v. 2025.</w:t>
+      </w:r>
+    </w:p>
+    <w:p>
+      <w:pPr>
+        <w:rPr>
+          <w:color w:val="000000" w:themeColor="text1" w:themeTint="FF" w:themeShade="FF"/>
+          <w:lang w:val="en-US"/>
+        </w:rPr>
+      </w:pPr>
+      <w:r>
+        <w:rPr>
+          <w:color w:val="000000" w:themeColor="text1" w:themeTint="FF" w:themeShade="FF"/>
+          <w:lang w:val="en-US"/>
+        </w:rPr>
         <w:t xml:space="preserve">RS </w:t>
       </w:r>
-      <w:proofErr w:type="gramStart"/>
-      <w:r>
-        <w:rPr>
-          <w:color w:val="0070C0"/>
+      <w:r>
+        <w:rPr>
+          <w:color w:val="000000" w:themeColor="text1" w:themeTint="FF" w:themeShade="FF"/>
           <w:lang w:val="en-US"/>
         </w:rPr>
         <w:t>2  -</w:t>
       </w:r>
-      <w:proofErr w:type="gramEnd"/>
-      <w:r>
-        <w:rPr>
-          <w:color w:val="0070C0"/>
+      <w:r>
+        <w:rPr>
+          <w:color w:val="000000" w:themeColor="text1" w:themeTint="FF" w:themeShade="FF"/>
           <w:lang w:val="en-US"/>
         </w:rPr>
         <w:t xml:space="preserve"> Microsoft Word 2019.</w:t>
@@ -4075,24 +4641,114 @@
     <w:p>
       <w:pPr>
         <w:rPr>
-          <w:color w:val="0070C0"/>
-        </w:rPr>
-      </w:pPr>
-      <w:r>
-        <w:rPr>
-          <w:color w:val="0070C0"/>
+          <w:color w:val="000000" w:themeColor="text1" w:themeTint="FF" w:themeShade="FF"/>
+        </w:rPr>
+      </w:pPr>
+      <w:r>
+        <w:rPr>
+          <w:color w:val="000000" w:themeColor="text1" w:themeTint="FF" w:themeShade="FF"/>
         </w:rPr>
         <w:t>RS 3 - Sistema operacional Microsoft Windows 11 Professional.</w:t>
       </w:r>
-    </w:p>
-    <w:p>
-      <w:pPr>
-        <w:rPr>
-          <w:color w:val="FF0000"/>
-        </w:rPr>
-      </w:pPr>
-      <w:bookmarkStart w:name="_pxyab1tdqc6h" w:colFirst="0" w:colLast="0" w:id="15"/>
+      <w:bookmarkStart w:name="_pxyab1tdqc6h" w:id="15"/>
       <w:bookmarkEnd w:id="15"/>
+    </w:p>
+    <w:p>
+      <w:pPr>
+        <w:rPr>
+          <w:color w:val="000000" w:themeColor="text1" w:themeTint="FF" w:themeShade="FF"/>
+        </w:rPr>
+      </w:pPr>
+      <w:r>
+        <w:rPr>
+          <w:color w:val="000000" w:themeColor="text1" w:themeTint="FF" w:themeShade="FF"/>
+        </w:rPr>
+        <w:t>RS 4 - PostgreSQL</w:t>
+      </w:r>
+    </w:p>
+    <w:p>
+      <w:pPr>
+        <w:rPr>
+          <w:color w:val="000000" w:themeColor="text1" w:themeTint="FF" w:themeShade="FF"/>
+        </w:rPr>
+      </w:pPr>
+      <w:r>
+        <w:rPr>
+          <w:color w:val="000000" w:themeColor="text1" w:themeTint="FF" w:themeShade="FF"/>
+        </w:rPr>
+        <w:t xml:space="preserve">RS 5 </w:t>
+      </w:r>
+      <w:r>
+        <w:rPr>
+          <w:color w:val="000000" w:themeColor="text1" w:themeTint="FF" w:themeShade="FF"/>
+        </w:rPr>
+        <w:t xml:space="preserve">- </w:t>
+      </w:r>
+      <w:r>
+        <w:rPr>
+          <w:color w:val="000000" w:themeColor="text1" w:themeTint="FF" w:themeShade="FF"/>
+        </w:rPr>
+        <w:t xml:space="preserve"> </w:t>
+      </w:r>
+      <w:r>
+        <w:rPr>
+          <w:color w:val="000000" w:themeColor="text1" w:themeTint="FF" w:themeShade="FF"/>
+        </w:rPr>
+        <w:t>Git</w:t>
+      </w:r>
+    </w:p>
+    <w:p>
+      <w:pPr>
+        <w:rPr>
+          <w:color w:val="000000" w:themeColor="text1" w:themeTint="FF" w:themeShade="FF"/>
+        </w:rPr>
+      </w:pPr>
+      <w:r>
+        <w:rPr>
+          <w:color w:val="000000" w:themeColor="text1" w:themeTint="FF" w:themeShade="FF"/>
+        </w:rPr>
+        <w:t xml:space="preserve">RS 6 – </w:t>
+      </w:r>
+      <w:r>
+        <w:rPr>
+          <w:color w:val="000000" w:themeColor="text1" w:themeTint="FF" w:themeShade="FF"/>
+        </w:rPr>
+        <w:t>Notepad</w:t>
+      </w:r>
+      <w:r>
+        <w:rPr>
+          <w:color w:val="000000" w:themeColor="text1" w:themeTint="FF" w:themeShade="FF"/>
+        </w:rPr>
+        <w:t xml:space="preserve"> ++</w:t>
+      </w:r>
+    </w:p>
+    <w:p>
+      <w:pPr>
+        <w:rPr>
+          <w:color w:val="000000" w:themeColor="text1" w:themeTint="FF" w:themeShade="FF"/>
+        </w:rPr>
+      </w:pPr>
+    </w:p>
+    <w:p>
+      <w:pPr>
+        <w:rPr>
+          <w:color w:val="000000" w:themeColor="text1" w:themeTint="FF" w:themeShade="FF"/>
+        </w:rPr>
+      </w:pPr>
+    </w:p>
+    <w:p>
+      <w:pPr>
+        <w:rPr>
+          <w:color w:val="000000" w:themeColor="text1" w:themeTint="FF" w:themeShade="FF"/>
+        </w:rPr>
+      </w:pPr>
+    </w:p>
+    <w:p>
+      <w:pPr>
+        <w:rPr>
+          <w:color w:val="000000" w:themeColor="text1" w:themeTint="FF" w:themeShade="FF"/>
+        </w:rPr>
+      </w:pPr>
     </w:p>
     <w:p>
       <w:pPr>
@@ -4112,35 +4768,119 @@
       </w:pPr>
       <w:r>
         <w:rPr>
-          <w:smallCaps/>
-          <w:color w:val="000000"/>
+          <w:smallCaps w:val="1"/>
+          <w:color w:val="000000" w:themeColor="text1" w:themeTint="FF" w:themeShade="FF"/>
         </w:rPr>
         <w:t xml:space="preserve">3.4 OUTROS RECURSOS </w:t>
       </w:r>
     </w:p>
     <w:p>
       <w:pPr>
+        <w:spacing w:before="240" w:beforeAutospacing="off" w:after="240" w:afterAutospacing="off"/>
         <w:jc w:val="both"/>
         <w:rPr>
-          <w:color w:val="0070C0"/>
-        </w:rPr>
-      </w:pPr>
-      <w:r>
-        <w:rPr>
-          <w:color w:val="0070C0"/>
-        </w:rPr>
-        <w:t>Outros equipamentos, materiais ou recursos financeiros necessários para o trabalho. Por exemplo: vídeos, gravadores e câmera de vídeo.</w:t>
-      </w:r>
-    </w:p>
-    <w:p>
-      <w:pPr>
+          <w:rFonts w:ascii="Times New Roman" w:hAnsi="Times New Roman" w:eastAsia="Times New Roman" w:cs="Times New Roman"/>
+          <w:noProof w:val="0"/>
+          <w:sz w:val="24"/>
+          <w:szCs w:val="24"/>
+          <w:lang w:val="pt-BR"/>
+        </w:rPr>
+      </w:pPr>
+      <w:r>
+        <w:rPr>
+          <w:rFonts w:ascii="Times New Roman" w:hAnsi="Times New Roman" w:eastAsia="Times New Roman" w:cs="Times New Roman"/>
+          <w:noProof w:val="0"/>
+          <w:color w:val="auto"/>
+          <w:sz w:val="24"/>
+          <w:szCs w:val="24"/>
+          <w:lang w:val="pt-BR" w:eastAsia="pt-BR" w:bidi="ar-SA"/>
+        </w:rPr>
+        <w:t xml:space="preserve">Os outros recursos do projeto </w:t>
+      </w:r>
+      <w:r>
+        <w:rPr>
+          <w:rFonts w:ascii="Times New Roman" w:hAnsi="Times New Roman" w:eastAsia="Times New Roman" w:cs="Times New Roman"/>
+          <w:noProof w:val="0"/>
+          <w:color w:val="auto"/>
+          <w:sz w:val="24"/>
+          <w:szCs w:val="24"/>
+          <w:lang w:val="pt-BR" w:eastAsia="pt-BR" w:bidi="ar-SA"/>
+        </w:rPr>
+        <w:t>ElderConnect</w:t>
+      </w:r>
+      <w:r>
+        <w:rPr>
+          <w:rFonts w:ascii="Times New Roman" w:hAnsi="Times New Roman" w:eastAsia="Times New Roman" w:cs="Times New Roman"/>
+          <w:noProof w:val="0"/>
+          <w:color w:val="auto"/>
+          <w:sz w:val="24"/>
+          <w:szCs w:val="24"/>
+          <w:lang w:val="pt-BR" w:eastAsia="pt-BR" w:bidi="ar-SA"/>
+        </w:rPr>
+        <w:t xml:space="preserve"> envolvem elementos complementares que auxiliam no desenvolvimento e na organização das atividades. Entre eles, destacam-se o uso de ferramentas de apoio para comunicação e gerenciamento de tarefas, como plataformas de mensagens e controle de versionamento, que facilitam a colaboração entre os integrantes da equipe.</w:t>
+      </w:r>
+    </w:p>
+    <w:p>
+      <w:pPr>
+        <w:spacing w:before="240" w:beforeAutospacing="off" w:after="240" w:afterAutospacing="off"/>
         <w:jc w:val="both"/>
         <w:rPr>
-          <w:color w:val="0070C0"/>
-        </w:rPr>
-      </w:pPr>
-      <w:bookmarkStart w:name="_3unqfi5pywb" w:colFirst="0" w:colLast="0" w:id="16"/>
+          <w:rFonts w:ascii="Times New Roman" w:hAnsi="Times New Roman" w:eastAsia="Times New Roman" w:cs="Times New Roman"/>
+          <w:noProof w:val="0"/>
+          <w:sz w:val="24"/>
+          <w:szCs w:val="24"/>
+          <w:lang w:val="pt-BR"/>
+        </w:rPr>
+      </w:pPr>
+      <w:r>
+        <w:rPr>
+          <w:rFonts w:ascii="Times New Roman" w:hAnsi="Times New Roman" w:eastAsia="Times New Roman" w:cs="Times New Roman"/>
+          <w:noProof w:val="0"/>
+          <w:color w:val="auto"/>
+          <w:sz w:val="24"/>
+          <w:szCs w:val="24"/>
+          <w:lang w:val="pt-BR" w:eastAsia="pt-BR" w:bidi="ar-SA"/>
+        </w:rPr>
+        <w:t xml:space="preserve">Além disso, podem ser utilizados materiais digitais, como documentações, tutoriais e </w:t>
+      </w:r>
+      <w:r>
+        <w:rPr>
+          <w:rFonts w:ascii="Times New Roman" w:hAnsi="Times New Roman" w:eastAsia="Times New Roman" w:cs="Times New Roman"/>
+          <w:noProof w:val="0"/>
+          <w:color w:val="auto"/>
+          <w:sz w:val="24"/>
+          <w:szCs w:val="24"/>
+          <w:lang w:val="pt-BR" w:eastAsia="pt-BR" w:bidi="ar-SA"/>
+        </w:rPr>
+        <w:t>conteúdo</w:t>
+      </w:r>
+      <w:r>
+        <w:rPr>
+          <w:rFonts w:ascii="Times New Roman" w:hAnsi="Times New Roman" w:eastAsia="Times New Roman" w:cs="Times New Roman"/>
+          <w:noProof w:val="0"/>
+          <w:color w:val="auto"/>
+          <w:sz w:val="24"/>
+          <w:szCs w:val="24"/>
+          <w:lang w:val="pt-BR" w:eastAsia="pt-BR" w:bidi="ar-SA"/>
+        </w:rPr>
+        <w:t xml:space="preserve"> em vídeo, que auxiliam no aprendizado e na resolução de dúvidas durante o desenvolvimento. Não há, neste projeto, a necessidade de investimentos financeiros significativos, uma vez que a maior parte dos recursos utilizados é de acesso gratuito ou já está disponível para os integrantes.</w:t>
+      </w:r>
+      <w:bookmarkStart w:name="_3unqfi5pywb" w:id="16"/>
       <w:bookmarkEnd w:id="16"/>
+    </w:p>
+    <w:p>
+      <w:pPr>
+        <w:spacing w:before="240" w:beforeAutospacing="off" w:after="240" w:afterAutospacing="off"/>
+        <w:jc w:val="both"/>
+        <w:rPr>
+          <w:rFonts w:ascii="Times New Roman" w:hAnsi="Times New Roman" w:eastAsia="Times New Roman" w:cs="Times New Roman"/>
+          <w:noProof w:val="0"/>
+          <w:color w:val="auto"/>
+          <w:sz w:val="24"/>
+          <w:szCs w:val="24"/>
+          <w:lang w:val="pt-BR" w:eastAsia="pt-BR" w:bidi="ar-SA"/>
+        </w:rPr>
+      </w:pPr>
     </w:p>
     <w:p>
       <w:pPr>
@@ -4160,7 +4900,7 @@
       </w:pPr>
       <w:r>
         <w:rPr>
-          <w:color w:val="000000"/>
+          <w:color w:val="000000" w:themeColor="text1" w:themeTint="FF" w:themeShade="FF"/>
         </w:rPr>
         <w:t>3.5 CRONOGRAMA DO PROJETO</w:t>
       </w:r>
@@ -4169,25 +4909,24 @@
       <w:pPr>
         <w:jc w:val="both"/>
         <w:rPr>
-          <w:color w:val="0070C0"/>
-        </w:rPr>
-      </w:pPr>
-      <w:r>
-        <w:rPr>
-          <w:color w:val="0070C0"/>
-        </w:rPr>
-        <w:t>Preencher o documento do Apêndice A. O cronograma deve ser continuamente atualizado pela equipe.</w:t>
-      </w:r>
-    </w:p>
-    <w:p>
-      <w:pPr>
-        <w:jc w:val="both"/>
-        <w:rPr>
-          <w:color w:val="0070C0"/>
-        </w:rPr>
-      </w:pPr>
-    </w:p>
-    <w:p/>
+          <w:rFonts w:ascii="Times New Roman" w:hAnsi="Times New Roman" w:eastAsia="Times New Roman" w:cs="Times New Roman"/>
+          <w:color w:val="auto"/>
+          <w:sz w:val="24"/>
+          <w:szCs w:val="24"/>
+          <w:lang w:eastAsia="pt-BR" w:bidi="ar-SA"/>
+        </w:rPr>
+      </w:pPr>
+      <w:r>
+        <w:rPr>
+          <w:rFonts w:ascii="Times New Roman" w:hAnsi="Times New Roman" w:eastAsia="Times New Roman" w:cs="Times New Roman"/>
+          <w:color w:val="auto"/>
+          <w:sz w:val="24"/>
+          <w:szCs w:val="24"/>
+          <w:lang w:eastAsia="pt-BR" w:bidi="ar-SA"/>
+        </w:rPr>
+        <w:t>Cronograma do projeto se encontra na pasta do apêndice A no repositório do GitHub.</w:t>
+      </w:r>
+    </w:p>
     <w:p>
       <w:pPr>
         <w:keepNext/>

</xml_diff>

<commit_message>
doc: correcao do resumo
</commit_message>
<xml_diff>
--- a/PID_Relatório_5o_e_6o.Períodos_2026.docx
+++ b/PID_Relatório_5o_e_6o.Períodos_2026.docx
@@ -1,6 +1,6 @@
 
 <file path=word/document.xml><?xml version="1.0" encoding="utf-8"?>
-<w:document xmlns:wpc="http://schemas.microsoft.com/office/word/2010/wordprocessingCanvas" xmlns:mc="http://schemas.openxmlformats.org/markup-compatibility/2006" xmlns:o="urn:schemas-microsoft-com:office:office" xmlns:r="http://schemas.openxmlformats.org/officeDocument/2006/relationships" xmlns:m="http://schemas.openxmlformats.org/officeDocument/2006/math" xmlns:v="urn:schemas-microsoft-com:vml" xmlns:wp14="http://schemas.microsoft.com/office/word/2010/wordprocessingDrawing" xmlns:wp="http://schemas.openxmlformats.org/drawingml/2006/wordprocessingDrawing" xmlns:w10="urn:schemas-microsoft-com:office:word" xmlns:w="http://schemas.openxmlformats.org/wordprocessingml/2006/main" xmlns:w14="http://schemas.microsoft.com/office/word/2010/wordml" xmlns:wpg="http://schemas.microsoft.com/office/word/2010/wordprocessingGroup" xmlns:wpi="http://schemas.microsoft.com/office/word/2010/wordprocessingInk" xmlns:wne="http://schemas.microsoft.com/office/word/2006/wordml" xmlns:wps="http://schemas.microsoft.com/office/word/2010/wordprocessingShape" mc:Ignorable="w14 wp14">
+<w:document xmlns:wpc="http://schemas.microsoft.com/office/word/2010/wordprocessingCanvas" xmlns:cx="http://schemas.microsoft.com/office/drawing/2014/chartex" xmlns:cx1="http://schemas.microsoft.com/office/drawing/2015/9/8/chartex" xmlns:cx2="http://schemas.microsoft.com/office/drawing/2015/10/21/chartex" xmlns:cx3="http://schemas.microsoft.com/office/drawing/2016/5/9/chartex" xmlns:cx4="http://schemas.microsoft.com/office/drawing/2016/5/10/chartex" xmlns:cx5="http://schemas.microsoft.com/office/drawing/2016/5/11/chartex" xmlns:cx6="http://schemas.microsoft.com/office/drawing/2016/5/12/chartex" xmlns:cx7="http://schemas.microsoft.com/office/drawing/2016/5/13/chartex" xmlns:cx8="http://schemas.microsoft.com/office/drawing/2016/5/14/chartex" xmlns:mc="http://schemas.openxmlformats.org/markup-compatibility/2006" xmlns:aink="http://schemas.microsoft.com/office/drawing/2016/ink" xmlns:am3d="http://schemas.microsoft.com/office/drawing/2017/model3d" xmlns:o="urn:schemas-microsoft-com:office:office" xmlns:oel="http://schemas.microsoft.com/office/2019/extlst" xmlns:r="http://schemas.openxmlformats.org/officeDocument/2006/relationships" xmlns:m="http://schemas.openxmlformats.org/officeDocument/2006/math" xmlns:v="urn:schemas-microsoft-com:vml" xmlns:wp14="http://schemas.microsoft.com/office/word/2010/wordprocessingDrawing" xmlns:wp="http://schemas.openxmlformats.org/drawingml/2006/wordprocessingDrawing" xmlns:w10="urn:schemas-microsoft-com:office:word" xmlns:w="http://schemas.openxmlformats.org/wordprocessingml/2006/main" xmlns:w14="http://schemas.microsoft.com/office/word/2010/wordml" xmlns:w15="http://schemas.microsoft.com/office/word/2012/wordml" xmlns:w16cex="http://schemas.microsoft.com/office/word/2018/wordml/cex" xmlns:w16cid="http://schemas.microsoft.com/office/word/2016/wordml/cid" xmlns:w16="http://schemas.microsoft.com/office/word/2018/wordml" xmlns:w16du="http://schemas.microsoft.com/office/word/2023/wordml/word16du" xmlns:w16sdtdh="http://schemas.microsoft.com/office/word/2020/wordml/sdtdatahash" xmlns:w16sdtfl="http://schemas.microsoft.com/office/word/2024/wordml/sdtformatlock" xmlns:w16se="http://schemas.microsoft.com/office/word/2015/wordml/symex" xmlns:wpg="http://schemas.microsoft.com/office/word/2010/wordprocessingGroup" xmlns:wpi="http://schemas.microsoft.com/office/word/2010/wordprocessingInk" xmlns:wne="http://schemas.microsoft.com/office/word/2006/wordml" xmlns:wps="http://schemas.microsoft.com/office/word/2010/wordprocessingShape" mc:Ignorable="w14 w15 w16se w16cid w16 w16cex w16sdtdh w16sdtfl w16du wp14">
   <w:body>
     <w:p>
       <w:pPr>
@@ -24,18 +24,8 @@
           <w:bCs/>
           <w:color w:val="000000"/>
         </w:rPr>
-        <w:t xml:space="preserve">FAI – CENTRO DE ENSINO SUPERIOR EM GESTÃO, TECNOLOGIA E </w:t>
-      </w:r>
-      <w:proofErr w:type="gramStart"/>
-      <w:r>
-        <w:rPr>
-          <w:b/>
-          <w:bCs/>
-          <w:color w:val="000000"/>
-        </w:rPr>
-        <w:t>EDUCAÇÃO</w:t>
-      </w:r>
-      <w:proofErr w:type="gramEnd"/>
+        <w:t>FAI – CENTRO DE ENSINO SUPERIOR EM GESTÃO, TECNOLOGIA E EDUCAÇÃO</w:t>
+      </w:r>
     </w:p>
     <w:p>
       <w:pPr>
@@ -212,17 +202,8 @@
           <w:bCs/>
         </w:rPr>
         <w:lastRenderedPageBreak/>
-        <w:t xml:space="preserve">FAI – CENTRO DE ENSINO SUPERIOR EM GESTÃO, TECNOLOGIA E </w:t>
-      </w:r>
-      <w:proofErr w:type="gramStart"/>
-      <w:r>
-        <w:rPr>
-          <w:b/>
-          <w:bCs/>
-        </w:rPr>
-        <w:t>EDUCAÇÃO</w:t>
-      </w:r>
-      <w:proofErr w:type="gramEnd"/>
+        <w:t>FAI – CENTRO DE ENSINO SUPERIOR EM GESTÃO, TECNOLOGIA E EDUCAÇÃO</w:t>
+      </w:r>
     </w:p>
     <w:p>
       <w:pPr>
@@ -579,16 +560,11 @@
               <w:spacing w:before="40" w:after="40"/>
               <w:jc w:val="center"/>
             </w:pPr>
-            <w:proofErr w:type="gramStart"/>
             <w:r>
               <w:t>v</w:t>
             </w:r>
             <w:r>
-              <w:t>1</w:t>
-            </w:r>
-            <w:proofErr w:type="gramEnd"/>
-            <w:r>
-              <w:t>.0</w:t>
+              <w:t>1.0</w:t>
             </w:r>
           </w:p>
         </w:tc>
@@ -686,7 +662,6 @@
                 <w:color w:val="000000" w:themeColor="text1"/>
               </w:rPr>
             </w:pPr>
-            <w:proofErr w:type="gramStart"/>
             <w:r>
               <w:rPr>
                 <w:color w:val="000000" w:themeColor="text1"/>
@@ -697,14 +672,7 @@
               <w:rPr>
                 <w:color w:val="000000" w:themeColor="text1"/>
               </w:rPr>
-              <w:t>1</w:t>
-            </w:r>
-            <w:proofErr w:type="gramEnd"/>
-            <w:r>
-              <w:rPr>
-                <w:color w:val="000000" w:themeColor="text1"/>
-              </w:rPr>
-              <w:t>.1</w:t>
+              <w:t>1.1</w:t>
             </w:r>
           </w:p>
         </w:tc>
@@ -786,7 +754,6 @@
                 <w:color w:val="000000" w:themeColor="text1"/>
               </w:rPr>
             </w:pPr>
-            <w:proofErr w:type="gramStart"/>
             <w:r>
               <w:rPr>
                 <w:color w:val="000000" w:themeColor="text1"/>
@@ -797,14 +764,7 @@
               <w:rPr>
                 <w:color w:val="000000" w:themeColor="text1"/>
               </w:rPr>
-              <w:t>1</w:t>
-            </w:r>
-            <w:proofErr w:type="gramEnd"/>
-            <w:r>
-              <w:rPr>
-                <w:color w:val="000000" w:themeColor="text1"/>
-              </w:rPr>
-              <w:t>.2</w:t>
+              <w:t>1.2</w:t>
             </w:r>
           </w:p>
         </w:tc>
@@ -899,7 +859,6 @@
                 <w:color w:val="000000" w:themeColor="text1"/>
               </w:rPr>
             </w:pPr>
-            <w:proofErr w:type="gramStart"/>
             <w:r>
               <w:rPr>
                 <w:color w:val="000000" w:themeColor="text1"/>
@@ -910,14 +869,7 @@
               <w:rPr>
                 <w:color w:val="000000" w:themeColor="text1"/>
               </w:rPr>
-              <w:t>1</w:t>
-            </w:r>
-            <w:proofErr w:type="gramEnd"/>
-            <w:r>
-              <w:rPr>
-                <w:color w:val="000000" w:themeColor="text1"/>
-              </w:rPr>
-              <w:t>.3</w:t>
+              <w:t>1.3</w:t>
             </w:r>
           </w:p>
         </w:tc>
@@ -999,14 +951,12 @@
                 <w:color w:val="000000" w:themeColor="text1"/>
               </w:rPr>
             </w:pPr>
-            <w:proofErr w:type="gramStart"/>
             <w:r>
               <w:rPr>
                 <w:color w:val="000000" w:themeColor="text1"/>
               </w:rPr>
               <w:t>v2</w:t>
             </w:r>
-            <w:proofErr w:type="gramEnd"/>
           </w:p>
         </w:tc>
         <w:tc>
@@ -1075,14 +1025,12 @@
                 <w:color w:val="000000" w:themeColor="text1"/>
               </w:rPr>
             </w:pPr>
-            <w:proofErr w:type="gramStart"/>
             <w:r>
               <w:rPr>
                 <w:color w:val="000000" w:themeColor="text1"/>
               </w:rPr>
               <w:t>v3</w:t>
             </w:r>
-            <w:proofErr w:type="gramEnd"/>
           </w:p>
         </w:tc>
         <w:tc>
@@ -1117,10 +1065,83 @@
           </w:p>
         </w:tc>
       </w:tr>
+      <w:tr>
+        <w:trPr>
+          <w:trHeight w:val="300"/>
+        </w:trPr>
+        <w:tc>
+          <w:tcPr>
+            <w:tcW w:w="1272" w:type="dxa"/>
+          </w:tcPr>
+          <w:p>
+            <w:pPr>
+              <w:jc w:val="center"/>
+              <w:rPr>
+                <w:color w:val="000000" w:themeColor="text1"/>
+              </w:rPr>
+            </w:pPr>
+            <w:r>
+              <w:rPr>
+                <w:color w:val="000000" w:themeColor="text1"/>
+              </w:rPr>
+              <w:t>01/05/26</w:t>
+            </w:r>
+          </w:p>
+        </w:tc>
+        <w:tc>
+          <w:tcPr>
+            <w:tcW w:w="1275" w:type="dxa"/>
+          </w:tcPr>
+          <w:p>
+            <w:pPr>
+              <w:jc w:val="center"/>
+              <w:rPr>
+                <w:color w:val="000000" w:themeColor="text1"/>
+              </w:rPr>
+            </w:pPr>
+            <w:r>
+              <w:rPr>
+                <w:color w:val="000000" w:themeColor="text1"/>
+              </w:rPr>
+              <w:t>V3.1</w:t>
+            </w:r>
+          </w:p>
+        </w:tc>
+        <w:tc>
+          <w:tcPr>
+            <w:tcW w:w="1977" w:type="dxa"/>
+          </w:tcPr>
+          <w:p>
+            <w:pPr>
+              <w:rPr>
+                <w:color w:val="000000" w:themeColor="text1"/>
+              </w:rPr>
+            </w:pPr>
+            <w:r>
+              <w:rPr>
+                <w:color w:val="000000" w:themeColor="text1"/>
+              </w:rPr>
+              <w:t>Marcela</w:t>
+            </w:r>
+          </w:p>
+        </w:tc>
+        <w:tc>
+          <w:tcPr>
+            <w:tcW w:w="4402" w:type="dxa"/>
+          </w:tcPr>
+          <w:p>
+            <w:pPr>
+              <w:jc w:val="both"/>
+            </w:pPr>
+            <w:r>
+              <w:t>Resumo (Ajustes no texto)</w:t>
+            </w:r>
+          </w:p>
+        </w:tc>
+      </w:tr>
     </w:tbl>
     <w:p>
       <w:pPr>
-        <w:jc w:val="center"/>
         <w:rPr>
           <w:sz w:val="28"/>
           <w:szCs w:val="28"/>
@@ -1168,21 +1189,22 @@
       <w:r>
         <w:t xml:space="preserve">Com o aumento do envelhecimento da população nas últimas décadas, houve dificuldades para os familiares na organização das atividades diárias e no acompanhamento adequado da rotina de cuidado, necessitando do auxílio de cuidadores especializados. Devido à dificuldade de encontrar cuidadores confiáveis, o </w:t>
       </w:r>
-      <w:proofErr w:type="gramStart"/>
+      <w:proofErr w:type="spellStart"/>
       <w:r>
         <w:t>ElderConnect</w:t>
       </w:r>
-      <w:proofErr w:type="gramEnd"/>
-      <w:r>
-        <w:t xml:space="preserve"> foi criado com o objetivo de auxiliar na conexão entre cuidadores e familiares, além de contribuir para o gerenciamento das atividades de cuidado. O sistema será projetado usando Java e </w:t>
-      </w:r>
-      <w:proofErr w:type="gramStart"/>
-      <w:r>
-        <w:t>PostSQL</w:t>
-      </w:r>
-      <w:proofErr w:type="gramEnd"/>
-      <w:r>
-        <w:t xml:space="preserve"> para banco de dados. O objetivo é desenvolver um sistema que auxilie e facilite o cuidado com pessoas idosas.</w:t>
+      <w:proofErr w:type="spellEnd"/>
+      <w:r>
+        <w:t xml:space="preserve"> foi criado com o objetivo de auxiliar na conexão entre cuidadores e familiares, além de contribuir para o gerenciamento das atividades de cuidado. </w:t>
+      </w:r>
+      <w:r>
+        <w:t>A metodologia adotada consiste em</w:t>
+      </w:r>
+      <w:r>
+        <w:t xml:space="preserve"> etapas de levantamento de requisitos, análise, modelagem, implementação e testes. Espera-se que o sistema reduza a dificuldade na busca por cuidadores e melhore na organização da rotina de cuidados, tornando mais fácil e mais segura.</w:t>
+      </w:r>
+      <w:r>
+        <w:t xml:space="preserve"> Dessa forma, o sistema se apresenta como uma solução para apoiar o cuidado com idosos.</w:t>
       </w:r>
     </w:p>
     <w:p>
@@ -1292,20 +1314,20 @@
               </wp:anchor>
             </w:drawing>
           </mc:Choice>
-          <mc:Fallback xmlns:cx1="http://schemas.microsoft.com/office/drawing/2015/9/8/chartex" xmlns:cx2="http://schemas.microsoft.com/office/drawing/2015/10/21/chartex" xmlns:cx3="http://schemas.microsoft.com/office/drawing/2016/5/9/chartex" xmlns:cx4="http://schemas.microsoft.com/office/drawing/2016/5/10/chartex" xmlns:cx5="http://schemas.microsoft.com/office/drawing/2016/5/11/chartex" xmlns:cx6="http://schemas.microsoft.com/office/drawing/2016/5/12/chartex" xmlns:cx7="http://schemas.microsoft.com/office/drawing/2016/5/13/chartex" xmlns:cx8="http://schemas.microsoft.com/office/drawing/2016/5/14/chartex" xmlns:aink="http://schemas.microsoft.com/office/drawing/2016/ink" xmlns:am3d="http://schemas.microsoft.com/office/drawing/2017/model3d" xmlns:oel="http://schemas.microsoft.com/office/2019/extlst" xmlns:w16cex="http://schemas.microsoft.com/office/word/2018/wordml/cex" xmlns:w16cid="http://schemas.microsoft.com/office/word/2016/wordml/cid" xmlns:w16="http://schemas.microsoft.com/office/word/2018/wordml" xmlns:w16du="http://schemas.microsoft.com/office/word/2023/wordml/word16du" xmlns:w16sdtdh="http://schemas.microsoft.com/office/word/2020/wordml/sdtdatahash" xmlns:w16sdtfl="http://schemas.microsoft.com/office/word/2024/wordml/sdtformatlock" xmlns:a="http://schemas.openxmlformats.org/drawingml/2006/main" xmlns:w16se="http://schemas.microsoft.com/office/word/2015/wordml/symex" xmlns:w15="http://schemas.microsoft.com/office/word/2012/wordml" xmlns:cx="http://schemas.microsoft.com/office/drawing/2014/chartex">
-            <w:pict w14:anchorId="08459B00">
-              <v:shapetype id="_x0000_t202" coordsize="21600,21600" o:spt="202" path="m,l,21600r21600,l21600,xe" w14:anchorId="7018CBA8">
+          <mc:Fallback>
+            <w:pict>
+              <v:shapetype w14:anchorId="7018CBA8" id="_x0000_t202" coordsize="21600,21600" o:spt="202" path="m,l,21600r21600,l21600,xe">
                 <v:stroke joinstyle="miter"/>
                 <v:path gradientshapeok="t" o:connecttype="rect"/>
               </v:shapetype>
-              <v:shape id="Caixa de Texto 1" style="position:absolute;margin-left:445pt;margin-top:-47.6pt;width:10pt;height:13.6pt;z-index:251658240;visibility:visible;mso-wrap-style:square;mso-wrap-distance-left:9pt;mso-wrap-distance-top:0;mso-wrap-distance-right:9pt;mso-wrap-distance-bottom:0;mso-position-horizontal:absolute;mso-position-horizontal-relative:text;mso-position-vertical:absolute;mso-position-vertical-relative:text;v-text-anchor:top" o:spid="_x0000_s1026" stroked="f" type="#_x0000_t202" o:gfxdata="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">
+              <v:shape id="Caixa de Texto 1" o:spid="_x0000_s1026" type="#_x0000_t202" style="position:absolute;margin-left:445pt;margin-top:-47.6pt;width:10pt;height:13.6pt;z-index:251658240;visibility:visible;mso-wrap-style:square;mso-wrap-distance-left:9pt;mso-wrap-distance-top:0;mso-wrap-distance-right:9pt;mso-wrap-distance-bottom:0;mso-position-horizontal:absolute;mso-position-horizontal-relative:text;mso-position-vertical:absolute;mso-position-vertical-relative:text;v-text-anchor:top" o:gfxdata="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" stroked="f">
                 <v:textbox>
                   <w:txbxContent>
                     <w:p>
                       <w:pPr>
                         <w:suppressAutoHyphens/>
                         <w:spacing w:line="1" w:lineRule="atLeast"/>
-                        <w:ind w:leftChars="-1" w:hanging="2" w:hangingChars="1"/>
+                        <w:ind w:leftChars="-1" w:hangingChars="1" w:hanging="2"/>
                         <w:textDirection w:val="btLr"/>
                         <w:textAlignment w:val="top"/>
                         <w:outlineLvl w:val="0"/>
@@ -1318,7 +1340,7 @@
                       <w:pPr>
                         <w:suppressAutoHyphens/>
                         <w:spacing w:line="1" w:lineRule="atLeast"/>
-                        <w:ind w:leftChars="-1" w:hanging="2" w:hangingChars="1"/>
+                        <w:ind w:leftChars="-1" w:hangingChars="1" w:hanging="2"/>
                         <w:textDirection w:val="btLr"/>
                         <w:textAlignment w:val="top"/>
                         <w:outlineLvl w:val="0"/>
@@ -1408,13 +1430,8 @@
               <w:jc w:val="both"/>
             </w:pPr>
             <w:r>
-              <w:t xml:space="preserve">FAI - Centro de Ensino Superior em Gestão, Tecnologia e </w:t>
-            </w:r>
-            <w:proofErr w:type="gramStart"/>
-            <w:r>
-              <w:t>Educação</w:t>
-            </w:r>
-            <w:proofErr w:type="gramEnd"/>
+              <w:t>FAI - Centro de Ensino Superior em Gestão, Tecnologia e Educação</w:t>
+            </w:r>
           </w:p>
         </w:tc>
       </w:tr>
@@ -1531,21 +1548,12 @@
               <w:spacing w:before="120" w:after="120"/>
               <w:jc w:val="both"/>
             </w:pPr>
-            <w:proofErr w:type="spellStart"/>
             <w:r>
               <w:rPr>
                 <w:i/>
                 <w:iCs/>
               </w:rPr>
-              <w:t>Random</w:t>
-            </w:r>
-            <w:proofErr w:type="spellEnd"/>
-            <w:r>
-              <w:rPr>
-                <w:i/>
-                <w:iCs/>
-              </w:rPr>
-              <w:t xml:space="preserve"> Access </w:t>
+              <w:t xml:space="preserve">Random Access </w:t>
             </w:r>
             <w:proofErr w:type="spellStart"/>
             <w:r>
@@ -1744,7 +1752,6 @@
           <w:docPartUnique/>
         </w:docPartObj>
       </w:sdtPr>
-      <w:sdtEndPr/>
       <w:sdtContent>
         <w:p>
           <w:pPr>
@@ -2761,9 +2768,9 @@
         <w:spacing w:before="120" w:after="120"/>
         <w:jc w:val="both"/>
         <w:sectPr>
-          <w:headerReference w:type="even" r:id="rId7"/>
-          <w:headerReference w:type="default" r:id="rId8"/>
-          <w:headerReference w:type="first" r:id="rId9"/>
+          <w:headerReference w:type="even" r:id="rId6"/>
+          <w:headerReference w:type="default" r:id="rId7"/>
+          <w:headerReference w:type="first" r:id="rId8"/>
           <w:pgSz w:w="11907" w:h="16840"/>
           <w:pgMar w:top="1701" w:right="1134" w:bottom="1134" w:left="1701" w:header="720" w:footer="720" w:gutter="0"/>
           <w:pgNumType w:start="1"/>
@@ -2793,7 +2800,6 @@
       </w:pPr>
       <w:bookmarkStart w:id="1" w:name="_uebpuqog7hoa" w:colFirst="0" w:colLast="0"/>
       <w:bookmarkEnd w:id="1"/>
-      <w:proofErr w:type="gramStart"/>
       <w:r>
         <w:rPr>
           <w:b/>
@@ -2802,17 +2808,7 @@
           <w:color w:val="000000"/>
         </w:rPr>
         <w:lastRenderedPageBreak/>
-        <w:t>1</w:t>
-      </w:r>
-      <w:proofErr w:type="gramEnd"/>
-      <w:r>
-        <w:rPr>
-          <w:b/>
-          <w:bCs/>
-          <w:smallCaps/>
-          <w:color w:val="000000"/>
-        </w:rPr>
-        <w:t xml:space="preserve"> INTRODUÇÃO</w:t>
+        <w:t>1 INTRODUÇÃO</w:t>
       </w:r>
       <w:r>
         <w:rPr>
@@ -2893,16 +2889,16 @@
               </wp:anchor>
             </w:drawing>
           </mc:Choice>
-          <mc:Fallback xmlns:cx1="http://schemas.microsoft.com/office/drawing/2015/9/8/chartex" xmlns:cx2="http://schemas.microsoft.com/office/drawing/2015/10/21/chartex" xmlns:cx3="http://schemas.microsoft.com/office/drawing/2016/5/9/chartex" xmlns:cx4="http://schemas.microsoft.com/office/drawing/2016/5/10/chartex" xmlns:cx5="http://schemas.microsoft.com/office/drawing/2016/5/11/chartex" xmlns:cx6="http://schemas.microsoft.com/office/drawing/2016/5/12/chartex" xmlns:cx7="http://schemas.microsoft.com/office/drawing/2016/5/13/chartex" xmlns:cx8="http://schemas.microsoft.com/office/drawing/2016/5/14/chartex" xmlns:aink="http://schemas.microsoft.com/office/drawing/2016/ink" xmlns:am3d="http://schemas.microsoft.com/office/drawing/2017/model3d" xmlns:oel="http://schemas.microsoft.com/office/2019/extlst" xmlns:w16cex="http://schemas.microsoft.com/office/word/2018/wordml/cex" xmlns:w16cid="http://schemas.microsoft.com/office/word/2016/wordml/cid" xmlns:w16="http://schemas.microsoft.com/office/word/2018/wordml" xmlns:w16du="http://schemas.microsoft.com/office/word/2023/wordml/word16du" xmlns:w16sdtdh="http://schemas.microsoft.com/office/word/2020/wordml/sdtdatahash" xmlns:w16sdtfl="http://schemas.microsoft.com/office/word/2024/wordml/sdtformatlock" xmlns:a="http://schemas.openxmlformats.org/drawingml/2006/main" xmlns:w16se="http://schemas.microsoft.com/office/word/2015/wordml/symex" xmlns:w15="http://schemas.microsoft.com/office/word/2012/wordml" xmlns:cx="http://schemas.microsoft.com/office/drawing/2014/chartex">
-            <w:pict w14:anchorId="39C9A96B">
-              <v:shape id="Caixa de Texto 3" style="position:absolute;margin-left:440pt;margin-top:-54.4pt;width:15pt;height:20.4pt;z-index:251659264;visibility:visible;mso-wrap-style:square;mso-wrap-distance-left:9pt;mso-wrap-distance-top:0;mso-wrap-distance-right:9pt;mso-wrap-distance-bottom:0;mso-position-horizontal:absolute;mso-position-horizontal-relative:text;mso-position-vertical:absolute;mso-position-vertical-relative:text;v-text-anchor:top" o:spid="_x0000_s1027" stroked="f" type="#_x0000_t202" o:gfxdata="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" w14:anchorId="65E7CEEC">
+          <mc:Fallback>
+            <w:pict>
+              <v:shape w14:anchorId="65E7CEEC" id="Caixa de Texto 3" o:spid="_x0000_s1027" type="#_x0000_t202" style="position:absolute;margin-left:440pt;margin-top:-54.4pt;width:15pt;height:20.4pt;z-index:251659264;visibility:visible;mso-wrap-style:square;mso-wrap-distance-left:9pt;mso-wrap-distance-top:0;mso-wrap-distance-right:9pt;mso-wrap-distance-bottom:0;mso-position-horizontal:absolute;mso-position-horizontal-relative:text;mso-position-vertical:absolute;mso-position-vertical-relative:text;v-text-anchor:top" o:gfxdata="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" stroked="f">
                 <v:textbox>
                   <w:txbxContent>
                     <w:p>
                       <w:pPr>
                         <w:suppressAutoHyphens/>
                         <w:spacing w:line="1" w:lineRule="atLeast"/>
-                        <w:ind w:leftChars="-1" w:hanging="2" w:hangingChars="1"/>
+                        <w:ind w:leftChars="-1" w:hangingChars="1" w:hanging="2"/>
                         <w:textDirection w:val="btLr"/>
                         <w:textAlignment w:val="top"/>
                         <w:outlineLvl w:val="0"/>
@@ -2915,7 +2911,7 @@
                       <w:pPr>
                         <w:suppressAutoHyphens/>
                         <w:spacing w:line="1" w:lineRule="atLeast"/>
-                        <w:ind w:leftChars="-1" w:hanging="2" w:hangingChars="1"/>
+                        <w:ind w:leftChars="-1" w:hangingChars="1" w:hanging="2"/>
                         <w:textDirection w:val="btLr"/>
                         <w:textAlignment w:val="top"/>
                         <w:outlineLvl w:val="0"/>
@@ -3010,16 +3006,16 @@
               </wp:anchor>
             </w:drawing>
           </mc:Choice>
-          <mc:Fallback xmlns:cx1="http://schemas.microsoft.com/office/drawing/2015/9/8/chartex" xmlns:cx2="http://schemas.microsoft.com/office/drawing/2015/10/21/chartex" xmlns:cx3="http://schemas.microsoft.com/office/drawing/2016/5/9/chartex" xmlns:cx4="http://schemas.microsoft.com/office/drawing/2016/5/10/chartex" xmlns:cx5="http://schemas.microsoft.com/office/drawing/2016/5/11/chartex" xmlns:cx6="http://schemas.microsoft.com/office/drawing/2016/5/12/chartex" xmlns:cx7="http://schemas.microsoft.com/office/drawing/2016/5/13/chartex" xmlns:cx8="http://schemas.microsoft.com/office/drawing/2016/5/14/chartex" xmlns:aink="http://schemas.microsoft.com/office/drawing/2016/ink" xmlns:am3d="http://schemas.microsoft.com/office/drawing/2017/model3d" xmlns:oel="http://schemas.microsoft.com/office/2019/extlst" xmlns:w16cex="http://schemas.microsoft.com/office/word/2018/wordml/cex" xmlns:w16cid="http://schemas.microsoft.com/office/word/2016/wordml/cid" xmlns:w16="http://schemas.microsoft.com/office/word/2018/wordml" xmlns:w16du="http://schemas.microsoft.com/office/word/2023/wordml/word16du" xmlns:w16sdtdh="http://schemas.microsoft.com/office/word/2020/wordml/sdtdatahash" xmlns:w16sdtfl="http://schemas.microsoft.com/office/word/2024/wordml/sdtformatlock" xmlns:a="http://schemas.openxmlformats.org/drawingml/2006/main" xmlns:w16se="http://schemas.microsoft.com/office/word/2015/wordml/symex" xmlns:w15="http://schemas.microsoft.com/office/word/2012/wordml" xmlns:cx="http://schemas.microsoft.com/office/drawing/2014/chartex">
-            <w:pict w14:anchorId="32BFD1CD">
-              <v:shape id="Caixa de Texto 2" style="position:absolute;margin-left:445pt;margin-top:-54.4pt;width:10pt;height:20.4pt;z-index:251660288;visibility:visible;mso-wrap-style:square;mso-wrap-distance-left:9pt;mso-wrap-distance-top:0;mso-wrap-distance-right:9pt;mso-wrap-distance-bottom:0;mso-position-horizontal:absolute;mso-position-horizontal-relative:text;mso-position-vertical:absolute;mso-position-vertical-relative:text;v-text-anchor:top" o:spid="_x0000_s1028" stroked="f" type="#_x0000_t202" o:gfxdata="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" w14:anchorId="7FCD1C33">
+          <mc:Fallback>
+            <w:pict>
+              <v:shape w14:anchorId="7FCD1C33" id="Caixa de Texto 2" o:spid="_x0000_s1028" type="#_x0000_t202" style="position:absolute;margin-left:445pt;margin-top:-54.4pt;width:10pt;height:20.4pt;z-index:251660288;visibility:visible;mso-wrap-style:square;mso-wrap-distance-left:9pt;mso-wrap-distance-top:0;mso-wrap-distance-right:9pt;mso-wrap-distance-bottom:0;mso-position-horizontal:absolute;mso-position-horizontal-relative:text;mso-position-vertical:absolute;mso-position-vertical-relative:text;v-text-anchor:top" o:gfxdata="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" stroked="f">
                 <v:textbox>
                   <w:txbxContent>
                     <w:p>
                       <w:pPr>
                         <w:suppressAutoHyphens/>
                         <w:spacing w:line="1" w:lineRule="atLeast"/>
-                        <w:ind w:leftChars="-1" w:hanging="2" w:hangingChars="1"/>
+                        <w:ind w:leftChars="-1" w:hangingChars="1" w:hanging="2"/>
                         <w:textDirection w:val="btLr"/>
                         <w:textAlignment w:val="top"/>
                         <w:outlineLvl w:val="0"/>
@@ -3032,7 +3028,7 @@
                       <w:pPr>
                         <w:suppressAutoHyphens/>
                         <w:spacing w:line="1" w:lineRule="atLeast"/>
-                        <w:ind w:leftChars="-1" w:hanging="2" w:hangingChars="1"/>
+                        <w:ind w:leftChars="-1" w:hangingChars="1" w:hanging="2"/>
                         <w:textDirection w:val="btLr"/>
                         <w:textAlignment w:val="top"/>
                         <w:outlineLvl w:val="0"/>
@@ -3075,7 +3071,6 @@
         <w:t xml:space="preserve">O </w:t>
       </w:r>
       <w:proofErr w:type="spellStart"/>
-      <w:proofErr w:type="gramStart"/>
       <w:r>
         <w:rPr>
           <w:color w:val="000000" w:themeColor="text1"/>
@@ -3083,7 +3078,6 @@
         <w:t>ElderConnect</w:t>
       </w:r>
       <w:proofErr w:type="spellEnd"/>
-      <w:proofErr w:type="gramEnd"/>
       <w:r>
         <w:rPr>
           <w:color w:val="000000" w:themeColor="text1"/>
@@ -3127,37 +3121,7 @@
         <w:rPr>
           <w:color w:val="000000" w:themeColor="text1"/>
         </w:rPr>
-        <w:t xml:space="preserve"> e </w:t>
-      </w:r>
-      <w:proofErr w:type="spellStart"/>
-      <w:proofErr w:type="gramStart"/>
-      <w:r>
-        <w:rPr>
-          <w:color w:val="000000" w:themeColor="text1"/>
-        </w:rPr>
-        <w:t>PostgreSQL</w:t>
-      </w:r>
-      <w:proofErr w:type="spellEnd"/>
-      <w:proofErr w:type="gramEnd"/>
-      <w:r>
-        <w:rPr>
-          <w:color w:val="000000" w:themeColor="text1"/>
-        </w:rPr>
-        <w:t xml:space="preserve"> como banco de dados, garantindo organização, segurança e escalabilidade. O objetivo principal é oferecer uma solução prática, segura e organizada para apoiar o cuidado com a pessoa idosa, promovendo mais tranquilidade aos </w:t>
-      </w:r>
-      <w:proofErr w:type="gramStart"/>
-      <w:r>
-        <w:rPr>
-          <w:color w:val="000000" w:themeColor="text1"/>
-        </w:rPr>
-        <w:t>familiares e maior profissionalização</w:t>
-      </w:r>
-      <w:proofErr w:type="gramEnd"/>
-      <w:r>
-        <w:rPr>
-          <w:color w:val="000000" w:themeColor="text1"/>
-        </w:rPr>
-        <w:t xml:space="preserve"> aos cuidadores.</w:t>
+        <w:t xml:space="preserve"> e PostgreSQL como banco de dados, garantindo organização, segurança e escalabilidade. O objetivo principal é oferecer uma solução prática, segura e organizada para apoiar o cuidado com a pessoa idosa, promovendo mais tranquilidade aos familiares e maior profissionalização aos cuidadores.</w:t>
       </w:r>
     </w:p>
     <w:p>
@@ -3183,7 +3147,6 @@
       <w:r>
         <w:br w:type="page"/>
       </w:r>
-      <w:proofErr w:type="gramStart"/>
       <w:r>
         <w:rPr>
           <w:b/>
@@ -3194,7 +3157,6 @@
         <w:lastRenderedPageBreak/>
         <w:t>2</w:t>
       </w:r>
-      <w:proofErr w:type="gramEnd"/>
       <w:r>
         <w:rPr>
           <w:b/>
@@ -3224,21 +3186,7 @@
         <w:rPr>
           <w:color w:val="000000" w:themeColor="text1"/>
         </w:rPr>
-        <w:t xml:space="preserve">Neste capítulo serão apresentados o tema do projeto, a formulação do problema e a hipótese, os objetivos gerais e específicos, a justificativa do trabalho, o público de interesse, o referencial teórico, a metodologia de desenvolvimento e a análise </w:t>
-      </w:r>
-      <w:proofErr w:type="gramStart"/>
-      <w:r>
-        <w:rPr>
-          <w:color w:val="000000" w:themeColor="text1"/>
-        </w:rPr>
-        <w:t>situacional relacionados ao projeto</w:t>
-      </w:r>
-      <w:proofErr w:type="gramEnd"/>
-      <w:r>
-        <w:rPr>
-          <w:color w:val="000000" w:themeColor="text1"/>
-        </w:rPr>
-        <w:t>.</w:t>
+        <w:t>Neste capítulo serão apresentados o tema do projeto, a formulação do problema e a hipótese, os objetivos gerais e específicos, a justificativa do trabalho, o público de interesse, o referencial teórico, a metodologia de desenvolvimento e a análise situacional relacionados ao projeto.</w:t>
       </w:r>
     </w:p>
     <w:p>
@@ -3294,21 +3242,12 @@
           <w:color w:val="000000"/>
         </w:rPr>
       </w:pPr>
-      <w:proofErr w:type="gramStart"/>
       <w:r>
         <w:rPr>
           <w:smallCaps/>
           <w:color w:val="000000"/>
         </w:rPr>
-        <w:t>2.2 FORMULAÇÃO</w:t>
-      </w:r>
-      <w:proofErr w:type="gramEnd"/>
-      <w:r>
-        <w:rPr>
-          <w:smallCaps/>
-          <w:color w:val="000000"/>
-        </w:rPr>
-        <w:t xml:space="preserve"> DO PROBLEMA E HIPÓTESE</w:t>
+        <w:t>2.2 FORMULAÇÃO DO PROBLEMA E HIPÓTESE</w:t>
       </w:r>
     </w:p>
     <w:p>
@@ -3329,21 +3268,7 @@
         <w:rPr>
           <w:color w:val="000000" w:themeColor="text1"/>
         </w:rPr>
-        <w:t xml:space="preserve"> Em uma entrevista realizada com uma cuidadora de idosos, foram relatadas algumas dificuldades enfrentadas no dia a dia da profissão. Entre elas, </w:t>
-      </w:r>
-      <w:proofErr w:type="gramStart"/>
-      <w:r>
-        <w:rPr>
-          <w:color w:val="000000" w:themeColor="text1"/>
-        </w:rPr>
-        <w:t>destacam-se</w:t>
-      </w:r>
-      <w:proofErr w:type="gramEnd"/>
-      <w:r>
-        <w:rPr>
-          <w:color w:val="000000" w:themeColor="text1"/>
-        </w:rPr>
-        <w:t xml:space="preserve"> a dificuldade em transmitir confiança às famílias dos idosos, a dificuldade das famílias em encontrar cuidadores disponíveis e confiáveis e a ausência de um ambiente organizado onde seja possível procurar profissionais, visualizar suas experiências e avaliar seus serviços. Um lugar organizado onde a família poderia procurar cuidadores e ver suas experiencias.</w:t>
+        <w:t xml:space="preserve"> Em uma entrevista realizada com uma cuidadora de idosos, foram relatadas algumas dificuldades enfrentadas no dia a dia da profissão. Entre elas, destacam-se a dificuldade em transmitir confiança às famílias dos idosos, a dificuldade das famílias em encontrar cuidadores disponíveis e confiáveis e a ausência de um ambiente organizado onde seja possível procurar profissionais, visualizar suas experiências e avaliar seus serviços. Um lugar organizado onde a família poderia procurar cuidadores e ver suas experiencias.</w:t>
       </w:r>
     </w:p>
     <w:p>
@@ -3467,15 +3392,7 @@
       </w:r>
       <w:r>
         <w:br/>
-        <w:t xml:space="preserve">• </w:t>
-      </w:r>
-      <w:proofErr w:type="gramStart"/>
-      <w:r>
-        <w:t>Implementar</w:t>
-      </w:r>
-      <w:proofErr w:type="gramEnd"/>
-      <w:r>
-        <w:t xml:space="preserve"> uma agenda de medicamentos para auxiliar no controle de remédios, doses e horários.</w:t>
+        <w:t>• Implementar uma agenda de medicamentos para auxiliar no controle de remédios, doses e horários.</w:t>
       </w:r>
       <w:r>
         <w:br/>
@@ -3511,15 +3428,7 @@
         <w:jc w:val="both"/>
       </w:pPr>
       <w:r>
-        <w:t xml:space="preserve">O crescimento da população idosa tem aumentado </w:t>
-      </w:r>
-      <w:proofErr w:type="gramStart"/>
-      <w:r>
-        <w:t>a</w:t>
-      </w:r>
-      <w:proofErr w:type="gramEnd"/>
-      <w:r>
-        <w:t xml:space="preserve"> necessidade de cuidados especializados e acompanhamento diário. Muitas famílias enfrentam dificuldades para encontrar cuidadores de idosos confiáveis e qualificados, além de não possuírem um ambiente organizado onde possam buscar profissionais e verificar suas experiências e disponibilidade. Da mesma forma, cuidadores também enfrentam dificuldades para divulgar seus serviços e conquistar a confiança das famílias.</w:t>
+        <w:t>O crescimento da população idosa tem aumentado a necessidade de cuidados especializados e acompanhamento diário. Muitas famílias enfrentam dificuldades para encontrar cuidadores de idosos confiáveis e qualificados, além de não possuírem um ambiente organizado onde possam buscar profissionais e verificar suas experiências e disponibilidade. Da mesma forma, cuidadores também enfrentam dificuldades para divulgar seus serviços e conquistar a confiança das famílias.</w:t>
       </w:r>
     </w:p>
     <w:p>
@@ -3569,21 +3478,12 @@
           <w:color w:val="000000"/>
         </w:rPr>
       </w:pPr>
-      <w:proofErr w:type="gramStart"/>
       <w:r>
         <w:rPr>
           <w:smallCaps/>
           <w:color w:val="000000"/>
         </w:rPr>
-        <w:t>2.5 PÚBLICO</w:t>
-      </w:r>
-      <w:proofErr w:type="gramEnd"/>
-      <w:r>
-        <w:rPr>
-          <w:smallCaps/>
-          <w:color w:val="000000"/>
-        </w:rPr>
-        <w:t xml:space="preserve"> DE INTERESSE</w:t>
+        <w:t>2.5 PÚBLICO DE INTERESSE</w:t>
       </w:r>
     </w:p>
     <w:p>
@@ -3611,21 +3511,12 @@
           <w:color w:val="000000"/>
         </w:rPr>
       </w:pPr>
-      <w:proofErr w:type="gramStart"/>
       <w:r>
         <w:rPr>
           <w:smallCaps/>
           <w:color w:val="000000" w:themeColor="text1"/>
         </w:rPr>
-        <w:t>2.6 REFERENCIAL</w:t>
-      </w:r>
-      <w:proofErr w:type="gramEnd"/>
-      <w:r>
-        <w:rPr>
-          <w:smallCaps/>
-          <w:color w:val="000000" w:themeColor="text1"/>
-        </w:rPr>
-        <w:t xml:space="preserve"> TEÓRICO </w:t>
+        <w:t xml:space="preserve">2.6 REFERENCIAL TEÓRICO </w:t>
       </w:r>
     </w:p>
     <w:p>
@@ -3643,26 +3534,10 @@
         <w:jc w:val="both"/>
       </w:pPr>
       <w:r>
-        <w:t xml:space="preserve">De acordo com Marek </w:t>
-      </w:r>
-      <w:proofErr w:type="gramStart"/>
-      <w:r>
-        <w:t>et</w:t>
-      </w:r>
-      <w:proofErr w:type="gramEnd"/>
-      <w:r>
-        <w:t xml:space="preserve"> al., o gerenciamento de medicamentos em idosos é um processo complexo, pois envolve diversos fatores como dificuldades cognitivas, problemas de visão e a presença de múltiplos medicamentos prescritos. Esses fatores podem levar a erros na administração dos remédios quando não há um acompanhamento adequado, principalmente quando o idoso vive sozinho ou depende de diferentes cuidadores ao lon</w:t>
-      </w:r>
-      <w:r>
-        <w:t xml:space="preserve">go do dia (MAREK </w:t>
-      </w:r>
-      <w:proofErr w:type="gramStart"/>
-      <w:r>
-        <w:t>et</w:t>
-      </w:r>
-      <w:proofErr w:type="gramEnd"/>
-      <w:r>
-        <w:t xml:space="preserve"> al., 2008).</w:t>
+        <w:t>De acordo com Marek et al., o gerenciamento de medicamentos em idosos é um processo complexo, pois envolve diversos fatores como dificuldades cognitivas, problemas de visão e a presença de múltiplos medicamentos prescritos. Esses fatores podem levar a erros na administração dos remédios quando não há um acompanhamento adequado, principalmente quando o idoso vive sozinho ou depende de diferentes cuidadores ao lon</w:t>
+      </w:r>
+      <w:r>
+        <w:t>go do dia (MAREK et al., 2008).</w:t>
       </w:r>
     </w:p>
     <w:p>
@@ -3680,23 +3555,10 @@
         <w:jc w:val="both"/>
       </w:pPr>
       <w:r>
-        <w:t xml:space="preserve">Um exemplo de trabalho relacionado é o aplicativo </w:t>
-      </w:r>
-      <w:proofErr w:type="gramStart"/>
-      <w:r>
-        <w:t>DoseApp</w:t>
-      </w:r>
-      <w:proofErr w:type="gramEnd"/>
-      <w:r>
-        <w:t>, que foi desenvolvido com o objetivo de auxiliar cuidadores e familiares no gerenciamento de medicamentos e na organização da rotina diária de idosos. O sistema permite registrar horários, dosagens e outras informações importantes, reduzindo o risco de perda de informações quando há revezamento entre diferentes cuidadores (ROSTIROLLA; SOUZA, 2022</w:t>
-      </w:r>
-      <w:proofErr w:type="gramStart"/>
-      <w:r>
-        <w:t>)</w:t>
+        <w:t>Um exemplo de trabalho relacionado é o aplicativo DoseApp, que foi desenvolvido com o objetivo de auxiliar cuidadores e familiares no gerenciamento de medicamentos e na organização da rotina diária de idosos. O sistema permite registrar horários, dosagens e outras informações importantes, reduzindo o risco de perda de informações quando há revezamento entre diferentes cuidadores (ROSTIROLLA; SOUZA, 2022)</w:t>
       </w:r>
       <w:bookmarkStart w:id="7" w:name="_ctqy09cxo6nw"/>
       <w:bookmarkEnd w:id="7"/>
-      <w:proofErr w:type="gramEnd"/>
     </w:p>
     <w:p>
       <w:pPr>
@@ -3709,14 +3571,9 @@
           <w:between w:val="nil"/>
         </w:pBdr>
       </w:pPr>
-      <w:proofErr w:type="gramStart"/>
       <w:r>
         <w:lastRenderedPageBreak/>
-        <w:t>2.7 METODOLOGIA</w:t>
-      </w:r>
-      <w:proofErr w:type="gramEnd"/>
-      <w:r>
-        <w:t xml:space="preserve"> DE TRABALHO</w:t>
+        <w:t>2.7 METODOLOGIA DE TRABALHO</w:t>
       </w:r>
     </w:p>
     <w:p>
@@ -3725,15 +3582,7 @@
         <w:jc w:val="both"/>
       </w:pPr>
       <w:r>
-        <w:t xml:space="preserve">Para o desenvolvimento do projeto </w:t>
-      </w:r>
-      <w:proofErr w:type="gramStart"/>
-      <w:r>
-        <w:t>ElderConnect</w:t>
-      </w:r>
-      <w:proofErr w:type="gramEnd"/>
-      <w:r>
-        <w:t>, será adotada uma abordagem baseada nas etapas de análise, planejamento, desenvolvimento e testes do sistema. O objetivo dessa metodologia é garantir que o sistema seja construído de forma organizada, atendendo às necessidades identificadas durante o levantamento de informações e entrevistas realizadas.</w:t>
+        <w:t>Para o desenvolvimento do projeto ElderConnect, será adotada uma abordagem baseada nas etapas de análise, planejamento, desenvolvimento e testes do sistema. O objetivo dessa metodologia é garantir que o sistema seja construído de forma organizada, atendendo às necessidades identificadas durante o levantamento de informações e entrevistas realizadas.</w:t>
       </w:r>
     </w:p>
     <w:p>
@@ -3771,38 +3620,14 @@
       <w:r>
         <w:t xml:space="preserve">Posteriormente será iniciada a fase de desenvolvimento do sistema, utilizando a linguagem de programação Java para o </w:t>
       </w:r>
-      <w:bookmarkStart w:id="8" w:name="_GoBack"/>
       <w:r>
         <w:rPr>
           <w:i/>
         </w:rPr>
-        <w:t>bac</w:t>
-      </w:r>
-      <w:bookmarkEnd w:id="8"/>
-      <w:r>
-        <w:rPr>
-          <w:i/>
-        </w:rPr>
-        <w:t>kend</w:t>
-      </w:r>
-      <w:r>
-        <w:t xml:space="preserve"> e o sistema de gerenciamento de banco de dados </w:t>
-      </w:r>
-      <w:proofErr w:type="gramStart"/>
-      <w:r>
-        <w:t>PostgreSQL</w:t>
-      </w:r>
-      <w:proofErr w:type="gramEnd"/>
-      <w:r>
-        <w:t xml:space="preserve"> para armazenamento das informações. Durante essa fase serão </w:t>
-      </w:r>
-      <w:proofErr w:type="gramStart"/>
-      <w:r>
-        <w:t>implementadas</w:t>
-      </w:r>
-      <w:proofErr w:type="gramEnd"/>
-      <w:r>
-        <w:t xml:space="preserve"> as funcionalidades definidas anteriormente, bem como os mecanismos de autenticação e organização dos dados dos usuários.</w:t>
+        <w:t>backend</w:t>
+      </w:r>
+      <w:r>
+        <w:t xml:space="preserve"> e o sistema de gerenciamento de banco de dados PostgreSQL para armazenamento das informações. Durante essa fase serão implementadas as funcionalidades definidas anteriormente, bem como os mecanismos de autenticação e organização dos dados dos usuários.</w:t>
       </w:r>
     </w:p>
     <w:p>
@@ -3817,8 +3642,8 @@
         <w:lastRenderedPageBreak/>
         <w:t>identificadas no início do projeto. Caso sejam identificados problemas ou melhorias, ajustes serão realizados antes da finalização do projeto.</w:t>
       </w:r>
-      <w:bookmarkStart w:id="9" w:name="_u304za3h7w33"/>
-      <w:bookmarkEnd w:id="9"/>
+      <w:bookmarkStart w:id="8" w:name="_u304za3h7w33"/>
+      <w:bookmarkEnd w:id="8"/>
     </w:p>
     <w:p>
       <w:pPr>
@@ -3831,13 +3656,8 @@
           <w:between w:val="nil"/>
         </w:pBdr>
       </w:pPr>
-      <w:proofErr w:type="gramStart"/>
-      <w:r>
-        <w:t>2.8 ANÁLISE</w:t>
-      </w:r>
-      <w:proofErr w:type="gramEnd"/>
-      <w:r>
-        <w:t xml:space="preserve"> SITUACIONAL</w:t>
+      <w:r>
+        <w:t>2.8 ANÁLISE SITUACIONAL</w:t>
       </w:r>
     </w:p>
     <w:p>
@@ -3857,23 +3677,7 @@
         <w:jc w:val="both"/>
       </w:pPr>
       <w:r>
-        <w:t xml:space="preserve">A partir dessas entrevistas, foi possível identificar alguns pontos em comum. Entre os principais desafios estão </w:t>
-      </w:r>
-      <w:proofErr w:type="gramStart"/>
-      <w:r>
-        <w:t>a</w:t>
-      </w:r>
-      <w:proofErr w:type="gramEnd"/>
-      <w:r>
-        <w:t xml:space="preserve"> dificuldade de encontrar cuidadores disponíveis e confiáveis, a falta de organização na divulgação dos serviços de cuidado e a necessidade de ferramentas que auxiliem no acompanhamento da rotina e da saúde dos idosos. Observou-se também que soluções tecnológicas podem contribuir significativamente para reduzir essas dificuldades, desde que sejam </w:t>
-      </w:r>
-      <w:proofErr w:type="gramStart"/>
-      <w:r>
-        <w:t>simples, acessíveis</w:t>
-      </w:r>
-      <w:proofErr w:type="gramEnd"/>
-      <w:r>
-        <w:t xml:space="preserve"> e adaptadas ao perfil dos usuários, que muitas vezes possuem pouca familiaridade com sistemas digitais.</w:t>
+        <w:t>A partir dessas entrevistas, foi possível identificar alguns pontos em comum. Entre os principais desafios estão a dificuldade de encontrar cuidadores disponíveis e confiáveis, a falta de organização na divulgação dos serviços de cuidado e a necessidade de ferramentas que auxiliem no acompanhamento da rotina e da saúde dos idosos. Observou-se também que soluções tecnológicas podem contribuir significativamente para reduzir essas dificuldades, desde que sejam simples, acessíveis e adaptadas ao perfil dos usuários, que muitas vezes possuem pouca familiaridade com sistemas digitais.</w:t>
       </w:r>
     </w:p>
     <w:p>
@@ -3898,9 +3702,8 @@
           <w:color w:val="000000"/>
         </w:rPr>
       </w:pPr>
-      <w:bookmarkStart w:id="10" w:name="_5xhdqyoxv5pz"/>
-      <w:bookmarkEnd w:id="10"/>
-      <w:proofErr w:type="gramStart"/>
+      <w:bookmarkStart w:id="9" w:name="_5xhdqyoxv5pz"/>
+      <w:bookmarkEnd w:id="9"/>
       <w:r>
         <w:rPr>
           <w:b/>
@@ -3909,38 +3712,12 @@
           <w:color w:val="000000" w:themeColor="text1"/>
         </w:rPr>
         <w:lastRenderedPageBreak/>
-        <w:t>3</w:t>
-      </w:r>
-      <w:proofErr w:type="gramEnd"/>
-      <w:r>
-        <w:rPr>
-          <w:b/>
-          <w:bCs/>
-          <w:smallCaps/>
-          <w:color w:val="000000" w:themeColor="text1"/>
-        </w:rPr>
-        <w:t xml:space="preserve"> PLANEJAMENTO </w:t>
-      </w:r>
-    </w:p>
-    <w:p>
-      <w:r>
-        <w:t xml:space="preserve">Neste capítulo, é apresentado o planejamento do projeto </w:t>
-      </w:r>
-      <w:proofErr w:type="gramStart"/>
-      <w:r>
-        <w:t>ElderConnect</w:t>
-      </w:r>
-      <w:proofErr w:type="gramEnd"/>
-      <w:r>
-        <w:t xml:space="preserve">, mostrando de forma clara e organizada como o sistema será desenvolvido ao longo do tempo. São descritos os recursos necessários para a execução do projeto, incluindo recursos humanos, de software e de hardware, além de outros elementos importantes para seu desenvolvimento. Também é apresentado o cronograma do projeto, definindo prazos e organizando as atividades, o que facilita o acompanhamento de todo o processo. Dessa forma, este capítulo funciona como um guia prático, ajudando a manter o projeto no caminho certo e garantindo que o </w:t>
-      </w:r>
-      <w:proofErr w:type="gramStart"/>
-      <w:r>
-        <w:t>ElderConnect</w:t>
-      </w:r>
-      <w:proofErr w:type="gramEnd"/>
-      <w:r>
-        <w:t xml:space="preserve"> seja desenvolvido de forma eficiente, segura e alinhada aos objetivos propostos.</w:t>
+        <w:t xml:space="preserve">3 PLANEJAMENTO </w:t>
+      </w:r>
+    </w:p>
+    <w:p>
+      <w:r>
+        <w:t>Neste capítulo, é apresentado o planejamento do projeto ElderConnect, mostrando de forma clara e organizada como o sistema será desenvolvido ao longo do tempo. São descritos os recursos necessários para a execução do projeto, incluindo recursos humanos, de software e de hardware, além de outros elementos importantes para seu desenvolvimento. Também é apresentado o cronograma do projeto, definindo prazos e organizando as atividades, o que facilita o acompanhamento de todo o processo. Dessa forma, este capítulo funciona como um guia prático, ajudando a manter o projeto no caminho certo e garantindo que o ElderConnect seja desenvolvido de forma eficiente, segura e alinhada aos objetivos propostos.</w:t>
       </w:r>
     </w:p>
     <w:p>
@@ -3949,8 +3726,8 @@
           <w:color w:val="0070C0"/>
         </w:rPr>
       </w:pPr>
-      <w:bookmarkStart w:id="11" w:name="_85x6gq42hjga" w:colFirst="0" w:colLast="0"/>
-      <w:bookmarkEnd w:id="11"/>
+      <w:bookmarkStart w:id="10" w:name="_85x6gq42hjga" w:colFirst="0" w:colLast="0"/>
+      <w:bookmarkEnd w:id="10"/>
     </w:p>
     <w:p>
       <w:pPr>
@@ -3981,15 +3758,7 @@
         <w:jc w:val="both"/>
       </w:pPr>
       <w:r>
-        <w:t xml:space="preserve">Os recursos humanos do projeto </w:t>
-      </w:r>
-      <w:proofErr w:type="gramStart"/>
-      <w:r>
-        <w:t>ElderConnect</w:t>
-      </w:r>
-      <w:proofErr w:type="gramEnd"/>
-      <w:r>
-        <w:t xml:space="preserve"> são compostos por três integrantes: Bruno Eduardo Faria de Morais, </w:t>
+        <w:t xml:space="preserve">Os recursos humanos do projeto ElderConnect são compostos por três integrantes: Bruno Eduardo Faria de Morais, </w:t>
       </w:r>
       <w:r>
         <w:t>José Alfredo dos Reis Júnior</w:t>
@@ -4001,15 +3770,7 @@
         <w:t>Marcela de Cássia Costa Rezende</w:t>
       </w:r>
       <w:r>
-        <w:t xml:space="preserve">, responsáveis pelo desenvolvimento do sistema. Os membros atuam de forma colaborativa nas etapas de análise, </w:t>
-      </w:r>
-      <w:proofErr w:type="gramStart"/>
-      <w:r>
-        <w:t>implementação</w:t>
-      </w:r>
-      <w:proofErr w:type="gramEnd"/>
-      <w:r>
-        <w:t xml:space="preserve"> e testes, contribuindo conjuntamente para a construção da solução e para a tomada de decisões ao longo do projeto.</w:t>
+        <w:t>, responsáveis pelo desenvolvimento do sistema. Os membros atuam de forma colaborativa nas etapas de análise, implementação e testes, contribuindo conjuntamente para a construção da solução e para a tomada de decisões ao longo do projeto.</w:t>
       </w:r>
     </w:p>
     <w:p>
@@ -4060,8 +3821,8 @@
           <w:color w:val="FF0000"/>
         </w:rPr>
       </w:pPr>
-      <w:bookmarkStart w:id="12" w:name="_hlzhjesqyqyu"/>
-      <w:bookmarkEnd w:id="12"/>
+      <w:bookmarkStart w:id="11" w:name="_hlzhjesqyqyu"/>
+      <w:bookmarkEnd w:id="11"/>
     </w:p>
     <w:p>
       <w:pPr>
@@ -4136,44 +3897,36 @@
           <w:color w:val="000000" w:themeColor="text1"/>
           <w:lang w:val="en-US"/>
         </w:rPr>
-        <w:t xml:space="preserve">AMD Ryzen 7 5825U </w:t>
-      </w:r>
-      <w:proofErr w:type="gramStart"/>
+        <w:t>AMD Ryzen 7 5825U 16</w:t>
+      </w:r>
       <w:r>
         <w:rPr>
           <w:color w:val="000000" w:themeColor="text1"/>
           <w:lang w:val="en-US"/>
         </w:rPr>
-        <w:t>16</w:t>
+        <w:t>gb</w:t>
       </w:r>
       <w:r>
         <w:rPr>
           <w:color w:val="000000" w:themeColor="text1"/>
           <w:lang w:val="en-US"/>
         </w:rPr>
-        <w:t>gb</w:t>
-      </w:r>
-      <w:proofErr w:type="gramEnd"/>
+        <w:t xml:space="preserve"> </w:t>
+      </w:r>
       <w:r>
         <w:rPr>
           <w:color w:val="000000" w:themeColor="text1"/>
           <w:lang w:val="en-US"/>
         </w:rPr>
-        <w:t xml:space="preserve"> </w:t>
-      </w:r>
-      <w:r>
+        <w:t>ram</w:t>
+      </w:r>
+    </w:p>
+    <w:p>
+      <w:pPr>
+        <w:jc w:val="both"/>
         <w:rPr>
           <w:color w:val="000000" w:themeColor="text1"/>
           <w:lang w:val="en-US"/>
-        </w:rPr>
-        <w:t>ram</w:t>
-      </w:r>
-    </w:p>
-    <w:p>
-      <w:pPr>
-        <w:jc w:val="both"/>
-        <w:rPr>
-          <w:color w:val="000000" w:themeColor="text1"/>
         </w:rPr>
       </w:pPr>
       <w:r>
@@ -4191,7 +3944,6 @@
         </w:rPr>
         <w:t>Notebook Dell Inspirion i7 16</w:t>
       </w:r>
-      <w:proofErr w:type="gramStart"/>
       <w:r>
         <w:rPr>
           <w:color w:val="000000" w:themeColor="text1"/>
@@ -4199,13 +3951,28 @@
         </w:rPr>
         <w:t>gb</w:t>
       </w:r>
-      <w:proofErr w:type="gramEnd"/>
       <w:r>
         <w:rPr>
           <w:color w:val="000000" w:themeColor="text1"/>
           <w:lang w:val="en-US"/>
         </w:rPr>
-        <w:t xml:space="preserve"> ram ssd480 hd 500</w:t>
+        <w:t xml:space="preserve"> ram ssd480 </w:t>
+      </w:r>
+      <w:proofErr w:type="spellStart"/>
+      <w:r>
+        <w:rPr>
+          <w:color w:val="000000" w:themeColor="text1"/>
+          <w:lang w:val="en-US"/>
+        </w:rPr>
+        <w:t>hd</w:t>
+      </w:r>
+      <w:proofErr w:type="spellEnd"/>
+      <w:r>
+        <w:rPr>
+          <w:color w:val="000000" w:themeColor="text1"/>
+          <w:lang w:val="en-US"/>
+        </w:rPr>
+        <w:t xml:space="preserve"> 500</w:t>
       </w:r>
     </w:p>
     <w:p>
@@ -4213,13 +3980,14 @@
         <w:jc w:val="both"/>
         <w:rPr>
           <w:color w:val="000000" w:themeColor="text1"/>
-        </w:rPr>
-      </w:pPr>
-      <w:r>
-        <w:rPr>
-          <w:color w:val="000000" w:themeColor="text1"/>
           <w:lang w:val="en-US"/>
         </w:rPr>
+      </w:pPr>
+      <w:r>
+        <w:rPr>
+          <w:color w:val="000000" w:themeColor="text1"/>
+          <w:lang w:val="en-US"/>
+        </w:rPr>
         <w:t xml:space="preserve">RH 3 – </w:t>
       </w:r>
       <w:r>
@@ -4227,23 +3995,39 @@
           <w:color w:val="000000" w:themeColor="text1"/>
           <w:lang w:val="en-US"/>
         </w:rPr>
-        <w:t xml:space="preserve">Notebook Dell Inspiron i5 </w:t>
-      </w:r>
-      <w:proofErr w:type="gramStart"/>
+        <w:t xml:space="preserve">Notebook Dell Inspiron i5 8gb ram, </w:t>
+      </w:r>
+      <w:proofErr w:type="spellStart"/>
       <w:r>
         <w:rPr>
           <w:color w:val="000000" w:themeColor="text1"/>
           <w:lang w:val="en-US"/>
         </w:rPr>
-        <w:t>8gb</w:t>
-      </w:r>
-      <w:proofErr w:type="gramEnd"/>
+        <w:t>ssd</w:t>
+      </w:r>
+      <w:proofErr w:type="spellEnd"/>
       <w:r>
         <w:rPr>
           <w:color w:val="000000" w:themeColor="text1"/>
           <w:lang w:val="en-US"/>
         </w:rPr>
-        <w:t xml:space="preserve"> ram, ssd 240, hd 620</w:t>
+        <w:t xml:space="preserve"> 240, </w:t>
+      </w:r>
+      <w:proofErr w:type="spellStart"/>
+      <w:r>
+        <w:rPr>
+          <w:color w:val="000000" w:themeColor="text1"/>
+          <w:lang w:val="en-US"/>
+        </w:rPr>
+        <w:t>hd</w:t>
+      </w:r>
+      <w:proofErr w:type="spellEnd"/>
+      <w:r>
+        <w:rPr>
+          <w:color w:val="000000" w:themeColor="text1"/>
+          <w:lang w:val="en-US"/>
+        </w:rPr>
+        <w:t xml:space="preserve"> 620</w:t>
       </w:r>
     </w:p>
     <w:p>
@@ -4279,8 +4063,8 @@
         </w:rPr>
         <w:t xml:space="preserve"> Mouse</w:t>
       </w:r>
-      <w:bookmarkStart w:id="13" w:name="_zgip7uuby6ix"/>
-      <w:bookmarkEnd w:id="13"/>
+      <w:bookmarkStart w:id="12" w:name="_zgip7uuby6ix"/>
+      <w:bookmarkEnd w:id="12"/>
     </w:p>
     <w:p>
       <w:pPr>
@@ -4384,27 +4168,52 @@
         </w:rPr>
         <w:t>RS 3 - Sistema operacional Microsoft Windows 11 Professional.</w:t>
       </w:r>
-      <w:bookmarkStart w:id="14" w:name="_pxyab1tdqc6h"/>
-      <w:bookmarkEnd w:id="14"/>
-    </w:p>
-    <w:p>
-      <w:pPr>
-        <w:rPr>
-          <w:color w:val="000000" w:themeColor="text1"/>
-        </w:rPr>
-      </w:pPr>
-      <w:r>
-        <w:rPr>
-          <w:color w:val="000000" w:themeColor="text1"/>
-        </w:rPr>
-        <w:t xml:space="preserve">RS 4 - </w:t>
+      <w:bookmarkStart w:id="13" w:name="_pxyab1tdqc6h"/>
+      <w:bookmarkEnd w:id="13"/>
+    </w:p>
+    <w:p>
+      <w:pPr>
+        <w:rPr>
+          <w:color w:val="000000" w:themeColor="text1"/>
+          <w:lang w:val="en-US"/>
+        </w:rPr>
+      </w:pPr>
+      <w:r>
+        <w:rPr>
+          <w:color w:val="000000" w:themeColor="text1"/>
+          <w:lang w:val="en-US"/>
+        </w:rPr>
+        <w:t>RS 4 - PostgreSQL</w:t>
+      </w:r>
+    </w:p>
+    <w:p>
+      <w:pPr>
+        <w:rPr>
+          <w:color w:val="000000" w:themeColor="text1"/>
+          <w:lang w:val="en-US"/>
+        </w:rPr>
+      </w:pPr>
+      <w:r>
+        <w:rPr>
+          <w:color w:val="000000" w:themeColor="text1"/>
+          <w:lang w:val="en-US"/>
+        </w:rPr>
+        <w:t xml:space="preserve">RS 5 </w:t>
       </w:r>
       <w:proofErr w:type="gramStart"/>
       <w:r>
         <w:rPr>
           <w:color w:val="000000" w:themeColor="text1"/>
-        </w:rPr>
-        <w:t>PostgreSQL</w:t>
+          <w:lang w:val="en-US"/>
+        </w:rPr>
+        <w:t xml:space="preserve">- </w:t>
+      </w:r>
+      <w:r>
+        <w:rPr>
+          <w:color w:val="000000" w:themeColor="text1"/>
+          <w:lang w:val="en-US"/>
+        </w:rPr>
+        <w:t xml:space="preserve"> Git</w:t>
       </w:r>
       <w:proofErr w:type="gramEnd"/>
     </w:p>
@@ -4412,50 +4221,13 @@
       <w:pPr>
         <w:rPr>
           <w:color w:val="000000" w:themeColor="text1"/>
-        </w:rPr>
-      </w:pPr>
-      <w:r>
-        <w:rPr>
-          <w:color w:val="000000" w:themeColor="text1"/>
-        </w:rPr>
-        <w:t xml:space="preserve">RS 5 </w:t>
-      </w:r>
-      <w:r>
-        <w:rPr>
-          <w:color w:val="000000" w:themeColor="text1"/>
-        </w:rPr>
-        <w:t>-</w:t>
-      </w:r>
-      <w:proofErr w:type="gramStart"/>
-      <w:r>
-        <w:rPr>
-          <w:color w:val="000000" w:themeColor="text1"/>
-        </w:rPr>
-        <w:t xml:space="preserve"> </w:t>
-      </w:r>
-      <w:r>
-        <w:rPr>
-          <w:color w:val="000000" w:themeColor="text1"/>
-        </w:rPr>
-        <w:t xml:space="preserve"> </w:t>
-      </w:r>
-      <w:proofErr w:type="gramEnd"/>
-      <w:r>
-        <w:rPr>
-          <w:color w:val="000000" w:themeColor="text1"/>
-        </w:rPr>
-        <w:t>Git</w:t>
-      </w:r>
-    </w:p>
-    <w:p>
-      <w:pPr>
-        <w:rPr>
-          <w:color w:val="000000" w:themeColor="text1"/>
-        </w:rPr>
-      </w:pPr>
-      <w:r>
-        <w:rPr>
-          <w:color w:val="000000" w:themeColor="text1"/>
+          <w:lang w:val="en-US"/>
+        </w:rPr>
+      </w:pPr>
+      <w:r>
+        <w:rPr>
+          <w:color w:val="000000" w:themeColor="text1"/>
+          <w:lang w:val="en-US"/>
         </w:rPr>
         <w:t>RS 6 – Notepad ++</w:t>
       </w:r>
@@ -4464,27 +4236,31 @@
       <w:pPr>
         <w:rPr>
           <w:color w:val="000000" w:themeColor="text1"/>
-        </w:rPr>
-      </w:pPr>
-    </w:p>
-    <w:p>
-      <w:pPr>
-        <w:rPr>
-          <w:color w:val="000000" w:themeColor="text1"/>
-        </w:rPr>
-      </w:pPr>
-    </w:p>
-    <w:p>
-      <w:pPr>
-        <w:rPr>
-          <w:color w:val="000000" w:themeColor="text1"/>
-        </w:rPr>
-      </w:pPr>
-    </w:p>
-    <w:p>
-      <w:pPr>
-        <w:rPr>
-          <w:color w:val="000000" w:themeColor="text1"/>
+          <w:lang w:val="en-US"/>
+        </w:rPr>
+      </w:pPr>
+    </w:p>
+    <w:p>
+      <w:pPr>
+        <w:rPr>
+          <w:color w:val="000000" w:themeColor="text1"/>
+          <w:lang w:val="en-US"/>
+        </w:rPr>
+      </w:pPr>
+    </w:p>
+    <w:p>
+      <w:pPr>
+        <w:rPr>
+          <w:color w:val="000000" w:themeColor="text1"/>
+          <w:lang w:val="en-US"/>
+        </w:rPr>
+      </w:pPr>
+    </w:p>
+    <w:p>
+      <w:pPr>
+        <w:rPr>
+          <w:color w:val="000000" w:themeColor="text1"/>
+          <w:lang w:val="en-US"/>
         </w:rPr>
       </w:pPr>
     </w:p>
@@ -4518,15 +4294,7 @@
         <w:jc w:val="both"/>
       </w:pPr>
       <w:r>
-        <w:t xml:space="preserve">Os outros recursos do projeto </w:t>
-      </w:r>
-      <w:proofErr w:type="gramStart"/>
-      <w:r>
-        <w:t>ElderConnect</w:t>
-      </w:r>
-      <w:proofErr w:type="gramEnd"/>
-      <w:r>
-        <w:t xml:space="preserve"> envolvem elementos complementares que auxiliam no desenvolvimento e na organização das atividades. Entre eles, destacam-se o uso de ferramentas de apoio para comunicação e gerenciamento de tarefas, como plataformas de mensagens e controle de versionamento, que facilitam a colaboração entre os integrantes da equipe.</w:t>
+        <w:t>Os outros recursos do projeto ElderConnect envolvem elementos complementares que auxiliam no desenvolvimento e na organização das atividades. Entre eles, destacam-se o uso de ferramentas de apoio para comunicação e gerenciamento de tarefas, como plataformas de mensagens e controle de versionamento, que facilitam a colaboração entre os integrantes da equipe.</w:t>
       </w:r>
     </w:p>
     <w:p>
@@ -4541,8 +4309,8 @@
         <w:lastRenderedPageBreak/>
         <w:t>desenvolvimento. Não há, neste projeto, a necessidade de investimentos financeiros significativos, uma vez que a maior parte dos recursos utilizados é de acesso gratuito ou já está disponível para os integrantes.</w:t>
       </w:r>
-      <w:bookmarkStart w:id="15" w:name="_3unqfi5pywb"/>
-      <w:bookmarkEnd w:id="15"/>
+      <w:bookmarkStart w:id="14" w:name="_3unqfi5pywb"/>
+      <w:bookmarkEnd w:id="14"/>
     </w:p>
     <w:p>
       <w:pPr>
@@ -4566,19 +4334,11 @@
           <w:color w:val="000000"/>
         </w:rPr>
       </w:pPr>
-      <w:proofErr w:type="gramStart"/>
-      <w:r>
-        <w:rPr>
-          <w:color w:val="000000" w:themeColor="text1"/>
-        </w:rPr>
-        <w:t>3.5 CRONOGRAMA</w:t>
-      </w:r>
-      <w:proofErr w:type="gramEnd"/>
-      <w:r>
-        <w:rPr>
-          <w:color w:val="000000" w:themeColor="text1"/>
-        </w:rPr>
-        <w:t xml:space="preserve"> DO PROJETO</w:t>
+      <w:r>
+        <w:rPr>
+          <w:color w:val="000000" w:themeColor="text1"/>
+        </w:rPr>
+        <w:t>3.5 CRONOGRAMA DO PROJETO</w:t>
       </w:r>
     </w:p>
     <w:p>
@@ -4586,15 +4346,7 @@
         <w:jc w:val="both"/>
       </w:pPr>
       <w:r>
-        <w:t xml:space="preserve">Cronograma do projeto se encontra na pasta do apêndice A no repositório do </w:t>
-      </w:r>
-      <w:proofErr w:type="gramStart"/>
-      <w:r>
-        <w:t>GitHub</w:t>
-      </w:r>
-      <w:proofErr w:type="gramEnd"/>
-      <w:r>
-        <w:t>.</w:t>
+        <w:t>Cronograma do projeto se encontra na pasta do apêndice A no repositório do GitHub.</w:t>
       </w:r>
     </w:p>
     <w:p>
@@ -4615,12 +4367,11 @@
           <w:color w:val="000000"/>
         </w:rPr>
       </w:pPr>
-      <w:bookmarkStart w:id="16" w:name="_69ez10u2xwkb" w:colFirst="0" w:colLast="0"/>
-      <w:bookmarkEnd w:id="16"/>
+      <w:bookmarkStart w:id="15" w:name="_69ez10u2xwkb" w:colFirst="0" w:colLast="0"/>
+      <w:bookmarkEnd w:id="15"/>
       <w:r>
         <w:br w:type="page"/>
       </w:r>
-      <w:proofErr w:type="gramStart"/>
       <w:r>
         <w:rPr>
           <w:b/>
@@ -4628,16 +4379,7 @@
           <w:color w:val="000000"/>
         </w:rPr>
         <w:lastRenderedPageBreak/>
-        <w:t>4</w:t>
-      </w:r>
-      <w:proofErr w:type="gramEnd"/>
-      <w:r>
-        <w:rPr>
-          <w:b/>
-          <w:bCs/>
-          <w:color w:val="000000"/>
-        </w:rPr>
-        <w:t xml:space="preserve"> ESPECIFICAÇÃO E ANÁLISE DOS REQUISITOS DO SISTEMA DE SOFTWARE</w:t>
+        <w:t>4 ESPECIFICAÇÃO E ANÁLISE DOS REQUISITOS DO SISTEMA DE SOFTWARE</w:t>
       </w:r>
     </w:p>
     <w:p/>
@@ -4656,40 +4398,32 @@
           <w:color w:val="000000"/>
         </w:rPr>
       </w:pPr>
-      <w:bookmarkStart w:id="17" w:name="_p41l1yyjr2lp" w:colFirst="0" w:colLast="0"/>
+      <w:bookmarkStart w:id="16" w:name="_p41l1yyjr2lp" w:colFirst="0" w:colLast="0"/>
+      <w:bookmarkEnd w:id="16"/>
+      <w:r>
+        <w:rPr>
+          <w:color w:val="000000"/>
+        </w:rPr>
+        <w:t>4.1 ESPECIFICAÇÃO DOS REQUISITOS FUNCIONAIS</w:t>
+      </w:r>
+    </w:p>
+    <w:p>
+      <w:pPr>
+        <w:jc w:val="both"/>
+        <w:rPr>
+          <w:color w:val="0070C0"/>
+        </w:rPr>
+      </w:pPr>
+      <w:r>
+        <w:rPr>
+          <w:color w:val="0070C0"/>
+        </w:rPr>
+        <w:t>Preencher o documento disponível no Apêndice B. Deve ser continuamente atualizado pela equipe.</w:t>
+      </w:r>
+    </w:p>
+    <w:p>
+      <w:bookmarkStart w:id="17" w:name="_jnfti9d8nig6" w:colFirst="0" w:colLast="0"/>
       <w:bookmarkEnd w:id="17"/>
-      <w:proofErr w:type="gramStart"/>
-      <w:r>
-        <w:rPr>
-          <w:color w:val="000000"/>
-        </w:rPr>
-        <w:t>4.1 ESPECIFICAÇÃO</w:t>
-      </w:r>
-      <w:proofErr w:type="gramEnd"/>
-      <w:r>
-        <w:rPr>
-          <w:color w:val="000000"/>
-        </w:rPr>
-        <w:t xml:space="preserve"> DOS REQUISITOS FUNCIONAIS</w:t>
-      </w:r>
-    </w:p>
-    <w:p>
-      <w:pPr>
-        <w:jc w:val="both"/>
-        <w:rPr>
-          <w:color w:val="0070C0"/>
-        </w:rPr>
-      </w:pPr>
-      <w:r>
-        <w:rPr>
-          <w:color w:val="0070C0"/>
-        </w:rPr>
-        <w:t>Preencher o documento disponível no Apêndice B. Deve ser continuamente atualizado pela equipe.</w:t>
-      </w:r>
-    </w:p>
-    <w:p>
-      <w:bookmarkStart w:id="18" w:name="_jnfti9d8nig6" w:colFirst="0" w:colLast="0"/>
-      <w:bookmarkEnd w:id="18"/>
     </w:p>
     <w:p>
       <w:pPr>
@@ -4706,19 +4440,11 @@
           <w:color w:val="000000"/>
         </w:rPr>
       </w:pPr>
-      <w:proofErr w:type="gramStart"/>
       <w:r>
         <w:rPr>
           <w:color w:val="000000"/>
         </w:rPr>
-        <w:t>4.2 ESPECIFICAÇÃO</w:t>
-      </w:r>
-      <w:proofErr w:type="gramEnd"/>
-      <w:r>
-        <w:rPr>
-          <w:color w:val="000000"/>
-        </w:rPr>
-        <w:t xml:space="preserve"> DOS REQUISITOS NÃO FUNCIONAIS</w:t>
+        <w:t>4.2 ESPECIFICAÇÃO DOS REQUISITOS NÃO FUNCIONAIS</w:t>
       </w:r>
     </w:p>
     <w:p>
@@ -4736,8 +4462,8 @@
       </w:r>
     </w:p>
     <w:p>
-      <w:bookmarkStart w:id="19" w:name="_yfftpsqmbn38" w:colFirst="0" w:colLast="0"/>
-      <w:bookmarkEnd w:id="19"/>
+      <w:bookmarkStart w:id="18" w:name="_yfftpsqmbn38" w:colFirst="0" w:colLast="0"/>
+      <w:bookmarkEnd w:id="18"/>
     </w:p>
     <w:p>
       <w:pPr>
@@ -4754,21 +4480,12 @@
           <w:color w:val="000000"/>
         </w:rPr>
       </w:pPr>
-      <w:proofErr w:type="gramStart"/>
       <w:r>
         <w:rPr>
           <w:smallCaps/>
           <w:color w:val="000000"/>
         </w:rPr>
-        <w:t>4.3 ANÁLISE</w:t>
-      </w:r>
-      <w:proofErr w:type="gramEnd"/>
-      <w:r>
-        <w:rPr>
-          <w:smallCaps/>
-          <w:color w:val="000000"/>
-        </w:rPr>
-        <w:t xml:space="preserve"> DOS REQUISITOS</w:t>
+        <w:t>4.3 ANÁLISE DOS REQUISITOS</w:t>
       </w:r>
     </w:p>
     <w:p>
@@ -4782,14 +4499,7 @@
         <w:rPr>
           <w:color w:val="0070C0"/>
         </w:rPr>
-        <w:t>Preencher os documentos disponíveis no Apêndice D.</w:t>
-      </w:r>
-      <w:proofErr w:type="gramStart"/>
-      <w:r>
-        <w:rPr>
-          <w:color w:val="0070C0"/>
-        </w:rPr>
-        <w:t xml:space="preserve">  </w:t>
+        <w:t xml:space="preserve">Preencher os documentos disponíveis no Apêndice D.  </w:t>
       </w:r>
     </w:p>
     <w:p>
@@ -4809,13 +4519,11 @@
           <w:color w:val="000000"/>
         </w:rPr>
       </w:pPr>
-      <w:bookmarkStart w:id="20" w:name="_zbtgsztsx5qt" w:colFirst="0" w:colLast="0"/>
-      <w:bookmarkEnd w:id="20"/>
-      <w:proofErr w:type="gramEnd"/>
+      <w:bookmarkStart w:id="19" w:name="_zbtgsztsx5qt" w:colFirst="0" w:colLast="0"/>
+      <w:bookmarkEnd w:id="19"/>
       <w:r>
         <w:br w:type="page"/>
       </w:r>
-      <w:proofErr w:type="gramStart"/>
       <w:r>
         <w:rPr>
           <w:b/>
@@ -4823,16 +4531,7 @@
           <w:color w:val="000000"/>
         </w:rPr>
         <w:lastRenderedPageBreak/>
-        <w:t>5</w:t>
-      </w:r>
-      <w:proofErr w:type="gramEnd"/>
-      <w:r>
-        <w:rPr>
-          <w:b/>
-          <w:bCs/>
-          <w:color w:val="000000"/>
-        </w:rPr>
-        <w:t xml:space="preserve"> ARQUITETURA E PROJETO DO SISTEMA DE SOFTWARE</w:t>
+        <w:t>5 ARQUITETURA E PROJETO DO SISTEMA DE SOFTWARE</w:t>
       </w:r>
     </w:p>
     <w:p>
@@ -4866,12 +4565,11 @@
           <w:color w:val="000000"/>
         </w:rPr>
       </w:pPr>
-      <w:bookmarkStart w:id="21" w:name="_uzs395uand0e" w:colFirst="0" w:colLast="0"/>
-      <w:bookmarkEnd w:id="21"/>
+      <w:bookmarkStart w:id="20" w:name="_uzs395uand0e" w:colFirst="0" w:colLast="0"/>
+      <w:bookmarkEnd w:id="20"/>
       <w:r>
         <w:br w:type="page"/>
       </w:r>
-      <w:proofErr w:type="gramStart"/>
       <w:r>
         <w:rPr>
           <w:b/>
@@ -4879,16 +4577,7 @@
           <w:color w:val="000000"/>
         </w:rPr>
         <w:lastRenderedPageBreak/>
-        <w:t>6</w:t>
-      </w:r>
-      <w:proofErr w:type="gramEnd"/>
-      <w:r>
-        <w:rPr>
-          <w:b/>
-          <w:bCs/>
-          <w:color w:val="000000"/>
-        </w:rPr>
-        <w:t xml:space="preserve"> IMPLEMENTAÇÃO DO SISTEMA DE SOFTWARE</w:t>
+        <w:t>6 IMPLEMENTAÇÃO DO SISTEMA DE SOFTWARE</w:t>
       </w:r>
     </w:p>
     <w:p/>
@@ -4925,12 +4614,11 @@
           <w:color w:val="000000"/>
         </w:rPr>
       </w:pPr>
-      <w:bookmarkStart w:id="22" w:name="_xwz6vzo9lzyl" w:colFirst="0" w:colLast="0"/>
-      <w:bookmarkEnd w:id="22"/>
+      <w:bookmarkStart w:id="21" w:name="_xwz6vzo9lzyl" w:colFirst="0" w:colLast="0"/>
+      <w:bookmarkEnd w:id="21"/>
       <w:r>
         <w:br w:type="page"/>
       </w:r>
-      <w:proofErr w:type="gramStart"/>
       <w:r>
         <w:rPr>
           <w:b/>
@@ -4938,16 +4626,7 @@
           <w:color w:val="000000"/>
         </w:rPr>
         <w:lastRenderedPageBreak/>
-        <w:t>7</w:t>
-      </w:r>
-      <w:proofErr w:type="gramEnd"/>
-      <w:r>
-        <w:rPr>
-          <w:b/>
-          <w:bCs/>
-          <w:color w:val="000000"/>
-        </w:rPr>
-        <w:t xml:space="preserve"> PLANO DE TESTES PARA O SISTEMA DE SOFTWARE</w:t>
+        <w:t>7 PLANO DE TESTES PARA O SISTEMA DE SOFTWARE</w:t>
       </w:r>
     </w:p>
     <w:p>
@@ -5002,8 +4681,8 @@
           <w:color w:val="FF0000"/>
         </w:rPr>
       </w:pPr>
-      <w:bookmarkStart w:id="23" w:name="_mkvs2qyhhbcp" w:colFirst="0" w:colLast="0"/>
-      <w:bookmarkEnd w:id="23"/>
+      <w:bookmarkStart w:id="22" w:name="_mkvs2qyhhbcp" w:colFirst="0" w:colLast="0"/>
+      <w:bookmarkEnd w:id="22"/>
     </w:p>
     <w:p>
       <w:pPr>
@@ -5023,12 +4702,11 @@
           <w:color w:val="000000"/>
         </w:rPr>
       </w:pPr>
-      <w:bookmarkStart w:id="24" w:name="_8zxqz5wgmdxn" w:colFirst="0" w:colLast="0"/>
-      <w:bookmarkEnd w:id="24"/>
+      <w:bookmarkStart w:id="23" w:name="_8zxqz5wgmdxn" w:colFirst="0" w:colLast="0"/>
+      <w:bookmarkEnd w:id="23"/>
       <w:r>
         <w:br w:type="page"/>
       </w:r>
-      <w:proofErr w:type="gramStart"/>
       <w:r>
         <w:rPr>
           <w:b/>
@@ -5037,17 +4715,7 @@
           <w:color w:val="000000"/>
         </w:rPr>
         <w:lastRenderedPageBreak/>
-        <w:t>8</w:t>
-      </w:r>
-      <w:proofErr w:type="gramEnd"/>
-      <w:r>
-        <w:rPr>
-          <w:b/>
-          <w:bCs/>
-          <w:smallCaps/>
-          <w:color w:val="000000"/>
-        </w:rPr>
-        <w:t xml:space="preserve"> CONCLUSÃO</w:t>
+        <w:t>8 CONCLUSÃO</w:t>
       </w:r>
     </w:p>
     <w:p>
@@ -5061,21 +4729,7 @@
         <w:rPr>
           <w:color w:val="0070C0"/>
         </w:rPr>
-        <w:t xml:space="preserve">Descreva a conclusão do trabalho em cada entrega de incremento, identificando se os objetivos definidos estão sendo </w:t>
-      </w:r>
-      <w:proofErr w:type="gramStart"/>
-      <w:r>
-        <w:rPr>
-          <w:color w:val="0070C0"/>
-        </w:rPr>
-        <w:t>alcançados, as perspectivas</w:t>
-      </w:r>
-      <w:proofErr w:type="gramEnd"/>
-      <w:r>
-        <w:rPr>
-          <w:color w:val="0070C0"/>
-        </w:rPr>
-        <w:t xml:space="preserve"> para a continuidade do trabalho, os desafios encontrados e os conhecimentos adquiridos.</w:t>
+        <w:t>Descreva a conclusão do trabalho em cada entrega de incremento, identificando se os objetivos definidos estão sendo alcançados, as perspectivas para a continuidade do trabalho, os desafios encontrados e os conhecimentos adquiridos.</w:t>
       </w:r>
     </w:p>
     <w:p>
@@ -5096,8 +4750,8 @@
           <w:color w:val="000000"/>
         </w:rPr>
       </w:pPr>
-      <w:bookmarkStart w:id="25" w:name="_vu8skbkjafvu"/>
-      <w:bookmarkEnd w:id="25"/>
+      <w:bookmarkStart w:id="24" w:name="_vu8skbkjafvu"/>
+      <w:bookmarkEnd w:id="24"/>
       <w:r>
         <w:br w:type="page"/>
       </w:r>
@@ -5120,80 +4774,66 @@
         <w:rPr>
           <w:lang w:val="en-US"/>
         </w:rPr>
-        <w:t>MAREK, Karen D. et al. Medication Management of the Community-Dwelling Older Adult. In: Patient Safety and Quality: An Evidence-Based Handbook for Nurses. Rockville: AHRQ, 2008.</w:t>
-      </w:r>
+        <w:t xml:space="preserve">MAREK, Karen D. et al. Medication Management of the Community-Dwelling Older Adult. In: Patient Safety and Quality: An Evidence-Based Handbook for Nurses. </w:t>
+      </w:r>
+      <w:proofErr w:type="spellStart"/>
+      <w:r>
+        <w:t>Rockville</w:t>
+      </w:r>
+      <w:proofErr w:type="spellEnd"/>
+      <w:r>
+        <w:t>: AHRQ, 2008.</w:t>
+      </w:r>
+      <w:r>
+        <w:t xml:space="preserve"> </w:t>
+      </w:r>
+      <w:r>
+        <w:t>Disponível em: &lt;https://www.ncbi.nlm.nih.gov/books/NBK2670/&gt;</w:t>
+      </w:r>
+      <w:r>
+        <w:t xml:space="preserve"> </w:t>
+      </w:r>
+    </w:p>
+    <w:p>
+      <w:pPr>
+        <w:spacing w:line="240" w:lineRule="auto"/>
+      </w:pPr>
+      <w:r>
+        <w:t>ROSTIROLLA, Gabriela T.; SOUZA, Odair M. DoseApp: Aplicativo para gestão de medicamentos e auxílio nas rotinas dos cuidadores de idosos. Anais do Latinoware, 2022.</w:t>
+      </w:r>
+      <w:r>
+        <w:t xml:space="preserve"> Disponível em: &lt;https://sol.sbc.org.br/index.php/latinoware/article/view/22976/&gt;.</w:t>
+      </w:r>
+    </w:p>
+    <w:p>
+      <w:pPr>
+        <w:spacing w:before="120" w:after="120"/>
+      </w:pPr>
       <w:r>
         <w:rPr>
           <w:lang w:val="en-US"/>
         </w:rPr>
+        <w:t xml:space="preserve">ZHOU, Zhiyin. Adhera: A Human-Centered Health Informatics Solution for Reducing Informal Caregiver Burden through Improved Medication Adherence. </w:t>
+      </w:r>
+      <w:r>
+        <w:t>2025.</w:t>
+      </w:r>
+      <w:r>
         <w:t xml:space="preserve"> </w:t>
       </w:r>
       <w:r>
-        <w:t>Disponível em: &lt;</w:t>
-      </w:r>
-      <w:proofErr w:type="gramStart"/>
-      <w:r>
-        <w:t>https</w:t>
-      </w:r>
-      <w:proofErr w:type="gramEnd"/>
-      <w:r>
-        <w:t>://www.ncbi.nlm.nih.gov/books/NBK2670/&gt;</w:t>
-      </w:r>
-      <w:r>
-        <w:rPr>
-          <w:lang w:val="en-US"/>
-        </w:rPr>
-        <w:t xml:space="preserve"> </w:t>
-      </w:r>
-    </w:p>
-    <w:p>
-      <w:pPr>
-        <w:spacing w:line="240" w:lineRule="auto"/>
-      </w:pPr>
-      <w:r>
-        <w:t xml:space="preserve">ROSTIROLLA, Gabriela T.; SOUZA, Odair M. </w:t>
-      </w:r>
-      <w:proofErr w:type="gramStart"/>
-      <w:r>
-        <w:t>DoseApp</w:t>
-      </w:r>
-      <w:proofErr w:type="gramEnd"/>
-      <w:r>
-        <w:t>: Aplicativo para gestão de medicamentos e auxílio nas rotinas dos cuidadores de idosos. Anais do Latinoware, 2022.</w:t>
-      </w:r>
-      <w:r>
-        <w:t xml:space="preserve"> Disponível em: &lt;</w:t>
-      </w:r>
-      <w:proofErr w:type="gramStart"/>
-      <w:r>
-        <w:t>https</w:t>
-      </w:r>
-      <w:proofErr w:type="gramEnd"/>
-      <w:r>
-        <w:t>://sol.sbc.org.br/index.php/latinoware/article/view/22976/&gt;.</w:t>
-      </w:r>
-    </w:p>
-    <w:p>
-      <w:pPr>
-        <w:spacing w:before="120" w:after="120"/>
-      </w:pPr>
-      <w:r>
-        <w:rPr>
-          <w:lang w:val="en-US"/>
-        </w:rPr>
-        <w:t>ZHOU, Zhiyin. Adhera: A Human-Centered Health Informatics Solution for Reducing Informal Caregiver Burden through Improved Medication Adherence. 2025.</w:t>
-      </w:r>
-      <w:r>
-        <w:rPr>
-          <w:lang w:val="en-US"/>
-        </w:rPr>
-        <w:t xml:space="preserve"> </w:t>
-      </w:r>
-      <w:r>
         <w:t xml:space="preserve">Disponível em: </w:t>
       </w:r>
       <w:r>
-        <w:t>&lt;https://arxiv.org/abs/2512.03878/&gt;</w:t>
+        <w:t>&lt;https://arxiv.org/</w:t>
+      </w:r>
+      <w:proofErr w:type="spellStart"/>
+      <w:r>
+        <w:t>abs</w:t>
+      </w:r>
+      <w:proofErr w:type="spellEnd"/>
+      <w:r>
+        <w:t>/2512.03878/&gt;</w:t>
       </w:r>
       <w:r>
         <w:t>.</w:t>
@@ -5225,8 +4865,8 @@
           <w:color w:val="000000"/>
         </w:rPr>
       </w:pPr>
-      <w:bookmarkStart w:id="26" w:name="_amvst46n8d5f" w:colFirst="0" w:colLast="0"/>
-      <w:bookmarkEnd w:id="26"/>
+      <w:bookmarkStart w:id="25" w:name="_amvst46n8d5f" w:colFirst="0" w:colLast="0"/>
+      <w:bookmarkEnd w:id="25"/>
       <w:r>
         <w:br w:type="page"/>
       </w:r>
@@ -5245,12 +4885,10 @@
         <w:t>O cronograma do projeto está disponível na pasta “</w:t>
       </w:r>
       <w:proofErr w:type="spellStart"/>
-      <w:proofErr w:type="gramStart"/>
       <w:r>
         <w:t>ApêndiceA</w:t>
       </w:r>
       <w:proofErr w:type="spellEnd"/>
-      <w:proofErr w:type="gramEnd"/>
       <w:r>
         <w:t>” que acompanha este documento.</w:t>
       </w:r>
@@ -5273,8 +4911,8 @@
           <w:color w:val="000000"/>
         </w:rPr>
       </w:pPr>
-      <w:bookmarkStart w:id="27" w:name="_9qjp406jcxub" w:colFirst="0" w:colLast="0"/>
-      <w:bookmarkEnd w:id="27"/>
+      <w:bookmarkStart w:id="26" w:name="_9qjp406jcxub" w:colFirst="0" w:colLast="0"/>
+      <w:bookmarkEnd w:id="26"/>
       <w:r>
         <w:br w:type="page"/>
       </w:r>
@@ -5293,12 +4931,10 @@
         <w:t>Os requisitos estão disponíveis na pasta “</w:t>
       </w:r>
       <w:proofErr w:type="spellStart"/>
-      <w:proofErr w:type="gramStart"/>
       <w:r>
         <w:t>ApêndiceB</w:t>
       </w:r>
       <w:proofErr w:type="spellEnd"/>
-      <w:proofErr w:type="gramEnd"/>
       <w:r>
         <w:t>” que acompanha este documento.</w:t>
       </w:r>
@@ -5321,8 +4957,8 @@
           <w:color w:val="000000"/>
         </w:rPr>
       </w:pPr>
-      <w:bookmarkStart w:id="28" w:name="_io2bxhhvd09c" w:colFirst="0" w:colLast="0"/>
-      <w:bookmarkEnd w:id="28"/>
+      <w:bookmarkStart w:id="27" w:name="_io2bxhhvd09c" w:colFirst="0" w:colLast="0"/>
+      <w:bookmarkEnd w:id="27"/>
       <w:r>
         <w:br w:type="page"/>
       </w:r>
@@ -5341,12 +4977,10 @@
         <w:t>Os requisitos estão disponíveis na pasta “</w:t>
       </w:r>
       <w:proofErr w:type="spellStart"/>
-      <w:proofErr w:type="gramStart"/>
       <w:r>
         <w:t>ApêndiceC</w:t>
       </w:r>
       <w:proofErr w:type="spellEnd"/>
-      <w:proofErr w:type="gramEnd"/>
       <w:r>
         <w:t>” que acompanha este documento.</w:t>
       </w:r>
@@ -5373,8 +5007,8 @@
       </w:pPr>
     </w:p>
     <w:sectPr>
-      <w:headerReference w:type="default" r:id="rId10"/>
-      <w:headerReference w:type="first" r:id="rId11"/>
+      <w:headerReference w:type="default" r:id="rId9"/>
+      <w:headerReference w:type="first" r:id="rId10"/>
       <w:pgSz w:w="11907" w:h="16840"/>
       <w:pgMar w:top="1699" w:right="1138" w:bottom="1238" w:left="1699" w:header="720" w:footer="720" w:gutter="0"/>
       <w:cols w:space="720"/>
@@ -5385,7 +5019,7 @@
 </file>
 
 <file path=word/endnotes.xml><?xml version="1.0" encoding="utf-8"?>
-<w:endnotes xmlns:wpc="http://schemas.microsoft.com/office/word/2010/wordprocessingCanvas" xmlns:mc="http://schemas.openxmlformats.org/markup-compatibility/2006" xmlns:o="urn:schemas-microsoft-com:office:office" xmlns:r="http://schemas.openxmlformats.org/officeDocument/2006/relationships" xmlns:m="http://schemas.openxmlformats.org/officeDocument/2006/math" xmlns:v="urn:schemas-microsoft-com:vml" xmlns:wp14="http://schemas.microsoft.com/office/word/2010/wordprocessingDrawing" xmlns:wp="http://schemas.openxmlformats.org/drawingml/2006/wordprocessingDrawing" xmlns:w10="urn:schemas-microsoft-com:office:word" xmlns:w="http://schemas.openxmlformats.org/wordprocessingml/2006/main" xmlns:w14="http://schemas.microsoft.com/office/word/2010/wordml" xmlns:wpg="http://schemas.microsoft.com/office/word/2010/wordprocessingGroup" xmlns:wpi="http://schemas.microsoft.com/office/word/2010/wordprocessingInk" xmlns:wne="http://schemas.microsoft.com/office/word/2006/wordml" xmlns:wps="http://schemas.microsoft.com/office/word/2010/wordprocessingShape" mc:Ignorable="w14 wp14">
+<w:endnotes xmlns:wpc="http://schemas.microsoft.com/office/word/2010/wordprocessingCanvas" xmlns:cx="http://schemas.microsoft.com/office/drawing/2014/chartex" xmlns:cx1="http://schemas.microsoft.com/office/drawing/2015/9/8/chartex" xmlns:cx2="http://schemas.microsoft.com/office/drawing/2015/10/21/chartex" xmlns:cx3="http://schemas.microsoft.com/office/drawing/2016/5/9/chartex" xmlns:cx4="http://schemas.microsoft.com/office/drawing/2016/5/10/chartex" xmlns:cx5="http://schemas.microsoft.com/office/drawing/2016/5/11/chartex" xmlns:cx6="http://schemas.microsoft.com/office/drawing/2016/5/12/chartex" xmlns:cx7="http://schemas.microsoft.com/office/drawing/2016/5/13/chartex" xmlns:cx8="http://schemas.microsoft.com/office/drawing/2016/5/14/chartex" xmlns:mc="http://schemas.openxmlformats.org/markup-compatibility/2006" xmlns:aink="http://schemas.microsoft.com/office/drawing/2016/ink" xmlns:am3d="http://schemas.microsoft.com/office/drawing/2017/model3d" xmlns:o="urn:schemas-microsoft-com:office:office" xmlns:oel="http://schemas.microsoft.com/office/2019/extlst" xmlns:r="http://schemas.openxmlformats.org/officeDocument/2006/relationships" xmlns:m="http://schemas.openxmlformats.org/officeDocument/2006/math" xmlns:v="urn:schemas-microsoft-com:vml" xmlns:wp14="http://schemas.microsoft.com/office/word/2010/wordprocessingDrawing" xmlns:wp="http://schemas.openxmlformats.org/drawingml/2006/wordprocessingDrawing" xmlns:w10="urn:schemas-microsoft-com:office:word" xmlns:w="http://schemas.openxmlformats.org/wordprocessingml/2006/main" xmlns:w14="http://schemas.microsoft.com/office/word/2010/wordml" xmlns:w15="http://schemas.microsoft.com/office/word/2012/wordml" xmlns:w16cex="http://schemas.microsoft.com/office/word/2018/wordml/cex" xmlns:w16cid="http://schemas.microsoft.com/office/word/2016/wordml/cid" xmlns:w16="http://schemas.microsoft.com/office/word/2018/wordml" xmlns:w16du="http://schemas.microsoft.com/office/word/2023/wordml/word16du" xmlns:w16sdtdh="http://schemas.microsoft.com/office/word/2020/wordml/sdtdatahash" xmlns:w16sdtfl="http://schemas.microsoft.com/office/word/2024/wordml/sdtformatlock" xmlns:w16se="http://schemas.microsoft.com/office/word/2015/wordml/symex" xmlns:wpg="http://schemas.microsoft.com/office/word/2010/wordprocessingGroup" xmlns:wpi="http://schemas.microsoft.com/office/word/2010/wordprocessingInk" xmlns:wne="http://schemas.microsoft.com/office/word/2006/wordml" xmlns:wps="http://schemas.microsoft.com/office/word/2010/wordprocessingShape" mc:Ignorable="w14 w15 w16se w16cid w16 w16cex w16sdtdh w16sdtfl w16du wp14">
   <w:endnote w:type="separator" w:id="-1">
     <w:p>
       <w:pPr>
@@ -5410,7 +5044,7 @@
 </file>
 
 <file path=word/footnotes.xml><?xml version="1.0" encoding="utf-8"?>
-<w:footnotes xmlns:wpc="http://schemas.microsoft.com/office/word/2010/wordprocessingCanvas" xmlns:mc="http://schemas.openxmlformats.org/markup-compatibility/2006" xmlns:o="urn:schemas-microsoft-com:office:office" xmlns:r="http://schemas.openxmlformats.org/officeDocument/2006/relationships" xmlns:m="http://schemas.openxmlformats.org/officeDocument/2006/math" xmlns:v="urn:schemas-microsoft-com:vml" xmlns:wp14="http://schemas.microsoft.com/office/word/2010/wordprocessingDrawing" xmlns:wp="http://schemas.openxmlformats.org/drawingml/2006/wordprocessingDrawing" xmlns:w10="urn:schemas-microsoft-com:office:word" xmlns:w="http://schemas.openxmlformats.org/wordprocessingml/2006/main" xmlns:w14="http://schemas.microsoft.com/office/word/2010/wordml" xmlns:wpg="http://schemas.microsoft.com/office/word/2010/wordprocessingGroup" xmlns:wpi="http://schemas.microsoft.com/office/word/2010/wordprocessingInk" xmlns:wne="http://schemas.microsoft.com/office/word/2006/wordml" xmlns:wps="http://schemas.microsoft.com/office/word/2010/wordprocessingShape" mc:Ignorable="w14 wp14">
+<w:footnotes xmlns:wpc="http://schemas.microsoft.com/office/word/2010/wordprocessingCanvas" xmlns:cx="http://schemas.microsoft.com/office/drawing/2014/chartex" xmlns:cx1="http://schemas.microsoft.com/office/drawing/2015/9/8/chartex" xmlns:cx2="http://schemas.microsoft.com/office/drawing/2015/10/21/chartex" xmlns:cx3="http://schemas.microsoft.com/office/drawing/2016/5/9/chartex" xmlns:cx4="http://schemas.microsoft.com/office/drawing/2016/5/10/chartex" xmlns:cx5="http://schemas.microsoft.com/office/drawing/2016/5/11/chartex" xmlns:cx6="http://schemas.microsoft.com/office/drawing/2016/5/12/chartex" xmlns:cx7="http://schemas.microsoft.com/office/drawing/2016/5/13/chartex" xmlns:cx8="http://schemas.microsoft.com/office/drawing/2016/5/14/chartex" xmlns:mc="http://schemas.openxmlformats.org/markup-compatibility/2006" xmlns:aink="http://schemas.microsoft.com/office/drawing/2016/ink" xmlns:am3d="http://schemas.microsoft.com/office/drawing/2017/model3d" xmlns:o="urn:schemas-microsoft-com:office:office" xmlns:oel="http://schemas.microsoft.com/office/2019/extlst" xmlns:r="http://schemas.openxmlformats.org/officeDocument/2006/relationships" xmlns:m="http://schemas.openxmlformats.org/officeDocument/2006/math" xmlns:v="urn:schemas-microsoft-com:vml" xmlns:wp14="http://schemas.microsoft.com/office/word/2010/wordprocessingDrawing" xmlns:wp="http://schemas.openxmlformats.org/drawingml/2006/wordprocessingDrawing" xmlns:w10="urn:schemas-microsoft-com:office:word" xmlns:w="http://schemas.openxmlformats.org/wordprocessingml/2006/main" xmlns:w14="http://schemas.microsoft.com/office/word/2010/wordml" xmlns:w15="http://schemas.microsoft.com/office/word/2012/wordml" xmlns:w16cex="http://schemas.microsoft.com/office/word/2018/wordml/cex" xmlns:w16cid="http://schemas.microsoft.com/office/word/2016/wordml/cid" xmlns:w16="http://schemas.microsoft.com/office/word/2018/wordml" xmlns:w16du="http://schemas.microsoft.com/office/word/2023/wordml/word16du" xmlns:w16sdtdh="http://schemas.microsoft.com/office/word/2020/wordml/sdtdatahash" xmlns:w16sdtfl="http://schemas.microsoft.com/office/word/2024/wordml/sdtformatlock" xmlns:w16se="http://schemas.microsoft.com/office/word/2015/wordml/symex" xmlns:wpg="http://schemas.microsoft.com/office/word/2010/wordprocessingGroup" xmlns:wpi="http://schemas.microsoft.com/office/word/2010/wordprocessingInk" xmlns:wne="http://schemas.microsoft.com/office/word/2006/wordml" xmlns:wps="http://schemas.microsoft.com/office/word/2010/wordprocessingShape" mc:Ignorable="w14 w15 w16se w16cid w16 w16cex w16sdtdh w16sdtfl w16du wp14">
   <w:footnote w:type="separator" w:id="-1">
     <w:p>
       <w:pPr>
@@ -5435,7 +5069,7 @@
 </file>
 
 <file path=word/header1.xml><?xml version="1.0" encoding="utf-8"?>
-<w:hdr xmlns:wpc="http://schemas.microsoft.com/office/word/2010/wordprocessingCanvas" xmlns:mc="http://schemas.openxmlformats.org/markup-compatibility/2006" xmlns:o="urn:schemas-microsoft-com:office:office" xmlns:r="http://schemas.openxmlformats.org/officeDocument/2006/relationships" xmlns:m="http://schemas.openxmlformats.org/officeDocument/2006/math" xmlns:v="urn:schemas-microsoft-com:vml" xmlns:wp14="http://schemas.microsoft.com/office/word/2010/wordprocessingDrawing" xmlns:wp="http://schemas.openxmlformats.org/drawingml/2006/wordprocessingDrawing" xmlns:w10="urn:schemas-microsoft-com:office:word" xmlns:w="http://schemas.openxmlformats.org/wordprocessingml/2006/main" xmlns:w14="http://schemas.microsoft.com/office/word/2010/wordml" xmlns:wpg="http://schemas.microsoft.com/office/word/2010/wordprocessingGroup" xmlns:wpi="http://schemas.microsoft.com/office/word/2010/wordprocessingInk" xmlns:wne="http://schemas.microsoft.com/office/word/2006/wordml" xmlns:wps="http://schemas.microsoft.com/office/word/2010/wordprocessingShape" mc:Ignorable="w14 wp14">
+<w:hdr xmlns:wpc="http://schemas.microsoft.com/office/word/2010/wordprocessingCanvas" xmlns:cx="http://schemas.microsoft.com/office/drawing/2014/chartex" xmlns:cx1="http://schemas.microsoft.com/office/drawing/2015/9/8/chartex" xmlns:cx2="http://schemas.microsoft.com/office/drawing/2015/10/21/chartex" xmlns:cx3="http://schemas.microsoft.com/office/drawing/2016/5/9/chartex" xmlns:cx4="http://schemas.microsoft.com/office/drawing/2016/5/10/chartex" xmlns:cx5="http://schemas.microsoft.com/office/drawing/2016/5/11/chartex" xmlns:cx6="http://schemas.microsoft.com/office/drawing/2016/5/12/chartex" xmlns:cx7="http://schemas.microsoft.com/office/drawing/2016/5/13/chartex" xmlns:cx8="http://schemas.microsoft.com/office/drawing/2016/5/14/chartex" xmlns:mc="http://schemas.openxmlformats.org/markup-compatibility/2006" xmlns:aink="http://schemas.microsoft.com/office/drawing/2016/ink" xmlns:am3d="http://schemas.microsoft.com/office/drawing/2017/model3d" xmlns:o="urn:schemas-microsoft-com:office:office" xmlns:oel="http://schemas.microsoft.com/office/2019/extlst" xmlns:r="http://schemas.openxmlformats.org/officeDocument/2006/relationships" xmlns:m="http://schemas.openxmlformats.org/officeDocument/2006/math" xmlns:v="urn:schemas-microsoft-com:vml" xmlns:wp14="http://schemas.microsoft.com/office/word/2010/wordprocessingDrawing" xmlns:wp="http://schemas.openxmlformats.org/drawingml/2006/wordprocessingDrawing" xmlns:w10="urn:schemas-microsoft-com:office:word" xmlns:w="http://schemas.openxmlformats.org/wordprocessingml/2006/main" xmlns:w14="http://schemas.microsoft.com/office/word/2010/wordml" xmlns:w15="http://schemas.microsoft.com/office/word/2012/wordml" xmlns:w16cex="http://schemas.microsoft.com/office/word/2018/wordml/cex" xmlns:w16cid="http://schemas.microsoft.com/office/word/2016/wordml/cid" xmlns:w16="http://schemas.microsoft.com/office/word/2018/wordml" xmlns:w16du="http://schemas.microsoft.com/office/word/2023/wordml/word16du" xmlns:w16sdtdh="http://schemas.microsoft.com/office/word/2020/wordml/sdtdatahash" xmlns:w16sdtfl="http://schemas.microsoft.com/office/word/2024/wordml/sdtformatlock" xmlns:w16se="http://schemas.microsoft.com/office/word/2015/wordml/symex" xmlns:wpg="http://schemas.microsoft.com/office/word/2010/wordprocessingGroup" xmlns:wpi="http://schemas.microsoft.com/office/word/2010/wordprocessingInk" xmlns:wne="http://schemas.microsoft.com/office/word/2006/wordml" xmlns:wps="http://schemas.microsoft.com/office/word/2010/wordprocessingShape" mc:Ignorable="w14 w15 w16se w16cid w16 w16cex w16sdtdh w16sdtfl w16du wp14">
   <w:p>
     <w:pPr>
       <w:pBdr>
@@ -5496,7 +5130,7 @@
 </file>
 
 <file path=word/header2.xml><?xml version="1.0" encoding="utf-8"?>
-<w:hdr xmlns:wpc="http://schemas.microsoft.com/office/word/2010/wordprocessingCanvas" xmlns:mc="http://schemas.openxmlformats.org/markup-compatibility/2006" xmlns:o="urn:schemas-microsoft-com:office:office" xmlns:r="http://schemas.openxmlformats.org/officeDocument/2006/relationships" xmlns:m="http://schemas.openxmlformats.org/officeDocument/2006/math" xmlns:v="urn:schemas-microsoft-com:vml" xmlns:wp14="http://schemas.microsoft.com/office/word/2010/wordprocessingDrawing" xmlns:wp="http://schemas.openxmlformats.org/drawingml/2006/wordprocessingDrawing" xmlns:w10="urn:schemas-microsoft-com:office:word" xmlns:w="http://schemas.openxmlformats.org/wordprocessingml/2006/main" xmlns:w14="http://schemas.microsoft.com/office/word/2010/wordml" xmlns:wpg="http://schemas.microsoft.com/office/word/2010/wordprocessingGroup" xmlns:wpi="http://schemas.microsoft.com/office/word/2010/wordprocessingInk" xmlns:wne="http://schemas.microsoft.com/office/word/2006/wordml" xmlns:wps="http://schemas.microsoft.com/office/word/2010/wordprocessingShape" mc:Ignorable="w14 wp14">
+<w:hdr xmlns:wpc="http://schemas.microsoft.com/office/word/2010/wordprocessingCanvas" xmlns:cx="http://schemas.microsoft.com/office/drawing/2014/chartex" xmlns:cx1="http://schemas.microsoft.com/office/drawing/2015/9/8/chartex" xmlns:cx2="http://schemas.microsoft.com/office/drawing/2015/10/21/chartex" xmlns:cx3="http://schemas.microsoft.com/office/drawing/2016/5/9/chartex" xmlns:cx4="http://schemas.microsoft.com/office/drawing/2016/5/10/chartex" xmlns:cx5="http://schemas.microsoft.com/office/drawing/2016/5/11/chartex" xmlns:cx6="http://schemas.microsoft.com/office/drawing/2016/5/12/chartex" xmlns:cx7="http://schemas.microsoft.com/office/drawing/2016/5/13/chartex" xmlns:cx8="http://schemas.microsoft.com/office/drawing/2016/5/14/chartex" xmlns:mc="http://schemas.openxmlformats.org/markup-compatibility/2006" xmlns:aink="http://schemas.microsoft.com/office/drawing/2016/ink" xmlns:am3d="http://schemas.microsoft.com/office/drawing/2017/model3d" xmlns:o="urn:schemas-microsoft-com:office:office" xmlns:oel="http://schemas.microsoft.com/office/2019/extlst" xmlns:r="http://schemas.openxmlformats.org/officeDocument/2006/relationships" xmlns:m="http://schemas.openxmlformats.org/officeDocument/2006/math" xmlns:v="urn:schemas-microsoft-com:vml" xmlns:wp14="http://schemas.microsoft.com/office/word/2010/wordprocessingDrawing" xmlns:wp="http://schemas.openxmlformats.org/drawingml/2006/wordprocessingDrawing" xmlns:w10="urn:schemas-microsoft-com:office:word" xmlns:w="http://schemas.openxmlformats.org/wordprocessingml/2006/main" xmlns:w14="http://schemas.microsoft.com/office/word/2010/wordml" xmlns:w15="http://schemas.microsoft.com/office/word/2012/wordml" xmlns:w16cex="http://schemas.microsoft.com/office/word/2018/wordml/cex" xmlns:w16cid="http://schemas.microsoft.com/office/word/2016/wordml/cid" xmlns:w16="http://schemas.microsoft.com/office/word/2018/wordml" xmlns:w16du="http://schemas.microsoft.com/office/word/2023/wordml/word16du" xmlns:w16sdtdh="http://schemas.microsoft.com/office/word/2020/wordml/sdtdatahash" xmlns:w16sdtfl="http://schemas.microsoft.com/office/word/2024/wordml/sdtformatlock" xmlns:w16se="http://schemas.microsoft.com/office/word/2015/wordml/symex" xmlns:wpg="http://schemas.microsoft.com/office/word/2010/wordprocessingGroup" xmlns:wpi="http://schemas.microsoft.com/office/word/2010/wordprocessingInk" xmlns:wne="http://schemas.microsoft.com/office/word/2006/wordml" xmlns:wps="http://schemas.microsoft.com/office/word/2010/wordprocessingShape" mc:Ignorable="w14 w15 w16se w16cid w16 w16cex w16sdtdh w16sdtfl w16du wp14">
   <w:p>
     <w:pPr>
       <w:pBdr>
@@ -5570,7 +5204,7 @@
 </file>
 
 <file path=word/header3.xml><?xml version="1.0" encoding="utf-8"?>
-<w:hdr xmlns:wpc="http://schemas.microsoft.com/office/word/2010/wordprocessingCanvas" xmlns:mc="http://schemas.openxmlformats.org/markup-compatibility/2006" xmlns:o="urn:schemas-microsoft-com:office:office" xmlns:r="http://schemas.openxmlformats.org/officeDocument/2006/relationships" xmlns:m="http://schemas.openxmlformats.org/officeDocument/2006/math" xmlns:v="urn:schemas-microsoft-com:vml" xmlns:wp14="http://schemas.microsoft.com/office/word/2010/wordprocessingDrawing" xmlns:wp="http://schemas.openxmlformats.org/drawingml/2006/wordprocessingDrawing" xmlns:w10="urn:schemas-microsoft-com:office:word" xmlns:w="http://schemas.openxmlformats.org/wordprocessingml/2006/main" xmlns:w14="http://schemas.microsoft.com/office/word/2010/wordml" xmlns:wpg="http://schemas.microsoft.com/office/word/2010/wordprocessingGroup" xmlns:wpi="http://schemas.microsoft.com/office/word/2010/wordprocessingInk" xmlns:wne="http://schemas.microsoft.com/office/word/2006/wordml" xmlns:wps="http://schemas.microsoft.com/office/word/2010/wordprocessingShape" mc:Ignorable="w14 wp14">
+<w:hdr xmlns:wpc="http://schemas.microsoft.com/office/word/2010/wordprocessingCanvas" xmlns:cx="http://schemas.microsoft.com/office/drawing/2014/chartex" xmlns:cx1="http://schemas.microsoft.com/office/drawing/2015/9/8/chartex" xmlns:cx2="http://schemas.microsoft.com/office/drawing/2015/10/21/chartex" xmlns:cx3="http://schemas.microsoft.com/office/drawing/2016/5/9/chartex" xmlns:cx4="http://schemas.microsoft.com/office/drawing/2016/5/10/chartex" xmlns:cx5="http://schemas.microsoft.com/office/drawing/2016/5/11/chartex" xmlns:cx6="http://schemas.microsoft.com/office/drawing/2016/5/12/chartex" xmlns:cx7="http://schemas.microsoft.com/office/drawing/2016/5/13/chartex" xmlns:cx8="http://schemas.microsoft.com/office/drawing/2016/5/14/chartex" xmlns:mc="http://schemas.openxmlformats.org/markup-compatibility/2006" xmlns:aink="http://schemas.microsoft.com/office/drawing/2016/ink" xmlns:am3d="http://schemas.microsoft.com/office/drawing/2017/model3d" xmlns:o="urn:schemas-microsoft-com:office:office" xmlns:oel="http://schemas.microsoft.com/office/2019/extlst" xmlns:r="http://schemas.openxmlformats.org/officeDocument/2006/relationships" xmlns:m="http://schemas.openxmlformats.org/officeDocument/2006/math" xmlns:v="urn:schemas-microsoft-com:vml" xmlns:wp14="http://schemas.microsoft.com/office/word/2010/wordprocessingDrawing" xmlns:wp="http://schemas.openxmlformats.org/drawingml/2006/wordprocessingDrawing" xmlns:w10="urn:schemas-microsoft-com:office:word" xmlns:w="http://schemas.openxmlformats.org/wordprocessingml/2006/main" xmlns:w14="http://schemas.microsoft.com/office/word/2010/wordml" xmlns:w15="http://schemas.microsoft.com/office/word/2012/wordml" xmlns:w16cex="http://schemas.microsoft.com/office/word/2018/wordml/cex" xmlns:w16cid="http://schemas.microsoft.com/office/word/2016/wordml/cid" xmlns:w16="http://schemas.microsoft.com/office/word/2018/wordml" xmlns:w16du="http://schemas.microsoft.com/office/word/2023/wordml/word16du" xmlns:w16sdtdh="http://schemas.microsoft.com/office/word/2020/wordml/sdtdatahash" xmlns:w16sdtfl="http://schemas.microsoft.com/office/word/2024/wordml/sdtformatlock" xmlns:w16se="http://schemas.microsoft.com/office/word/2015/wordml/symex" xmlns:wpg="http://schemas.microsoft.com/office/word/2010/wordprocessingGroup" xmlns:wpi="http://schemas.microsoft.com/office/word/2010/wordprocessingInk" xmlns:wne="http://schemas.microsoft.com/office/word/2006/wordml" xmlns:wps="http://schemas.microsoft.com/office/word/2010/wordprocessingShape" mc:Ignorable="w14 w15 w16se w16cid w16 w16cex w16sdtdh w16sdtfl w16du wp14">
   <w:p>
     <w:pPr>
       <w:pBdr>
@@ -5612,7 +5246,7 @@
 </file>
 
 <file path=word/header4.xml><?xml version="1.0" encoding="utf-8"?>
-<w:hdr xmlns:wpc="http://schemas.microsoft.com/office/word/2010/wordprocessingCanvas" xmlns:mc="http://schemas.openxmlformats.org/markup-compatibility/2006" xmlns:o="urn:schemas-microsoft-com:office:office" xmlns:r="http://schemas.openxmlformats.org/officeDocument/2006/relationships" xmlns:m="http://schemas.openxmlformats.org/officeDocument/2006/math" xmlns:v="urn:schemas-microsoft-com:vml" xmlns:wp14="http://schemas.microsoft.com/office/word/2010/wordprocessingDrawing" xmlns:wp="http://schemas.openxmlformats.org/drawingml/2006/wordprocessingDrawing" xmlns:w10="urn:schemas-microsoft-com:office:word" xmlns:w="http://schemas.openxmlformats.org/wordprocessingml/2006/main" xmlns:w14="http://schemas.microsoft.com/office/word/2010/wordml" xmlns:wpg="http://schemas.microsoft.com/office/word/2010/wordprocessingGroup" xmlns:wpi="http://schemas.microsoft.com/office/word/2010/wordprocessingInk" xmlns:wne="http://schemas.microsoft.com/office/word/2006/wordml" xmlns:wps="http://schemas.microsoft.com/office/word/2010/wordprocessingShape" mc:Ignorable="w14 wp14">
+<w:hdr xmlns:wpc="http://schemas.microsoft.com/office/word/2010/wordprocessingCanvas" xmlns:cx="http://schemas.microsoft.com/office/drawing/2014/chartex" xmlns:cx1="http://schemas.microsoft.com/office/drawing/2015/9/8/chartex" xmlns:cx2="http://schemas.microsoft.com/office/drawing/2015/10/21/chartex" xmlns:cx3="http://schemas.microsoft.com/office/drawing/2016/5/9/chartex" xmlns:cx4="http://schemas.microsoft.com/office/drawing/2016/5/10/chartex" xmlns:cx5="http://schemas.microsoft.com/office/drawing/2016/5/11/chartex" xmlns:cx6="http://schemas.microsoft.com/office/drawing/2016/5/12/chartex" xmlns:cx7="http://schemas.microsoft.com/office/drawing/2016/5/13/chartex" xmlns:cx8="http://schemas.microsoft.com/office/drawing/2016/5/14/chartex" xmlns:mc="http://schemas.openxmlformats.org/markup-compatibility/2006" xmlns:aink="http://schemas.microsoft.com/office/drawing/2016/ink" xmlns:am3d="http://schemas.microsoft.com/office/drawing/2017/model3d" xmlns:o="urn:schemas-microsoft-com:office:office" xmlns:oel="http://schemas.microsoft.com/office/2019/extlst" xmlns:r="http://schemas.openxmlformats.org/officeDocument/2006/relationships" xmlns:m="http://schemas.openxmlformats.org/officeDocument/2006/math" xmlns:v="urn:schemas-microsoft-com:vml" xmlns:wp14="http://schemas.microsoft.com/office/word/2010/wordprocessingDrawing" xmlns:wp="http://schemas.openxmlformats.org/drawingml/2006/wordprocessingDrawing" xmlns:w10="urn:schemas-microsoft-com:office:word" xmlns:w="http://schemas.openxmlformats.org/wordprocessingml/2006/main" xmlns:w14="http://schemas.microsoft.com/office/word/2010/wordml" xmlns:w15="http://schemas.microsoft.com/office/word/2012/wordml" xmlns:w16cex="http://schemas.microsoft.com/office/word/2018/wordml/cex" xmlns:w16cid="http://schemas.microsoft.com/office/word/2016/wordml/cid" xmlns:w16="http://schemas.microsoft.com/office/word/2018/wordml" xmlns:w16du="http://schemas.microsoft.com/office/word/2023/wordml/word16du" xmlns:w16sdtdh="http://schemas.microsoft.com/office/word/2020/wordml/sdtdatahash" xmlns:w16sdtfl="http://schemas.microsoft.com/office/word/2024/wordml/sdtformatlock" xmlns:w16se="http://schemas.microsoft.com/office/word/2015/wordml/symex" xmlns:wpg="http://schemas.microsoft.com/office/word/2010/wordprocessingGroup" xmlns:wpi="http://schemas.microsoft.com/office/word/2010/wordprocessingInk" xmlns:wne="http://schemas.microsoft.com/office/word/2006/wordml" xmlns:wps="http://schemas.microsoft.com/office/word/2010/wordprocessingShape" mc:Ignorable="w14 w15 w16se w16cid w16 w16cex w16sdtdh w16sdtfl w16du wp14">
   <w:p>
     <w:pPr>
       <w:pBdr>
@@ -5686,7 +5320,7 @@
 </file>
 
 <file path=word/header5.xml><?xml version="1.0" encoding="utf-8"?>
-<w:hdr xmlns:wpc="http://schemas.microsoft.com/office/word/2010/wordprocessingCanvas" xmlns:mc="http://schemas.openxmlformats.org/markup-compatibility/2006" xmlns:o="urn:schemas-microsoft-com:office:office" xmlns:r="http://schemas.openxmlformats.org/officeDocument/2006/relationships" xmlns:m="http://schemas.openxmlformats.org/officeDocument/2006/math" xmlns:v="urn:schemas-microsoft-com:vml" xmlns:wp14="http://schemas.microsoft.com/office/word/2010/wordprocessingDrawing" xmlns:wp="http://schemas.openxmlformats.org/drawingml/2006/wordprocessingDrawing" xmlns:w10="urn:schemas-microsoft-com:office:word" xmlns:w="http://schemas.openxmlformats.org/wordprocessingml/2006/main" xmlns:w14="http://schemas.microsoft.com/office/word/2010/wordml" xmlns:wpg="http://schemas.microsoft.com/office/word/2010/wordprocessingGroup" xmlns:wpi="http://schemas.microsoft.com/office/word/2010/wordprocessingInk" xmlns:wne="http://schemas.microsoft.com/office/word/2006/wordml" xmlns:wps="http://schemas.microsoft.com/office/word/2010/wordprocessingShape" mc:Ignorable="w14 wp14">
+<w:hdr xmlns:wpc="http://schemas.microsoft.com/office/word/2010/wordprocessingCanvas" xmlns:cx="http://schemas.microsoft.com/office/drawing/2014/chartex" xmlns:cx1="http://schemas.microsoft.com/office/drawing/2015/9/8/chartex" xmlns:cx2="http://schemas.microsoft.com/office/drawing/2015/10/21/chartex" xmlns:cx3="http://schemas.microsoft.com/office/drawing/2016/5/9/chartex" xmlns:cx4="http://schemas.microsoft.com/office/drawing/2016/5/10/chartex" xmlns:cx5="http://schemas.microsoft.com/office/drawing/2016/5/11/chartex" xmlns:cx6="http://schemas.microsoft.com/office/drawing/2016/5/12/chartex" xmlns:cx7="http://schemas.microsoft.com/office/drawing/2016/5/13/chartex" xmlns:cx8="http://schemas.microsoft.com/office/drawing/2016/5/14/chartex" xmlns:mc="http://schemas.openxmlformats.org/markup-compatibility/2006" xmlns:aink="http://schemas.microsoft.com/office/drawing/2016/ink" xmlns:am3d="http://schemas.microsoft.com/office/drawing/2017/model3d" xmlns:o="urn:schemas-microsoft-com:office:office" xmlns:oel="http://schemas.microsoft.com/office/2019/extlst" xmlns:r="http://schemas.openxmlformats.org/officeDocument/2006/relationships" xmlns:m="http://schemas.openxmlformats.org/officeDocument/2006/math" xmlns:v="urn:schemas-microsoft-com:vml" xmlns:wp14="http://schemas.microsoft.com/office/word/2010/wordprocessingDrawing" xmlns:wp="http://schemas.openxmlformats.org/drawingml/2006/wordprocessingDrawing" xmlns:w10="urn:schemas-microsoft-com:office:word" xmlns:w="http://schemas.openxmlformats.org/wordprocessingml/2006/main" xmlns:w14="http://schemas.microsoft.com/office/word/2010/wordml" xmlns:w15="http://schemas.microsoft.com/office/word/2012/wordml" xmlns:w16cex="http://schemas.microsoft.com/office/word/2018/wordml/cex" xmlns:w16cid="http://schemas.microsoft.com/office/word/2016/wordml/cid" xmlns:w16="http://schemas.microsoft.com/office/word/2018/wordml" xmlns:w16du="http://schemas.microsoft.com/office/word/2023/wordml/word16du" xmlns:w16sdtdh="http://schemas.microsoft.com/office/word/2020/wordml/sdtdatahash" xmlns:w16sdtfl="http://schemas.microsoft.com/office/word/2024/wordml/sdtformatlock" xmlns:w16se="http://schemas.microsoft.com/office/word/2015/wordml/symex" xmlns:wpg="http://schemas.microsoft.com/office/word/2010/wordprocessingGroup" xmlns:wpi="http://schemas.microsoft.com/office/word/2010/wordprocessingInk" xmlns:wne="http://schemas.microsoft.com/office/word/2006/wordml" xmlns:wps="http://schemas.microsoft.com/office/word/2010/wordprocessingShape" mc:Ignorable="w14 w15 w16se w16cid w16 w16cex w16sdtdh w16sdtfl w16du wp14">
   <w:p>
     <w:pPr>
       <w:pBdr>
@@ -5747,7 +5381,7 @@
 </file>
 
 <file path=word/styles.xml><?xml version="1.0" encoding="utf-8"?>
-<w:styles xmlns:mc="http://schemas.openxmlformats.org/markup-compatibility/2006" xmlns:r="http://schemas.openxmlformats.org/officeDocument/2006/relationships" xmlns:w="http://schemas.openxmlformats.org/wordprocessingml/2006/main" xmlns:w14="http://schemas.microsoft.com/office/word/2010/wordml" mc:Ignorable="w14">
+<w:styles xmlns:mc="http://schemas.openxmlformats.org/markup-compatibility/2006" xmlns:r="http://schemas.openxmlformats.org/officeDocument/2006/relationships" xmlns:w="http://schemas.openxmlformats.org/wordprocessingml/2006/main" xmlns:w14="http://schemas.microsoft.com/office/word/2010/wordml" xmlns:w15="http://schemas.microsoft.com/office/word/2012/wordml" xmlns:w16cex="http://schemas.microsoft.com/office/word/2018/wordml/cex" xmlns:w16cid="http://schemas.microsoft.com/office/word/2016/wordml/cid" xmlns:w16="http://schemas.microsoft.com/office/word/2018/wordml" xmlns:w16du="http://schemas.microsoft.com/office/word/2023/wordml/word16du" xmlns:w16sdtdh="http://schemas.microsoft.com/office/word/2020/wordml/sdtdatahash" xmlns:w16sdtfl="http://schemas.microsoft.com/office/word/2024/wordml/sdtformatlock" xmlns:w16se="http://schemas.microsoft.com/office/word/2015/wordml/symex" mc:Ignorable="w14 w15 w16se w16cid w16 w16cex w16sdtdh w16sdtfl w16du">
   <w:docDefaults>
     <w:rPrDefault>
       <w:rPr>
@@ -5763,561 +5397,383 @@
       </w:pPr>
     </w:pPrDefault>
   </w:docDefaults>
-  <w:latentStyles w:defLockedState="0" w:defUIPriority="99" w:defSemiHidden="1" w:defUnhideWhenUsed="1" w:defQFormat="0" w:count="267">
-    <w:lsdException w:name="Normal" w:semiHidden="0" w:uiPriority="0" w:unhideWhenUsed="0" w:qFormat="1"/>
-    <w:lsdException w:name="heading 1" w:semiHidden="0" w:uiPriority="9" w:unhideWhenUsed="0" w:qFormat="1"/>
-    <w:lsdException w:name="heading 2" w:uiPriority="9" w:qFormat="1"/>
-    <w:lsdException w:name="heading 3" w:uiPriority="9" w:qFormat="1"/>
-    <w:lsdException w:name="heading 4" w:uiPriority="9" w:qFormat="1"/>
-    <w:lsdException w:name="heading 5" w:uiPriority="9" w:qFormat="1"/>
-    <w:lsdException w:name="heading 6" w:uiPriority="9" w:qFormat="1"/>
-    <w:lsdException w:name="heading 7" w:uiPriority="9" w:qFormat="1"/>
-    <w:lsdException w:name="heading 8" w:uiPriority="9" w:qFormat="1"/>
-    <w:lsdException w:name="heading 9" w:uiPriority="9" w:qFormat="1"/>
-    <w:lsdException w:name="toc 1" w:uiPriority="39"/>
-    <w:lsdException w:name="toc 2" w:uiPriority="39"/>
-    <w:lsdException w:name="toc 3" w:uiPriority="39"/>
-    <w:lsdException w:name="toc 4" w:uiPriority="39"/>
-    <w:lsdException w:name="toc 5" w:uiPriority="39"/>
-    <w:lsdException w:name="toc 6" w:uiPriority="39"/>
-    <w:lsdException w:name="toc 7" w:uiPriority="39"/>
-    <w:lsdException w:name="toc 8" w:uiPriority="39"/>
-    <w:lsdException w:name="toc 9" w:uiPriority="39"/>
-    <w:lsdException w:name="caption" w:uiPriority="35" w:qFormat="1"/>
-    <w:lsdException w:name="Title" w:semiHidden="0" w:uiPriority="10" w:unhideWhenUsed="0" w:qFormat="1"/>
-    <w:lsdException w:name="Default Paragraph Font" w:uiPriority="1"/>
-    <w:lsdException w:name="Subtitle" w:semiHidden="0" w:uiPriority="11" w:unhideWhenUsed="0" w:qFormat="1"/>
-    <w:lsdException w:name="Strong" w:semiHidden="0" w:uiPriority="22" w:unhideWhenUsed="0" w:qFormat="1"/>
-    <w:lsdException w:name="Emphasis" w:semiHidden="0" w:uiPriority="20" w:unhideWhenUsed="0" w:qFormat="1"/>
-    <w:lsdException w:name="Table Grid" w:semiHidden="0" w:uiPriority="39" w:unhideWhenUsed="0"/>
-    <w:lsdException w:name="Placeholder Text" w:unhideWhenUsed="0"/>
-    <w:lsdException w:name="No Spacing" w:semiHidden="0" w:uiPriority="1" w:unhideWhenUsed="0" w:qFormat="1"/>
-    <w:lsdException w:name="Light Shading" w:semiHidden="0" w:uiPriority="60" w:unhideWhenUsed="0"/>
-    <w:lsdException w:name="Light List" w:semiHidden="0" w:uiPriority="61" w:unhideWhenUsed="0"/>
-    <w:lsdException w:name="Light Grid" w:semiHidden="0" w:uiPriority="62" w:unhideWhenUsed="0"/>
-    <w:lsdException w:name="Medium Shading 1" w:semiHidden="0" w:uiPriority="63" w:unhideWhenUsed="0"/>
-    <w:lsdException w:name="Medium Shading 2" w:semiHidden="0" w:uiPriority="64" w:unhideWhenUsed="0"/>
-    <w:lsdException w:name="Medium List 1" w:semiHidden="0" w:uiPriority="65" w:unhideWhenUsed="0"/>
-    <w:lsdException w:name="Medium List 2" w:semiHidden="0" w:uiPriority="66" w:unhideWhenUsed="0"/>
-    <w:lsdException w:name="Medium Grid 1" w:semiHidden="0" w:uiPriority="67" w:unhideWhenUsed="0"/>
-    <w:lsdException w:name="Medium Grid 2" w:semiHidden="0" w:uiPriority="68" w:unhideWhenUsed="0"/>
-    <w:lsdException w:name="Medium Grid 3" w:semiHidden="0" w:uiPriority="69" w:unhideWhenUsed="0"/>
-    <w:lsdException w:name="Dark List" w:semiHidden="0" w:uiPriority="70" w:unhideWhenUsed="0"/>
-    <w:lsdException w:name="Colorful Shading" w:semiHidden="0" w:uiPriority="71" w:unhideWhenUsed="0"/>
-    <w:lsdException w:name="Colorful List" w:semiHidden="0" w:uiPriority="72" w:unhideWhenUsed="0"/>
-    <w:lsdException w:name="Colorful Grid" w:semiHidden="0" w:uiPriority="73" w:unhideWhenUsed="0"/>
-    <w:lsdException w:name="Light Shading Accent 1" w:semiHidden="0" w:uiPriority="60" w:unhideWhenUsed="0"/>
-    <w:lsdException w:name="Light List Accent 1" w:semiHidden="0" w:uiPriority="61" w:unhideWhenUsed="0"/>
-    <w:lsdException w:name="Light Grid Accent 1" w:semiHidden="0" w:uiPriority="62" w:unhideWhenUsed="0"/>
-    <w:lsdException w:name="Medium Shading 1 Accent 1" w:semiHidden="0" w:uiPriority="63" w:unhideWhenUsed="0"/>
-    <w:lsdException w:name="Medium Shading 2 Accent 1" w:semiHidden="0" w:uiPriority="64" w:unhideWhenUsed="0"/>
-    <w:lsdException w:name="Medium List 1 Accent 1" w:semiHidden="0" w:uiPriority="65" w:unhideWhenUsed="0"/>
-    <w:lsdException w:name="Revision" w:unhideWhenUsed="0"/>
-    <w:lsdException w:name="List Paragraph" w:semiHidden="0" w:uiPriority="34" w:unhideWhenUsed="0" w:qFormat="1"/>
-    <w:lsdException w:name="Quote" w:semiHidden="0" w:uiPriority="29" w:unhideWhenUsed="0" w:qFormat="1"/>
-    <w:lsdException w:name="Intense Quote" w:semiHidden="0" w:uiPriority="30" w:unhideWhenUsed="0" w:qFormat="1"/>
-    <w:lsdException w:name="Medium List 2 Accent 1" w:semiHidden="0" w:uiPriority="66" w:unhideWhenUsed="0"/>
-    <w:lsdException w:name="Medium Grid 1 Accent 1" w:semiHidden="0" w:uiPriority="67" w:unhideWhenUsed="0"/>
-    <w:lsdException w:name="Medium Grid 2 Accent 1" w:semiHidden="0" w:uiPriority="68" w:unhideWhenUsed="0"/>
-    <w:lsdException w:name="Medium Grid 3 Accent 1" w:semiHidden="0" w:uiPriority="69" w:unhideWhenUsed="0"/>
-    <w:lsdException w:name="Dark List Accent 1" w:semiHidden="0" w:uiPriority="70" w:unhideWhenUsed="0"/>
-    <w:lsdException w:name="Colorful Shading Accent 1" w:semiHidden="0" w:uiPriority="71" w:unhideWhenUsed="0"/>
-    <w:lsdException w:name="Colorful List Accent 1" w:semiHidden="0" w:uiPriority="72" w:unhideWhenUsed="0"/>
-    <w:lsdException w:name="Colorful Grid Accent 1" w:semiHidden="0" w:uiPriority="73" w:unhideWhenUsed="0"/>
-    <w:lsdException w:name="Light Shading Accent 2" w:semiHidden="0" w:uiPriority="60" w:unhideWhenUsed="0"/>
-    <w:lsdException w:name="Light List Accent 2" w:semiHidden="0" w:uiPriority="61" w:unhideWhenUsed="0"/>
-    <w:lsdException w:name="Light Grid Accent 2" w:semiHidden="0" w:uiPriority="62" w:unhideWhenUsed="0"/>
-    <w:lsdException w:name="Medium Shading 1 Accent 2" w:semiHidden="0" w:uiPriority="63" w:unhideWhenUsed="0"/>
-    <w:lsdException w:name="Medium Shading 2 Accent 2" w:semiHidden="0" w:uiPriority="64" w:unhideWhenUsed="0"/>
-    <w:lsdException w:name="Medium List 1 Accent 2" w:semiHidden="0" w:uiPriority="65" w:unhideWhenUsed="0"/>
-    <w:lsdException w:name="Medium List 2 Accent 2" w:semiHidden="0" w:uiPriority="66" w:unhideWhenUsed="0"/>
-    <w:lsdException w:name="Medium Grid 1 Accent 2" w:semiHidden="0" w:uiPriority="67" w:unhideWhenUsed="0"/>
-    <w:lsdException w:name="Medium Grid 2 Accent 2" w:semiHidden="0" w:uiPriority="68" w:unhideWhenUsed="0"/>
-    <w:lsdException w:name="Medium Grid 3 Accent 2" w:semiHidden="0" w:uiPriority="69" w:unhideWhenUsed="0"/>
-    <w:lsdException w:name="Dark List Accent 2" w:semiHidden="0" w:uiPriority="70" w:unhideWhenUsed="0"/>
-    <w:lsdException w:name="Colorful Shading Accent 2" w:semiHidden="0" w:uiPriority="71" w:unhideWhenUsed="0"/>
-    <w:lsdException w:name="Colorful List Accent 2" w:semiHidden="0" w:uiPriority="72" w:unhideWhenUsed="0"/>
-    <w:lsdException w:name="Colorful Grid Accent 2" w:semiHidden="0" w:uiPriority="73" w:unhideWhenUsed="0"/>
-    <w:lsdException w:name="Light Shading Accent 3" w:semiHidden="0" w:uiPriority="60" w:unhideWhenUsed="0"/>
-    <w:lsdException w:name="Light List Accent 3" w:semiHidden="0" w:uiPriority="61" w:unhideWhenUsed="0"/>
-    <w:lsdException w:name="Light Grid Accent 3" w:semiHidden="0" w:uiPriority="62" w:unhideWhenUsed="0"/>
-    <w:lsdException w:name="Medium Shading 1 Accent 3" w:semiHidden="0" w:uiPriority="63" w:unhideWhenUsed="0"/>
-    <w:lsdException w:name="Medium Shading 2 Accent 3" w:semiHidden="0" w:uiPriority="64" w:unhideWhenUsed="0"/>
-    <w:lsdException w:name="Medium List 1 Accent 3" w:semiHidden="0" w:uiPriority="65" w:unhideWhenUsed="0"/>
-    <w:lsdException w:name="Medium List 2 Accent 3" w:semiHidden="0" w:uiPriority="66" w:unhideWhenUsed="0"/>
-    <w:lsdException w:name="Medium Grid 1 Accent 3" w:semiHidden="0" w:uiPriority="67" w:unhideWhenUsed="0"/>
-    <w:lsdException w:name="Medium Grid 2 Accent 3" w:semiHidden="0" w:uiPriority="68" w:unhideWhenUsed="0"/>
-    <w:lsdException w:name="Medium Grid 3 Accent 3" w:semiHidden="0" w:uiPriority="69" w:unhideWhenUsed="0"/>
-    <w:lsdException w:name="Dark List Accent 3" w:semiHidden="0" w:uiPriority="70" w:unhideWhenUsed="0"/>
-    <w:lsdException w:name="Colorful Shading Accent 3" w:semiHidden="0" w:uiPriority="71" w:unhideWhenUsed="0"/>
-    <w:lsdException w:name="Colorful List Accent 3" w:semiHidden="0" w:uiPriority="72" w:unhideWhenUsed="0"/>
-    <w:lsdException w:name="Colorful Grid Accent 3" w:semiHidden="0" w:uiPriority="73" w:unhideWhenUsed="0"/>
-    <w:lsdException w:name="Light Shading Accent 4" w:semiHidden="0" w:uiPriority="60" w:unhideWhenUsed="0"/>
-    <w:lsdException w:name="Light List Accent 4" w:semiHidden="0" w:uiPriority="61" w:unhideWhenUsed="0"/>
-    <w:lsdException w:name="Light Grid Accent 4" w:semiHidden="0" w:uiPriority="62" w:unhideWhenUsed="0"/>
-    <w:lsdException w:name="Medium Shading 1 Accent 4" w:semiHidden="0" w:uiPriority="63" w:unhideWhenUsed="0"/>
-    <w:lsdException w:name="Medium Shading 2 Accent 4" w:semiHidden="0" w:uiPriority="64" w:unhideWhenUsed="0"/>
-    <w:lsdException w:name="Medium List 1 Accent 4" w:semiHidden="0" w:uiPriority="65" w:unhideWhenUsed="0"/>
-    <w:lsdException w:name="Medium List 2 Accent 4" w:semiHidden="0" w:uiPriority="66" w:unhideWhenUsed="0"/>
-    <w:lsdException w:name="Medium Grid 1 Accent 4" w:semiHidden="0" w:uiPriority="67" w:unhideWhenUsed="0"/>
-    <w:lsdException w:name="Medium Grid 2 Accent 4" w:semiHidden="0" w:uiPriority="68" w:unhideWhenUsed="0"/>
-    <w:lsdException w:name="Medium Grid 3 Accent 4" w:semiHidden="0" w:uiPriority="69" w:unhideWhenUsed="0"/>
-    <w:lsdException w:name="Dark List Accent 4" w:semiHidden="0" w:uiPriority="70" w:unhideWhenUsed="0"/>
-    <w:lsdException w:name="Colorful Shading Accent 4" w:semiHidden="0" w:uiPriority="71" w:unhideWhenUsed="0"/>
-    <w:lsdException w:name="Colorful List Accent 4" w:semiHidden="0" w:uiPriority="72" w:unhideWhenUsed="0"/>
-    <w:lsdException w:name="Colorful Grid Accent 4" w:semiHidden="0" w:uiPriority="73" w:unhideWhenUsed="0"/>
-    <w:lsdException w:name="Light Shading Accent 5" w:semiHidden="0" w:uiPriority="60" w:unhideWhenUsed="0"/>
-    <w:lsdException w:name="Light List Accent 5" w:semiHidden="0" w:uiPriority="61" w:unhideWhenUsed="0"/>
-    <w:lsdException w:name="Light Grid Accent 5" w:semiHidden="0" w:uiPriority="62" w:unhideWhenUsed="0"/>
-    <w:lsdException w:name="Medium Shading 1 Accent 5" w:semiHidden="0" w:uiPriority="63" w:unhideWhenUsed="0"/>
-    <w:lsdException w:name="Medium Shading 2 Accent 5" w:semiHidden="0" w:uiPriority="64" w:unhideWhenUsed="0"/>
-    <w:lsdException w:name="Medium List 1 Accent 5" w:semiHidden="0" w:uiPriority="65" w:unhideWhenUsed="0"/>
-    <w:lsdException w:name="Medium List 2 Accent 5" w:semiHidden="0" w:uiPriority="66" w:unhideWhenUsed="0"/>
-    <w:lsdException w:name="Medium Grid 1 Accent 5" w:semiHidden="0" w:uiPriority="67" w:unhideWhenUsed="0"/>
-    <w:lsdException w:name="Medium Grid 2 Accent 5" w:semiHidden="0" w:uiPriority="68" w:unhideWhenUsed="0"/>
-    <w:lsdException w:name="Medium Grid 3 Accent 5" w:semiHidden="0" w:uiPriority="69" w:unhideWhenUsed="0"/>
-    <w:lsdException w:name="Dark List Accent 5" w:semiHidden="0" w:uiPriority="70" w:unhideWhenUsed="0"/>
-    <w:lsdException w:name="Colorful Shading Accent 5" w:semiHidden="0" w:uiPriority="71" w:unhideWhenUsed="0"/>
-    <w:lsdException w:name="Colorful List Accent 5" w:semiHidden="0" w:uiPriority="72" w:unhideWhenUsed="0"/>
-    <w:lsdException w:name="Colorful Grid Accent 5" w:semiHidden="0" w:uiPriority="73" w:unhideWhenUsed="0"/>
-    <w:lsdException w:name="Light Shading Accent 6" w:semiHidden="0" w:uiPriority="60" w:unhideWhenUsed="0"/>
-    <w:lsdException w:name="Light List Accent 6" w:semiHidden="0" w:uiPriority="61" w:unhideWhenUsed="0"/>
-    <w:lsdException w:name="Light Grid Accent 6" w:semiHidden="0" w:uiPriority="62" w:unhideWhenUsed="0"/>
-    <w:lsdException w:name="Medium Shading 1 Accent 6" w:semiHidden="0" w:uiPriority="63" w:unhideWhenUsed="0"/>
-    <w:lsdException w:name="Medium Shading 2 Accent 6" w:semiHidden="0" w:uiPriority="64" w:unhideWhenUsed="0"/>
-    <w:lsdException w:name="Medium List 1 Accent 6" w:semiHidden="0" w:uiPriority="65" w:unhideWhenUsed="0"/>
-    <w:lsdException w:name="Medium List 2 Accent 6" w:semiHidden="0" w:uiPriority="66" w:unhideWhenUsed="0"/>
-    <w:lsdException w:name="Medium Grid 1 Accent 6" w:semiHidden="0" w:uiPriority="67" w:unhideWhenUsed="0"/>
-    <w:lsdException w:name="Medium Grid 2 Accent 6" w:semiHidden="0" w:uiPriority="68" w:unhideWhenUsed="0"/>
-    <w:lsdException w:name="Medium Grid 3 Accent 6" w:semiHidden="0" w:uiPriority="69" w:unhideWhenUsed="0"/>
-    <w:lsdException w:name="Dark List Accent 6" w:semiHidden="0" w:uiPriority="70" w:unhideWhenUsed="0"/>
-    <w:lsdException w:name="Colorful Shading Accent 6" w:semiHidden="0" w:uiPriority="71" w:unhideWhenUsed="0"/>
-    <w:lsdException w:name="Colorful List Accent 6" w:semiHidden="0" w:uiPriority="72" w:unhideWhenUsed="0"/>
-    <w:lsdException w:name="Colorful Grid Accent 6" w:semiHidden="0" w:uiPriority="73" w:unhideWhenUsed="0"/>
-    <w:lsdException w:name="Subtle Emphasis" w:semiHidden="0" w:uiPriority="19" w:unhideWhenUsed="0" w:qFormat="1"/>
-    <w:lsdException w:name="Intense Emphasis" w:semiHidden="0" w:uiPriority="21" w:unhideWhenUsed="0" w:qFormat="1"/>
-    <w:lsdException w:name="Subtle Reference" w:semiHidden="0" w:uiPriority="31" w:unhideWhenUsed="0" w:qFormat="1"/>
-    <w:lsdException w:name="Intense Reference" w:semiHidden="0" w:uiPriority="32" w:unhideWhenUsed="0" w:qFormat="1"/>
-    <w:lsdException w:name="Book Title" w:semiHidden="0" w:uiPriority="33" w:unhideWhenUsed="0" w:qFormat="1"/>
-    <w:lsdException w:name="Bibliography" w:uiPriority="37"/>
-    <w:lsdException w:name="TOC Heading" w:uiPriority="39" w:qFormat="1"/>
-  </w:latentStyles>
-  <w:style w:type="paragraph" w:default="1" w:styleId="Normal">
-    <w:name w:val="Normal"/>
-    <w:qFormat/>
-  </w:style>
-  <w:style w:type="paragraph" w:styleId="Ttulo1">
-    <w:name w:val="heading 1"/>
-    <w:basedOn w:val="Normal"/>
-    <w:next w:val="Normal"/>
-    <w:uiPriority w:val="9"/>
-    <w:qFormat/>
-    <w:pPr>
-      <w:keepNext/>
-      <w:keepLines/>
-      <w:spacing w:before="480" w:after="120"/>
-      <w:outlineLvl w:val="0"/>
-    </w:pPr>
-    <w:rPr>
-      <w:b/>
-      <w:bCs/>
-      <w:sz w:val="48"/>
-      <w:szCs w:val="48"/>
-    </w:rPr>
-  </w:style>
-  <w:style w:type="paragraph" w:styleId="Ttulo2">
-    <w:name w:val="heading 2"/>
-    <w:basedOn w:val="Normal"/>
-    <w:next w:val="Normal"/>
-    <w:uiPriority w:val="9"/>
-    <w:semiHidden/>
-    <w:unhideWhenUsed/>
-    <w:qFormat/>
-    <w:pPr>
-      <w:keepNext/>
-      <w:keepLines/>
-      <w:spacing w:before="360" w:after="80"/>
-      <w:outlineLvl w:val="1"/>
-    </w:pPr>
-    <w:rPr>
-      <w:b/>
-      <w:bCs/>
-      <w:sz w:val="36"/>
-      <w:szCs w:val="36"/>
-    </w:rPr>
-  </w:style>
-  <w:style w:type="paragraph" w:styleId="Ttulo3">
-    <w:name w:val="heading 3"/>
-    <w:basedOn w:val="Normal"/>
-    <w:next w:val="Normal"/>
-    <w:uiPriority w:val="9"/>
-    <w:semiHidden/>
-    <w:unhideWhenUsed/>
-    <w:qFormat/>
-    <w:pPr>
-      <w:keepNext/>
-      <w:keepLines/>
-      <w:spacing w:before="280" w:after="80"/>
-      <w:outlineLvl w:val="2"/>
-    </w:pPr>
-    <w:rPr>
-      <w:b/>
-      <w:bCs/>
-      <w:sz w:val="28"/>
-      <w:szCs w:val="28"/>
-    </w:rPr>
-  </w:style>
-  <w:style w:type="paragraph" w:styleId="Ttulo4">
-    <w:name w:val="heading 4"/>
-    <w:basedOn w:val="Normal"/>
-    <w:next w:val="Normal"/>
-    <w:uiPriority w:val="9"/>
-    <w:semiHidden/>
-    <w:unhideWhenUsed/>
-    <w:qFormat/>
-    <w:pPr>
-      <w:keepNext/>
-      <w:keepLines/>
-      <w:spacing w:before="240" w:after="40"/>
-      <w:outlineLvl w:val="3"/>
-    </w:pPr>
-    <w:rPr>
-      <w:b/>
-      <w:bCs/>
-    </w:rPr>
-  </w:style>
-  <w:style w:type="paragraph" w:styleId="Ttulo5">
-    <w:name w:val="heading 5"/>
-    <w:basedOn w:val="Normal"/>
-    <w:next w:val="Normal"/>
-    <w:uiPriority w:val="9"/>
-    <w:semiHidden/>
-    <w:unhideWhenUsed/>
-    <w:qFormat/>
-    <w:pPr>
-      <w:keepNext/>
-      <w:keepLines/>
-      <w:spacing w:before="220" w:after="40"/>
-      <w:outlineLvl w:val="4"/>
-    </w:pPr>
-    <w:rPr>
-      <w:b/>
-      <w:bCs/>
-      <w:sz w:val="22"/>
-      <w:szCs w:val="22"/>
-    </w:rPr>
-  </w:style>
-  <w:style w:type="paragraph" w:styleId="Ttulo6">
-    <w:name w:val="heading 6"/>
-    <w:basedOn w:val="Normal"/>
-    <w:next w:val="Normal"/>
-    <w:uiPriority w:val="9"/>
-    <w:semiHidden/>
-    <w:unhideWhenUsed/>
-    <w:qFormat/>
-    <w:pPr>
-      <w:keepNext/>
-      <w:keepLines/>
-      <w:spacing w:before="200" w:after="40"/>
-      <w:outlineLvl w:val="5"/>
-    </w:pPr>
-    <w:rPr>
-      <w:b/>
-      <w:bCs/>
-      <w:sz w:val="20"/>
-      <w:szCs w:val="20"/>
-    </w:rPr>
-  </w:style>
-  <w:style w:type="character" w:default="1" w:styleId="Fontepargpadro">
-    <w:name w:val="Default Paragraph Font"/>
-    <w:uiPriority w:val="1"/>
-    <w:semiHidden/>
-    <w:unhideWhenUsed/>
-  </w:style>
-  <w:style w:type="table" w:default="1" w:styleId="Tabelanormal">
-    <w:name w:val="Normal Table"/>
-    <w:uiPriority w:val="99"/>
-    <w:semiHidden/>
-    <w:unhideWhenUsed/>
-    <w:tblPr>
-      <w:tblInd w:w="0" w:type="dxa"/>
-      <w:tblCellMar>
-        <w:top w:w="0" w:type="dxa"/>
-        <w:left w:w="108" w:type="dxa"/>
-        <w:bottom w:w="0" w:type="dxa"/>
-        <w:right w:w="108" w:type="dxa"/>
-      </w:tblCellMar>
-    </w:tblPr>
-  </w:style>
-  <w:style w:type="numbering" w:default="1" w:styleId="Semlista">
-    <w:name w:val="No List"/>
-    <w:uiPriority w:val="99"/>
-    <w:semiHidden/>
-    <w:unhideWhenUsed/>
-  </w:style>
-  <w:style w:type="table" w:customStyle="1" w:styleId="TableNormal">
-    <w:name w:val="TableNormal"/>
-    <w:tblPr>
-      <w:tblCellMar>
-        <w:top w:w="100" w:type="dxa"/>
-        <w:left w:w="100" w:type="dxa"/>
-        <w:bottom w:w="100" w:type="dxa"/>
-        <w:right w:w="100" w:type="dxa"/>
-      </w:tblCellMar>
-    </w:tblPr>
-  </w:style>
-  <w:style w:type="paragraph" w:styleId="Ttulo">
-    <w:name w:val="Title"/>
-    <w:basedOn w:val="Normal"/>
-    <w:next w:val="Normal"/>
-    <w:uiPriority w:val="10"/>
-    <w:qFormat/>
-    <w:pPr>
-      <w:keepNext/>
-      <w:keepLines/>
-      <w:spacing w:before="480" w:after="120"/>
-    </w:pPr>
-    <w:rPr>
-      <w:b/>
-      <w:bCs/>
-      <w:sz w:val="72"/>
-      <w:szCs w:val="72"/>
-    </w:rPr>
-  </w:style>
-  <w:style w:type="paragraph" w:styleId="Subttulo">
-    <w:name w:val="Subtitle"/>
-    <w:basedOn w:val="Normal"/>
-    <w:next w:val="Normal"/>
-    <w:uiPriority w:val="11"/>
-    <w:qFormat/>
-    <w:pPr>
-      <w:keepNext/>
-      <w:keepLines/>
-      <w:spacing w:before="360" w:after="80"/>
-    </w:pPr>
-    <w:rPr>
-      <w:rFonts w:ascii="Georgia" w:eastAsia="Georgia" w:hAnsi="Georgia" w:cs="Georgia"/>
-      <w:i/>
-      <w:iCs/>
-      <w:color w:val="666666"/>
-      <w:sz w:val="48"/>
-      <w:szCs w:val="48"/>
-    </w:rPr>
-  </w:style>
-  <w:style w:type="table" w:customStyle="1" w:styleId="a">
-    <w:basedOn w:val="TableNormal"/>
-    <w:tblPr>
-      <w:tblStyleRowBandSize w:val="1"/>
-      <w:tblStyleColBandSize w:val="1"/>
-      <w:tblCellMar>
-        <w:top w:w="0" w:type="dxa"/>
-        <w:left w:w="108" w:type="dxa"/>
-        <w:bottom w:w="0" w:type="dxa"/>
-        <w:right w:w="108" w:type="dxa"/>
-      </w:tblCellMar>
-    </w:tblPr>
-  </w:style>
-  <w:style w:type="table" w:customStyle="1" w:styleId="a0">
-    <w:basedOn w:val="TableNormal"/>
-    <w:tblPr>
-      <w:tblStyleRowBandSize w:val="1"/>
-      <w:tblStyleColBandSize w:val="1"/>
-      <w:tblCellMar>
-        <w:top w:w="0" w:type="dxa"/>
-        <w:left w:w="108" w:type="dxa"/>
-        <w:bottom w:w="0" w:type="dxa"/>
-        <w:right w:w="108" w:type="dxa"/>
-      </w:tblCellMar>
-    </w:tblPr>
-  </w:style>
-  <w:style w:type="paragraph" w:styleId="Textodebalo">
-    <w:name w:val="Balloon Text"/>
-    <w:basedOn w:val="Normal"/>
-    <w:link w:val="TextodebaloChar"/>
-    <w:uiPriority w:val="99"/>
-    <w:semiHidden/>
-    <w:unhideWhenUsed/>
-    <w:rsid w:val="00B808CD"/>
-    <w:pPr>
-      <w:spacing w:after="0" w:line="240" w:lineRule="auto"/>
-    </w:pPr>
-    <w:rPr>
-      <w:rFonts w:ascii="Tahoma" w:hAnsi="Tahoma" w:cs="Tahoma"/>
-      <w:sz w:val="16"/>
-      <w:szCs w:val="16"/>
-    </w:rPr>
-  </w:style>
-  <w:style w:type="character" w:customStyle="1" w:styleId="TextodebaloChar">
-    <w:name w:val="Texto de balão Char"/>
-    <w:basedOn w:val="Fontepargpadro"/>
-    <w:link w:val="Textodebalo"/>
-    <w:uiPriority w:val="99"/>
-    <w:semiHidden/>
-    <w:rsid w:val="00B808CD"/>
-    <w:rPr>
-      <w:rFonts w:ascii="Tahoma" w:hAnsi="Tahoma" w:cs="Tahoma"/>
-      <w:sz w:val="16"/>
-      <w:szCs w:val="16"/>
-    </w:rPr>
-  </w:style>
-</w:styles>
-</file>
-
-<file path=word/stylesWithEffects.xml><?xml version="1.0" encoding="utf-8"?>
-<w:styles xmlns:wpc="http://schemas.microsoft.com/office/word/2010/wordprocessingCanvas" xmlns:mc="http://schemas.openxmlformats.org/markup-compatibility/2006" xmlns:o="urn:schemas-microsoft-com:office:office" xmlns:r="http://schemas.openxmlformats.org/officeDocument/2006/relationships" xmlns:m="http://schemas.openxmlformats.org/officeDocument/2006/math" xmlns:v="urn:schemas-microsoft-com:vml" xmlns:wp14="http://schemas.microsoft.com/office/word/2010/wordprocessingDrawing" xmlns:wp="http://schemas.openxmlformats.org/drawingml/2006/wordprocessingDrawing" xmlns:w10="urn:schemas-microsoft-com:office:word" xmlns:w="http://schemas.openxmlformats.org/wordprocessingml/2006/main" xmlns:w14="http://schemas.microsoft.com/office/word/2010/wordml" xmlns:wpg="http://schemas.microsoft.com/office/word/2010/wordprocessingGroup" xmlns:wpi="http://schemas.microsoft.com/office/word/2010/wordprocessingInk" xmlns:wne="http://schemas.microsoft.com/office/word/2006/wordml" xmlns:wps="http://schemas.microsoft.com/office/word/2010/wordprocessingShape" mc:Ignorable="w14 wp14">
-  <w:docDefaults>
-    <w:rPrDefault>
-      <w:rPr>
-        <w:rFonts w:ascii="Times New Roman" w:eastAsia="Times New Roman" w:hAnsi="Times New Roman" w:cs="Times New Roman"/>
-        <w:sz w:val="24"/>
-        <w:szCs w:val="24"/>
-        <w:lang w:val="pt-BR" w:eastAsia="pt-BR" w:bidi="ar-SA"/>
-      </w:rPr>
-    </w:rPrDefault>
-    <w:pPrDefault>
-      <w:pPr>
-        <w:spacing w:after="240" w:line="360" w:lineRule="auto"/>
-      </w:pPr>
-    </w:pPrDefault>
-  </w:docDefaults>
-  <w:latentStyles w:defLockedState="0" w:defUIPriority="99" w:defSemiHidden="1" w:defUnhideWhenUsed="1" w:defQFormat="0" w:count="267">
-    <w:lsdException w:name="Normal" w:semiHidden="0" w:uiPriority="0" w:unhideWhenUsed="0" w:qFormat="1"/>
-    <w:lsdException w:name="heading 1" w:semiHidden="0" w:uiPriority="9" w:unhideWhenUsed="0" w:qFormat="1"/>
-    <w:lsdException w:name="heading 2" w:uiPriority="9" w:qFormat="1"/>
-    <w:lsdException w:name="heading 3" w:uiPriority="9" w:qFormat="1"/>
-    <w:lsdException w:name="heading 4" w:uiPriority="9" w:qFormat="1"/>
-    <w:lsdException w:name="heading 5" w:uiPriority="9" w:qFormat="1"/>
-    <w:lsdException w:name="heading 6" w:uiPriority="9" w:qFormat="1"/>
-    <w:lsdException w:name="heading 7" w:uiPriority="9" w:qFormat="1"/>
-    <w:lsdException w:name="heading 8" w:uiPriority="9" w:qFormat="1"/>
-    <w:lsdException w:name="heading 9" w:uiPriority="9" w:qFormat="1"/>
-    <w:lsdException w:name="toc 1" w:uiPriority="39"/>
-    <w:lsdException w:name="toc 2" w:uiPriority="39"/>
-    <w:lsdException w:name="toc 3" w:uiPriority="39"/>
-    <w:lsdException w:name="toc 4" w:uiPriority="39"/>
-    <w:lsdException w:name="toc 5" w:uiPriority="39"/>
-    <w:lsdException w:name="toc 6" w:uiPriority="39"/>
-    <w:lsdException w:name="toc 7" w:uiPriority="39"/>
-    <w:lsdException w:name="toc 8" w:uiPriority="39"/>
-    <w:lsdException w:name="toc 9" w:uiPriority="39"/>
-    <w:lsdException w:name="caption" w:uiPriority="35" w:qFormat="1"/>
-    <w:lsdException w:name="Title" w:semiHidden="0" w:uiPriority="10" w:unhideWhenUsed="0" w:qFormat="1"/>
-    <w:lsdException w:name="Default Paragraph Font" w:uiPriority="1"/>
-    <w:lsdException w:name="Subtitle" w:semiHidden="0" w:uiPriority="11" w:unhideWhenUsed="0" w:qFormat="1"/>
-    <w:lsdException w:name="Strong" w:semiHidden="0" w:uiPriority="22" w:unhideWhenUsed="0" w:qFormat="1"/>
-    <w:lsdException w:name="Emphasis" w:semiHidden="0" w:uiPriority="20" w:unhideWhenUsed="0" w:qFormat="1"/>
-    <w:lsdException w:name="Table Grid" w:semiHidden="0" w:uiPriority="39" w:unhideWhenUsed="0"/>
-    <w:lsdException w:name="Placeholder Text" w:unhideWhenUsed="0"/>
-    <w:lsdException w:name="No Spacing" w:semiHidden="0" w:uiPriority="1" w:unhideWhenUsed="0" w:qFormat="1"/>
-    <w:lsdException w:name="Light Shading" w:semiHidden="0" w:uiPriority="60" w:unhideWhenUsed="0"/>
-    <w:lsdException w:name="Light List" w:semiHidden="0" w:uiPriority="61" w:unhideWhenUsed="0"/>
-    <w:lsdException w:name="Light Grid" w:semiHidden="0" w:uiPriority="62" w:unhideWhenUsed="0"/>
-    <w:lsdException w:name="Medium Shading 1" w:semiHidden="0" w:uiPriority="63" w:unhideWhenUsed="0"/>
-    <w:lsdException w:name="Medium Shading 2" w:semiHidden="0" w:uiPriority="64" w:unhideWhenUsed="0"/>
-    <w:lsdException w:name="Medium List 1" w:semiHidden="0" w:uiPriority="65" w:unhideWhenUsed="0"/>
-    <w:lsdException w:name="Medium List 2" w:semiHidden="0" w:uiPriority="66" w:unhideWhenUsed="0"/>
-    <w:lsdException w:name="Medium Grid 1" w:semiHidden="0" w:uiPriority="67" w:unhideWhenUsed="0"/>
-    <w:lsdException w:name="Medium Grid 2" w:semiHidden="0" w:uiPriority="68" w:unhideWhenUsed="0"/>
-    <w:lsdException w:name="Medium Grid 3" w:semiHidden="0" w:uiPriority="69" w:unhideWhenUsed="0"/>
-    <w:lsdException w:name="Dark List" w:semiHidden="0" w:uiPriority="70" w:unhideWhenUsed="0"/>
-    <w:lsdException w:name="Colorful Shading" w:semiHidden="0" w:uiPriority="71" w:unhideWhenUsed="0"/>
-    <w:lsdException w:name="Colorful List" w:semiHidden="0" w:uiPriority="72" w:unhideWhenUsed="0"/>
-    <w:lsdException w:name="Colorful Grid" w:semiHidden="0" w:uiPriority="73" w:unhideWhenUsed="0"/>
-    <w:lsdException w:name="Light Shading Accent 1" w:semiHidden="0" w:uiPriority="60" w:unhideWhenUsed="0"/>
-    <w:lsdException w:name="Light List Accent 1" w:semiHidden="0" w:uiPriority="61" w:unhideWhenUsed="0"/>
-    <w:lsdException w:name="Light Grid Accent 1" w:semiHidden="0" w:uiPriority="62" w:unhideWhenUsed="0"/>
-    <w:lsdException w:name="Medium Shading 1 Accent 1" w:semiHidden="0" w:uiPriority="63" w:unhideWhenUsed="0"/>
-    <w:lsdException w:name="Medium Shading 2 Accent 1" w:semiHidden="0" w:uiPriority="64" w:unhideWhenUsed="0"/>
-    <w:lsdException w:name="Medium List 1 Accent 1" w:semiHidden="0" w:uiPriority="65" w:unhideWhenUsed="0"/>
-    <w:lsdException w:name="Revision" w:unhideWhenUsed="0"/>
-    <w:lsdException w:name="List Paragraph" w:semiHidden="0" w:uiPriority="34" w:unhideWhenUsed="0" w:qFormat="1"/>
-    <w:lsdException w:name="Quote" w:semiHidden="0" w:uiPriority="29" w:unhideWhenUsed="0" w:qFormat="1"/>
-    <w:lsdException w:name="Intense Quote" w:semiHidden="0" w:uiPriority="30" w:unhideWhenUsed="0" w:qFormat="1"/>
-    <w:lsdException w:name="Medium List 2 Accent 1" w:semiHidden="0" w:uiPriority="66" w:unhideWhenUsed="0"/>
-    <w:lsdException w:name="Medium Grid 1 Accent 1" w:semiHidden="0" w:uiPriority="67" w:unhideWhenUsed="0"/>
-    <w:lsdException w:name="Medium Grid 2 Accent 1" w:semiHidden="0" w:uiPriority="68" w:unhideWhenUsed="0"/>
-    <w:lsdException w:name="Medium Grid 3 Accent 1" w:semiHidden="0" w:uiPriority="69" w:unhideWhenUsed="0"/>
-    <w:lsdException w:name="Dark List Accent 1" w:semiHidden="0" w:uiPriority="70" w:unhideWhenUsed="0"/>
-    <w:lsdException w:name="Colorful Shading Accent 1" w:semiHidden="0" w:uiPriority="71" w:unhideWhenUsed="0"/>
-    <w:lsdException w:name="Colorful List Accent 1" w:semiHidden="0" w:uiPriority="72" w:unhideWhenUsed="0"/>
-    <w:lsdException w:name="Colorful Grid Accent 1" w:semiHidden="0" w:uiPriority="73" w:unhideWhenUsed="0"/>
-    <w:lsdException w:name="Light Shading Accent 2" w:semiHidden="0" w:uiPriority="60" w:unhideWhenUsed="0"/>
-    <w:lsdException w:name="Light List Accent 2" w:semiHidden="0" w:uiPriority="61" w:unhideWhenUsed="0"/>
-    <w:lsdException w:name="Light Grid Accent 2" w:semiHidden="0" w:uiPriority="62" w:unhideWhenUsed="0"/>
-    <w:lsdException w:name="Medium Shading 1 Accent 2" w:semiHidden="0" w:uiPriority="63" w:unhideWhenUsed="0"/>
-    <w:lsdException w:name="Medium Shading 2 Accent 2" w:semiHidden="0" w:uiPriority="64" w:unhideWhenUsed="0"/>
-    <w:lsdException w:name="Medium List 1 Accent 2" w:semiHidden="0" w:uiPriority="65" w:unhideWhenUsed="0"/>
-    <w:lsdException w:name="Medium List 2 Accent 2" w:semiHidden="0" w:uiPriority="66" w:unhideWhenUsed="0"/>
-    <w:lsdException w:name="Medium Grid 1 Accent 2" w:semiHidden="0" w:uiPriority="67" w:unhideWhenUsed="0"/>
-    <w:lsdException w:name="Medium Grid 2 Accent 2" w:semiHidden="0" w:uiPriority="68" w:unhideWhenUsed="0"/>
-    <w:lsdException w:name="Medium Grid 3 Accent 2" w:semiHidden="0" w:uiPriority="69" w:unhideWhenUsed="0"/>
-    <w:lsdException w:name="Dark List Accent 2" w:semiHidden="0" w:uiPriority="70" w:unhideWhenUsed="0"/>
-    <w:lsdException w:name="Colorful Shading Accent 2" w:semiHidden="0" w:uiPriority="71" w:unhideWhenUsed="0"/>
-    <w:lsdException w:name="Colorful List Accent 2" w:semiHidden="0" w:uiPriority="72" w:unhideWhenUsed="0"/>
-    <w:lsdException w:name="Colorful Grid Accent 2" w:semiHidden="0" w:uiPriority="73" w:unhideWhenUsed="0"/>
-    <w:lsdException w:name="Light Shading Accent 3" w:semiHidden="0" w:uiPriority="60" w:unhideWhenUsed="0"/>
-    <w:lsdException w:name="Light List Accent 3" w:semiHidden="0" w:uiPriority="61" w:unhideWhenUsed="0"/>
-    <w:lsdException w:name="Light Grid Accent 3" w:semiHidden="0" w:uiPriority="62" w:unhideWhenUsed="0"/>
-    <w:lsdException w:name="Medium Shading 1 Accent 3" w:semiHidden="0" w:uiPriority="63" w:unhideWhenUsed="0"/>
-    <w:lsdException w:name="Medium Shading 2 Accent 3" w:semiHidden="0" w:uiPriority="64" w:unhideWhenUsed="0"/>
-    <w:lsdException w:name="Medium List 1 Accent 3" w:semiHidden="0" w:uiPriority="65" w:unhideWhenUsed="0"/>
-    <w:lsdException w:name="Medium List 2 Accent 3" w:semiHidden="0" w:uiPriority="66" w:unhideWhenUsed="0"/>
-    <w:lsdException w:name="Medium Grid 1 Accent 3" w:semiHidden="0" w:uiPriority="67" w:unhideWhenUsed="0"/>
-    <w:lsdException w:name="Medium Grid 2 Accent 3" w:semiHidden="0" w:uiPriority="68" w:unhideWhenUsed="0"/>
-    <w:lsdException w:name="Medium Grid 3 Accent 3" w:semiHidden="0" w:uiPriority="69" w:unhideWhenUsed="0"/>
-    <w:lsdException w:name="Dark List Accent 3" w:semiHidden="0" w:uiPriority="70" w:unhideWhenUsed="0"/>
-    <w:lsdException w:name="Colorful Shading Accent 3" w:semiHidden="0" w:uiPriority="71" w:unhideWhenUsed="0"/>
-    <w:lsdException w:name="Colorful List Accent 3" w:semiHidden="0" w:uiPriority="72" w:unhideWhenUsed="0"/>
-    <w:lsdException w:name="Colorful Grid Accent 3" w:semiHidden="0" w:uiPriority="73" w:unhideWhenUsed="0"/>
-    <w:lsdException w:name="Light Shading Accent 4" w:semiHidden="0" w:uiPriority="60" w:unhideWhenUsed="0"/>
-    <w:lsdException w:name="Light List Accent 4" w:semiHidden="0" w:uiPriority="61" w:unhideWhenUsed="0"/>
-    <w:lsdException w:name="Light Grid Accent 4" w:semiHidden="0" w:uiPriority="62" w:unhideWhenUsed="0"/>
-    <w:lsdException w:name="Medium Shading 1 Accent 4" w:semiHidden="0" w:uiPriority="63" w:unhideWhenUsed="0"/>
-    <w:lsdException w:name="Medium Shading 2 Accent 4" w:semiHidden="0" w:uiPriority="64" w:unhideWhenUsed="0"/>
-    <w:lsdException w:name="Medium List 1 Accent 4" w:semiHidden="0" w:uiPriority="65" w:unhideWhenUsed="0"/>
-    <w:lsdException w:name="Medium List 2 Accent 4" w:semiHidden="0" w:uiPriority="66" w:unhideWhenUsed="0"/>
-    <w:lsdException w:name="Medium Grid 1 Accent 4" w:semiHidden="0" w:uiPriority="67" w:unhideWhenUsed="0"/>
-    <w:lsdException w:name="Medium Grid 2 Accent 4" w:semiHidden="0" w:uiPriority="68" w:unhideWhenUsed="0"/>
-    <w:lsdException w:name="Medium Grid 3 Accent 4" w:semiHidden="0" w:uiPriority="69" w:unhideWhenUsed="0"/>
-    <w:lsdException w:name="Dark List Accent 4" w:semiHidden="0" w:uiPriority="70" w:unhideWhenUsed="0"/>
-    <w:lsdException w:name="Colorful Shading Accent 4" w:semiHidden="0" w:uiPriority="71" w:unhideWhenUsed="0"/>
-    <w:lsdException w:name="Colorful List Accent 4" w:semiHidden="0" w:uiPriority="72" w:unhideWhenUsed="0"/>
-    <w:lsdException w:name="Colorful Grid Accent 4" w:semiHidden="0" w:uiPriority="73" w:unhideWhenUsed="0"/>
-    <w:lsdException w:name="Light Shading Accent 5" w:semiHidden="0" w:uiPriority="60" w:unhideWhenUsed="0"/>
-    <w:lsdException w:name="Light List Accent 5" w:semiHidden="0" w:uiPriority="61" w:unhideWhenUsed="0"/>
-    <w:lsdException w:name="Light Grid Accent 5" w:semiHidden="0" w:uiPriority="62" w:unhideWhenUsed="0"/>
-    <w:lsdException w:name="Medium Shading 1 Accent 5" w:semiHidden="0" w:uiPriority="63" w:unhideWhenUsed="0"/>
-    <w:lsdException w:name="Medium Shading 2 Accent 5" w:semiHidden="0" w:uiPriority="64" w:unhideWhenUsed="0"/>
-    <w:lsdException w:name="Medium List 1 Accent 5" w:semiHidden="0" w:uiPriority="65" w:unhideWhenUsed="0"/>
-    <w:lsdException w:name="Medium List 2 Accent 5" w:semiHidden="0" w:uiPriority="66" w:unhideWhenUsed="0"/>
-    <w:lsdException w:name="Medium Grid 1 Accent 5" w:semiHidden="0" w:uiPriority="67" w:unhideWhenUsed="0"/>
-    <w:lsdException w:name="Medium Grid 2 Accent 5" w:semiHidden="0" w:uiPriority="68" w:unhideWhenUsed="0"/>
-    <w:lsdException w:name="Medium Grid 3 Accent 5" w:semiHidden="0" w:uiPriority="69" w:unhideWhenUsed="0"/>
-    <w:lsdException w:name="Dark List Accent 5" w:semiHidden="0" w:uiPriority="70" w:unhideWhenUsed="0"/>
-    <w:lsdException w:name="Colorful Shading Accent 5" w:semiHidden="0" w:uiPriority="71" w:unhideWhenUsed="0"/>
-    <w:lsdException w:name="Colorful List Accent 5" w:semiHidden="0" w:uiPriority="72" w:unhideWhenUsed="0"/>
-    <w:lsdException w:name="Colorful Grid Accent 5" w:semiHidden="0" w:uiPriority="73" w:unhideWhenUsed="0"/>
-    <w:lsdException w:name="Light Shading Accent 6" w:semiHidden="0" w:uiPriority="60" w:unhideWhenUsed="0"/>
-    <w:lsdException w:name="Light List Accent 6" w:semiHidden="0" w:uiPriority="61" w:unhideWhenUsed="0"/>
-    <w:lsdException w:name="Light Grid Accent 6" w:semiHidden="0" w:uiPriority="62" w:unhideWhenUsed="0"/>
-    <w:lsdException w:name="Medium Shading 1 Accent 6" w:semiHidden="0" w:uiPriority="63" w:unhideWhenUsed="0"/>
-    <w:lsdException w:name="Medium Shading 2 Accent 6" w:semiHidden="0" w:uiPriority="64" w:unhideWhenUsed="0"/>
-    <w:lsdException w:name="Medium List 1 Accent 6" w:semiHidden="0" w:uiPriority="65" w:unhideWhenUsed="0"/>
-    <w:lsdException w:name="Medium List 2 Accent 6" w:semiHidden="0" w:uiPriority="66" w:unhideWhenUsed="0"/>
-    <w:lsdException w:name="Medium Grid 1 Accent 6" w:semiHidden="0" w:uiPriority="67" w:unhideWhenUsed="0"/>
-    <w:lsdException w:name="Medium Grid 2 Accent 6" w:semiHidden="0" w:uiPriority="68" w:unhideWhenUsed="0"/>
-    <w:lsdException w:name="Medium Grid 3 Accent 6" w:semiHidden="0" w:uiPriority="69" w:unhideWhenUsed="0"/>
-    <w:lsdException w:name="Dark List Accent 6" w:semiHidden="0" w:uiPriority="70" w:unhideWhenUsed="0"/>
-    <w:lsdException w:name="Colorful Shading Accent 6" w:semiHidden="0" w:uiPriority="71" w:unhideWhenUsed="0"/>
-    <w:lsdException w:name="Colorful List Accent 6" w:semiHidden="0" w:uiPriority="72" w:unhideWhenUsed="0"/>
-    <w:lsdException w:name="Colorful Grid Accent 6" w:semiHidden="0" w:uiPriority="73" w:unhideWhenUsed="0"/>
-    <w:lsdException w:name="Subtle Emphasis" w:semiHidden="0" w:uiPriority="19" w:unhideWhenUsed="0" w:qFormat="1"/>
-    <w:lsdException w:name="Intense Emphasis" w:semiHidden="0" w:uiPriority="21" w:unhideWhenUsed="0" w:qFormat="1"/>
-    <w:lsdException w:name="Subtle Reference" w:semiHidden="0" w:uiPriority="31" w:unhideWhenUsed="0" w:qFormat="1"/>
-    <w:lsdException w:name="Intense Reference" w:semiHidden="0" w:uiPriority="32" w:unhideWhenUsed="0" w:qFormat="1"/>
-    <w:lsdException w:name="Book Title" w:semiHidden="0" w:uiPriority="33" w:unhideWhenUsed="0" w:qFormat="1"/>
-    <w:lsdException w:name="Bibliography" w:uiPriority="37"/>
-    <w:lsdException w:name="TOC Heading" w:uiPriority="39" w:qFormat="1"/>
+  <w:latentStyles w:defLockedState="0" w:defUIPriority="99" w:defSemiHidden="0" w:defUnhideWhenUsed="0" w:defQFormat="0" w:count="376">
+    <w:lsdException w:name="Normal" w:uiPriority="0" w:qFormat="1"/>
+    <w:lsdException w:name="heading 1" w:uiPriority="9" w:qFormat="1"/>
+    <w:lsdException w:name="heading 2" w:semiHidden="1" w:uiPriority="9" w:unhideWhenUsed="1" w:qFormat="1"/>
+    <w:lsdException w:name="heading 3" w:semiHidden="1" w:uiPriority="9" w:unhideWhenUsed="1" w:qFormat="1"/>
+    <w:lsdException w:name="heading 4" w:semiHidden="1" w:uiPriority="9" w:unhideWhenUsed="1" w:qFormat="1"/>
+    <w:lsdException w:name="heading 5" w:semiHidden="1" w:uiPriority="9" w:unhideWhenUsed="1" w:qFormat="1"/>
+    <w:lsdException w:name="heading 6" w:semiHidden="1" w:uiPriority="9" w:unhideWhenUsed="1" w:qFormat="1"/>
+    <w:lsdException w:name="heading 7" w:semiHidden="1" w:uiPriority="9" w:unhideWhenUsed="1" w:qFormat="1"/>
+    <w:lsdException w:name="heading 8" w:semiHidden="1" w:uiPriority="9" w:unhideWhenUsed="1" w:qFormat="1"/>
+    <w:lsdException w:name="heading 9" w:semiHidden="1" w:uiPriority="9" w:unhideWhenUsed="1" w:qFormat="1"/>
+    <w:lsdException w:name="index 1" w:semiHidden="1" w:unhideWhenUsed="1"/>
+    <w:lsdException w:name="index 2" w:semiHidden="1" w:unhideWhenUsed="1"/>
+    <w:lsdException w:name="index 3" w:semiHidden="1" w:unhideWhenUsed="1"/>
+    <w:lsdException w:name="index 4" w:semiHidden="1" w:unhideWhenUsed="1"/>
+    <w:lsdException w:name="index 5" w:semiHidden="1" w:unhideWhenUsed="1"/>
+    <w:lsdException w:name="index 6" w:semiHidden="1" w:unhideWhenUsed="1"/>
+    <w:lsdException w:name="index 7" w:semiHidden="1" w:unhideWhenUsed="1"/>
+    <w:lsdException w:name="index 8" w:semiHidden="1" w:unhideWhenUsed="1"/>
+    <w:lsdException w:name="index 9" w:semiHidden="1" w:unhideWhenUsed="1"/>
+    <w:lsdException w:name="toc 1" w:semiHidden="1" w:uiPriority="39" w:unhideWhenUsed="1"/>
+    <w:lsdException w:name="toc 2" w:semiHidden="1" w:uiPriority="39" w:unhideWhenUsed="1"/>
+    <w:lsdException w:name="toc 3" w:semiHidden="1" w:uiPriority="39" w:unhideWhenUsed="1"/>
+    <w:lsdException w:name="toc 4" w:semiHidden="1" w:uiPriority="39" w:unhideWhenUsed="1"/>
+    <w:lsdException w:name="toc 5" w:semiHidden="1" w:uiPriority="39" w:unhideWhenUsed="1"/>
+    <w:lsdException w:name="toc 6" w:semiHidden="1" w:uiPriority="39" w:unhideWhenUsed="1"/>
+    <w:lsdException w:name="toc 7" w:semiHidden="1" w:uiPriority="39" w:unhideWhenUsed="1"/>
+    <w:lsdException w:name="toc 8" w:semiHidden="1" w:uiPriority="39" w:unhideWhenUsed="1"/>
+    <w:lsdException w:name="toc 9" w:semiHidden="1" w:uiPriority="39" w:unhideWhenUsed="1"/>
+    <w:lsdException w:name="Normal Indent" w:semiHidden="1" w:unhideWhenUsed="1"/>
+    <w:lsdException w:name="footnote text" w:semiHidden="1" w:unhideWhenUsed="1"/>
+    <w:lsdException w:name="annotation text" w:semiHidden="1" w:unhideWhenUsed="1"/>
+    <w:lsdException w:name="header" w:semiHidden="1" w:unhideWhenUsed="1"/>
+    <w:lsdException w:name="footer" w:semiHidden="1" w:unhideWhenUsed="1"/>
+    <w:lsdException w:name="index heading" w:semiHidden="1" w:unhideWhenUsed="1"/>
+    <w:lsdException w:name="caption" w:semiHidden="1" w:uiPriority="35" w:unhideWhenUsed="1" w:qFormat="1"/>
+    <w:lsdException w:name="table of figures" w:semiHidden="1" w:unhideWhenUsed="1"/>
+    <w:lsdException w:name="envelope address" w:semiHidden="1" w:unhideWhenUsed="1"/>
+    <w:lsdException w:name="envelope return" w:semiHidden="1" w:unhideWhenUsed="1"/>
+    <w:lsdException w:name="footnote reference" w:semiHidden="1" w:unhideWhenUsed="1"/>
+    <w:lsdException w:name="annotation reference" w:semiHidden="1" w:unhideWhenUsed="1"/>
+    <w:lsdException w:name="line number" w:semiHidden="1" w:unhideWhenUsed="1"/>
+    <w:lsdException w:name="page number" w:semiHidden="1" w:unhideWhenUsed="1"/>
+    <w:lsdException w:name="endnote reference" w:semiHidden="1" w:unhideWhenUsed="1"/>
+    <w:lsdException w:name="endnote text" w:semiHidden="1" w:unhideWhenUsed="1"/>
+    <w:lsdException w:name="table of authorities" w:semiHidden="1" w:unhideWhenUsed="1"/>
+    <w:lsdException w:name="macro" w:semiHidden="1" w:unhideWhenUsed="1"/>
+    <w:lsdException w:name="toa heading" w:semiHidden="1" w:unhideWhenUsed="1"/>
+    <w:lsdException w:name="List" w:semiHidden="1" w:unhideWhenUsed="1"/>
+    <w:lsdException w:name="List Bullet" w:semiHidden="1" w:unhideWhenUsed="1"/>
+    <w:lsdException w:name="List Number" w:semiHidden="1" w:unhideWhenUsed="1"/>
+    <w:lsdException w:name="List 2" w:semiHidden="1" w:unhideWhenUsed="1"/>
+    <w:lsdException w:name="List 3" w:semiHidden="1" w:unhideWhenUsed="1"/>
+    <w:lsdException w:name="List 4" w:semiHidden="1" w:unhideWhenUsed="1"/>
+    <w:lsdException w:name="List 5" w:semiHidden="1" w:unhideWhenUsed="1"/>
+    <w:lsdException w:name="List Bullet 2" w:semiHidden="1" w:unhideWhenUsed="1"/>
+    <w:lsdException w:name="List Bullet 3" w:semiHidden="1" w:unhideWhenUsed="1"/>
+    <w:lsdException w:name="List Bullet 4" w:semiHidden="1" w:unhideWhenUsed="1"/>
+    <w:lsdException w:name="List Bullet 5" w:semiHidden="1" w:unhideWhenUsed="1"/>
+    <w:lsdException w:name="List Number 2" w:semiHidden="1" w:unhideWhenUsed="1"/>
+    <w:lsdException w:name="List Number 3" w:semiHidden="1" w:unhideWhenUsed="1"/>
+    <w:lsdException w:name="List Number 4" w:semiHidden="1" w:unhideWhenUsed="1"/>
+    <w:lsdException w:name="List Number 5" w:semiHidden="1" w:unhideWhenUsed="1"/>
+    <w:lsdException w:name="Title" w:uiPriority="10" w:qFormat="1"/>
+    <w:lsdException w:name="Closing" w:semiHidden="1" w:unhideWhenUsed="1"/>
+    <w:lsdException w:name="Signature" w:semiHidden="1" w:unhideWhenUsed="1"/>
+    <w:lsdException w:name="Default Paragraph Font" w:semiHidden="1" w:uiPriority="1" w:unhideWhenUsed="1"/>
+    <w:lsdException w:name="Body Text" w:semiHidden="1" w:unhideWhenUsed="1"/>
+    <w:lsdException w:name="Body Text Indent" w:semiHidden="1" w:unhideWhenUsed="1"/>
+    <w:lsdException w:name="List Continue" w:semiHidden="1" w:unhideWhenUsed="1"/>
+    <w:lsdException w:name="List Continue 2" w:semiHidden="1" w:unhideWhenUsed="1"/>
+    <w:lsdException w:name="List Continue 3" w:semiHidden="1" w:unhideWhenUsed="1"/>
+    <w:lsdException w:name="List Continue 4" w:semiHidden="1" w:unhideWhenUsed="1"/>
+    <w:lsdException w:name="List Continue 5" w:semiHidden="1" w:unhideWhenUsed="1"/>
+    <w:lsdException w:name="Message Header" w:semiHidden="1" w:unhideWhenUsed="1"/>
+    <w:lsdException w:name="Subtitle" w:uiPriority="11" w:qFormat="1"/>
+    <w:lsdException w:name="Salutation" w:semiHidden="1" w:unhideWhenUsed="1"/>
+    <w:lsdException w:name="Date" w:semiHidden="1" w:unhideWhenUsed="1"/>
+    <w:lsdException w:name="Body Text First Indent" w:semiHidden="1" w:unhideWhenUsed="1"/>
+    <w:lsdException w:name="Body Text First Indent 2" w:semiHidden="1" w:unhideWhenUsed="1"/>
+    <w:lsdException w:name="Note Heading" w:semiHidden="1" w:unhideWhenUsed="1"/>
+    <w:lsdException w:name="Body Text 2" w:semiHidden="1" w:unhideWhenUsed="1"/>
+    <w:lsdException w:name="Body Text 3" w:semiHidden="1" w:unhideWhenUsed="1"/>
+    <w:lsdException w:name="Body Text Indent 2" w:semiHidden="1" w:unhideWhenUsed="1"/>
+    <w:lsdException w:name="Body Text Indent 3" w:semiHidden="1" w:unhideWhenUsed="1"/>
+    <w:lsdException w:name="Block Text" w:semiHidden="1" w:unhideWhenUsed="1"/>
+    <w:lsdException w:name="Hyperlink" w:semiHidden="1" w:unhideWhenUsed="1"/>
+    <w:lsdException w:name="FollowedHyperlink" w:semiHidden="1" w:unhideWhenUsed="1"/>
+    <w:lsdException w:name="Strong" w:uiPriority="22" w:qFormat="1"/>
+    <w:lsdException w:name="Emphasis" w:uiPriority="20" w:qFormat="1"/>
+    <w:lsdException w:name="Document Map" w:semiHidden="1" w:unhideWhenUsed="1"/>
+    <w:lsdException w:name="Plain Text" w:semiHidden="1" w:unhideWhenUsed="1"/>
+    <w:lsdException w:name="E-mail Signature" w:semiHidden="1" w:unhideWhenUsed="1"/>
+    <w:lsdException w:name="HTML Top of Form" w:semiHidden="1" w:unhideWhenUsed="1"/>
+    <w:lsdException w:name="HTML Bottom of Form" w:semiHidden="1" w:unhideWhenUsed="1"/>
+    <w:lsdException w:name="Normal (Web)" w:semiHidden="1" w:unhideWhenUsed="1"/>
+    <w:lsdException w:name="HTML Acronym" w:semiHidden="1" w:unhideWhenUsed="1"/>
+    <w:lsdException w:name="HTML Address" w:semiHidden="1" w:unhideWhenUsed="1"/>
+    <w:lsdException w:name="HTML Cite" w:semiHidden="1" w:unhideWhenUsed="1"/>
+    <w:lsdException w:name="HTML Code" w:semiHidden="1" w:unhideWhenUsed="1"/>
+    <w:lsdException w:name="HTML Definition" w:semiHidden="1" w:unhideWhenUsed="1"/>
+    <w:lsdException w:name="HTML Keyboard" w:semiHidden="1" w:unhideWhenUsed="1"/>
+    <w:lsdException w:name="HTML Preformatted" w:semiHidden="1" w:unhideWhenUsed="1"/>
+    <w:lsdException w:name="HTML Sample" w:semiHidden="1" w:unhideWhenUsed="1"/>
+    <w:lsdException w:name="HTML Typewriter" w:semiHidden="1" w:unhideWhenUsed="1"/>
+    <w:lsdException w:name="HTML Variable" w:semiHidden="1" w:unhideWhenUsed="1"/>
+    <w:lsdException w:name="Normal Table" w:semiHidden="1" w:unhideWhenUsed="1"/>
+    <w:lsdException w:name="annotation subject" w:semiHidden="1" w:unhideWhenUsed="1"/>
+    <w:lsdException w:name="No List" w:semiHidden="1" w:unhideWhenUsed="1"/>
+    <w:lsdException w:name="Outline List 1" w:semiHidden="1" w:unhideWhenUsed="1"/>
+    <w:lsdException w:name="Outline List 2" w:semiHidden="1" w:unhideWhenUsed="1"/>
+    <w:lsdException w:name="Outline List 3" w:semiHidden="1" w:unhideWhenUsed="1"/>
+    <w:lsdException w:name="Table Simple 1" w:semiHidden="1" w:unhideWhenUsed="1"/>
+    <w:lsdException w:name="Table Simple 2" w:semiHidden="1" w:unhideWhenUsed="1"/>
+    <w:lsdException w:name="Table Simple 3" w:semiHidden="1" w:unhideWhenUsed="1"/>
+    <w:lsdException w:name="Table Classic 1" w:semiHidden="1" w:unhideWhenUsed="1"/>
+    <w:lsdException w:name="Table Classic 2" w:semiHidden="1" w:unhideWhenUsed="1"/>
+    <w:lsdException w:name="Table Classic 3" w:semiHidden="1" w:unhideWhenUsed="1"/>
+    <w:lsdException w:name="Table Classic 4" w:semiHidden="1" w:unhideWhenUsed="1"/>
+    <w:lsdException w:name="Table Colorful 1" w:semiHidden="1" w:unhideWhenUsed="1"/>
+    <w:lsdException w:name="Table Colorful 2" w:semiHidden="1" w:unhideWhenUsed="1"/>
+    <w:lsdException w:name="Table Colorful 3" w:semiHidden="1" w:unhideWhenUsed="1"/>
+    <w:lsdException w:name="Table Columns 1" w:semiHidden="1" w:unhideWhenUsed="1"/>
+    <w:lsdException w:name="Table Columns 2" w:semiHidden="1" w:unhideWhenUsed="1"/>
+    <w:lsdException w:name="Table Columns 3" w:semiHidden="1" w:unhideWhenUsed="1"/>
+    <w:lsdException w:name="Table Columns 4" w:semiHidden="1" w:unhideWhenUsed="1"/>
+    <w:lsdException w:name="Table Columns 5" w:semiHidden="1" w:unhideWhenUsed="1"/>
+    <w:lsdException w:name="Table Grid 1" w:semiHidden="1" w:unhideWhenUsed="1"/>
+    <w:lsdException w:name="Table Grid 2" w:semiHidden="1" w:unhideWhenUsed="1"/>
+    <w:lsdException w:name="Table Grid 3" w:semiHidden="1" w:unhideWhenUsed="1"/>
+    <w:lsdException w:name="Table Grid 4" w:semiHidden="1" w:unhideWhenUsed="1"/>
+    <w:lsdException w:name="Table Grid 5" w:semiHidden="1" w:unhideWhenUsed="1"/>
+    <w:lsdException w:name="Table Grid 6" w:semiHidden="1" w:unhideWhenUsed="1"/>
+    <w:lsdException w:name="Table Grid 7" w:semiHidden="1" w:unhideWhenUsed="1"/>
+    <w:lsdException w:name="Table Grid 8" w:semiHidden="1" w:unhideWhenUsed="1"/>
+    <w:lsdException w:name="Table List 1" w:semiHidden="1" w:unhideWhenUsed="1"/>
+    <w:lsdException w:name="Table List 2" w:semiHidden="1" w:unhideWhenUsed="1"/>
+    <w:lsdException w:name="Table List 3" w:semiHidden="1" w:unhideWhenUsed="1"/>
+    <w:lsdException w:name="Table List 4" w:semiHidden="1" w:unhideWhenUsed="1"/>
+    <w:lsdException w:name="Table List 5" w:semiHidden="1" w:unhideWhenUsed="1"/>
+    <w:lsdException w:name="Table List 6" w:semiHidden="1" w:unhideWhenUsed="1"/>
+    <w:lsdException w:name="Table List 7" w:semiHidden="1" w:unhideWhenUsed="1"/>
+    <w:lsdException w:name="Table List 8" w:semiHidden="1" w:unhideWhenUsed="1"/>
+    <w:lsdException w:name="Table 3D effects 1" w:semiHidden="1" w:unhideWhenUsed="1"/>
+    <w:lsdException w:name="Table 3D effects 2" w:semiHidden="1" w:unhideWhenUsed="1"/>
+    <w:lsdException w:name="Table 3D effects 3" w:semiHidden="1" w:unhideWhenUsed="1"/>
+    <w:lsdException w:name="Table Contemporary" w:semiHidden="1" w:unhideWhenUsed="1"/>
+    <w:lsdException w:name="Table Elegant" w:semiHidden="1" w:unhideWhenUsed="1"/>
+    <w:lsdException w:name="Table Professional" w:semiHidden="1" w:unhideWhenUsed="1"/>
+    <w:lsdException w:name="Table Subtle 1" w:semiHidden="1" w:unhideWhenUsed="1"/>
+    <w:lsdException w:name="Table Subtle 2" w:semiHidden="1" w:unhideWhenUsed="1"/>
+    <w:lsdException w:name="Table Web 1" w:semiHidden="1" w:unhideWhenUsed="1"/>
+    <w:lsdException w:name="Table Web 2" w:semiHidden="1" w:unhideWhenUsed="1"/>
+    <w:lsdException w:name="Table Web 3" w:semiHidden="1" w:unhideWhenUsed="1"/>
+    <w:lsdException w:name="Balloon Text" w:semiHidden="1" w:unhideWhenUsed="1"/>
+    <w:lsdException w:name="Table Grid" w:uiPriority="39"/>
+    <w:lsdException w:name="Table Theme" w:semiHidden="1" w:unhideWhenUsed="1"/>
+    <w:lsdException w:name="Placeholder Text" w:semiHidden="1"/>
+    <w:lsdException w:name="No Spacing" w:uiPriority="1" w:qFormat="1"/>
+    <w:lsdException w:name="Light Shading" w:uiPriority="60"/>
+    <w:lsdException w:name="Light List" w:uiPriority="61"/>
+    <w:lsdException w:name="Light Grid" w:uiPriority="62"/>
+    <w:lsdException w:name="Medium Shading 1" w:uiPriority="63"/>
+    <w:lsdException w:name="Medium Shading 2" w:uiPriority="64"/>
+    <w:lsdException w:name="Medium List 1" w:uiPriority="65"/>
+    <w:lsdException w:name="Medium List 2" w:uiPriority="66"/>
+    <w:lsdException w:name="Medium Grid 1" w:uiPriority="67"/>
+    <w:lsdException w:name="Medium Grid 2" w:uiPriority="68"/>
+    <w:lsdException w:name="Medium Grid 3" w:uiPriority="69"/>
+    <w:lsdException w:name="Dark List" w:uiPriority="70"/>
+    <w:lsdException w:name="Colorful Shading" w:uiPriority="71"/>
+    <w:lsdException w:name="Colorful List" w:uiPriority="72"/>
+    <w:lsdException w:name="Colorful Grid" w:uiPriority="73"/>
+    <w:lsdException w:name="Light Shading Accent 1" w:uiPriority="60"/>
+    <w:lsdException w:name="Light List Accent 1" w:uiPriority="61"/>
+    <w:lsdException w:name="Light Grid Accent 1" w:uiPriority="62"/>
+    <w:lsdException w:name="Medium Shading 1 Accent 1" w:uiPriority="63"/>
+    <w:lsdException w:name="Medium Shading 2 Accent 1" w:uiPriority="64"/>
+    <w:lsdException w:name="Medium List 1 Accent 1" w:uiPriority="65"/>
+    <w:lsdException w:name="Revision" w:semiHidden="1"/>
+    <w:lsdException w:name="List Paragraph" w:uiPriority="34" w:qFormat="1"/>
+    <w:lsdException w:name="Quote" w:uiPriority="29" w:qFormat="1"/>
+    <w:lsdException w:name="Intense Quote" w:uiPriority="30" w:qFormat="1"/>
+    <w:lsdException w:name="Medium List 2 Accent 1" w:uiPriority="66"/>
+    <w:lsdException w:name="Medium Grid 1 Accent 1" w:uiPriority="67"/>
+    <w:lsdException w:name="Medium Grid 2 Accent 1" w:uiPriority="68"/>
+    <w:lsdException w:name="Medium Grid 3 Accent 1" w:uiPriority="69"/>
+    <w:lsdException w:name="Dark List Accent 1" w:uiPriority="70"/>
+    <w:lsdException w:name="Colorful Shading Accent 1" w:uiPriority="71"/>
+    <w:lsdException w:name="Colorful List Accent 1" w:uiPriority="72"/>
+    <w:lsdException w:name="Colorful Grid Accent 1" w:uiPriority="73"/>
+    <w:lsdException w:name="Light Shading Accent 2" w:uiPriority="60"/>
+    <w:lsdException w:name="Light List Accent 2" w:uiPriority="61"/>
+    <w:lsdException w:name="Light Grid Accent 2" w:uiPriority="62"/>
+    <w:lsdException w:name="Medium Shading 1 Accent 2" w:uiPriority="63"/>
+    <w:lsdException w:name="Medium Shading 2 Accent 2" w:uiPriority="64"/>
+    <w:lsdException w:name="Medium List 1 Accent 2" w:uiPriority="65"/>
+    <w:lsdException w:name="Medium List 2 Accent 2" w:uiPriority="66"/>
+    <w:lsdException w:name="Medium Grid 1 Accent 2" w:uiPriority="67"/>
+    <w:lsdException w:name="Medium Grid 2 Accent 2" w:uiPriority="68"/>
+    <w:lsdException w:name="Medium Grid 3 Accent 2" w:uiPriority="69"/>
+    <w:lsdException w:name="Dark List Accent 2" w:uiPriority="70"/>
+    <w:lsdException w:name="Colorful Shading Accent 2" w:uiPriority="71"/>
+    <w:lsdException w:name="Colorful List Accent 2" w:uiPriority="72"/>
+    <w:lsdException w:name="Colorful Grid Accent 2" w:uiPriority="73"/>
+    <w:lsdException w:name="Light Shading Accent 3" w:uiPriority="60"/>
+    <w:lsdException w:name="Light List Accent 3" w:uiPriority="61"/>
+    <w:lsdException w:name="Light Grid Accent 3" w:uiPriority="62"/>
+    <w:lsdException w:name="Medium Shading 1 Accent 3" w:uiPriority="63"/>
+    <w:lsdException w:name="Medium Shading 2 Accent 3" w:uiPriority="64"/>
+    <w:lsdException w:name="Medium List 1 Accent 3" w:uiPriority="65"/>
+    <w:lsdException w:name="Medium List 2 Accent 3" w:uiPriority="66"/>
+    <w:lsdException w:name="Medium Grid 1 Accent 3" w:uiPriority="67"/>
+    <w:lsdException w:name="Medium Grid 2 Accent 3" w:uiPriority="68"/>
+    <w:lsdException w:name="Medium Grid 3 Accent 3" w:uiPriority="69"/>
+    <w:lsdException w:name="Dark List Accent 3" w:uiPriority="70"/>
+    <w:lsdException w:name="Colorful Shading Accent 3" w:uiPriority="71"/>
+    <w:lsdException w:name="Colorful List Accent 3" w:uiPriority="72"/>
+    <w:lsdException w:name="Colorful Grid Accent 3" w:uiPriority="73"/>
+    <w:lsdException w:name="Light Shading Accent 4" w:uiPriority="60"/>
+    <w:lsdException w:name="Light List Accent 4" w:uiPriority="61"/>
+    <w:lsdException w:name="Light Grid Accent 4" w:uiPriority="62"/>
+    <w:lsdException w:name="Medium Shading 1 Accent 4" w:uiPriority="63"/>
+    <w:lsdException w:name="Medium Shading 2 Accent 4" w:uiPriority="64"/>
+    <w:lsdException w:name="Medium List 1 Accent 4" w:uiPriority="65"/>
+    <w:lsdException w:name="Medium List 2 Accent 4" w:uiPriority="66"/>
+    <w:lsdException w:name="Medium Grid 1 Accent 4" w:uiPriority="67"/>
+    <w:lsdException w:name="Medium Grid 2 Accent 4" w:uiPriority="68"/>
+    <w:lsdException w:name="Medium Grid 3 Accent 4" w:uiPriority="69"/>
+    <w:lsdException w:name="Dark List Accent 4" w:uiPriority="70"/>
+    <w:lsdException w:name="Colorful Shading Accent 4" w:uiPriority="71"/>
+    <w:lsdException w:name="Colorful List Accent 4" w:uiPriority="72"/>
+    <w:lsdException w:name="Colorful Grid Accent 4" w:uiPriority="73"/>
+    <w:lsdException w:name="Light Shading Accent 5" w:uiPriority="60"/>
+    <w:lsdException w:name="Light List Accent 5" w:uiPriority="61"/>
+    <w:lsdException w:name="Light Grid Accent 5" w:uiPriority="62"/>
+    <w:lsdException w:name="Medium Shading 1 Accent 5" w:uiPriority="63"/>
+    <w:lsdException w:name="Medium Shading 2 Accent 5" w:uiPriority="64"/>
+    <w:lsdException w:name="Medium List 1 Accent 5" w:uiPriority="65"/>
+    <w:lsdException w:name="Medium List 2 Accent 5" w:uiPriority="66"/>
+    <w:lsdException w:name="Medium Grid 1 Accent 5" w:uiPriority="67"/>
+    <w:lsdException w:name="Medium Grid 2 Accent 5" w:uiPriority="68"/>
+    <w:lsdException w:name="Medium Grid 3 Accent 5" w:uiPriority="69"/>
+    <w:lsdException w:name="Dark List Accent 5" w:uiPriority="70"/>
+    <w:lsdException w:name="Colorful Shading Accent 5" w:uiPriority="71"/>
+    <w:lsdException w:name="Colorful List Accent 5" w:uiPriority="72"/>
+    <w:lsdException w:name="Colorful Grid Accent 5" w:uiPriority="73"/>
+    <w:lsdException w:name="Light Shading Accent 6" w:uiPriority="60"/>
+    <w:lsdException w:name="Light List Accent 6" w:uiPriority="61"/>
+    <w:lsdException w:name="Light Grid Accent 6" w:uiPriority="62"/>
+    <w:lsdException w:name="Medium Shading 1 Accent 6" w:uiPriority="63"/>
+    <w:lsdException w:name="Medium Shading 2 Accent 6" w:uiPriority="64"/>
+    <w:lsdException w:name="Medium List 1 Accent 6" w:uiPriority="65"/>
+    <w:lsdException w:name="Medium List 2 Accent 6" w:uiPriority="66"/>
+    <w:lsdException w:name="Medium Grid 1 Accent 6" w:uiPriority="67"/>
+    <w:lsdException w:name="Medium Grid 2 Accent 6" w:uiPriority="68"/>
+    <w:lsdException w:name="Medium Grid 3 Accent 6" w:uiPriority="69"/>
+    <w:lsdException w:name="Dark List Accent 6" w:uiPriority="70"/>
+    <w:lsdException w:name="Colorful Shading Accent 6" w:uiPriority="71"/>
+    <w:lsdException w:name="Colorful List Accent 6" w:uiPriority="72"/>
+    <w:lsdException w:name="Colorful Grid Accent 6" w:uiPriority="73"/>
+    <w:lsdException w:name="Subtle Emphasis" w:uiPriority="19" w:qFormat="1"/>
+    <w:lsdException w:name="Intense Emphasis" w:uiPriority="21" w:qFormat="1"/>
+    <w:lsdException w:name="Subtle Reference" w:uiPriority="31" w:qFormat="1"/>
+    <w:lsdException w:name="Intense Reference" w:uiPriority="32" w:qFormat="1"/>
+    <w:lsdException w:name="Book Title" w:uiPriority="33" w:qFormat="1"/>
+    <w:lsdException w:name="Bibliography" w:semiHidden="1" w:uiPriority="37" w:unhideWhenUsed="1"/>
+    <w:lsdException w:name="TOC Heading" w:semiHidden="1" w:uiPriority="39" w:unhideWhenUsed="1" w:qFormat="1"/>
+    <w:lsdException w:name="Plain Table 1" w:uiPriority="41"/>
+    <w:lsdException w:name="Plain Table 2" w:uiPriority="42"/>
+    <w:lsdException w:name="Plain Table 3" w:uiPriority="43"/>
+    <w:lsdException w:name="Plain Table 4" w:uiPriority="44"/>
+    <w:lsdException w:name="Plain Table 5" w:uiPriority="45"/>
+    <w:lsdException w:name="Grid Table Light" w:uiPriority="40"/>
+    <w:lsdException w:name="Grid Table 1 Light" w:uiPriority="46"/>
+    <w:lsdException w:name="Grid Table 2" w:uiPriority="47"/>
+    <w:lsdException w:name="Grid Table 3" w:uiPriority="48"/>
+    <w:lsdException w:name="Grid Table 4" w:uiPriority="49"/>
+    <w:lsdException w:name="Grid Table 5 Dark" w:uiPriority="50"/>
+    <w:lsdException w:name="Grid Table 6 Colorful" w:uiPriority="51"/>
+    <w:lsdException w:name="Grid Table 7 Colorful" w:uiPriority="52"/>
+    <w:lsdException w:name="Grid Table 1 Light Accent 1" w:uiPriority="46"/>
+    <w:lsdException w:name="Grid Table 2 Accent 1" w:uiPriority="47"/>
+    <w:lsdException w:name="Grid Table 3 Accent 1" w:uiPriority="48"/>
+    <w:lsdException w:name="Grid Table 4 Accent 1" w:uiPriority="49"/>
+    <w:lsdException w:name="Grid Table 5 Dark Accent 1" w:uiPriority="50"/>
+    <w:lsdException w:name="Grid Table 6 Colorful Accent 1" w:uiPriority="51"/>
+    <w:lsdException w:name="Grid Table 7 Colorful Accent 1" w:uiPriority="52"/>
+    <w:lsdException w:name="Grid Table 1 Light Accent 2" w:uiPriority="46"/>
+    <w:lsdException w:name="Grid Table 2 Accent 2" w:uiPriority="47"/>
+    <w:lsdException w:name="Grid Table 3 Accent 2" w:uiPriority="48"/>
+    <w:lsdException w:name="Grid Table 4 Accent 2" w:uiPriority="49"/>
+    <w:lsdException w:name="Grid Table 5 Dark Accent 2" w:uiPriority="50"/>
+    <w:lsdException w:name="Grid Table 6 Colorful Accent 2" w:uiPriority="51"/>
+    <w:lsdException w:name="Grid Table 7 Colorful Accent 2" w:uiPriority="52"/>
+    <w:lsdException w:name="Grid Table 1 Light Accent 3" w:uiPriority="46"/>
+    <w:lsdException w:name="Grid Table 2 Accent 3" w:uiPriority="47"/>
+    <w:lsdException w:name="Grid Table 3 Accent 3" w:uiPriority="48"/>
+    <w:lsdException w:name="Grid Table 4 Accent 3" w:uiPriority="49"/>
+    <w:lsdException w:name="Grid Table 5 Dark Accent 3" w:uiPriority="50"/>
+    <w:lsdException w:name="Grid Table 6 Colorful Accent 3" w:uiPriority="51"/>
+    <w:lsdException w:name="Grid Table 7 Colorful Accent 3" w:uiPriority="52"/>
+    <w:lsdException w:name="Grid Table 1 Light Accent 4" w:uiPriority="46"/>
+    <w:lsdException w:name="Grid Table 2 Accent 4" w:uiPriority="47"/>
+    <w:lsdException w:name="Grid Table 3 Accent 4" w:uiPriority="48"/>
+    <w:lsdException w:name="Grid Table 4 Accent 4" w:uiPriority="49"/>
+    <w:lsdException w:name="Grid Table 5 Dark Accent 4" w:uiPriority="50"/>
+    <w:lsdException w:name="Grid Table 6 Colorful Accent 4" w:uiPriority="51"/>
+    <w:lsdException w:name="Grid Table 7 Colorful Accent 4" w:uiPriority="52"/>
+    <w:lsdException w:name="Grid Table 1 Light Accent 5" w:uiPriority="46"/>
+    <w:lsdException w:name="Grid Table 2 Accent 5" w:uiPriority="47"/>
+    <w:lsdException w:name="Grid Table 3 Accent 5" w:uiPriority="48"/>
+    <w:lsdException w:name="Grid Table 4 Accent 5" w:uiPriority="49"/>
+    <w:lsdException w:name="Grid Table 5 Dark Accent 5" w:uiPriority="50"/>
+    <w:lsdException w:name="Grid Table 6 Colorful Accent 5" w:uiPriority="51"/>
+    <w:lsdException w:name="Grid Table 7 Colorful Accent 5" w:uiPriority="52"/>
+    <w:lsdException w:name="Grid Table 1 Light Accent 6" w:uiPriority="46"/>
+    <w:lsdException w:name="Grid Table 2 Accent 6" w:uiPriority="47"/>
+    <w:lsdException w:name="Grid Table 3 Accent 6" w:uiPriority="48"/>
+    <w:lsdException w:name="Grid Table 4 Accent 6" w:uiPriority="49"/>
+    <w:lsdException w:name="Grid Table 5 Dark Accent 6" w:uiPriority="50"/>
+    <w:lsdException w:name="Grid Table 6 Colorful Accent 6" w:uiPriority="51"/>
+    <w:lsdException w:name="Grid Table 7 Colorful Accent 6" w:uiPriority="52"/>
+    <w:lsdException w:name="List Table 1 Light" w:uiPriority="46"/>
+    <w:lsdException w:name="List Table 2" w:uiPriority="47"/>
+    <w:lsdException w:name="List Table 3" w:uiPriority="48"/>
+    <w:lsdException w:name="List Table 4" w:uiPriority="49"/>
+    <w:lsdException w:name="List Table 5 Dark" w:uiPriority="50"/>
+    <w:lsdException w:name="List Table 6 Colorful" w:uiPriority="51"/>
+    <w:lsdException w:name="List Table 7 Colorful" w:uiPriority="52"/>
+    <w:lsdException w:name="List Table 1 Light Accent 1" w:uiPriority="46"/>
+    <w:lsdException w:name="List Table 2 Accent 1" w:uiPriority="47"/>
+    <w:lsdException w:name="List Table 3 Accent 1" w:uiPriority="48"/>
+    <w:lsdException w:name="List Table 4 Accent 1" w:uiPriority="49"/>
+    <w:lsdException w:name="List Table 5 Dark Accent 1" w:uiPriority="50"/>
+    <w:lsdException w:name="List Table 6 Colorful Accent 1" w:uiPriority="51"/>
+    <w:lsdException w:name="List Table 7 Colorful Accent 1" w:uiPriority="52"/>
+    <w:lsdException w:name="List Table 1 Light Accent 2" w:uiPriority="46"/>
+    <w:lsdException w:name="List Table 2 Accent 2" w:uiPriority="47"/>
+    <w:lsdException w:name="List Table 3 Accent 2" w:uiPriority="48"/>
+    <w:lsdException w:name="List Table 4 Accent 2" w:uiPriority="49"/>
+    <w:lsdException w:name="List Table 5 Dark Accent 2" w:uiPriority="50"/>
+    <w:lsdException w:name="List Table 6 Colorful Accent 2" w:uiPriority="51"/>
+    <w:lsdException w:name="List Table 7 Colorful Accent 2" w:uiPriority="52"/>
+    <w:lsdException w:name="List Table 1 Light Accent 3" w:uiPriority="46"/>
+    <w:lsdException w:name="List Table 2 Accent 3" w:uiPriority="47"/>
+    <w:lsdException w:name="List Table 3 Accent 3" w:uiPriority="48"/>
+    <w:lsdException w:name="List Table 4 Accent 3" w:uiPriority="49"/>
+    <w:lsdException w:name="List Table 5 Dark Accent 3" w:uiPriority="50"/>
+    <w:lsdException w:name="List Table 6 Colorful Accent 3" w:uiPriority="51"/>
+    <w:lsdException w:name="List Table 7 Colorful Accent 3" w:uiPriority="52"/>
+    <w:lsdException w:name="List Table 1 Light Accent 4" w:uiPriority="46"/>
+    <w:lsdException w:name="List Table 2 Accent 4" w:uiPriority="47"/>
+    <w:lsdException w:name="List Table 3 Accent 4" w:uiPriority="48"/>
+    <w:lsdException w:name="List Table 4 Accent 4" w:uiPriority="49"/>
+    <w:lsdException w:name="List Table 5 Dark Accent 4" w:uiPriority="50"/>
+    <w:lsdException w:name="List Table 6 Colorful Accent 4" w:uiPriority="51"/>
+    <w:lsdException w:name="List Table 7 Colorful Accent 4" w:uiPriority="52"/>
+    <w:lsdException w:name="List Table 1 Light Accent 5" w:uiPriority="46"/>
+    <w:lsdException w:name="List Table 2 Accent 5" w:uiPriority="47"/>
+    <w:lsdException w:name="List Table 3 Accent 5" w:uiPriority="48"/>
+    <w:lsdException w:name="List Table 4 Accent 5" w:uiPriority="49"/>
+    <w:lsdException w:name="List Table 5 Dark Accent 5" w:uiPriority="50"/>
+    <w:lsdException w:name="List Table 6 Colorful Accent 5" w:uiPriority="51"/>
+    <w:lsdException w:name="List Table 7 Colorful Accent 5" w:uiPriority="52"/>
+    <w:lsdException w:name="List Table 1 Light Accent 6" w:uiPriority="46"/>
+    <w:lsdException w:name="List Table 2 Accent 6" w:uiPriority="47"/>
+    <w:lsdException w:name="List Table 3 Accent 6" w:uiPriority="48"/>
+    <w:lsdException w:name="List Table 4 Accent 6" w:uiPriority="49"/>
+    <w:lsdException w:name="List Table 5 Dark Accent 6" w:uiPriority="50"/>
+    <w:lsdException w:name="List Table 6 Colorful Accent 6" w:uiPriority="51"/>
+    <w:lsdException w:name="List Table 7 Colorful Accent 6" w:uiPriority="52"/>
+    <w:lsdException w:name="Mention" w:semiHidden="1" w:unhideWhenUsed="1"/>
+    <w:lsdException w:name="Smart Hyperlink" w:semiHidden="1" w:unhideWhenUsed="1"/>
+    <w:lsdException w:name="Hashtag" w:semiHidden="1" w:unhideWhenUsed="1"/>
+    <w:lsdException w:name="Unresolved Mention" w:semiHidden="1" w:unhideWhenUsed="1"/>
+    <w:lsdException w:name="Smart Link" w:semiHidden="1" w:unhideWhenUsed="1"/>
   </w:latentStyles>
   <w:style w:type="paragraph" w:default="1" w:styleId="Normal">
     <w:name w:val="Normal"/>

</xml_diff>